<commit_message>
modified:   MPP_MES_USER_JOURNEYS.docx 	modified:   MPP_MES_USER_JOURNEYS.md 	new file:   docs/screenshots/screen-add-item-modal.png 	new file:   docs/screenshots/screen-add-location-modal.png 	new file:   docs/screenshots/screen-defect-codes.png 	new file:   docs/screenshots/screen-downtime-codes.png 	new file:   docs/screenshots/screen-item-boms-tab.png 	new file:   docs/screenshots/screen-item-eligibility-tab.png 	new file:   docs/screenshots/screen-item-master.png 	new file:   docs/screenshots/screen-item-quality-specs-tab.png 	new file:   docs/screenshots/screen-item-routes-tab.png 	new file:   docs/screenshots/screen-operation-templates.png 	new file:   docs/screenshots/screen-plant-hierarchy.png 	new file:   docs/screenshots/screen-quality-specs.png 	new file:   docs/screenshots/screen-shift-schedules.png 	modified:   mockup/index.html
</commit_message>
<xml_diff>
--- a/MPP_MES_USER_JOURNEYS.docx
+++ b/MPP_MES_USER_JOURNEYS.docx
@@ -2,7 +2,7 @@
 <file path=word/document.xml><?xml version="1.0" encoding="utf-8"?>
 <w:document xmlns:w="http://schemas.openxmlformats.org/wordprocessingml/2006/main" xmlns:m="http://schemas.openxmlformats.org/officeDocument/2006/math" xmlns:r="http://schemas.openxmlformats.org/officeDocument/2006/relationships" xmlns:o="urn:schemas-microsoft-com:office:office" xmlns:v="urn:schemas-microsoft-com:vml" xmlns:w10="urn:schemas-microsoft-com:office:word" xmlns:a="http://schemas.openxmlformats.org/drawingml/2006/main" xmlns:pic="http://schemas.openxmlformats.org/drawingml/2006/picture" xmlns:wp="http://schemas.openxmlformats.org/drawingml/2006/wordprocessingDrawing">
   <w:body>
-    <w:bookmarkStart w:id="50" w:name="mpp-mes-user-journeys"/>
+    <w:bookmarkStart w:id="89" w:name="mpp-mes-user-journeys"/>
     <w:p>
       <w:pPr>
         <w:pStyle w:val="Heading1"/>
@@ -116,15 +116,7 @@
         <w:tblStyle w:val="Table"/>
         <w:tblW w:type="pct" w:w="5000"/>
         <w:tblLayout w:type="fixed"/>
-        <w:tblBorders>
-          <w:top w:val="single" w:sz="4" w:space="0" w:color="808080"/>
-          <w:left w:val="single" w:sz="4" w:space="0" w:color="808080"/>
-          <w:bottom w:val="single" w:sz="4" w:space="0" w:color="808080"/>
-          <w:right w:val="single" w:sz="4" w:space="0" w:color="808080"/>
-          <w:insideH w:val="single" w:sz="4" w:space="0" w:color="BFBFBF"/>
-          <w:insideV w:val="single" w:sz="4" w:space="0" w:color="BFBFBF"/>
-        </w:tblBorders>
-        <w:tblLook w:firstRow="1" w:lastRow="0" w:firstColumn="0" w:lastColumn="0" w:noHBand="0" w:noVBand="1" w:val="0220"/>
+        <w:tblLook w:firstRow="1" w:lastRow="0" w:firstColumn="0" w:lastColumn="0" w:noHBand="0" w:noVBand="0" w:val="0020"/>
       </w:tblPr>
       <w:tblGrid>
         <w:gridCol w:w="1980"/>
@@ -137,73 +129,45 @@
           <w:tblHeader w:val="on"/>
         </w:trPr>
         <w:tc>
-          <w:tcPr>
-            <w:shd w:val="clear" w:color="auto" w:fill="1F4E79"/>
-          </w:tcPr>
-          <w:tcPr/>
-          <w:p>
-            <w:pPr>
-              <w:pStyle w:val="Compact"/>
-            </w:pPr>
-            <w:r>
-              <w:rPr>
-                <w:b/>
-                <w:color w:val="FFFFFF"/>
-              </w:rPr>
+          <w:tcPr/>
+          <w:p>
+            <w:pPr>
+              <w:pStyle w:val="Compact"/>
+            </w:pPr>
+            <w:r>
               <w:t xml:space="preserve">Version</w:t>
             </w:r>
           </w:p>
         </w:tc>
         <w:tc>
-          <w:tcPr>
-            <w:shd w:val="clear" w:color="auto" w:fill="1F4E79"/>
-          </w:tcPr>
-          <w:tcPr/>
-          <w:p>
-            <w:pPr>
-              <w:pStyle w:val="Compact"/>
-            </w:pPr>
-            <w:r>
-              <w:rPr>
-                <w:b/>
-                <w:color w:val="FFFFFF"/>
-              </w:rPr>
+          <w:tcPr/>
+          <w:p>
+            <w:pPr>
+              <w:pStyle w:val="Compact"/>
+            </w:pPr>
+            <w:r>
               <w:t xml:space="preserve">Date</w:t>
             </w:r>
           </w:p>
         </w:tc>
         <w:tc>
-          <w:tcPr>
-            <w:shd w:val="clear" w:color="auto" w:fill="1F4E79"/>
-          </w:tcPr>
-          <w:tcPr/>
-          <w:p>
-            <w:pPr>
-              <w:pStyle w:val="Compact"/>
-            </w:pPr>
-            <w:r>
-              <w:rPr>
-                <w:b/>
-                <w:color w:val="FFFFFF"/>
-              </w:rPr>
+          <w:tcPr/>
+          <w:p>
+            <w:pPr>
+              <w:pStyle w:val="Compact"/>
+            </w:pPr>
+            <w:r>
               <w:t xml:space="preserve">Author</w:t>
             </w:r>
           </w:p>
         </w:tc>
         <w:tc>
-          <w:tcPr>
-            <w:shd w:val="clear" w:color="auto" w:fill="1F4E79"/>
-          </w:tcPr>
-          <w:tcPr/>
-          <w:p>
-            <w:pPr>
-              <w:pStyle w:val="Compact"/>
-            </w:pPr>
-            <w:r>
-              <w:rPr>
-                <w:b/>
-                <w:color w:val="FFFFFF"/>
-              </w:rPr>
+          <w:tcPr/>
+          <w:p>
+            <w:pPr>
+              <w:pStyle w:val="Compact"/>
+            </w:pPr>
+            <w:r>
               <w:t xml:space="preserve">Change Summary</w:t>
             </w:r>
           </w:p>
@@ -257,9 +221,6 @@
       </w:tr>
       <w:tr>
         <w:tc>
-          <w:tcPr>
-            <w:shd w:val="clear" w:color="auto" w:fill="F2F2F2"/>
-          </w:tcPr>
           <w:tcPr/>
           <w:p>
             <w:pPr>
@@ -271,9 +232,6 @@
           </w:p>
         </w:tc>
         <w:tc>
-          <w:tcPr>
-            <w:shd w:val="clear" w:color="auto" w:fill="F2F2F2"/>
-          </w:tcPr>
           <w:tcPr/>
           <w:p>
             <w:pPr>
@@ -285,9 +243,6 @@
           </w:p>
         </w:tc>
         <w:tc>
-          <w:tcPr>
-            <w:shd w:val="clear" w:color="auto" w:fill="F2F2F2"/>
-          </w:tcPr>
           <w:tcPr/>
           <w:p>
             <w:pPr>
@@ -299,9 +254,6 @@
           </w:p>
         </w:tc>
         <w:tc>
-          <w:tcPr>
-            <w:shd w:val="clear" w:color="auto" w:fill="F2F2F2"/>
-          </w:tcPr>
           <w:tcPr/>
           <w:p>
             <w:pPr>
@@ -361,9 +313,6 @@
       </w:tr>
       <w:tr>
         <w:tc>
-          <w:tcPr>
-            <w:shd w:val="clear" w:color="auto" w:fill="F2F2F2"/>
-          </w:tcPr>
           <w:tcPr/>
           <w:p>
             <w:pPr>
@@ -375,9 +324,6 @@
           </w:p>
         </w:tc>
         <w:tc>
-          <w:tcPr>
-            <w:shd w:val="clear" w:color="auto" w:fill="F2F2F2"/>
-          </w:tcPr>
           <w:tcPr/>
           <w:p>
             <w:pPr>
@@ -389,9 +335,6 @@
           </w:p>
         </w:tc>
         <w:tc>
-          <w:tcPr>
-            <w:shd w:val="clear" w:color="auto" w:fill="F2F2F2"/>
-          </w:tcPr>
           <w:tcPr/>
           <w:p>
             <w:pPr>
@@ -403,9 +346,6 @@
           </w:p>
         </w:tc>
         <w:tc>
-          <w:tcPr>
-            <w:shd w:val="clear" w:color="auto" w:fill="F2F2F2"/>
-          </w:tcPr>
           <w:tcPr/>
           <w:p>
             <w:pPr>
@@ -459,6 +399,52 @@
             </w:pPr>
             <w:r>
               <w:t xml:space="preserve">Aligned to data model v1.3 and Phase 5/6 SQL delivery. Configuration Tool arc now reflects three-state versioning (Draft / Published / Deprecated) for RouteTemplate, OperationTemplate, and Bom — engineers author across sessions, publish to release for production, and deprecate rather than delete. OperationTemplate data collection described via the DataCollectionField junction (configurable per step) instead of hardcoded flags. Location management references the SortOrder + MoveUp/MoveDown arrow-button pattern (no drag-and-drop, per project convention). Plant Floor arc references HoldEvent as a single place/release lifecycle table consistent with DowntimeEvent. Added note that all Configuration Tool screens bind to Ignition Named Queries over stored procs returning a single result set (see FDS §11 FDS-11-011).</w:t>
+            </w:r>
+          </w:p>
+        </w:tc>
+      </w:tr>
+      <w:tr>
+        <w:tc>
+          <w:tcPr/>
+          <w:p>
+            <w:pPr>
+              <w:pStyle w:val="Compact"/>
+            </w:pPr>
+            <w:r>
+              <w:t xml:space="preserve">0.6</w:t>
+            </w:r>
+          </w:p>
+        </w:tc>
+        <w:tc>
+          <w:tcPr/>
+          <w:p>
+            <w:pPr>
+              <w:pStyle w:val="Compact"/>
+            </w:pPr>
+            <w:r>
+              <w:t xml:space="preserve">2026-04-16</w:t>
+            </w:r>
+          </w:p>
+        </w:tc>
+        <w:tc>
+          <w:tcPr/>
+          <w:p>
+            <w:pPr>
+              <w:pStyle w:val="Compact"/>
+            </w:pPr>
+            <w:r>
+              <w:t xml:space="preserve">Hunter Kraft</w:t>
+            </w:r>
+          </w:p>
+        </w:tc>
+        <w:tc>
+          <w:tcPr/>
+          <w:p>
+            <w:pPr>
+              <w:pStyle w:val="Compact"/>
+            </w:pPr>
+            <w:r>
+              <w:t xml:space="preserve">Mockup screenshots reviewed and incorporated into Arc 1 narrative. UI details (screen names, field labels, button labels, layout descriptions) updated to match the actual Perspective mockup. In progress — updating section by section as screenshots are reviewed.</w:t>
             </w:r>
           </w:p>
         </w:tc>
@@ -494,15 +480,7 @@
         <w:tblStyle w:val="Table"/>
         <w:tblW w:type="pct" w:w="5000"/>
         <w:tblLayout w:type="fixed"/>
-        <w:tblBorders>
-          <w:top w:val="single" w:sz="4" w:space="0" w:color="808080"/>
-          <w:left w:val="single" w:sz="4" w:space="0" w:color="808080"/>
-          <w:bottom w:val="single" w:sz="4" w:space="0" w:color="808080"/>
-          <w:right w:val="single" w:sz="4" w:space="0" w:color="808080"/>
-          <w:insideH w:val="single" w:sz="4" w:space="0" w:color="BFBFBF"/>
-          <w:insideV w:val="single" w:sz="4" w:space="0" w:color="BFBFBF"/>
-        </w:tblBorders>
-        <w:tblLook w:firstRow="1" w:lastRow="0" w:firstColumn="0" w:lastColumn="0" w:noHBand="0" w:noVBand="1" w:val="0220"/>
+        <w:tblLook w:firstRow="1" w:lastRow="0" w:firstColumn="0" w:lastColumn="0" w:noHBand="0" w:noVBand="0" w:val="0020"/>
       </w:tblPr>
       <w:tblGrid>
         <w:gridCol w:w="1980"/>
@@ -515,73 +493,45 @@
           <w:tblHeader w:val="on"/>
         </w:trPr>
         <w:tc>
-          <w:tcPr>
-            <w:shd w:val="clear" w:color="auto" w:fill="1F4E79"/>
-          </w:tcPr>
-          <w:tcPr/>
-          <w:p>
-            <w:pPr>
-              <w:pStyle w:val="Compact"/>
-            </w:pPr>
-            <w:r>
-              <w:rPr>
-                <w:b/>
-                <w:color w:val="FFFFFF"/>
-              </w:rPr>
+          <w:tcPr/>
+          <w:p>
+            <w:pPr>
+              <w:pStyle w:val="Compact"/>
+            </w:pPr>
+            <w:r>
               <w:t xml:space="preserve">Arc</w:t>
             </w:r>
           </w:p>
         </w:tc>
         <w:tc>
-          <w:tcPr>
-            <w:shd w:val="clear" w:color="auto" w:fill="1F4E79"/>
-          </w:tcPr>
-          <w:tcPr/>
-          <w:p>
-            <w:pPr>
-              <w:pStyle w:val="Compact"/>
-            </w:pPr>
-            <w:r>
-              <w:rPr>
-                <w:b/>
-                <w:color w:val="FFFFFF"/>
-              </w:rPr>
+          <w:tcPr/>
+          <w:p>
+            <w:pPr>
+              <w:pStyle w:val="Compact"/>
+            </w:pPr>
+            <w:r>
               <w:t xml:space="preserve">Who</w:t>
             </w:r>
           </w:p>
         </w:tc>
         <w:tc>
-          <w:tcPr>
-            <w:shd w:val="clear" w:color="auto" w:fill="1F4E79"/>
-          </w:tcPr>
-          <w:tcPr/>
-          <w:p>
-            <w:pPr>
-              <w:pStyle w:val="Compact"/>
-            </w:pPr>
-            <w:r>
-              <w:rPr>
-                <w:b/>
-                <w:color w:val="FFFFFF"/>
-              </w:rPr>
+          <w:tcPr/>
+          <w:p>
+            <w:pPr>
+              <w:pStyle w:val="Compact"/>
+            </w:pPr>
+            <w:r>
               <w:t xml:space="preserve">When</w:t>
             </w:r>
           </w:p>
         </w:tc>
         <w:tc>
-          <w:tcPr>
-            <w:shd w:val="clear" w:color="auto" w:fill="1F4E79"/>
-          </w:tcPr>
-          <w:tcPr/>
-          <w:p>
-            <w:pPr>
-              <w:pStyle w:val="Compact"/>
-            </w:pPr>
-            <w:r>
-              <w:rPr>
-                <w:b/>
-                <w:color w:val="FFFFFF"/>
-              </w:rPr>
+          <w:tcPr/>
+          <w:p>
+            <w:pPr>
+              <w:pStyle w:val="Compact"/>
+            </w:pPr>
+            <w:r>
               <w:t xml:space="preserve">What They See</w:t>
             </w:r>
           </w:p>
@@ -639,9 +589,6 @@
       </w:tr>
       <w:tr>
         <w:tc>
-          <w:tcPr>
-            <w:shd w:val="clear" w:color="auto" w:fill="F2F2F2"/>
-          </w:tcPr>
           <w:tcPr/>
           <w:p>
             <w:pPr>
@@ -657,9 +604,6 @@
           </w:p>
         </w:tc>
         <w:tc>
-          <w:tcPr>
-            <w:shd w:val="clear" w:color="auto" w:fill="F2F2F2"/>
-          </w:tcPr>
           <w:tcPr/>
           <w:p>
             <w:pPr>
@@ -671,9 +615,6 @@
           </w:p>
         </w:tc>
         <w:tc>
-          <w:tcPr>
-            <w:shd w:val="clear" w:color="auto" w:fill="F2F2F2"/>
-          </w:tcPr>
           <w:tcPr/>
           <w:p>
             <w:pPr>
@@ -685,9 +626,6 @@
           </w:p>
         </w:tc>
         <w:tc>
-          <w:tcPr>
-            <w:shd w:val="clear" w:color="auto" w:fill="F2F2F2"/>
-          </w:tcPr>
           <w:tcPr/>
           <w:p>
             <w:pPr>
@@ -716,7 +654,7 @@
       </w:r>
     </w:p>
     <w:bookmarkEnd w:id="10"/>
-    <w:bookmarkStart w:id="16" w:name="X8a62b6bbd3b7dbd28b80423735197bca531f61b"/>
+    <w:bookmarkStart w:id="55" w:name="X8a62b6bbd3b7dbd28b80423735197bca531f61b"/>
     <w:p>
       <w:pPr>
         <w:pStyle w:val="Heading2"/>
@@ -739,7 +677,7 @@
         <w:t xml:space="preserve">Before a single LOT can be created on the shop floor, an engineer at Madison Precision Products has to teach the MES what the plant looks like, what it makes, and how it makes it. This is the configuration tool — the Ignition Perspective application that probably lives behind a different navigation root than the shop floor screens, accessible only to users whose AD accounts carry an engineering or admin role in Ignition.</w:t>
       </w:r>
     </w:p>
-    <w:bookmarkStart w:id="11" w:name="building-the-plant"/>
+    <w:bookmarkStart w:id="17" w:name="building-the-plant"/>
     <w:p>
       <w:pPr>
         <w:pStyle w:val="Heading3"/>
@@ -753,7 +691,116 @@
         <w:pStyle w:val="FirstParagraph"/>
       </w:pPr>
       <w:r>
-        <w:t xml:space="preserve">The engineer’s first job is the plant model. They open the Location Management screen and start building the hierarchy from the top down. Madison Precision Products is the Site. Under it, they create Areas — maybe the physical buildings or wings. These are the Areas: Die Cast, Trim Shop, Machine Shop, Production Control. Under areas, Lines. Under lines, individual Machines — all ~230 of them. Each one is just a row in the same</w:t>
+        <w:t xml:space="preserve">The engineer’s first job is the plant model. They navigate to the</w:t>
+      </w:r>
+      <w:r>
+        <w:t xml:space="preserve"> </w:t>
+      </w:r>
+      <w:r>
+        <w:rPr>
+          <w:b/>
+          <w:bCs/>
+        </w:rPr>
+        <w:t xml:space="preserve">Plant</w:t>
+      </w:r>
+      <w:r>
+        <w:t xml:space="preserve"> </w:t>
+      </w:r>
+      <w:r>
+        <w:t xml:space="preserve">category in the left rail and open the</w:t>
+      </w:r>
+      <w:r>
+        <w:t xml:space="preserve"> </w:t>
+      </w:r>
+      <w:r>
+        <w:rPr>
+          <w:b/>
+          <w:bCs/>
+        </w:rPr>
+        <w:t xml:space="preserve">Plant Hierarchy</w:t>
+      </w:r>
+      <w:r>
+        <w:t xml:space="preserve"> </w:t>
+      </w:r>
+      <w:r>
+        <w:t xml:space="preserve">screen. The left panel shows the full location tree — each node labeled with its ISA-95 tier on the right (Enterprise, Site, Area, Cell). A</w:t>
+      </w:r>
+      <w:r>
+        <w:t xml:space="preserve"> </w:t>
+      </w:r>
+      <w:r>
+        <w:rPr>
+          <w:b/>
+          <w:bCs/>
+        </w:rPr>
+        <w:t xml:space="preserve">Search locations…</w:t>
+      </w:r>
+      <w:r>
+        <w:t xml:space="preserve"> </w:t>
+      </w:r>
+      <w:r>
+        <w:t xml:space="preserve">bar at the top of the tree lets them jump directly to any location by name. The</w:t>
+      </w:r>
+      <w:r>
+        <w:t xml:space="preserve"> </w:t>
+      </w:r>
+      <w:r>
+        <w:rPr>
+          <w:b/>
+          <w:bCs/>
+        </w:rPr>
+        <w:t xml:space="preserve">+ Add Location</w:t>
+      </w:r>
+      <w:r>
+        <w:t xml:space="preserve"> </w:t>
+      </w:r>
+      <w:r>
+        <w:t xml:space="preserve">button in the top right of the screen opens the creation flow.</w:t>
+      </w:r>
+    </w:p>
+    <w:p>
+      <w:pPr>
+        <w:pStyle w:val="BodyText"/>
+      </w:pPr>
+      <w:r>
+        <w:t xml:space="preserve">The hierarchy is built top-down. Madison Precision Products is the Enterprise. Under it, Madison Facility is the Site. Under that, the Areas: Die Cast, Trim Shop, Machine Shop, Production Control, Quality Control. Under each area, the individual machines as Cells — all ~230 of them.</w:t>
+      </w:r>
+    </w:p>
+    <w:p>
+      <w:pPr>
+        <w:pStyle w:val="BodyText"/>
+      </w:pPr>
+      <w:r>
+        <w:t xml:space="preserve">When the engineer clicks</w:t>
+      </w:r>
+      <w:r>
+        <w:t xml:space="preserve"> </w:t>
+      </w:r>
+      <w:r>
+        <w:rPr>
+          <w:b/>
+          <w:bCs/>
+        </w:rPr>
+        <w:t xml:space="preserve">+ Add Location</w:t>
+      </w:r>
+      <w:r>
+        <w:t xml:space="preserve">, a modal appears with four fields:</w:t>
+      </w:r>
+      <w:r>
+        <w:t xml:space="preserve"> </w:t>
+      </w:r>
+      <w:r>
+        <w:rPr>
+          <w:b/>
+          <w:bCs/>
+        </w:rPr>
+        <w:t xml:space="preserve">Location Type Definition</w:t>
+      </w:r>
+      <w:r>
+        <w:t xml:space="preserve"> </w:t>
+      </w:r>
+      <w:r>
+        <w:t xml:space="preserve">(a dropdown that sets both the ISA-95 tier and the polymorphic kind — e.g.,</w:t>
       </w:r>
       <w:r>
         <w:t xml:space="preserve"> </w:t>
@@ -762,13 +809,150 @@
         <w:rPr>
           <w:rStyle w:val="VerbatimChar"/>
         </w:rPr>
-        <w:t xml:space="preserve">Location</w:t>
-      </w:r>
-      <w:r>
-        <w:t xml:space="preserve"> </w:t>
-      </w:r>
-      <w:r>
-        <w:t xml:space="preserve">table, differentiated by its</w:t>
+        <w:t xml:space="preserve">Cell • DieCastMachine</w:t>
+      </w:r>
+      <w:r>
+        <w:t xml:space="preserve">),</w:t>
+      </w:r>
+      <w:r>
+        <w:t xml:space="preserve"> </w:t>
+      </w:r>
+      <w:r>
+        <w:rPr>
+          <w:b/>
+          <w:bCs/>
+        </w:rPr>
+        <w:t xml:space="preserve">Name</w:t>
+      </w:r>
+      <w:r>
+        <w:t xml:space="preserve"> </w:t>
+      </w:r>
+      <w:r>
+        <w:t xml:space="preserve">(e.g., DC Machine #20),</w:t>
+      </w:r>
+      <w:r>
+        <w:t xml:space="preserve"> </w:t>
+      </w:r>
+      <w:r>
+        <w:rPr>
+          <w:b/>
+          <w:bCs/>
+        </w:rPr>
+        <w:t xml:space="preserve">Code</w:t>
+      </w:r>
+      <w:r>
+        <w:t xml:space="preserve"> </w:t>
+      </w:r>
+      <w:r>
+        <w:t xml:space="preserve">(e.g., DC-020), and an optional</w:t>
+      </w:r>
+      <w:r>
+        <w:t xml:space="preserve"> </w:t>
+      </w:r>
+      <w:r>
+        <w:rPr>
+          <w:b/>
+          <w:bCs/>
+        </w:rPr>
+        <w:t xml:space="preserve">Description</w:t>
+      </w:r>
+      <w:r>
+        <w:t xml:space="preserve">. Clicking</w:t>
+      </w:r>
+      <w:r>
+        <w:t xml:space="preserve"> </w:t>
+      </w:r>
+      <w:r>
+        <w:rPr>
+          <w:b/>
+          <w:bCs/>
+        </w:rPr>
+        <w:t xml:space="preserve">Create Location</w:t>
+      </w:r>
+      <w:r>
+        <w:t xml:space="preserve"> </w:t>
+      </w:r>
+      <w:r>
+        <w:t xml:space="preserve">adds the new node to the tree and opens its detail panel for attribute entry. Cancel dismisses without saving.</w:t>
+      </w:r>
+    </w:p>
+    <w:p>
+      <w:pPr>
+        <w:pStyle w:val="CaptionedFigure"/>
+      </w:pPr>
+      <w:r>
+        <w:drawing>
+          <wp:inline>
+            <wp:extent cx="5334000" cy="3168927"/>
+            <wp:effectExtent b="0" l="0" r="0" t="0"/>
+            <wp:docPr descr="Add Location Modal" title="" id="12" name="Picture"/>
+            <a:graphic>
+              <a:graphicData uri="http://schemas.openxmlformats.org/drawingml/2006/picture">
+                <pic:pic>
+                  <pic:nvPicPr>
+                    <pic:cNvPr descr="docs/screenshots/screen-add-location-modal.png" id="13" name="Picture"/>
+                    <pic:cNvPicPr>
+                      <a:picLocks noChangeArrowheads="1" noChangeAspect="1"/>
+                    </pic:cNvPicPr>
+                  </pic:nvPicPr>
+                  <pic:blipFill>
+                    <a:blip r:embed="rId11"/>
+                    <a:stretch>
+                      <a:fillRect/>
+                    </a:stretch>
+                  </pic:blipFill>
+                  <pic:spPr bwMode="auto">
+                    <a:xfrm>
+                      <a:off x="0" y="0"/>
+                      <a:ext cx="5334000" cy="3168927"/>
+                    </a:xfrm>
+                    <a:prstGeom prst="rect">
+                      <a:avLst/>
+                    </a:prstGeom>
+                    <a:noFill/>
+                    <a:ln w="9525">
+                      <a:noFill/>
+                      <a:headEnd/>
+                      <a:tailEnd/>
+                    </a:ln>
+                  </pic:spPr>
+                </pic:pic>
+              </a:graphicData>
+            </a:graphic>
+          </wp:inline>
+        </w:drawing>
+      </w:r>
+    </w:p>
+    <w:p>
+      <w:pPr>
+        <w:pStyle w:val="ImageCaption"/>
+      </w:pPr>
+      <w:r>
+        <w:t xml:space="preserve">Add Location Modal</w:t>
+      </w:r>
+    </w:p>
+    <w:p>
+      <w:pPr>
+        <w:pStyle w:val="BodyText"/>
+      </w:pPr>
+      <w:r>
+        <w:t xml:space="preserve">Clicking any node in the tree loads its</w:t>
+      </w:r>
+      <w:r>
+        <w:t xml:space="preserve"> </w:t>
+      </w:r>
+      <w:r>
+        <w:rPr>
+          <w:b/>
+          <w:bCs/>
+        </w:rPr>
+        <w:t xml:space="preserve">Location Details</w:t>
+      </w:r>
+      <w:r>
+        <w:t xml:space="preserve"> </w:t>
+      </w:r>
+      <w:r>
+        <w:t xml:space="preserve">panel on the right. The panel header shows the location’s type tags — for example,</w:t>
       </w:r>
       <w:r>
         <w:t xml:space="preserve"> </w:t>
@@ -777,18 +961,134 @@
         <w:rPr>
           <w:rStyle w:val="VerbatimChar"/>
         </w:rPr>
-        <w:t xml:space="preserve">LocationType</w:t>
+        <w:t xml:space="preserve">Cell • DieCastMachine</w:t>
+      </w:r>
+      <w:r>
+        <w:t xml:space="preserve"> </w:t>
+      </w:r>
+      <w:r>
+        <w:t xml:space="preserve">— so the engineer always knows both the ISA-95 tier and the polymorphic kind at a glance. The core fields are</w:t>
+      </w:r>
+      <w:r>
+        <w:t xml:space="preserve"> </w:t>
+      </w:r>
+      <w:r>
+        <w:rPr>
+          <w:b/>
+          <w:bCs/>
+        </w:rPr>
+        <w:t xml:space="preserve">Name</w:t>
+      </w:r>
+      <w:r>
+        <w:t xml:space="preserve">,</w:t>
+      </w:r>
+      <w:r>
+        <w:t xml:space="preserve"> </w:t>
+      </w:r>
+      <w:r>
+        <w:rPr>
+          <w:b/>
+          <w:bCs/>
+        </w:rPr>
+        <w:t xml:space="preserve">Code</w:t>
+      </w:r>
+      <w:r>
+        <w:t xml:space="preserve">,</w:t>
+      </w:r>
+      <w:r>
+        <w:t xml:space="preserve"> </w:t>
+      </w:r>
+      <w:r>
+        <w:rPr>
+          <w:b/>
+          <w:bCs/>
+        </w:rPr>
+        <w:t xml:space="preserve">Parent</w:t>
+      </w:r>
+      <w:r>
+        <w:t xml:space="preserve">,</w:t>
+      </w:r>
+      <w:r>
+        <w:t xml:space="preserve"> </w:t>
+      </w:r>
+      <w:r>
+        <w:rPr>
+          <w:b/>
+          <w:bCs/>
+        </w:rPr>
+        <w:t xml:space="preserve">Description</w:t>
+      </w:r>
+      <w:r>
+        <w:t xml:space="preserve">, and</w:t>
+      </w:r>
+      <w:r>
+        <w:t xml:space="preserve"> </w:t>
+      </w:r>
+      <w:r>
+        <w:rPr>
+          <w:b/>
+          <w:bCs/>
+        </w:rPr>
+        <w:t xml:space="preserve">Sort Order</w:t>
       </w:r>
       <w:r>
         <w:t xml:space="preserve">.</w:t>
       </w:r>
+      <w:r>
+        <w:t xml:space="preserve"> </w:t>
+      </w:r>
+      <w:r>
+        <w:rPr>
+          <w:b/>
+          <w:bCs/>
+        </w:rPr>
+        <w:t xml:space="preserve">Save</w:t>
+      </w:r>
+      <w:r>
+        <w:t xml:space="preserve"> </w:t>
+      </w:r>
+      <w:r>
+        <w:t xml:space="preserve">and</w:t>
+      </w:r>
+      <w:r>
+        <w:t xml:space="preserve"> </w:t>
+      </w:r>
+      <w:r>
+        <w:rPr>
+          <w:b/>
+          <w:bCs/>
+        </w:rPr>
+        <w:t xml:space="preserve">Deprecate</w:t>
+      </w:r>
+      <w:r>
+        <w:t xml:space="preserve"> </w:t>
+      </w:r>
+      <w:r>
+        <w:t xml:space="preserve">actions sit in the top-right corner of the panel.</w:t>
+      </w:r>
     </w:p>
     <w:p>
       <w:pPr>
         <w:pStyle w:val="BodyText"/>
       </w:pPr>
       <w:r>
-        <w:t xml:space="preserve">As they create each machine, the system shows them the attribute definitions for that location type. A Die Cast machine might need</w:t>
+        <w:t xml:space="preserve">Below the core fields, the</w:t>
+      </w:r>
+      <w:r>
+        <w:t xml:space="preserve"> </w:t>
+      </w:r>
+      <w:r>
+        <w:rPr>
+          <w:b/>
+          <w:bCs/>
+        </w:rPr>
+        <w:t xml:space="preserve">Attributes</w:t>
+      </w:r>
+      <w:r>
+        <w:t xml:space="preserve"> </w:t>
+      </w:r>
+      <w:r>
+        <w:t xml:space="preserve">section displays the schema for that location’s kind. DC Machine #7, for example, shows the</w:t>
       </w:r>
       <w:r>
         <w:t xml:space="preserve"> </w:t>
@@ -797,9 +1097,310 @@
         <w:rPr>
           <w:rStyle w:val="VerbatimChar"/>
         </w:rPr>
+        <w:t xml:space="preserve">DieCastMachine</w:t>
+      </w:r>
+      <w:r>
+        <w:t xml:space="preserve"> </w:t>
+      </w:r>
+      <w:r>
+        <w:t xml:space="preserve">schema:</w:t>
+      </w:r>
+      <w:r>
+        <w:t xml:space="preserve"> </w:t>
+      </w:r>
+      <w:r>
+        <w:rPr>
+          <w:b/>
+          <w:bCs/>
+        </w:rPr>
         <w:t xml:space="preserve">Tonnage</w:t>
       </w:r>
       <w:r>
+        <w:t xml:space="preserve"> </w:t>
+      </w:r>
+      <w:r>
+        <w:t xml:space="preserve">(400, DECIMAL, tons — required),</w:t>
+      </w:r>
+      <w:r>
+        <w:t xml:space="preserve"> </w:t>
+      </w:r>
+      <w:r>
+        <w:rPr>
+          <w:b/>
+          <w:bCs/>
+        </w:rPr>
+        <w:t xml:space="preserve">NumberOfCavities</w:t>
+      </w:r>
+      <w:r>
+        <w:t xml:space="preserve"> </w:t>
+      </w:r>
+      <w:r>
+        <w:t xml:space="preserve">(2, INT — required), and</w:t>
+      </w:r>
+      <w:r>
+        <w:t xml:space="preserve"> </w:t>
+      </w:r>
+      <w:r>
+        <w:rPr>
+          <w:b/>
+          <w:bCs/>
+        </w:rPr>
+        <w:t xml:space="preserve">RefCycleTimeSec</w:t>
+      </w:r>
+      <w:r>
+        <w:t xml:space="preserve"> </w:t>
+      </w:r>
+      <w:r>
+        <w:t xml:space="preserve">(62.5, DECIMAL, sec — optional). Each attribute row has up/down arrows on the left for reordering. The data type and UOM are shown inline next to the value field, and the</w:t>
+      </w:r>
+      <w:r>
+        <w:t xml:space="preserve"> </w:t>
+      </w:r>
+      <w:r>
+        <w:rPr>
+          <w:b/>
+          <w:bCs/>
+        </w:rPr>
+        <w:t xml:space="preserve">REQ</w:t>
+      </w:r>
+      <w:r>
+        <w:t xml:space="preserve"> </w:t>
+      </w:r>
+      <w:r>
+        <w:t xml:space="preserve">checkbox indicates whether the attribute is mandatory for that location kind. The engineer fills in the values for each machine as they work through the hierarchy.</w:t>
+      </w:r>
+    </w:p>
+    <w:p>
+      <w:pPr>
+        <w:pStyle w:val="CaptionedFigure"/>
+      </w:pPr>
+      <w:r>
+        <w:drawing>
+          <wp:inline>
+            <wp:extent cx="5334000" cy="2639102"/>
+            <wp:effectExtent b="0" l="0" r="0" t="0"/>
+            <wp:docPr descr="Plant Hierarchy Screen — DC Machine #7 selected, showing DieCastMachine attribute schema" title="" id="15" name="Picture"/>
+            <a:graphic>
+              <a:graphicData uri="http://schemas.openxmlformats.org/drawingml/2006/picture">
+                <pic:pic>
+                  <pic:nvPicPr>
+                    <pic:cNvPr descr="docs/screenshots/screen-plant-hierarchy.png" id="16" name="Picture"/>
+                    <pic:cNvPicPr>
+                      <a:picLocks noChangeArrowheads="1" noChangeAspect="1"/>
+                    </pic:cNvPicPr>
+                  </pic:nvPicPr>
+                  <pic:blipFill>
+                    <a:blip r:embed="rId14"/>
+                    <a:stretch>
+                      <a:fillRect/>
+                    </a:stretch>
+                  </pic:blipFill>
+                  <pic:spPr bwMode="auto">
+                    <a:xfrm>
+                      <a:off x="0" y="0"/>
+                      <a:ext cx="5334000" cy="2639102"/>
+                    </a:xfrm>
+                    <a:prstGeom prst="rect">
+                      <a:avLst/>
+                    </a:prstGeom>
+                    <a:noFill/>
+                    <a:ln w="9525">
+                      <a:noFill/>
+                      <a:headEnd/>
+                      <a:tailEnd/>
+                    </a:ln>
+                  </pic:spPr>
+                </pic:pic>
+              </a:graphicData>
+            </a:graphic>
+          </wp:inline>
+        </w:drawing>
+      </w:r>
+    </w:p>
+    <w:p>
+      <w:pPr>
+        <w:pStyle w:val="ImageCaption"/>
+      </w:pPr>
+      <w:r>
+        <w:t xml:space="preserve">Plant Hierarchy Screen — DC Machine #7 selected, showing DieCastMachine attribute schema</w:t>
+      </w:r>
+    </w:p>
+    <w:p>
+      <w:pPr>
+        <w:pStyle w:val="BodyText"/>
+      </w:pPr>
+      <w:r>
+        <w:t xml:space="preserve">They also create the logical locations: Receiving Dock, Shipping Dock, WIP Storage, Sort Cage. These are Inventory Location types — they don’t have cycle times, but they’re real places where LOTs live.</w:t>
+      </w:r>
+    </w:p>
+    <w:p>
+      <w:pPr>
+        <w:pStyle w:val="BodyText"/>
+      </w:pPr>
+      <w:r>
+        <w:t xml:space="preserve">Then they set up terminals. Each Ignition client station on the floor gets a</w:t>
+      </w:r>
+      <w:r>
+        <w:t xml:space="preserve"> </w:t>
+      </w:r>
+      <w:r>
+        <w:rPr>
+          <w:rStyle w:val="VerbatimChar"/>
+        </w:rPr>
+        <w:t xml:space="preserve">Terminal</w:t>
+      </w:r>
+      <w:r>
+        <w:t xml:space="preserve"> </w:t>
+      </w:r>
+      <w:r>
+        <w:t xml:space="preserve">record — its IP address, which location it’s at, which Zebra printer it talks to, whether it has a barcode scanner. This is how the system knows that when operator Maria scans a LOT at terminal DC-05, that action happened at Die Cast Machine #5, and any label it prints goes to the Zebra on the table next to her.</w:t>
+      </w:r>
+    </w:p>
+    <w:bookmarkEnd w:id="17"/>
+    <w:bookmarkStart w:id="36" w:name="defining-what-we-make"/>
+    <w:p>
+      <w:pPr>
+        <w:pStyle w:val="Heading3"/>
+      </w:pPr>
+      <w:r>
+        <w:t xml:space="preserve">Defining What We Make</w:t>
+      </w:r>
+    </w:p>
+    <w:p>
+      <w:pPr>
+        <w:pStyle w:val="FirstParagraph"/>
+      </w:pPr>
+      <w:r>
+        <w:t xml:space="preserve">Next, the item master. The engineer navigates to the</w:t>
+      </w:r>
+      <w:r>
+        <w:t xml:space="preserve"> </w:t>
+      </w:r>
+      <w:r>
+        <w:rPr>
+          <w:b/>
+          <w:bCs/>
+        </w:rPr>
+        <w:t xml:space="preserve">Parts</w:t>
+      </w:r>
+      <w:r>
+        <w:t xml:space="preserve"> </w:t>
+      </w:r>
+      <w:r>
+        <w:t xml:space="preserve">category in the left rail and opens the</w:t>
+      </w:r>
+      <w:r>
+        <w:t xml:space="preserve"> </w:t>
+      </w:r>
+      <w:r>
+        <w:rPr>
+          <w:b/>
+          <w:bCs/>
+        </w:rPr>
+        <w:t xml:space="preserve">Item Master</w:t>
+      </w:r>
+      <w:r>
+        <w:t xml:space="preserve"> </w:t>
+      </w:r>
+      <w:r>
+        <w:t xml:space="preserve">screen. The left panel shows a searchable, filterable list of all items — a</w:t>
+      </w:r>
+      <w:r>
+        <w:t xml:space="preserve"> </w:t>
+      </w:r>
+      <w:r>
+        <w:rPr>
+          <w:b/>
+          <w:bCs/>
+        </w:rPr>
+        <w:t xml:space="preserve">Search items…</w:t>
+      </w:r>
+      <w:r>
+        <w:t xml:space="preserve"> </w:t>
+      </w:r>
+      <w:r>
+        <w:t xml:space="preserve">bar at the top and an</w:t>
+      </w:r>
+      <w:r>
+        <w:t xml:space="preserve"> </w:t>
+      </w:r>
+      <w:r>
+        <w:rPr>
+          <w:b/>
+          <w:bCs/>
+        </w:rPr>
+        <w:t xml:space="preserve">All Types</w:t>
+      </w:r>
+      <w:r>
+        <w:t xml:space="preserve"> </w:t>
+      </w:r>
+      <w:r>
+        <w:t xml:space="preserve">dropdown to filter by item type (Finished Good, Component, Pass-Through, etc.). Each item in the list shows its part number, description, and a type badge (FG, COMP, PT).</w:t>
+      </w:r>
+    </w:p>
+    <w:p>
+      <w:pPr>
+        <w:pStyle w:val="BodyText"/>
+      </w:pPr>
+      <w:r>
+        <w:t xml:space="preserve">Clicking an item loads its detail panel on the right. The header shows the part number, name, and a status badge (e.g.,</w:t>
+      </w:r>
+      <w:r>
+        <w:t xml:space="preserve"> </w:t>
+      </w:r>
+      <w:r>
+        <w:rPr>
+          <w:b/>
+          <w:bCs/>
+        </w:rPr>
+        <w:t xml:space="preserve">Finished Good</w:t>
+      </w:r>
+      <w:r>
+        <w:t xml:space="preserve">), with</w:t>
+      </w:r>
+      <w:r>
+        <w:t xml:space="preserve"> </w:t>
+      </w:r>
+      <w:r>
+        <w:rPr>
+          <w:b/>
+          <w:bCs/>
+        </w:rPr>
+        <w:t xml:space="preserve">Save</w:t>
+      </w:r>
+      <w:r>
+        <w:t xml:space="preserve"> </w:t>
+      </w:r>
+      <w:r>
+        <w:t xml:space="preserve">and</w:t>
+      </w:r>
+      <w:r>
+        <w:t xml:space="preserve"> </w:t>
+      </w:r>
+      <w:r>
+        <w:rPr>
+          <w:b/>
+          <w:bCs/>
+        </w:rPr>
+        <w:t xml:space="preserve">Deprecate</w:t>
+      </w:r>
+      <w:r>
+        <w:t xml:space="preserve"> </w:t>
+      </w:r>
+      <w:r>
+        <w:t xml:space="preserve">buttons in the top-right corner. The core fields are:</w:t>
+      </w:r>
+      <w:r>
+        <w:t xml:space="preserve"> </w:t>
+      </w:r>
+      <w:r>
+        <w:rPr>
+          <w:b/>
+          <w:bCs/>
+        </w:rPr>
+        <w:t xml:space="preserve">Part Number</w:t>
+      </w:r>
+      <w:r>
         <w:t xml:space="preserve">,</w:t>
       </w:r>
       <w:r>
@@ -807,9 +1408,176 @@
       </w:r>
       <w:r>
         <w:rPr>
-          <w:rStyle w:val="VerbatimChar"/>
-        </w:rPr>
-        <w:t xml:space="preserve">RefCycleTimeSec</w:t>
+          <w:b/>
+          <w:bCs/>
+        </w:rPr>
+        <w:t xml:space="preserve">Item Type</w:t>
+      </w:r>
+      <w:r>
+        <w:t xml:space="preserve"> </w:t>
+      </w:r>
+      <w:r>
+        <w:t xml:space="preserve">(dropdown),</w:t>
+      </w:r>
+      <w:r>
+        <w:t xml:space="preserve"> </w:t>
+      </w:r>
+      <w:r>
+        <w:rPr>
+          <w:b/>
+          <w:bCs/>
+        </w:rPr>
+        <w:t xml:space="preserve">UOM</w:t>
+      </w:r>
+      <w:r>
+        <w:t xml:space="preserve"> </w:t>
+      </w:r>
+      <w:r>
+        <w:t xml:space="preserve">(dropdown),</w:t>
+      </w:r>
+      <w:r>
+        <w:t xml:space="preserve"> </w:t>
+      </w:r>
+      <w:r>
+        <w:rPr>
+          <w:b/>
+          <w:bCs/>
+        </w:rPr>
+        <w:t xml:space="preserve">Description</w:t>
+      </w:r>
+      <w:r>
+        <w:t xml:space="preserve">,</w:t>
+      </w:r>
+      <w:r>
+        <w:t xml:space="preserve"> </w:t>
+      </w:r>
+      <w:r>
+        <w:rPr>
+          <w:b/>
+          <w:bCs/>
+        </w:rPr>
+        <w:t xml:space="preserve">Macola Part #</w:t>
+      </w:r>
+      <w:r>
+        <w:t xml:space="preserve"> </w:t>
+      </w:r>
+      <w:r>
+        <w:t xml:space="preserve">(ERP cross-reference),</w:t>
+      </w:r>
+      <w:r>
+        <w:t xml:space="preserve"> </w:t>
+      </w:r>
+      <w:r>
+        <w:rPr>
+          <w:b/>
+          <w:bCs/>
+        </w:rPr>
+        <w:t xml:space="preserve">Unit Weight</w:t>
+      </w:r>
+      <w:r>
+        <w:t xml:space="preserve">,</w:t>
+      </w:r>
+      <w:r>
+        <w:t xml:space="preserve"> </w:t>
+      </w:r>
+      <w:r>
+        <w:rPr>
+          <w:b/>
+          <w:bCs/>
+        </w:rPr>
+        <w:t xml:space="preserve">Weight UOM</w:t>
+      </w:r>
+      <w:r>
+        <w:t xml:space="preserve">,</w:t>
+      </w:r>
+      <w:r>
+        <w:t xml:space="preserve"> </w:t>
+      </w:r>
+      <w:r>
+        <w:rPr>
+          <w:b/>
+          <w:bCs/>
+        </w:rPr>
+        <w:t xml:space="preserve">Default Sub-Lot Qty</w:t>
+      </w:r>
+      <w:r>
+        <w:t xml:space="preserve"> </w:t>
+      </w:r>
+      <w:r>
+        <w:t xml:space="preserve">(how many pieces per sub-LOT when a parent LOT splits at machining), and</w:t>
+      </w:r>
+      <w:r>
+        <w:t xml:space="preserve"> </w:t>
+      </w:r>
+      <w:r>
+        <w:rPr>
+          <w:b/>
+          <w:bCs/>
+        </w:rPr>
+        <w:t xml:space="preserve">Max Lot Size</w:t>
+      </w:r>
+      <w:r>
+        <w:t xml:space="preserve"> </w:t>
+      </w:r>
+      <w:r>
+        <w:t xml:space="preserve">(reasonability check ceiling).</w:t>
+      </w:r>
+    </w:p>
+    <w:p>
+      <w:pPr>
+        <w:pStyle w:val="BodyText"/>
+      </w:pPr>
+      <w:r>
+        <w:t xml:space="preserve">Below the core fields, a five-tab strip gives access to all item-related configuration:</w:t>
+      </w:r>
+      <w:r>
+        <w:t xml:space="preserve"> </w:t>
+      </w:r>
+      <w:r>
+        <w:rPr>
+          <w:b/>
+          <w:bCs/>
+        </w:rPr>
+        <w:t xml:space="preserve">Container Config</w:t>
+      </w:r>
+      <w:r>
+        <w:t xml:space="preserve">,</w:t>
+      </w:r>
+      <w:r>
+        <w:t xml:space="preserve"> </w:t>
+      </w:r>
+      <w:r>
+        <w:rPr>
+          <w:b/>
+          <w:bCs/>
+        </w:rPr>
+        <w:t xml:space="preserve">Routes</w:t>
+      </w:r>
+      <w:r>
+        <w:t xml:space="preserve">,</w:t>
+      </w:r>
+      <w:r>
+        <w:t xml:space="preserve"> </w:t>
+      </w:r>
+      <w:r>
+        <w:rPr>
+          <w:b/>
+          <w:bCs/>
+        </w:rPr>
+        <w:t xml:space="preserve">BOMs</w:t>
+      </w:r>
+      <w:r>
+        <w:t xml:space="preserve">,</w:t>
+      </w:r>
+      <w:r>
+        <w:t xml:space="preserve"> </w:t>
+      </w:r>
+      <w:r>
+        <w:rPr>
+          <w:b/>
+          <w:bCs/>
+        </w:rPr>
+        <w:t xml:space="preserve">Quality Specs</w:t>
       </w:r>
       <w:r>
         <w:t xml:space="preserve">, and</w:t>
@@ -819,21 +1587,1015 @@
       </w:r>
       <w:r>
         <w:rPr>
-          <w:rStyle w:val="VerbatimChar"/>
-        </w:rPr>
-        <w:t xml:space="preserve">NumberOfCavities</w:t>
-      </w:r>
-      <w:r>
-        <w:t xml:space="preserve">. A machining center might need</w:t>
-      </w:r>
-      <w:r>
-        <w:t xml:space="preserve"> </w:t>
-      </w:r>
-      <w:r>
-        <w:rPr>
-          <w:rStyle w:val="VerbatimChar"/>
-        </w:rPr>
-        <w:t xml:space="preserve">SpindleCount</w:t>
+          <w:b/>
+          <w:bCs/>
+        </w:rPr>
+        <w:t xml:space="preserve">Eligibility</w:t>
+      </w:r>
+      <w:r>
+        <w:t xml:space="preserve">.</w:t>
+      </w:r>
+    </w:p>
+    <w:p>
+      <w:pPr>
+        <w:pStyle w:val="BodyText"/>
+      </w:pPr>
+      <w:r>
+        <w:t xml:space="preserve">When the engineer clicks</w:t>
+      </w:r>
+      <w:r>
+        <w:t xml:space="preserve"> </w:t>
+      </w:r>
+      <w:r>
+        <w:rPr>
+          <w:b/>
+          <w:bCs/>
+        </w:rPr>
+        <w:t xml:space="preserve">+ Add Item</w:t>
+      </w:r>
+      <w:r>
+        <w:t xml:space="preserve">, a modal appears organized into four sections:</w:t>
+      </w:r>
+      <w:r>
+        <w:t xml:space="preserve"> </w:t>
+      </w:r>
+      <w:r>
+        <w:rPr>
+          <w:b/>
+          <w:bCs/>
+        </w:rPr>
+        <w:t xml:space="preserve">Identity</w:t>
+      </w:r>
+      <w:r>
+        <w:t xml:space="preserve"> </w:t>
+      </w:r>
+      <w:r>
+        <w:t xml:space="preserve">(Part Number — required, Item Type dropdown — required, UOM dropdown — required),</w:t>
+      </w:r>
+      <w:r>
+        <w:t xml:space="preserve"> </w:t>
+      </w:r>
+      <w:r>
+        <w:rPr>
+          <w:b/>
+          <w:bCs/>
+        </w:rPr>
+        <w:t xml:space="preserve">Description</w:t>
+      </w:r>
+      <w:r>
+        <w:t xml:space="preserve"> </w:t>
+      </w:r>
+      <w:r>
+        <w:t xml:space="preserve">(required),</w:t>
+      </w:r>
+      <w:r>
+        <w:t xml:space="preserve"> </w:t>
+      </w:r>
+      <w:r>
+        <w:rPr>
+          <w:b/>
+          <w:bCs/>
+        </w:rPr>
+        <w:t xml:space="preserve">Weight</w:t>
+      </w:r>
+      <w:r>
+        <w:t xml:space="preserve"> </w:t>
+      </w:r>
+      <w:r>
+        <w:t xml:space="preserve">(Unit Weight and Weight UOM dropdown),</w:t>
+      </w:r>
+      <w:r>
+        <w:t xml:space="preserve"> </w:t>
+      </w:r>
+      <w:r>
+        <w:rPr>
+          <w:b/>
+          <w:bCs/>
+        </w:rPr>
+        <w:t xml:space="preserve">Lot Configuration</w:t>
+      </w:r>
+      <w:r>
+        <w:t xml:space="preserve"> </w:t>
+      </w:r>
+      <w:r>
+        <w:t xml:space="preserve">(Default Sub-Lot Qty defaulting to 24, Max Lot Size defaulting to 100), and</w:t>
+      </w:r>
+      <w:r>
+        <w:t xml:space="preserve"> </w:t>
+      </w:r>
+      <w:r>
+        <w:rPr>
+          <w:b/>
+          <w:bCs/>
+        </w:rPr>
+        <w:t xml:space="preserve">ERP Integration</w:t>
+      </w:r>
+      <w:r>
+        <w:t xml:space="preserve"> </w:t>
+      </w:r>
+      <w:r>
+        <w:t xml:space="preserve">(Macola Part # — optional, for future Macola integration). Clicking</w:t>
+      </w:r>
+      <w:r>
+        <w:t xml:space="preserve"> </w:t>
+      </w:r>
+      <w:r>
+        <w:rPr>
+          <w:b/>
+          <w:bCs/>
+        </w:rPr>
+        <w:t xml:space="preserve">Create Item</w:t>
+      </w:r>
+      <w:r>
+        <w:t xml:space="preserve"> </w:t>
+      </w:r>
+      <w:r>
+        <w:t xml:space="preserve">adds the item and opens its detail panel.</w:t>
+      </w:r>
+    </w:p>
+    <w:p>
+      <w:pPr>
+        <w:pStyle w:val="CaptionedFigure"/>
+      </w:pPr>
+      <w:r>
+        <w:drawing>
+          <wp:inline>
+            <wp:extent cx="5334000" cy="4161692"/>
+            <wp:effectExtent b="0" l="0" r="0" t="0"/>
+            <wp:docPr descr="Add Item Modal" title="" id="19" name="Picture"/>
+            <a:graphic>
+              <a:graphicData uri="http://schemas.openxmlformats.org/drawingml/2006/picture">
+                <pic:pic>
+                  <pic:nvPicPr>
+                    <pic:cNvPr descr="docs/screenshots/screen-add-item-modal.png" id="20" name="Picture"/>
+                    <pic:cNvPicPr>
+                      <a:picLocks noChangeArrowheads="1" noChangeAspect="1"/>
+                    </pic:cNvPicPr>
+                  </pic:nvPicPr>
+                  <pic:blipFill>
+                    <a:blip r:embed="rId18"/>
+                    <a:stretch>
+                      <a:fillRect/>
+                    </a:stretch>
+                  </pic:blipFill>
+                  <pic:spPr bwMode="auto">
+                    <a:xfrm>
+                      <a:off x="0" y="0"/>
+                      <a:ext cx="5334000" cy="4161692"/>
+                    </a:xfrm>
+                    <a:prstGeom prst="rect">
+                      <a:avLst/>
+                    </a:prstGeom>
+                    <a:noFill/>
+                    <a:ln w="9525">
+                      <a:noFill/>
+                      <a:headEnd/>
+                      <a:tailEnd/>
+                    </a:ln>
+                  </pic:spPr>
+                </pic:pic>
+              </a:graphicData>
+            </a:graphic>
+          </wp:inline>
+        </w:drawing>
+      </w:r>
+    </w:p>
+    <w:p>
+      <w:pPr>
+        <w:pStyle w:val="ImageCaption"/>
+      </w:pPr>
+      <w:r>
+        <w:t xml:space="preserve">Add Item Modal</w:t>
+      </w:r>
+    </w:p>
+    <w:p>
+      <w:pPr>
+        <w:pStyle w:val="BodyText"/>
+      </w:pPr>
+      <w:r>
+        <w:t xml:space="preserve">The</w:t>
+      </w:r>
+      <w:r>
+        <w:t xml:space="preserve"> </w:t>
+      </w:r>
+      <w:r>
+        <w:rPr>
+          <w:b/>
+          <w:bCs/>
+        </w:rPr>
+        <w:t xml:space="preserve">Container Config</w:t>
+      </w:r>
+      <w:r>
+        <w:t xml:space="preserve"> </w:t>
+      </w:r>
+      <w:r>
+        <w:t xml:space="preserve">tab defines Honda packing rules for finished goods. For the 5G0 Front Cover Assembly:</w:t>
+      </w:r>
+      <w:r>
+        <w:t xml:space="preserve"> </w:t>
+      </w:r>
+      <w:r>
+        <w:rPr>
+          <w:b/>
+          <w:bCs/>
+        </w:rPr>
+        <w:t xml:space="preserve">Trays Per Container</w:t>
+      </w:r>
+      <w:r>
+        <w:t xml:space="preserve"> </w:t>
+      </w:r>
+      <w:r>
+        <w:t xml:space="preserve">= 4,</w:t>
+      </w:r>
+      <w:r>
+        <w:t xml:space="preserve"> </w:t>
+      </w:r>
+      <w:r>
+        <w:rPr>
+          <w:b/>
+          <w:bCs/>
+        </w:rPr>
+        <w:t xml:space="preserve">Parts Per Tray</w:t>
+      </w:r>
+      <w:r>
+        <w:t xml:space="preserve"> </w:t>
+      </w:r>
+      <w:r>
+        <w:t xml:space="preserve">= 12,</w:t>
+      </w:r>
+      <w:r>
+        <w:t xml:space="preserve"> </w:t>
+      </w:r>
+      <w:r>
+        <w:rPr>
+          <w:b/>
+          <w:bCs/>
+        </w:rPr>
+        <w:t xml:space="preserve">Serialized</w:t>
+      </w:r>
+      <w:r>
+        <w:t xml:space="preserve"> </w:t>
+      </w:r>
+      <w:r>
+        <w:t xml:space="preserve">= Yes,</w:t>
+      </w:r>
+      <w:r>
+        <w:t xml:space="preserve"> </w:t>
+      </w:r>
+      <w:r>
+        <w:rPr>
+          <w:b/>
+          <w:bCs/>
+        </w:rPr>
+        <w:t xml:space="preserve">Dunnage Code</w:t>
+      </w:r>
+      <w:r>
+        <w:t xml:space="preserve"> </w:t>
+      </w:r>
+      <w:r>
+        <w:t xml:space="preserve">= RD-5G0F,</w:t>
+      </w:r>
+      <w:r>
+        <w:t xml:space="preserve"> </w:t>
+      </w:r>
+      <w:r>
+        <w:rPr>
+          <w:b/>
+          <w:bCs/>
+        </w:rPr>
+        <w:t xml:space="preserve">Customer Code</w:t>
+      </w:r>
+      <w:r>
+        <w:t xml:space="preserve"> </w:t>
+      </w:r>
+      <w:r>
+        <w:t xml:space="preserve">= HONDA-5G0. These values drive the container lifecycle on the floor — the MES knows exactly when a container is full and what label to print.</w:t>
+      </w:r>
+    </w:p>
+    <w:p>
+      <w:pPr>
+        <w:pStyle w:val="CaptionedFigure"/>
+      </w:pPr>
+      <w:r>
+        <w:drawing>
+          <wp:inline>
+            <wp:extent cx="5334000" cy="2639131"/>
+            <wp:effectExtent b="0" l="0" r="0" t="0"/>
+            <wp:docPr descr="Item Master Screen — 5G0 Front Cover Assembly, Container Config tab" title="" id="22" name="Picture"/>
+            <a:graphic>
+              <a:graphicData uri="http://schemas.openxmlformats.org/drawingml/2006/picture">
+                <pic:pic>
+                  <pic:nvPicPr>
+                    <pic:cNvPr descr="docs/screenshots/screen-item-master.png" id="23" name="Picture"/>
+                    <pic:cNvPicPr>
+                      <a:picLocks noChangeArrowheads="1" noChangeAspect="1"/>
+                    </pic:cNvPicPr>
+                  </pic:nvPicPr>
+                  <pic:blipFill>
+                    <a:blip r:embed="rId21"/>
+                    <a:stretch>
+                      <a:fillRect/>
+                    </a:stretch>
+                  </pic:blipFill>
+                  <pic:spPr bwMode="auto">
+                    <a:xfrm>
+                      <a:off x="0" y="0"/>
+                      <a:ext cx="5334000" cy="2639131"/>
+                    </a:xfrm>
+                    <a:prstGeom prst="rect">
+                      <a:avLst/>
+                    </a:prstGeom>
+                    <a:noFill/>
+                    <a:ln w="9525">
+                      <a:noFill/>
+                      <a:headEnd/>
+                      <a:tailEnd/>
+                    </a:ln>
+                  </pic:spPr>
+                </pic:pic>
+              </a:graphicData>
+            </a:graphic>
+          </wp:inline>
+        </w:drawing>
+      </w:r>
+    </w:p>
+    <w:p>
+      <w:pPr>
+        <w:pStyle w:val="ImageCaption"/>
+      </w:pPr>
+      <w:r>
+        <w:t xml:space="preserve">Item Master Screen — 5G0 Front Cover Assembly, Container Config tab</w:t>
+      </w:r>
+    </w:p>
+    <w:p>
+      <w:pPr>
+        <w:pStyle w:val="BodyText"/>
+      </w:pPr>
+      <w:r>
+        <w:t xml:space="preserve">The</w:t>
+      </w:r>
+      <w:r>
+        <w:t xml:space="preserve"> </w:t>
+      </w:r>
+      <w:r>
+        <w:rPr>
+          <w:b/>
+          <w:bCs/>
+        </w:rPr>
+        <w:t xml:space="preserve">Routes tab</w:t>
+      </w:r>
+      <w:r>
+        <w:t xml:space="preserve"> </w:t>
+      </w:r>
+      <w:r>
+        <w:t xml:space="preserve">shows the active route version for the item. A version dropdown (e.g.,</w:t>
+      </w:r>
+      <w:r>
+        <w:t xml:space="preserve"> </w:t>
+      </w:r>
+      <w:r>
+        <w:t xml:space="preserve">“v2 — Effective 2026-01-15”</w:t>
+      </w:r>
+      <w:r>
+        <w:t xml:space="preserve">) displays the current version alongside its lifecycle badge (</w:t>
+      </w:r>
+      <w:r>
+        <w:rPr>
+          <w:b/>
+          <w:bCs/>
+        </w:rPr>
+        <w:t xml:space="preserve">Published</w:t>
+      </w:r>
+      <w:r>
+        <w:t xml:space="preserve">,</w:t>
+      </w:r>
+      <w:r>
+        <w:t xml:space="preserve"> </w:t>
+      </w:r>
+      <w:r>
+        <w:rPr>
+          <w:b/>
+          <w:bCs/>
+        </w:rPr>
+        <w:t xml:space="preserve">Draft</w:t>
+      </w:r>
+      <w:r>
+        <w:t xml:space="preserve">, or</w:t>
+      </w:r>
+      <w:r>
+        <w:t xml:space="preserve"> </w:t>
+      </w:r>
+      <w:r>
+        <w:rPr>
+          <w:b/>
+          <w:bCs/>
+        </w:rPr>
+        <w:t xml:space="preserve">Deprecated</w:t>
+      </w:r>
+      <w:r>
+        <w:t xml:space="preserve">). A</w:t>
+      </w:r>
+      <w:r>
+        <w:t xml:space="preserve"> </w:t>
+      </w:r>
+      <w:r>
+        <w:rPr>
+          <w:b/>
+          <w:bCs/>
+        </w:rPr>
+        <w:t xml:space="preserve">New Version</w:t>
+      </w:r>
+      <w:r>
+        <w:t xml:space="preserve"> </w:t>
+      </w:r>
+      <w:r>
+        <w:t xml:space="preserve">button clones the published route into a new draft for editing. The route steps table shows: step number,</w:t>
+      </w:r>
+      <w:r>
+        <w:t xml:space="preserve"> </w:t>
+      </w:r>
+      <w:r>
+        <w:rPr>
+          <w:b/>
+          <w:bCs/>
+        </w:rPr>
+        <w:t xml:space="preserve">Step Name</w:t>
+      </w:r>
+      <w:r>
+        <w:t xml:space="preserve">,</w:t>
+      </w:r>
+      <w:r>
+        <w:t xml:space="preserve"> </w:t>
+      </w:r>
+      <w:r>
+        <w:rPr>
+          <w:b/>
+          <w:bCs/>
+        </w:rPr>
+        <w:t xml:space="preserve">Area</w:t>
+      </w:r>
+      <w:r>
+        <w:t xml:space="preserve">, and</w:t>
+      </w:r>
+      <w:r>
+        <w:t xml:space="preserve"> </w:t>
+      </w:r>
+      <w:r>
+        <w:rPr>
+          <w:b/>
+          <w:bCs/>
+        </w:rPr>
+        <w:t xml:space="preserve">Data Collection</w:t>
+      </w:r>
+      <w:r>
+        <w:t xml:space="preserve"> </w:t>
+      </w:r>
+      <w:r>
+        <w:t xml:space="preserve">— a summary of what data fields are collected at each step. For the 5G0, the published v2 route has 5 steps: Die Cast (Die Cast area — Die, Cavity, Weight, Good, Bad), Trim (Trim Shop — Weight, Good, Bad), CNC Machining (Machine Shop — Good, Bad), Assembly Front (Die Cast — Serial, Material Verify, Good, Bad), and Pack &amp; Ship (Prod Control — Good). A footer note reminds the user that published routes are read-only.</w:t>
+      </w:r>
+    </w:p>
+    <w:p>
+      <w:pPr>
+        <w:pStyle w:val="CaptionedFigure"/>
+      </w:pPr>
+      <w:r>
+        <w:drawing>
+          <wp:inline>
+            <wp:extent cx="5334000" cy="1868765"/>
+            <wp:effectExtent b="0" l="0" r="0" t="0"/>
+            <wp:docPr descr="Item Routes Tab — 5G0 v2 Published Route" title="" id="25" name="Picture"/>
+            <a:graphic>
+              <a:graphicData uri="http://schemas.openxmlformats.org/drawingml/2006/picture">
+                <pic:pic>
+                  <pic:nvPicPr>
+                    <pic:cNvPr descr="docs/screenshots/screen-item-routes-tab.png" id="26" name="Picture"/>
+                    <pic:cNvPicPr>
+                      <a:picLocks noChangeArrowheads="1" noChangeAspect="1"/>
+                    </pic:cNvPicPr>
+                  </pic:nvPicPr>
+                  <pic:blipFill>
+                    <a:blip r:embed="rId24"/>
+                    <a:stretch>
+                      <a:fillRect/>
+                    </a:stretch>
+                  </pic:blipFill>
+                  <pic:spPr bwMode="auto">
+                    <a:xfrm>
+                      <a:off x="0" y="0"/>
+                      <a:ext cx="5334000" cy="1868765"/>
+                    </a:xfrm>
+                    <a:prstGeom prst="rect">
+                      <a:avLst/>
+                    </a:prstGeom>
+                    <a:noFill/>
+                    <a:ln w="9525">
+                      <a:noFill/>
+                      <a:headEnd/>
+                      <a:tailEnd/>
+                    </a:ln>
+                  </pic:spPr>
+                </pic:pic>
+              </a:graphicData>
+            </a:graphic>
+          </wp:inline>
+        </w:drawing>
+      </w:r>
+    </w:p>
+    <w:p>
+      <w:pPr>
+        <w:pStyle w:val="ImageCaption"/>
+      </w:pPr>
+      <w:r>
+        <w:t xml:space="preserve">Item Routes Tab — 5G0 v2 Published Route</w:t>
+      </w:r>
+    </w:p>
+    <w:p>
+      <w:pPr>
+        <w:pStyle w:val="BodyText"/>
+      </w:pPr>
+      <w:r>
+        <w:t xml:space="preserve">The</w:t>
+      </w:r>
+      <w:r>
+        <w:t xml:space="preserve"> </w:t>
+      </w:r>
+      <w:r>
+        <w:rPr>
+          <w:b/>
+          <w:bCs/>
+        </w:rPr>
+        <w:t xml:space="preserve">BOMs tab</w:t>
+      </w:r>
+      <w:r>
+        <w:t xml:space="preserve"> </w:t>
+      </w:r>
+      <w:r>
+        <w:t xml:space="preserve">follows the same versioned pattern. The 5G0’s v1 Published BOM shows two components in sequence order: Front Cover Casting (5G0-C, qty 1 EA) and Mounting Pin (PNA, qty 2 EA). Published BOMs are read-only;</w:t>
+      </w:r>
+      <w:r>
+        <w:t xml:space="preserve"> </w:t>
+      </w:r>
+      <w:r>
+        <w:rPr>
+          <w:b/>
+          <w:bCs/>
+        </w:rPr>
+        <w:t xml:space="preserve">New Version</w:t>
+      </w:r>
+      <w:r>
+        <w:t xml:space="preserve"> </w:t>
+      </w:r>
+      <w:r>
+        <w:t xml:space="preserve">clones into a draft for editing.</w:t>
+      </w:r>
+    </w:p>
+    <w:p>
+      <w:pPr>
+        <w:pStyle w:val="CaptionedFigure"/>
+      </w:pPr>
+      <w:r>
+        <w:drawing>
+          <wp:inline>
+            <wp:extent cx="5334000" cy="2321243"/>
+            <wp:effectExtent b="0" l="0" r="0" t="0"/>
+            <wp:docPr descr="Item BOMs Tab — 5G0 v1 Published BOM" title="" id="28" name="Picture"/>
+            <a:graphic>
+              <a:graphicData uri="http://schemas.openxmlformats.org/drawingml/2006/picture">
+                <pic:pic>
+                  <pic:nvPicPr>
+                    <pic:cNvPr descr="docs/screenshots/screen-item-boms-tab.png" id="29" name="Picture"/>
+                    <pic:cNvPicPr>
+                      <a:picLocks noChangeArrowheads="1" noChangeAspect="1"/>
+                    </pic:cNvPicPr>
+                  </pic:nvPicPr>
+                  <pic:blipFill>
+                    <a:blip r:embed="rId27"/>
+                    <a:stretch>
+                      <a:fillRect/>
+                    </a:stretch>
+                  </pic:blipFill>
+                  <pic:spPr bwMode="auto">
+                    <a:xfrm>
+                      <a:off x="0" y="0"/>
+                      <a:ext cx="5334000" cy="2321243"/>
+                    </a:xfrm>
+                    <a:prstGeom prst="rect">
+                      <a:avLst/>
+                    </a:prstGeom>
+                    <a:noFill/>
+                    <a:ln w="9525">
+                      <a:noFill/>
+                      <a:headEnd/>
+                      <a:tailEnd/>
+                    </a:ln>
+                  </pic:spPr>
+                </pic:pic>
+              </a:graphicData>
+            </a:graphic>
+          </wp:inline>
+        </w:drawing>
+      </w:r>
+    </w:p>
+    <w:p>
+      <w:pPr>
+        <w:pStyle w:val="ImageCaption"/>
+      </w:pPr>
+      <w:r>
+        <w:t xml:space="preserve">Item BOMs Tab — 5G0 v1 Published BOM</w:t>
+      </w:r>
+    </w:p>
+    <w:p>
+      <w:pPr>
+        <w:pStyle w:val="BodyText"/>
+      </w:pPr>
+      <w:r>
+        <w:t xml:space="preserve">The</w:t>
+      </w:r>
+      <w:r>
+        <w:t xml:space="preserve"> </w:t>
+      </w:r>
+      <w:r>
+        <w:rPr>
+          <w:b/>
+          <w:bCs/>
+        </w:rPr>
+        <w:t xml:space="preserve">Quality Specs tab</w:t>
+      </w:r>
+      <w:r>
+        <w:t xml:space="preserve"> </w:t>
+      </w:r>
+      <w:r>
+        <w:t xml:space="preserve">shows all quality specs linked to this item. Rather than editing specs inline, it displays a summary table —</w:t>
+      </w:r>
+      <w:r>
+        <w:t xml:space="preserve"> </w:t>
+      </w:r>
+      <w:r>
+        <w:rPr>
+          <w:b/>
+          <w:bCs/>
+        </w:rPr>
+        <w:t xml:space="preserve">Spec Name</w:t>
+      </w:r>
+      <w:r>
+        <w:t xml:space="preserve">,</w:t>
+      </w:r>
+      <w:r>
+        <w:t xml:space="preserve"> </w:t>
+      </w:r>
+      <w:r>
+        <w:rPr>
+          <w:b/>
+          <w:bCs/>
+        </w:rPr>
+        <w:t xml:space="preserve">Active Version</w:t>
+      </w:r>
+      <w:r>
+        <w:t xml:space="preserve">,</w:t>
+      </w:r>
+      <w:r>
+        <w:t xml:space="preserve"> </w:t>
+      </w:r>
+      <w:r>
+        <w:rPr>
+          <w:b/>
+          <w:bCs/>
+        </w:rPr>
+        <w:t xml:space="preserve">Status</w:t>
+      </w:r>
+      <w:r>
+        <w:t xml:space="preserve"> </w:t>
+      </w:r>
+      <w:r>
+        <w:t xml:space="preserve">— with a</w:t>
+      </w:r>
+      <w:r>
+        <w:t xml:space="preserve"> </w:t>
+      </w:r>
+      <w:r>
+        <w:rPr>
+          <w:b/>
+          <w:bCs/>
+        </w:rPr>
+        <w:t xml:space="preserve">Go to spec →</w:t>
+      </w:r>
+      <w:r>
+        <w:t xml:space="preserve"> </w:t>
+      </w:r>
+      <w:r>
+        <w:t xml:space="preserve">button that navigates directly to the full spec in the Quality Specs library. The 5G0 has two linked specs: 5G0 Dimensional Spec (v2, Published) and 5G0 Visual Inspection (v1, Published).</w:t>
+      </w:r>
+    </w:p>
+    <w:p>
+      <w:pPr>
+        <w:pStyle w:val="CaptionedFigure"/>
+      </w:pPr>
+      <w:r>
+        <w:drawing>
+          <wp:inline>
+            <wp:extent cx="5334000" cy="2321902"/>
+            <wp:effectExtent b="0" l="0" r="0" t="0"/>
+            <wp:docPr descr="Item Quality Specs Tab — Linked specs for 5G0 Front Cover" title="" id="31" name="Picture"/>
+            <a:graphic>
+              <a:graphicData uri="http://schemas.openxmlformats.org/drawingml/2006/picture">
+                <pic:pic>
+                  <pic:nvPicPr>
+                    <pic:cNvPr descr="docs/screenshots/screen-item-quality-specs-tab.png" id="32" name="Picture"/>
+                    <pic:cNvPicPr>
+                      <a:picLocks noChangeArrowheads="1" noChangeAspect="1"/>
+                    </pic:cNvPicPr>
+                  </pic:nvPicPr>
+                  <pic:blipFill>
+                    <a:blip r:embed="rId30"/>
+                    <a:stretch>
+                      <a:fillRect/>
+                    </a:stretch>
+                  </pic:blipFill>
+                  <pic:spPr bwMode="auto">
+                    <a:xfrm>
+                      <a:off x="0" y="0"/>
+                      <a:ext cx="5334000" cy="2321902"/>
+                    </a:xfrm>
+                    <a:prstGeom prst="rect">
+                      <a:avLst/>
+                    </a:prstGeom>
+                    <a:noFill/>
+                    <a:ln w="9525">
+                      <a:noFill/>
+                      <a:headEnd/>
+                      <a:tailEnd/>
+                    </a:ln>
+                  </pic:spPr>
+                </pic:pic>
+              </a:graphicData>
+            </a:graphic>
+          </wp:inline>
+        </w:drawing>
+      </w:r>
+    </w:p>
+    <w:p>
+      <w:pPr>
+        <w:pStyle w:val="ImageCaption"/>
+      </w:pPr>
+      <w:r>
+        <w:t xml:space="preserve">Item Quality Specs Tab — Linked specs for 5G0 Front Cover</w:t>
+      </w:r>
+    </w:p>
+    <w:p>
+      <w:pPr>
+        <w:pStyle w:val="BodyText"/>
+      </w:pPr>
+      <w:r>
+        <w:t xml:space="preserve">The</w:t>
+      </w:r>
+      <w:r>
+        <w:t xml:space="preserve"> </w:t>
+      </w:r>
+      <w:r>
+        <w:rPr>
+          <w:b/>
+          <w:bCs/>
+        </w:rPr>
+        <w:t xml:space="preserve">Eligibility tab</w:t>
+      </w:r>
+      <w:r>
+        <w:t xml:space="preserve"> </w:t>
+      </w:r>
+      <w:r>
+        <w:t xml:space="preserve">defines which machines can run this part. An</w:t>
+      </w:r>
+      <w:r>
+        <w:t xml:space="preserve"> </w:t>
+      </w:r>
+      <w:r>
+        <w:rPr>
+          <w:b/>
+          <w:bCs/>
+        </w:rPr>
+        <w:t xml:space="preserve">Area</w:t>
+      </w:r>
+      <w:r>
+        <w:t xml:space="preserve"> </w:t>
+      </w:r>
+      <w:r>
+        <w:t xml:space="preserve">dropdown filters the view by area. For the 5G0 in the Die Cast area, the table shows all four Die Cast machines with their codes and tonnage, and an</w:t>
+      </w:r>
+      <w:r>
+        <w:t xml:space="preserve"> </w:t>
+      </w:r>
+      <w:r>
+        <w:rPr>
+          <w:b/>
+          <w:bCs/>
+        </w:rPr>
+        <w:t xml:space="preserve">Eligible</w:t>
+      </w:r>
+      <w:r>
+        <w:t xml:space="preserve"> </w:t>
+      </w:r>
+      <w:r>
+        <w:t xml:space="preserve">checkbox for each. DC Machine #3 (400t), #7 (400t), and #12 (400t) are checked; DC Machine #15 (250t) is unchecked — the 5G0 requires 400-ton capacity.</w:t>
+      </w:r>
+    </w:p>
+    <w:p>
+      <w:pPr>
+        <w:pStyle w:val="CaptionedFigure"/>
+      </w:pPr>
+      <w:r>
+        <w:drawing>
+          <wp:inline>
+            <wp:extent cx="5334000" cy="2333625"/>
+            <wp:effectExtent b="0" l="0" r="0" t="0"/>
+            <wp:docPr descr="Item Eligibility Tab — Machine eligibility for 5G0 in Die Cast area" title="" id="34" name="Picture"/>
+            <a:graphic>
+              <a:graphicData uri="http://schemas.openxmlformats.org/drawingml/2006/picture">
+                <pic:pic>
+                  <pic:nvPicPr>
+                    <pic:cNvPr descr="docs/screenshots/screen-item-eligibility-tab.png" id="35" name="Picture"/>
+                    <pic:cNvPicPr>
+                      <a:picLocks noChangeArrowheads="1" noChangeAspect="1"/>
+                    </pic:cNvPicPr>
+                  </pic:nvPicPr>
+                  <pic:blipFill>
+                    <a:blip r:embed="rId33"/>
+                    <a:stretch>
+                      <a:fillRect/>
+                    </a:stretch>
+                  </pic:blipFill>
+                  <pic:spPr bwMode="auto">
+                    <a:xfrm>
+                      <a:off x="0" y="0"/>
+                      <a:ext cx="5334000" cy="2333625"/>
+                    </a:xfrm>
+                    <a:prstGeom prst="rect">
+                      <a:avLst/>
+                    </a:prstGeom>
+                    <a:noFill/>
+                    <a:ln w="9525">
+                      <a:noFill/>
+                      <a:headEnd/>
+                      <a:tailEnd/>
+                    </a:ln>
+                  </pic:spPr>
+                </pic:pic>
+              </a:graphicData>
+            </a:graphic>
+          </wp:inline>
+        </w:drawing>
+      </w:r>
+    </w:p>
+    <w:p>
+      <w:pPr>
+        <w:pStyle w:val="ImageCaption"/>
+      </w:pPr>
+      <w:r>
+        <w:t xml:space="preserve">Item Eligibility Tab — Machine eligibility for 5G0 in Die Cast area</w:t>
+      </w:r>
+    </w:p>
+    <w:bookmarkEnd w:id="36"/>
+    <w:bookmarkStart w:id="40" w:name="defining-how-we-make-it"/>
+    <w:p>
+      <w:pPr>
+        <w:pStyle w:val="Heading3"/>
+      </w:pPr>
+      <w:r>
+        <w:t xml:space="preserve">Defining How We Make It</w:t>
+      </w:r>
+    </w:p>
+    <w:p>
+      <w:pPr>
+        <w:pStyle w:val="FirstParagraph"/>
+      </w:pPr>
+      <w:r>
+        <w:t xml:space="preserve">Before routes can be assigned to items, the engineer needs to define the</w:t>
+      </w:r>
+      <w:r>
+        <w:t xml:space="preserve"> </w:t>
+      </w:r>
+      <w:r>
+        <w:rPr>
+          <w:b/>
+          <w:bCs/>
+        </w:rPr>
+        <w:t xml:space="preserve">Operation Templates</w:t>
+      </w:r>
+      <w:r>
+        <w:t xml:space="preserve"> </w:t>
+      </w:r>
+      <w:r>
+        <w:t xml:space="preserve">— the reusable data collection profiles that describe what each type of operation requires. The engineer navigates to</w:t>
+      </w:r>
+      <w:r>
+        <w:t xml:space="preserve"> </w:t>
+      </w:r>
+      <w:r>
+        <w:rPr>
+          <w:b/>
+          <w:bCs/>
+        </w:rPr>
+        <w:t xml:space="preserve">Parts › Operation Templates</w:t>
+      </w:r>
+      <w:r>
+        <w:t xml:space="preserve">. The left panel groups templates by area: Die Cast, Trim Shop, Machine Shop, Assembly. Each template in the list shows its name and version badge. Clicking a template loads its detail on the right:</w:t>
+      </w:r>
+      <w:r>
+        <w:t xml:space="preserve"> </w:t>
+      </w:r>
+      <w:r>
+        <w:rPr>
+          <w:b/>
+          <w:bCs/>
+        </w:rPr>
+        <w:t xml:space="preserve">Code</w:t>
+      </w:r>
+      <w:r>
+        <w:t xml:space="preserve"> </w:t>
+      </w:r>
+      <w:r>
+        <w:t xml:space="preserve">(e.g., DIE-CAST),</w:t>
+      </w:r>
+      <w:r>
+        <w:t xml:space="preserve"> </w:t>
+      </w:r>
+      <w:r>
+        <w:rPr>
+          <w:b/>
+          <w:bCs/>
+        </w:rPr>
+        <w:t xml:space="preserve">Name</w:t>
+      </w:r>
+      <w:r>
+        <w:t xml:space="preserve"> </w:t>
+      </w:r>
+      <w:r>
+        <w:t xml:space="preserve">(Die Cast Operation),</w:t>
+      </w:r>
+      <w:r>
+        <w:t xml:space="preserve"> </w:t>
+      </w:r>
+      <w:r>
+        <w:rPr>
+          <w:b/>
+          <w:bCs/>
+        </w:rPr>
+        <w:t xml:space="preserve">Area</w:t>
+      </w:r>
+      <w:r>
+        <w:t xml:space="preserve"> </w:t>
+      </w:r>
+      <w:r>
+        <w:t xml:space="preserve">(Die Cast dropdown), and</w:t>
+      </w:r>
+      <w:r>
+        <w:t xml:space="preserve"> </w:t>
+      </w:r>
+      <w:r>
+        <w:rPr>
+          <w:b/>
+          <w:bCs/>
+        </w:rPr>
+        <w:t xml:space="preserve">Description</w:t>
+      </w:r>
+      <w:r>
+        <w:t xml:space="preserve"> </w:t>
+      </w:r>
+      <w:r>
+        <w:t xml:space="preserve">(free-text summary, e.g.,</w:t>
+      </w:r>
+      <w:r>
+        <w:t xml:space="preserve"> </w:t>
+      </w:r>
+      <w:r>
+        <w:t xml:space="preserve">“Primary die cast operation with die, cavity, weight, and count collection.”</w:t>
+      </w:r>
+      <w:r>
+        <w:t xml:space="preserve">). Below, the</w:t>
+      </w:r>
+      <w:r>
+        <w:t xml:space="preserve"> </w:t>
+      </w:r>
+      <w:r>
+        <w:rPr>
+          <w:b/>
+          <w:bCs/>
+        </w:rPr>
+        <w:t xml:space="preserve">Data Collection Fields</w:t>
+      </w:r>
+      <w:r>
+        <w:t xml:space="preserve"> </w:t>
+      </w:r>
+      <w:r>
+        <w:t xml:space="preserve">table lists every field the operation captures — columns are</w:t>
+      </w:r>
+      <w:r>
+        <w:t xml:space="preserve"> </w:t>
+      </w:r>
+      <w:r>
+        <w:rPr>
+          <w:b/>
+          <w:bCs/>
+        </w:rPr>
+        <w:t xml:space="preserve">Field</w:t>
       </w:r>
       <w:r>
         <w:t xml:space="preserve"> </w:t>
@@ -846,12 +2608,116 @@
       </w:r>
       <w:r>
         <w:rPr>
-          <w:rStyle w:val="VerbatimChar"/>
-        </w:rPr>
-        <w:t xml:space="preserve">CoolantType</w:t>
-      </w:r>
-      <w:r>
-        <w:t xml:space="preserve">. These attribute definitions were themselves configured earlier — someone decided what metadata each type of location carries. The engineer fills in the values. They also create the logical locations: Receiving Dock, Shipping Dock, WIP Storage, Sort Cage. These are Inventory Location types — they don’t have cycle times, but they’re real places where LOTs live.</w:t>
+          <w:b/>
+          <w:bCs/>
+        </w:rPr>
+        <w:t xml:space="preserve">Required</w:t>
+      </w:r>
+      <w:r>
+        <w:t xml:space="preserve">. For Die Cast Operation v2, five fields are configured: CollectsDieInfo ✓, CollectsCavityInfo ✓, CollectsWeight ✓, CollectsGoodCount ✓, CollectsBadCount □ (not required in this version). Each field row has up/down arrows for reordering and a</w:t>
+      </w:r>
+      <w:r>
+        <w:t xml:space="preserve"> </w:t>
+      </w:r>
+      <w:r>
+        <w:rPr>
+          <w:b/>
+          <w:bCs/>
+        </w:rPr>
+        <w:t xml:space="preserve">Remove</w:t>
+      </w:r>
+      <w:r>
+        <w:t xml:space="preserve"> </w:t>
+      </w:r>
+      <w:r>
+        <w:t xml:space="preserve">button; the</w:t>
+      </w:r>
+      <w:r>
+        <w:t xml:space="preserve"> </w:t>
+      </w:r>
+      <w:r>
+        <w:rPr>
+          <w:b/>
+          <w:bCs/>
+        </w:rPr>
+        <w:t xml:space="preserve">+ Add Field</w:t>
+      </w:r>
+      <w:r>
+        <w:t xml:space="preserve"> </w:t>
+      </w:r>
+      <w:r>
+        <w:t xml:space="preserve">button in the top right of the table adds a new field to the template. A</w:t>
+      </w:r>
+      <w:r>
+        <w:t xml:space="preserve"> </w:t>
+      </w:r>
+      <w:r>
+        <w:rPr>
+          <w:b/>
+          <w:bCs/>
+        </w:rPr>
+        <w:t xml:space="preserve">New Version</w:t>
+      </w:r>
+      <w:r>
+        <w:t xml:space="preserve"> </w:t>
+      </w:r>
+      <w:r>
+        <w:t xml:space="preserve">button clones the published template into a draft for editing — published templates are read-only.</w:t>
+      </w:r>
+    </w:p>
+    <w:p>
+      <w:pPr>
+        <w:pStyle w:val="CaptionedFigure"/>
+      </w:pPr>
+      <w:r>
+        <w:drawing>
+          <wp:inline>
+            <wp:extent cx="5334000" cy="2647492"/>
+            <wp:effectExtent b="0" l="0" r="0" t="0"/>
+            <wp:docPr descr="Operation Templates Screen — Die Cast Operation v2 with Data Collection Fields" title="" id="38" name="Picture"/>
+            <a:graphic>
+              <a:graphicData uri="http://schemas.openxmlformats.org/drawingml/2006/picture">
+                <pic:pic>
+                  <pic:nvPicPr>
+                    <pic:cNvPr descr="docs/screenshots/screen-operation-templates.png" id="39" name="Picture"/>
+                    <pic:cNvPicPr>
+                      <a:picLocks noChangeArrowheads="1" noChangeAspect="1"/>
+                    </pic:cNvPicPr>
+                  </pic:nvPicPr>
+                  <pic:blipFill>
+                    <a:blip r:embed="rId37"/>
+                    <a:stretch>
+                      <a:fillRect/>
+                    </a:stretch>
+                  </pic:blipFill>
+                  <pic:spPr bwMode="auto">
+                    <a:xfrm>
+                      <a:off x="0" y="0"/>
+                      <a:ext cx="5334000" cy="2647492"/>
+                    </a:xfrm>
+                    <a:prstGeom prst="rect">
+                      <a:avLst/>
+                    </a:prstGeom>
+                    <a:noFill/>
+                    <a:ln w="9525">
+                      <a:noFill/>
+                      <a:headEnd/>
+                      <a:tailEnd/>
+                    </a:ln>
+                  </pic:spPr>
+                </pic:pic>
+              </a:graphicData>
+            </a:graphic>
+          </wp:inline>
+        </w:drawing>
+      </w:r>
+    </w:p>
+    <w:p>
+      <w:pPr>
+        <w:pStyle w:val="ImageCaption"/>
+      </w:pPr>
+      <w:r>
+        <w:t xml:space="preserve">Operation Templates Screen — Die Cast Operation v2 with Data Collection Fields</w:t>
       </w:r>
     </w:p>
     <w:p>
@@ -859,32 +2725,105 @@
         <w:pStyle w:val="BodyText"/>
       </w:pPr>
       <w:r>
-        <w:t xml:space="preserve">Then they set up terminals. Each Ignition client station on the floor gets a</w:t>
-      </w:r>
-      <w:r>
-        <w:t xml:space="preserve"> </w:t>
-      </w:r>
-      <w:r>
-        <w:rPr>
-          <w:rStyle w:val="VerbatimChar"/>
-        </w:rPr>
-        <w:t xml:space="preserve">Terminal</w:t>
-      </w:r>
-      <w:r>
-        <w:t xml:space="preserve"> </w:t>
-      </w:r>
-      <w:r>
-        <w:t xml:space="preserve">record — its IP address, which location it’s at, which Zebra printer it talks to, whether it has a barcode scanner. This is how the system knows that when operator Maria scans a LOT at terminal DC-05, that action happened at Die Cast Machine #5, and any label it prints goes to the Zebra on the table next to her.</w:t>
-      </w:r>
-    </w:p>
-    <w:bookmarkEnd w:id="11"/>
-    <w:bookmarkStart w:id="12" w:name="defining-what-we-make"/>
+        <w:t xml:space="preserve">Routes, BOMs, quality specs, and machine eligibility are all managed directly from the Item Master’s tab strip — the engineer never needs to leave the item record to configure the full production picture for a part.</w:t>
+      </w:r>
+    </w:p>
+    <w:p>
+      <w:pPr>
+        <w:pStyle w:val="BodyText"/>
+      </w:pPr>
+      <w:r>
+        <w:t xml:space="preserve">Routes define the ordered sequence of operations an item passes through. The 5G0’s published v2 route has five steps — Die Cast → Trim → CNC Machining → Assembly Front → Pack &amp; Ship — each mapped to an area and a data collection profile. The data collection profile is driven by the operation template at that step: Die Cast collects die info, cavity, weight, good count, and bad count; Assembly Front collects serial number, material verification, good count, and bad count. These profiles drive the shop floor UI — the screen at an assembly station looks different from the one at a die cast press because the step’s data collection tells it what fields to show.</w:t>
+      </w:r>
+    </w:p>
+    <w:p>
+      <w:pPr>
+        <w:pStyle w:val="BodyText"/>
+      </w:pPr>
+      <w:r>
+        <w:t xml:space="preserve">Machine eligibility is managed on the</w:t>
+      </w:r>
+      <w:r>
+        <w:t xml:space="preserve"> </w:t>
+      </w:r>
+      <w:r>
+        <w:rPr>
+          <w:b/>
+          <w:bCs/>
+        </w:rPr>
+        <w:t xml:space="preserve">Eligibility</w:t>
+      </w:r>
+      <w:r>
+        <w:t xml:space="preserve"> </w:t>
+      </w:r>
+      <w:r>
+        <w:t xml:space="preserve">tab. The engineer selects an area from the dropdown and sees every machine in that area with its code, tonnage, and an</w:t>
+      </w:r>
+      <w:r>
+        <w:t xml:space="preserve"> </w:t>
+      </w:r>
+      <w:r>
+        <w:rPr>
+          <w:b/>
+          <w:bCs/>
+        </w:rPr>
+        <w:t xml:space="preserve">Eligible</w:t>
+      </w:r>
+      <w:r>
+        <w:t xml:space="preserve"> </w:t>
+      </w:r>
+      <w:r>
+        <w:t xml:space="preserve">checkbox. The 5G0 needs a 400-ton press — machines #3, #7, and #12 are checked; machine #15 (250 tons) is not. This is what lets the MES validate that when an operator starts producing 5G0 parts on machine #7, that’s a legal combination.</w:t>
+      </w:r>
+    </w:p>
+    <w:p>
+      <w:pPr>
+        <w:pStyle w:val="BodyText"/>
+      </w:pPr>
+      <w:r>
+        <w:t xml:space="preserve">BOMs are versioned and authored on the</w:t>
+      </w:r>
+      <w:r>
+        <w:t xml:space="preserve"> </w:t>
+      </w:r>
+      <w:r>
+        <w:rPr>
+          <w:b/>
+          <w:bCs/>
+        </w:rPr>
+        <w:t xml:space="preserve">BOMs</w:t>
+      </w:r>
+      <w:r>
+        <w:t xml:space="preserve"> </w:t>
+      </w:r>
+      <w:r>
+        <w:t xml:space="preserve">tab. The 5G0’s v1 BOM requires one Front Cover Casting (5G0-C) and two Mounting Pins (PNA). Version 1 is effective from January 2026. If engineering changes the design in March, they click</w:t>
+      </w:r>
+      <w:r>
+        <w:t xml:space="preserve"> </w:t>
+      </w:r>
+      <w:r>
+        <w:rPr>
+          <w:b/>
+          <w:bCs/>
+        </w:rPr>
+        <w:t xml:space="preserve">New Version</w:t>
+      </w:r>
+      <w:r>
+        <w:t xml:space="preserve"> </w:t>
+      </w:r>
+      <w:r>
+        <w:t xml:space="preserve">to clone the BOM into a new draft — but every production record from January still references v1, preserving historical accuracy.</w:t>
+      </w:r>
+    </w:p>
+    <w:bookmarkEnd w:id="40"/>
+    <w:bookmarkStart w:id="47" w:name="defining-quality-standards"/>
     <w:p>
       <w:pPr>
         <w:pStyle w:val="Heading3"/>
       </w:pPr>
       <w:r>
-        <w:t xml:space="preserve">Defining What We Make</w:t>
+        <w:t xml:space="preserve">Defining Quality Standards</w:t>
       </w:r>
     </w:p>
     <w:p>
@@ -892,7 +2831,233 @@
         <w:pStyle w:val="FirstParagraph"/>
       </w:pPr>
       <w:r>
-        <w:t xml:space="preserve">Next, the item master. The engineer creates items — each one a part number that MPP either manufactures or receives from a vendor. They classify each item: Raw Material, Component, Sub-Assembly, Finished Good, Pass-Through. They set the Macola ERP cross-reference number for each part so the two systems can talk when that integration goes live. They set the default sub-lot quantity — how many pieces go into each sub-LOT when a parent LOT is split after machining. They set the max lot size for reasonability checks.</w:t>
+        <w:t xml:space="preserve">Quality specs are managed in the</w:t>
+      </w:r>
+      <w:r>
+        <w:t xml:space="preserve"> </w:t>
+      </w:r>
+      <w:r>
+        <w:rPr>
+          <w:b/>
+          <w:bCs/>
+        </w:rPr>
+        <w:t xml:space="preserve">Quality › Quality Specs</w:t>
+      </w:r>
+      <w:r>
+        <w:t xml:space="preserve"> </w:t>
+      </w:r>
+      <w:r>
+        <w:t xml:space="preserve">screen. The left panel has an item filter dropdown (e.g., 5G0 Front Cover) and lists all specs for that item — each showing its name, lifecycle status badge (Published, Draft), and version number. A separate spec can be in Draft for the same item while the prior version remains Published; the floor uses the Published version until the new one is explicitly published. Clicking a spec loads its full definition on the right:</w:t>
+      </w:r>
+      <w:r>
+        <w:t xml:space="preserve"> </w:t>
+      </w:r>
+      <w:r>
+        <w:rPr>
+          <w:b/>
+          <w:bCs/>
+        </w:rPr>
+        <w:t xml:space="preserve">Linked Item</w:t>
+      </w:r>
+      <w:r>
+        <w:t xml:space="preserve">,</w:t>
+      </w:r>
+      <w:r>
+        <w:t xml:space="preserve"> </w:t>
+      </w:r>
+      <w:r>
+        <w:rPr>
+          <w:b/>
+          <w:bCs/>
+        </w:rPr>
+        <w:t xml:space="preserve">Linked Operation</w:t>
+      </w:r>
+      <w:r>
+        <w:t xml:space="preserve"> </w:t>
+      </w:r>
+      <w:r>
+        <w:t xml:space="preserve">(e.g., CNC Machining), the effective date, and the version/status. The</w:t>
+      </w:r>
+      <w:r>
+        <w:t xml:space="preserve"> </w:t>
+      </w:r>
+      <w:r>
+        <w:rPr>
+          <w:b/>
+          <w:bCs/>
+        </w:rPr>
+        <w:t xml:space="preserve">Attributes</w:t>
+      </w:r>
+      <w:r>
+        <w:t xml:space="preserve"> </w:t>
+      </w:r>
+      <w:r>
+        <w:t xml:space="preserve">tab shows a table of every measurement in the spec with columns for</w:t>
+      </w:r>
+      <w:r>
+        <w:t xml:space="preserve"> </w:t>
+      </w:r>
+      <w:r>
+        <w:rPr>
+          <w:b/>
+          <w:bCs/>
+        </w:rPr>
+        <w:t xml:space="preserve">Attribute Name</w:t>
+      </w:r>
+      <w:r>
+        <w:t xml:space="preserve">,</w:t>
+      </w:r>
+      <w:r>
+        <w:t xml:space="preserve"> </w:t>
+      </w:r>
+      <w:r>
+        <w:rPr>
+          <w:b/>
+          <w:bCs/>
+        </w:rPr>
+        <w:t xml:space="preserve">Type</w:t>
+      </w:r>
+      <w:r>
+        <w:t xml:space="preserve">,</w:t>
+      </w:r>
+      <w:r>
+        <w:t xml:space="preserve"> </w:t>
+      </w:r>
+      <w:r>
+        <w:rPr>
+          <w:b/>
+          <w:bCs/>
+        </w:rPr>
+        <w:t xml:space="preserve">Target</w:t>
+      </w:r>
+      <w:r>
+        <w:t xml:space="preserve">,</w:t>
+      </w:r>
+      <w:r>
+        <w:t xml:space="preserve"> </w:t>
+      </w:r>
+      <w:r>
+        <w:rPr>
+          <w:b/>
+          <w:bCs/>
+        </w:rPr>
+        <w:t xml:space="preserve">Lower Limit</w:t>
+      </w:r>
+      <w:r>
+        <w:t xml:space="preserve">,</w:t>
+      </w:r>
+      <w:r>
+        <w:t xml:space="preserve"> </w:t>
+      </w:r>
+      <w:r>
+        <w:rPr>
+          <w:b/>
+          <w:bCs/>
+        </w:rPr>
+        <w:t xml:space="preserve">Upper Limit</w:t>
+      </w:r>
+      <w:r>
+        <w:t xml:space="preserve">,</w:t>
+      </w:r>
+      <w:r>
+        <w:t xml:space="preserve"> </w:t>
+      </w:r>
+      <w:r>
+        <w:rPr>
+          <w:b/>
+          <w:bCs/>
+        </w:rPr>
+        <w:t xml:space="preserve">UOM</w:t>
+      </w:r>
+      <w:r>
+        <w:t xml:space="preserve">, and</w:t>
+      </w:r>
+      <w:r>
+        <w:t xml:space="preserve"> </w:t>
+      </w:r>
+      <w:r>
+        <w:rPr>
+          <w:b/>
+          <w:bCs/>
+        </w:rPr>
+        <w:t xml:space="preserve">Trigger</w:t>
+      </w:r>
+      <w:r>
+        <w:t xml:space="preserve"> </w:t>
+      </w:r>
+      <w:r>
+        <w:t xml:space="preserve">(how often to sample). For the 5G0 Dimensional Spec v2: Surface Flatness (DECIMAL, target 0.002, lower 0.001, upper 0.003, in, FirstPiece), Bore Diameter (DECIMAL, target 25.40, lower 25.38, upper 25.42, mm, FirstPiece), and Porosity Visual (PASS/FAIL, target Pass, no numeric limits, Hourly). Each row defines exactly what the inspector enters on the floor and whether it’s a dimensional check or a pass/fail judgment. A</w:t>
+      </w:r>
+      <w:r>
+        <w:t xml:space="preserve"> </w:t>
+      </w:r>
+      <w:r>
+        <w:rPr>
+          <w:b/>
+          <w:bCs/>
+        </w:rPr>
+        <w:t xml:space="preserve">New Version</w:t>
+      </w:r>
+      <w:r>
+        <w:t xml:space="preserve"> </w:t>
+      </w:r>
+      <w:r>
+        <w:t xml:space="preserve">button clones the current spec into a draft for revision; published specs are read-only.</w:t>
+      </w:r>
+    </w:p>
+    <w:p>
+      <w:pPr>
+        <w:pStyle w:val="CaptionedFigure"/>
+      </w:pPr>
+      <w:r>
+        <w:drawing>
+          <wp:inline>
+            <wp:extent cx="5334000" cy="2650278"/>
+            <wp:effectExtent b="0" l="0" r="0" t="0"/>
+            <wp:docPr descr="Quality Specs Screen — 5G0 Dimensional Spec v2, Attributes tab with measurement details" title="" id="42" name="Picture"/>
+            <a:graphic>
+              <a:graphicData uri="http://schemas.openxmlformats.org/drawingml/2006/picture">
+                <pic:pic>
+                  <pic:nvPicPr>
+                    <pic:cNvPr descr="docs/screenshots/screen-quality-specs.png" id="43" name="Picture"/>
+                    <pic:cNvPicPr>
+                      <a:picLocks noChangeArrowheads="1" noChangeAspect="1"/>
+                    </pic:cNvPicPr>
+                  </pic:nvPicPr>
+                  <pic:blipFill>
+                    <a:blip r:embed="rId41"/>
+                    <a:stretch>
+                      <a:fillRect/>
+                    </a:stretch>
+                  </pic:blipFill>
+                  <pic:spPr bwMode="auto">
+                    <a:xfrm>
+                      <a:off x="0" y="0"/>
+                      <a:ext cx="5334000" cy="2650278"/>
+                    </a:xfrm>
+                    <a:prstGeom prst="rect">
+                      <a:avLst/>
+                    </a:prstGeom>
+                    <a:noFill/>
+                    <a:ln w="9525">
+                      <a:noFill/>
+                      <a:headEnd/>
+                      <a:tailEnd/>
+                    </a:ln>
+                  </pic:spPr>
+                </pic:pic>
+              </a:graphicData>
+            </a:graphic>
+          </wp:inline>
+        </w:drawing>
+      </w:r>
+    </w:p>
+    <w:p>
+      <w:pPr>
+        <w:pStyle w:val="ImageCaption"/>
+      </w:pPr>
+      <w:r>
+        <w:t xml:space="preserve">Quality Specs Screen — 5G0 Dimensional Spec v2, Attributes tab with measurement details</w:t>
       </w:r>
     </w:p>
     <w:p>
@@ -900,17 +3065,223 @@
         <w:pStyle w:val="BodyText"/>
       </w:pPr>
       <w:r>
-        <w:t xml:space="preserve">For each finished good that ships to Honda, they create a container configuration. The 5G0 Front Cover, for example, ships in containers with 4 trays, 12 parts per tray, serialized, with dunnage code RD-5G0F. The RPY Cam Holder ships 6 trays, 24 per tray, not serialized. These configs drive the container lifecycle on the floor — the MES knows when a container is full.</w:t>
-      </w:r>
-    </w:p>
-    <w:bookmarkEnd w:id="12"/>
-    <w:bookmarkStart w:id="13" w:name="defining-how-we-make-it"/>
+        <w:t xml:space="preserve">Defect codes are managed in the</w:t>
+      </w:r>
+      <w:r>
+        <w:t xml:space="preserve"> </w:t>
+      </w:r>
+      <w:r>
+        <w:rPr>
+          <w:b/>
+          <w:bCs/>
+        </w:rPr>
+        <w:t xml:space="preserve">Quality › Defect Codes</w:t>
+      </w:r>
+      <w:r>
+        <w:t xml:space="preserve"> </w:t>
+      </w:r>
+      <w:r>
+        <w:t xml:space="preserve">screen. The left panel has an</w:t>
+      </w:r>
+      <w:r>
+        <w:t xml:space="preserve"> </w:t>
+      </w:r>
+      <w:r>
+        <w:rPr>
+          <w:b/>
+          <w:bCs/>
+        </w:rPr>
+        <w:t xml:space="preserve">Area</w:t>
+      </w:r>
+      <w:r>
+        <w:t xml:space="preserve"> </w:t>
+      </w:r>
+      <w:r>
+        <w:t xml:space="preserve">filter dropdown (All Areas, Die Cast, Machine Shop, Trim Shop, HSP), a</w:t>
+      </w:r>
+      <w:r>
+        <w:t xml:space="preserve"> </w:t>
+      </w:r>
+      <w:r>
+        <w:rPr>
+          <w:b/>
+          <w:bCs/>
+        </w:rPr>
+        <w:t xml:space="preserve">Search</w:t>
+      </w:r>
+      <w:r>
+        <w:t xml:space="preserve"> </w:t>
+      </w:r>
+      <w:r>
+        <w:t xml:space="preserve">field, and an</w:t>
+      </w:r>
+      <w:r>
+        <w:t xml:space="preserve"> </w:t>
+      </w:r>
+      <w:r>
+        <w:rPr>
+          <w:b/>
+          <w:bCs/>
+        </w:rPr>
+        <w:t xml:space="preserve">Include Deprecated</w:t>
+      </w:r>
+      <w:r>
+        <w:t xml:space="preserve"> </w:t>
+      </w:r>
+      <w:r>
+        <w:t xml:space="preserve">checkbox. The right panel is a table:</w:t>
+      </w:r>
+      <w:r>
+        <w:t xml:space="preserve"> </w:t>
+      </w:r>
+      <w:r>
+        <w:rPr>
+          <w:b/>
+          <w:bCs/>
+        </w:rPr>
+        <w:t xml:space="preserve">Code</w:t>
+      </w:r>
+      <w:r>
+        <w:t xml:space="preserve">,</w:t>
+      </w:r>
+      <w:r>
+        <w:t xml:space="preserve"> </w:t>
+      </w:r>
+      <w:r>
+        <w:rPr>
+          <w:b/>
+          <w:bCs/>
+        </w:rPr>
+        <w:t xml:space="preserve">Description</w:t>
+      </w:r>
+      <w:r>
+        <w:t xml:space="preserve">,</w:t>
+      </w:r>
+      <w:r>
+        <w:t xml:space="preserve"> </w:t>
+      </w:r>
+      <w:r>
+        <w:rPr>
+          <w:b/>
+          <w:bCs/>
+        </w:rPr>
+        <w:t xml:space="preserve">Area</w:t>
+      </w:r>
+      <w:r>
+        <w:t xml:space="preserve">,</w:t>
+      </w:r>
+      <w:r>
+        <w:t xml:space="preserve"> </w:t>
+      </w:r>
+      <w:r>
+        <w:rPr>
+          <w:b/>
+          <w:bCs/>
+        </w:rPr>
+        <w:t xml:space="preserve">Excused</w:t>
+      </w:r>
+      <w:r>
+        <w:t xml:space="preserve"> </w:t>
+      </w:r>
+      <w:r>
+        <w:t xml:space="preserve">checkbox, and</w:t>
+      </w:r>
+      <w:r>
+        <w:t xml:space="preserve"> </w:t>
+      </w:r>
+      <w:r>
+        <w:rPr>
+          <w:b/>
+          <w:bCs/>
+        </w:rPr>
+        <w:t xml:space="preserve">Edit</w:t>
+      </w:r>
+      <w:r>
+        <w:t xml:space="preserve"> </w:t>
+      </w:r>
+      <w:r>
+        <w:t xml:space="preserve">button. Die Cast codes include DC-0135 Porosity, DC-0136 Cold Shut, DC-0137 Flash (excused ✓), DC-0138 Misrun. Machine Shop: MS-0001 Dimensional(OOT), MS-0143 Surface Finish, MS-0154 Tool Marks. Trim Shop: TS-0101 Burr—Trim. HSP vendor-part codes: HSP-0247 Vendor Defect—Dimensional. Clicking</w:t>
+      </w:r>
+      <w:r>
+        <w:t xml:space="preserve"> </w:t>
+      </w:r>
+      <w:r>
+        <w:rPr>
+          <w:b/>
+          <w:bCs/>
+        </w:rPr>
+        <w:t xml:space="preserve">Edit</w:t>
+      </w:r>
+      <w:r>
+        <w:t xml:space="preserve"> </w:t>
+      </w:r>
+      <w:r>
+        <w:t xml:space="preserve">on any row opens an inline editor for the description, area, and excused flag. The excused flag marks defects that are expected process variation — they’re tracked in full but don’t penalize OEE quality scores.</w:t>
+      </w:r>
+    </w:p>
+    <w:p>
+      <w:pPr>
+        <w:pStyle w:val="CaptionedFigure"/>
+      </w:pPr>
+      <w:r>
+        <w:drawing>
+          <wp:inline>
+            <wp:extent cx="5334000" cy="2650278"/>
+            <wp:effectExtent b="0" l="0" r="0" t="0"/>
+            <wp:docPr descr="Defect Codes Screen — All-area view showing codes across Die Cast, Machine Shop, Trim Shop, and HSP" title="" id="45" name="Picture"/>
+            <a:graphic>
+              <a:graphicData uri="http://schemas.openxmlformats.org/drawingml/2006/picture">
+                <pic:pic>
+                  <pic:nvPicPr>
+                    <pic:cNvPr descr="docs/screenshots/screen-defect-codes.png" id="46" name="Picture"/>
+                    <pic:cNvPicPr>
+                      <a:picLocks noChangeArrowheads="1" noChangeAspect="1"/>
+                    </pic:cNvPicPr>
+                  </pic:nvPicPr>
+                  <pic:blipFill>
+                    <a:blip r:embed="rId44"/>
+                    <a:stretch>
+                      <a:fillRect/>
+                    </a:stretch>
+                  </pic:blipFill>
+                  <pic:spPr bwMode="auto">
+                    <a:xfrm>
+                      <a:off x="0" y="0"/>
+                      <a:ext cx="5334000" cy="2650278"/>
+                    </a:xfrm>
+                    <a:prstGeom prst="rect">
+                      <a:avLst/>
+                    </a:prstGeom>
+                    <a:noFill/>
+                    <a:ln w="9525">
+                      <a:noFill/>
+                      <a:headEnd/>
+                      <a:tailEnd/>
+                    </a:ln>
+                  </pic:spPr>
+                </pic:pic>
+              </a:graphicData>
+            </a:graphic>
+          </wp:inline>
+        </w:drawing>
+      </w:r>
+    </w:p>
+    <w:p>
+      <w:pPr>
+        <w:pStyle w:val="ImageCaption"/>
+      </w:pPr>
+      <w:r>
+        <w:t xml:space="preserve">Defect Codes Screen — All-area view showing codes across Die Cast, Machine Shop, Trim Shop, and HSP</w:t>
+      </w:r>
+    </w:p>
+    <w:bookmarkEnd w:id="47"/>
+    <w:bookmarkStart w:id="54" w:name="defining-downtime-vocabulary"/>
     <w:p>
       <w:pPr>
         <w:pStyle w:val="Heading3"/>
       </w:pPr>
       <w:r>
-        <w:t xml:space="preserve">Defining How We Make It</w:t>
+        <w:t xml:space="preserve">Defining Downtime Vocabulary</w:t>
       </w:r>
     </w:p>
     <w:p>
@@ -918,7 +3289,242 @@
         <w:pStyle w:val="FirstParagraph"/>
       </w:pPr>
       <w:r>
-        <w:t xml:space="preserve">Now routes. The engineer creates a route template for each item — the ordered sequence of operations it passes through. The 5G0 Front Cover route might be: Die Cast → Trim → Machine (CNC) → Assembly Front → Pack &amp; Ship. Each step in the route points to an operation template — a reusable definition of what data to collect at that type of operation. The Die Cast operation template says: collect die info, collect cavity info, collect weight, collect good count, collect bad count. The Assembly operation template says: requires serial number, requires material verification, collects good count. These flags drive the UI — the shop floor screen at an assembly station looks different from the one at a die cast press because the operation template tells it what fields to show.</w:t>
+        <w:t xml:space="preserve">Downtime reason codes are managed in the</w:t>
+      </w:r>
+      <w:r>
+        <w:t xml:space="preserve"> </w:t>
+      </w:r>
+      <w:r>
+        <w:rPr>
+          <w:b/>
+          <w:bCs/>
+        </w:rPr>
+        <w:t xml:space="preserve">Operations › Downtime Codes</w:t>
+      </w:r>
+      <w:r>
+        <w:t xml:space="preserve"> </w:t>
+      </w:r>
+      <w:r>
+        <w:t xml:space="preserve">screen. The left panel has an</w:t>
+      </w:r>
+      <w:r>
+        <w:t xml:space="preserve"> </w:t>
+      </w:r>
+      <w:r>
+        <w:rPr>
+          <w:b/>
+          <w:bCs/>
+        </w:rPr>
+        <w:t xml:space="preserve">Area</w:t>
+      </w:r>
+      <w:r>
+        <w:t xml:space="preserve"> </w:t>
+      </w:r>
+      <w:r>
+        <w:t xml:space="preserve">filter, a</w:t>
+      </w:r>
+      <w:r>
+        <w:t xml:space="preserve"> </w:t>
+      </w:r>
+      <w:r>
+        <w:rPr>
+          <w:b/>
+          <w:bCs/>
+        </w:rPr>
+        <w:t xml:space="preserve">Reason Type</w:t>
+      </w:r>
+      <w:r>
+        <w:t xml:space="preserve"> </w:t>
+      </w:r>
+      <w:r>
+        <w:t xml:space="preserve">filter (All Types, Equipment, Setup, Quality, Mold), a</w:t>
+      </w:r>
+      <w:r>
+        <w:t xml:space="preserve"> </w:t>
+      </w:r>
+      <w:r>
+        <w:rPr>
+          <w:b/>
+          <w:bCs/>
+        </w:rPr>
+        <w:t xml:space="preserve">Search</w:t>
+      </w:r>
+      <w:r>
+        <w:t xml:space="preserve"> </w:t>
+      </w:r>
+      <w:r>
+        <w:t xml:space="preserve">field, and an</w:t>
+      </w:r>
+      <w:r>
+        <w:t xml:space="preserve"> </w:t>
+      </w:r>
+      <w:r>
+        <w:rPr>
+          <w:b/>
+          <w:bCs/>
+        </w:rPr>
+        <w:t xml:space="preserve">Include Deprecated</w:t>
+      </w:r>
+      <w:r>
+        <w:t xml:space="preserve"> </w:t>
+      </w:r>
+      <w:r>
+        <w:t xml:space="preserve">checkbox. The right panel is a table:</w:t>
+      </w:r>
+      <w:r>
+        <w:t xml:space="preserve"> </w:t>
+      </w:r>
+      <w:r>
+        <w:rPr>
+          <w:b/>
+          <w:bCs/>
+        </w:rPr>
+        <w:t xml:space="preserve">Code</w:t>
+      </w:r>
+      <w:r>
+        <w:t xml:space="preserve">,</w:t>
+      </w:r>
+      <w:r>
+        <w:t xml:space="preserve"> </w:t>
+      </w:r>
+      <w:r>
+        <w:rPr>
+          <w:b/>
+          <w:bCs/>
+        </w:rPr>
+        <w:t xml:space="preserve">Description</w:t>
+      </w:r>
+      <w:r>
+        <w:t xml:space="preserve">,</w:t>
+      </w:r>
+      <w:r>
+        <w:t xml:space="preserve"> </w:t>
+      </w:r>
+      <w:r>
+        <w:rPr>
+          <w:b/>
+          <w:bCs/>
+        </w:rPr>
+        <w:t xml:space="preserve">Area</w:t>
+      </w:r>
+      <w:r>
+        <w:t xml:space="preserve">,</w:t>
+      </w:r>
+      <w:r>
+        <w:t xml:space="preserve"> </w:t>
+      </w:r>
+      <w:r>
+        <w:rPr>
+          <w:b/>
+          <w:bCs/>
+        </w:rPr>
+        <w:t xml:space="preserve">Type</w:t>
+      </w:r>
+      <w:r>
+        <w:t xml:space="preserve">,</w:t>
+      </w:r>
+      <w:r>
+        <w:t xml:space="preserve"> </w:t>
+      </w:r>
+      <w:r>
+        <w:rPr>
+          <w:b/>
+          <w:bCs/>
+        </w:rPr>
+        <w:t xml:space="preserve">Excused</w:t>
+      </w:r>
+      <w:r>
+        <w:t xml:space="preserve"> </w:t>
+      </w:r>
+      <w:r>
+        <w:t xml:space="preserve">checkbox, and</w:t>
+      </w:r>
+      <w:r>
+        <w:t xml:space="preserve"> </w:t>
+      </w:r>
+      <w:r>
+        <w:rPr>
+          <w:b/>
+          <w:bCs/>
+        </w:rPr>
+        <w:t xml:space="preserve">Edit</w:t>
+      </w:r>
+      <w:r>
+        <w:t xml:space="preserve"> </w:t>
+      </w:r>
+      <w:r>
+        <w:t xml:space="preserve">button. Die Cast codes include DC-0001 Die Stuck (Equipment), DC-0002 Hydraulic Leak (Equipment), DC-0015 Mold Change (Setup, excused ✓ — scheduled mold changes don’t penalize availability), DC-0030 Quality Hold—Line Stop (Quality). Machine Shop: MS-0001 Tool Change (Setup, excused ✓), MS-0010 Spindle Error (Equipment). Trim Shop: TS-0001 Trim Die Repair (Mold). The excused flag determines whether a downtime event is included in the OEE availability denominator — planned maintenance, required setup, and mold changes are typically excused so they don’t artificially depress the score. Clicking</w:t>
+      </w:r>
+      <w:r>
+        <w:t xml:space="preserve"> </w:t>
+      </w:r>
+      <w:r>
+        <w:rPr>
+          <w:b/>
+          <w:bCs/>
+        </w:rPr>
+        <w:t xml:space="preserve">Edit</w:t>
+      </w:r>
+      <w:r>
+        <w:t xml:space="preserve"> </w:t>
+      </w:r>
+      <w:r>
+        <w:t xml:space="preserve">opens an inline editor for the code’s description, area, type, and excused flag.</w:t>
+      </w:r>
+    </w:p>
+    <w:p>
+      <w:pPr>
+        <w:pStyle w:val="CaptionedFigure"/>
+      </w:pPr>
+      <w:r>
+        <w:drawing>
+          <wp:inline>
+            <wp:extent cx="5334000" cy="2650278"/>
+            <wp:effectExtent b="0" l="0" r="0" t="0"/>
+            <wp:docPr descr="Downtime Codes Screen — Multi-department view with Reason Type filter" title="" id="49" name="Picture"/>
+            <a:graphic>
+              <a:graphicData uri="http://schemas.openxmlformats.org/drawingml/2006/picture">
+                <pic:pic>
+                  <pic:nvPicPr>
+                    <pic:cNvPr descr="docs/screenshots/screen-downtime-codes.png" id="50" name="Picture"/>
+                    <pic:cNvPicPr>
+                      <a:picLocks noChangeArrowheads="1" noChangeAspect="1"/>
+                    </pic:cNvPicPr>
+                  </pic:nvPicPr>
+                  <pic:blipFill>
+                    <a:blip r:embed="rId48"/>
+                    <a:stretch>
+                      <a:fillRect/>
+                    </a:stretch>
+                  </pic:blipFill>
+                  <pic:spPr bwMode="auto">
+                    <a:xfrm>
+                      <a:off x="0" y="0"/>
+                      <a:ext cx="5334000" cy="2650278"/>
+                    </a:xfrm>
+                    <a:prstGeom prst="rect">
+                      <a:avLst/>
+                    </a:prstGeom>
+                    <a:noFill/>
+                    <a:ln w="9525">
+                      <a:noFill/>
+                      <a:headEnd/>
+                      <a:tailEnd/>
+                    </a:ln>
+                  </pic:spPr>
+                </pic:pic>
+              </a:graphicData>
+            </a:graphic>
+          </wp:inline>
+        </w:drawing>
+      </w:r>
+    </w:p>
+    <w:p>
+      <w:pPr>
+        <w:pStyle w:val="ImageCaption"/>
+      </w:pPr>
+      <w:r>
+        <w:t xml:space="preserve">Downtime Codes Screen — Multi-department view with Reason Type filter</w:t>
       </w:r>
     </w:p>
     <w:p>
@@ -926,98 +3532,187 @@
         <w:pStyle w:val="BodyText"/>
       </w:pPr>
       <w:r>
-        <w:t xml:space="preserve">The engineer also creates the part-to-location eligibility map. Not every machine can run every part. The 5G0 can run on Die Cast machines 3, 7, and 12, but not on machine 15 (wrong tonnage). This map is what lets the MES validate that when an operator starts producing 5G0 parts on machine 7, that’s a legal combination.</w:t>
-      </w:r>
-    </w:p>
-    <w:p>
-      <w:pPr>
-        <w:pStyle w:val="BodyText"/>
-      </w:pPr>
-      <w:r>
-        <w:t xml:space="preserve">For assembled products with BOMs, the engineer creates versioned bills of material. The 5G0 Front Cover Assembly consumes one 5G0 casting and two PNA mounting pins. Version 1 of the BOM is effective from January 2026. If engineering changes the design in March, they create version 2 — but every production record from January still points to version 1.</w:t>
-      </w:r>
-    </w:p>
-    <w:bookmarkEnd w:id="13"/>
-    <w:bookmarkStart w:id="14" w:name="defining-quality-standards"/>
-    <w:p>
-      <w:pPr>
-        <w:pStyle w:val="Heading3"/>
-      </w:pPr>
-      <w:r>
-        <w:t xml:space="preserve">Defining Quality Standards</w:t>
-      </w:r>
-    </w:p>
-    <w:p>
-      <w:pPr>
-        <w:pStyle w:val="FirstParagraph"/>
-      </w:pPr>
-      <w:r>
-        <w:t xml:space="preserve">The engineer creates quality specs — also versioned. For the 5G0 Front Cover, the spec says: measure surface flatness (target 0.002”, lower limit 0.001”, upper limit 0.003”), check bore diameter (target 25.40mm ± 0.02mm), visual inspection for porosity (pass/fail). Each attribute has its data type, UOM, target, and limits. When an inspector on the floor takes a sample, the screen they see is generated from this spec — the system knows what to ask for because the engineer defined it here.</w:t>
-      </w:r>
-    </w:p>
-    <w:p>
-      <w:pPr>
-        <w:pStyle w:val="BodyText"/>
-      </w:pPr>
-      <w:r>
-        <w:t xml:space="preserve">They also load the defect codes — approximately 145 of them, organized by department. Die Cast gets codes for porosity (135), cold shut, flash, misrun. Machine Shop gets codes for out-of-tolerance (122</w:t>
-      </w:r>
-      <w:r>
-        <w:t xml:space="preserve"> </w:t>
-      </w:r>
-      <w:r>
-        <w:t xml:space="preserve">“Dimensional”</w:t>
-      </w:r>
-      <w:r>
-        <w:t xml:space="preserve">), tool marks (154), surface finish (143). There are also codes for Trim Shop, Production Control, Quality Control, and a High Speed Supplier Parts (HSP) department for vendor-part defects (codes 247–253). Each code carries an</w:t>
-      </w:r>
-      <w:r>
-        <w:t xml:space="preserve"> </w:t>
-      </w:r>
-      <w:r>
-        <w:rPr>
-          <w:rStyle w:val="VerbatimChar"/>
-        </w:rPr>
-        <w:t xml:space="preserve">IsExcused</w:t>
-      </w:r>
-      <w:r>
-        <w:t xml:space="preserve"> </w:t>
-      </w:r>
-      <w:r>
-        <w:t xml:space="preserve">flag for future OEE quality calculations.</w:t>
-      </w:r>
-    </w:p>
-    <w:bookmarkEnd w:id="14"/>
-    <w:bookmarkStart w:id="15" w:name="defining-downtime-vocabulary"/>
-    <w:p>
-      <w:pPr>
-        <w:pStyle w:val="Heading3"/>
-      </w:pPr>
-      <w:r>
-        <w:t xml:space="preserve">Defining Downtime Vocabulary</w:t>
-      </w:r>
-    </w:p>
-    <w:p>
-      <w:pPr>
-        <w:pStyle w:val="FirstParagraph"/>
-      </w:pPr>
-      <w:r>
-        <w:t xml:space="preserve">Finally, the ~660 downtime reason codes. Equipment failure on the 400-ton press. Mold change on die #7. Quality hold on line 3. Scheduled maintenance. Each code belongs to a department and a type (Equipment, Mold, Quality, Setup, Miscellaneous, Unscheduled), and carries an</w:t>
-      </w:r>
-      <w:r>
-        <w:t xml:space="preserve"> </w:t>
-      </w:r>
-      <w:r>
-        <w:rPr>
-          <w:rStyle w:val="VerbatimChar"/>
-        </w:rPr>
-        <w:t xml:space="preserve">IsExcused</w:t>
-      </w:r>
-      <w:r>
-        <w:t xml:space="preserve"> </w:t>
-      </w:r>
-      <w:r>
-        <w:t xml:space="preserve">flag. Shift schedules get defined here too — first shift 6am–2pm Monday through Friday, second shift 2pm–10pm, weekend overtime pattern.</w:t>
+        <w:t xml:space="preserve">Shift schedules are managed in the</w:t>
+      </w:r>
+      <w:r>
+        <w:t xml:space="preserve"> </w:t>
+      </w:r>
+      <w:r>
+        <w:rPr>
+          <w:b/>
+          <w:bCs/>
+        </w:rPr>
+        <w:t xml:space="preserve">Operations › Shift Schedules</w:t>
+      </w:r>
+      <w:r>
+        <w:t xml:space="preserve"> </w:t>
+      </w:r>
+      <w:r>
+        <w:t xml:space="preserve">screen. The table shows each schedule’s</w:t>
+      </w:r>
+      <w:r>
+        <w:t xml:space="preserve"> </w:t>
+      </w:r>
+      <w:r>
+        <w:rPr>
+          <w:b/>
+          <w:bCs/>
+        </w:rPr>
+        <w:t xml:space="preserve">Name</w:t>
+      </w:r>
+      <w:r>
+        <w:t xml:space="preserve">,</w:t>
+      </w:r>
+      <w:r>
+        <w:t xml:space="preserve"> </w:t>
+      </w:r>
+      <w:r>
+        <w:rPr>
+          <w:b/>
+          <w:bCs/>
+        </w:rPr>
+        <w:t xml:space="preserve">Start</w:t>
+      </w:r>
+      <w:r>
+        <w:t xml:space="preserve"> </w:t>
+      </w:r>
+      <w:r>
+        <w:t xml:space="preserve">time,</w:t>
+      </w:r>
+      <w:r>
+        <w:t xml:space="preserve"> </w:t>
+      </w:r>
+      <w:r>
+        <w:rPr>
+          <w:b/>
+          <w:bCs/>
+        </w:rPr>
+        <w:t xml:space="preserve">End</w:t>
+      </w:r>
+      <w:r>
+        <w:t xml:space="preserve"> </w:t>
+      </w:r>
+      <w:r>
+        <w:t xml:space="preserve">time,</w:t>
+      </w:r>
+      <w:r>
+        <w:t xml:space="preserve"> </w:t>
+      </w:r>
+      <w:r>
+        <w:rPr>
+          <w:b/>
+          <w:bCs/>
+        </w:rPr>
+        <w:t xml:space="preserve">Days</w:t>
+      </w:r>
+      <w:r>
+        <w:t xml:space="preserve"> </w:t>
+      </w:r>
+      <w:r>
+        <w:t xml:space="preserve">(shown as M T W T F S S pill buttons — active days filled blue, inactive hollow),</w:t>
+      </w:r>
+      <w:r>
+        <w:t xml:space="preserve"> </w:t>
+      </w:r>
+      <w:r>
+        <w:rPr>
+          <w:b/>
+          <w:bCs/>
+        </w:rPr>
+        <w:t xml:space="preserve">Effective</w:t>
+      </w:r>
+      <w:r>
+        <w:t xml:space="preserve"> </w:t>
+      </w:r>
+      <w:r>
+        <w:t xml:space="preserve">date, and an</w:t>
+      </w:r>
+      <w:r>
+        <w:t xml:space="preserve"> </w:t>
+      </w:r>
+      <w:r>
+        <w:rPr>
+          <w:b/>
+          <w:bCs/>
+        </w:rPr>
+        <w:t xml:space="preserve">Edit</w:t>
+      </w:r>
+      <w:r>
+        <w:t xml:space="preserve"> </w:t>
+      </w:r>
+      <w:r>
+        <w:t xml:space="preserve">button. Three schedules are configured: First Shift (06:00–14:00, Mon–Fri, effective 2026-01-01), Second Shift (14:00–22:00, Mon–Fri, effective 2026-01-01), and Weekend OT (06:00–16:00, Sat–Sun only, effective 2026-01-01). The day-pill display makes it immediately clear which shifts cover weekends — Weekend OT shows only the S–S pills filled, while the weekday shifts show M–F filled with S–S hollow. Clicking</w:t>
+      </w:r>
+      <w:r>
+        <w:t xml:space="preserve"> </w:t>
+      </w:r>
+      <w:r>
+        <w:rPr>
+          <w:b/>
+          <w:bCs/>
+        </w:rPr>
+        <w:t xml:space="preserve">Edit</w:t>
+      </w:r>
+      <w:r>
+        <w:t xml:space="preserve"> </w:t>
+      </w:r>
+      <w:r>
+        <w:t xml:space="preserve">opens an inline editor for the times, day selection, and effective date.</w:t>
+      </w:r>
+    </w:p>
+    <w:p>
+      <w:pPr>
+        <w:pStyle w:val="CaptionedFigure"/>
+      </w:pPr>
+      <w:r>
+        <w:drawing>
+          <wp:inline>
+            <wp:extent cx="5334000" cy="2646109"/>
+            <wp:effectExtent b="0" l="0" r="0" t="0"/>
+            <wp:docPr descr="Shift Schedules Screen — Three-shift configuration with day-pill indicators" title="" id="52" name="Picture"/>
+            <a:graphic>
+              <a:graphicData uri="http://schemas.openxmlformats.org/drawingml/2006/picture">
+                <pic:pic>
+                  <pic:nvPicPr>
+                    <pic:cNvPr descr="docs/screenshots/screen-shift-schedules.png" id="53" name="Picture"/>
+                    <pic:cNvPicPr>
+                      <a:picLocks noChangeArrowheads="1" noChangeAspect="1"/>
+                    </pic:cNvPicPr>
+                  </pic:nvPicPr>
+                  <pic:blipFill>
+                    <a:blip r:embed="rId51"/>
+                    <a:stretch>
+                      <a:fillRect/>
+                    </a:stretch>
+                  </pic:blipFill>
+                  <pic:spPr bwMode="auto">
+                    <a:xfrm>
+                      <a:off x="0" y="0"/>
+                      <a:ext cx="5334000" cy="2646109"/>
+                    </a:xfrm>
+                    <a:prstGeom prst="rect">
+                      <a:avLst/>
+                    </a:prstGeom>
+                    <a:noFill/>
+                    <a:ln w="9525">
+                      <a:noFill/>
+                      <a:headEnd/>
+                      <a:tailEnd/>
+                    </a:ln>
+                  </pic:spPr>
+                </pic:pic>
+              </a:graphicData>
+            </a:graphic>
+          </wp:inline>
+        </w:drawing>
+      </w:r>
+    </w:p>
+    <w:p>
+      <w:pPr>
+        <w:pStyle w:val="ImageCaption"/>
+      </w:pPr>
+      <w:r>
+        <w:t xml:space="preserve">Shift Schedules Screen — Three-shift configuration with day-pill indicators</w:t>
       </w:r>
     </w:p>
     <w:p>
@@ -1050,9 +3745,9 @@
         </w:pict>
       </w:r>
     </w:p>
-    <w:bookmarkEnd w:id="15"/>
-    <w:bookmarkEnd w:id="16"/>
-    <w:bookmarkStart w:id="26" w:name="X9d3dbf4d142c75b298042d81841f871b0d06ec6"/>
+    <w:bookmarkEnd w:id="54"/>
+    <w:bookmarkEnd w:id="55"/>
+    <w:bookmarkStart w:id="65" w:name="X9d3dbf4d142c75b298042d81841f871b0d06ec6"/>
     <w:p>
       <w:pPr>
         <w:pStyle w:val="Heading2"/>
@@ -1075,7 +3770,7 @@
         <w:t xml:space="preserve">It’s 6:15am on a Tuesday. First shift has started. The aluminum is already molten.</w:t>
       </w:r>
     </w:p>
-    <w:bookmarkStart w:id="17" w:name="am-die-cast-a-lot-is-born"/>
+    <w:bookmarkStart w:id="56" w:name="am-die-cast-a-lot-is-born"/>
     <w:p>
       <w:pPr>
         <w:pStyle w:val="Heading3"/>
@@ -1231,8 +3926,8 @@
         <w:t xml:space="preserve">would have been created automatically with source=PLC, and Carlos would just need to assign the reason code. Note: the legacy paper forms track downtime as cumulative minutes subtracted from a 425-minute base runtime (with adjustments for lunch, breaks, and overtime). The new MES captures discrete start/end events, which is a more granular model — the cumulative shift total is derived from the events rather than entered directly.</w:t>
       </w:r>
     </w:p>
-    <w:bookmarkEnd w:id="17"/>
-    <w:bookmarkStart w:id="18" w:name="am-trim-shop-lot-moves-through-the-plant"/>
+    <w:bookmarkEnd w:id="56"/>
+    <w:bookmarkStart w:id="57" w:name="am-trim-shop-lot-moves-through-the-plant"/>
     <w:p>
       <w:pPr>
         <w:pStyle w:val="Heading3"/>
@@ -1341,8 +4036,8 @@
         <w:t xml:space="preserve">records the Trim operation completion.</w:t>
       </w:r>
     </w:p>
-    <w:bookmarkEnd w:id="18"/>
-    <w:bookmarkStart w:id="19" w:name="am-machining-the-lot-splits"/>
+    <w:bookmarkEnd w:id="57"/>
+    <w:bookmarkStart w:id="58" w:name="am-machining-the-lot-splits"/>
     <w:p>
       <w:pPr>
         <w:pStyle w:val="Heading3"/>
@@ -1452,8 +4147,8 @@
         <w:t xml:space="preserve">Each sub-LOT now has its own journey. Sub-LOT A goes to CNC machine 12. The operator loads the parts, the machine runs, 23 come out good, 1 is out-of-tolerance. Production event: 23 good, 1 no-good. Reject event: code MS-OOT-01, quantity 1. Sub-LOT A now has 23 pieces.</w:t>
       </w:r>
     </w:p>
-    <w:bookmarkEnd w:id="19"/>
-    <w:bookmarkStart w:id="20" w:name="Xe45f8832e7997e311c5f47e21b87e7afa8aeaa5"/>
+    <w:bookmarkEnd w:id="58"/>
+    <w:bookmarkStart w:id="59" w:name="Xe45f8832e7997e311c5f47e21b87e7afa8aeaa5"/>
     <w:p>
       <w:pPr>
         <w:pStyle w:val="Heading3"/>
@@ -1781,8 +4476,8 @@
         <w:t xml:space="preserve">via OmniServer) rather than piece count.</w:t>
       </w:r>
     </w:p>
-    <w:bookmarkEnd w:id="20"/>
-    <w:bookmarkStart w:id="21" w:name="pm-a-quality-hold"/>
+    <w:bookmarkEnd w:id="59"/>
+    <w:bookmarkStart w:id="60" w:name="pm-a-quality-hold"/>
     <w:p>
       <w:pPr>
         <w:pStyle w:val="Heading3"/>
@@ -1911,8 +4606,8 @@
         <w:t xml:space="preserve">with the shipper ID. AIM acknowledges. The container status goes to HOLD. It’s not going on the truck.</w:t>
       </w:r>
     </w:p>
-    <w:bookmarkEnd w:id="21"/>
-    <w:bookmarkStart w:id="22" w:name="pm-the-sort-cage"/>
+    <w:bookmarkEnd w:id="60"/>
+    <w:bookmarkStart w:id="61" w:name="pm-the-sort-cage"/>
     <w:p>
       <w:pPr>
         <w:pStyle w:val="Heading3"/>
@@ -2142,8 +4837,8 @@
         <w:t xml:space="preserve">populated. LOT status goes back to GOOD. Production can resume.</w:t>
       </w:r>
     </w:p>
-    <w:bookmarkEnd w:id="22"/>
-    <w:bookmarkStart w:id="23" w:name="Xef0509370e552f9e4610b8262e70be2381c36f2"/>
+    <w:bookmarkEnd w:id="61"/>
+    <w:bookmarkStart w:id="62" w:name="Xef0509370e552f9e4610b8262e70be2381c36f2"/>
     <w:p>
       <w:pPr>
         <w:pStyle w:val="Heading3"/>
@@ -2214,8 +4909,8 @@
         <w:t xml:space="preserve">note on Scope Matrix row 20 refers to the dedicated operational workflows — Perspective screens for receiving inspection, vendor lot verification, and staging procedures specific to pass-through parts — not to the underlying tracking capability.</w:t>
       </w:r>
     </w:p>
-    <w:bookmarkEnd w:id="23"/>
-    <w:bookmarkStart w:id="24" w:name="pm-shipping-the-truck-leaves"/>
+    <w:bookmarkEnd w:id="62"/>
+    <w:bookmarkStart w:id="63" w:name="pm-shipping-the-truck-leaves"/>
     <w:p>
       <w:pPr>
         <w:pStyle w:val="Heading3"/>
@@ -2232,8 +4927,8 @@
         <w:t xml:space="preserve">The released containers — the good ones from this morning’s production, plus the re-sorted containers from the Sort Cage — are loaded onto the Honda truck. The shipping operator scans each container’s shipping label. The MES confirms: status Complete (not HOLD, not VOID), AIM shipper ID valid. Each container’s location moves to Shipping Dock → Shipped. The truck rolls out. Honda can trace every part on it back to the melt.</w:t>
       </w:r>
     </w:p>
-    <w:bookmarkEnd w:id="24"/>
-    <w:bookmarkStart w:id="25" w:name="end-of-shift"/>
+    <w:bookmarkEnd w:id="63"/>
+    <w:bookmarkStart w:id="64" w:name="end-of-shift"/>
     <w:p>
       <w:pPr>
         <w:pStyle w:val="Heading3"/>
@@ -2361,9 +5056,9 @@
         </w:pict>
       </w:r>
     </w:p>
-    <w:bookmarkEnd w:id="25"/>
-    <w:bookmarkEnd w:id="26"/>
-    <w:bookmarkStart w:id="46" w:name="assumptions-open-decisions"/>
+    <w:bookmarkEnd w:id="64"/>
+    <w:bookmarkEnd w:id="65"/>
+    <w:bookmarkStart w:id="85" w:name="assumptions-open-decisions"/>
     <w:p>
       <w:pPr>
         <w:pStyle w:val="Heading2"/>
@@ -2398,7 +5093,7 @@
         <w:t xml:space="preserve">✅ Resolved | 🔶 Pending Customer Validation / Pending Internal Review | ⬜ Open</w:t>
       </w:r>
     </w:p>
-    <w:bookmarkStart w:id="27" w:name="X6a009e946b00d98ca99525ff57917526fe4984c"/>
+    <w:bookmarkStart w:id="66" w:name="X6a009e946b00d98ca99525ff57917526fe4984c"/>
     <w:p>
       <w:pPr>
         <w:pStyle w:val="Heading3"/>
@@ -2453,8 +5148,8 @@
         <w:t xml:space="preserve">Maps to OI-06.</w:t>
       </w:r>
     </w:p>
-    <w:bookmarkEnd w:id="27"/>
-    <w:bookmarkStart w:id="28" w:name="X8a97f2b45aacffcfde53291572bcd0cf661d011"/>
+    <w:bookmarkEnd w:id="66"/>
+    <w:bookmarkStart w:id="67" w:name="X8a97f2b45aacffcfde53291572bcd0cf661d011"/>
     <w:p>
       <w:pPr>
         <w:pStyle w:val="Heading3"/>
@@ -2499,8 +5194,8 @@
         <w:t xml:space="preserve">LTT tags are pre-printed, but the first scan of a barcode creates the LOT record in the MES. No pre-registration of barcodes. No LOT tag inventory feature. Confirms FDS-05-002.</w:t>
       </w:r>
     </w:p>
-    <w:bookmarkEnd w:id="28"/>
-    <w:bookmarkStart w:id="29" w:name="X02d9ed5b59999fee2ed9f775d0d739f5d3a01b0"/>
+    <w:bookmarkEnd w:id="67"/>
+    <w:bookmarkStart w:id="68" w:name="X02d9ed5b59999fee2ed9f775d0d739f5d3a01b0"/>
     <w:p>
       <w:pPr>
         <w:pStyle w:val="Heading3"/>
@@ -2563,8 +5258,8 @@
         <w:t xml:space="preserve">with relationship_type = Split). Operator can adjust quantities or cancel the auto-split. Needs review with Ben.</w:t>
       </w:r>
     </w:p>
-    <w:bookmarkEnd w:id="29"/>
-    <w:bookmarkStart w:id="30" w:name="X8d9059566608ee12c9183bcb0fe5f5e27b15363"/>
+    <w:bookmarkEnd w:id="68"/>
+    <w:bookmarkStart w:id="69" w:name="X8d9059566608ee12c9183bcb0fe5f5e27b15363"/>
     <w:p>
       <w:pPr>
         <w:pStyle w:val="Heading3"/>
@@ -2619,8 +5314,8 @@
         <w:t xml:space="preserve">Maps to OI-02.</w:t>
       </w:r>
     </w:p>
-    <w:bookmarkEnd w:id="30"/>
-    <w:bookmarkStart w:id="31" w:name="sort-cage-serial-number-migration-open"/>
+    <w:bookmarkEnd w:id="69"/>
+    <w:bookmarkStart w:id="70" w:name="sort-cage-serial-number-migration-open"/>
     <w:p>
       <w:pPr>
         <w:pStyle w:val="Heading3"/>
@@ -2695,8 +5390,8 @@
         <w:t xml:space="preserve">table is needed.</w:t>
       </w:r>
     </w:p>
-    <w:bookmarkEnd w:id="31"/>
-    <w:bookmarkStart w:id="32" w:name="off-site-receiving-resolved"/>
+    <w:bookmarkEnd w:id="70"/>
+    <w:bookmarkStart w:id="71" w:name="off-site-receiving-resolved"/>
     <w:p>
       <w:pPr>
         <w:pStyle w:val="Heading3"/>
@@ -2741,8 +5436,8 @@
         <w:t xml:space="preserve">Online capability confirmed. No concerns about network reliability or offline requirements. Standard Ignition Perspective via VPN/published gateway.</w:t>
       </w:r>
     </w:p>
-    <w:bookmarkEnd w:id="32"/>
-    <w:bookmarkStart w:id="33" w:name="work-order-visibility-and-lifecycle-open"/>
+    <w:bookmarkEnd w:id="71"/>
+    <w:bookmarkStart w:id="72" w:name="work-order-visibility-and-lifecycle-open"/>
     <w:p>
       <w:pPr>
         <w:pStyle w:val="Heading3"/>
@@ -2809,8 +5504,8 @@
         <w:t xml:space="preserve">Maps to OI-07.</w:t>
       </w:r>
     </w:p>
-    <w:bookmarkEnd w:id="33"/>
-    <w:bookmarkStart w:id="34" w:name="lot-merge-business-rules-open"/>
+    <w:bookmarkEnd w:id="72"/>
+    <w:bookmarkStart w:id="73" w:name="lot-merge-business-rules-open"/>
     <w:p>
       <w:pPr>
         <w:pStyle w:val="Heading3"/>
@@ -2883,8 +5578,8 @@
         <w:t xml:space="preserve">Maps to OI-05.</w:t>
       </w:r>
     </w:p>
-    <w:bookmarkEnd w:id="34"/>
-    <w:bookmarkStart w:id="35" w:name="Xaf546f60fbb4131369bf8f225358aae274b9155"/>
+    <w:bookmarkEnd w:id="73"/>
+    <w:bookmarkStart w:id="74" w:name="Xaf546f60fbb4131369bf8f225358aae274b9155"/>
     <w:p>
       <w:pPr>
         <w:pStyle w:val="Heading3"/>
@@ -2956,8 +5651,8 @@
         <w:t xml:space="preserve">BOM-based check. The scanned source LOT’s part number must match a component in the active BOM version. Substitute parts are rejected. Needs MPP confirmation.</w:t>
       </w:r>
     </w:p>
-    <w:bookmarkEnd w:id="35"/>
-    <w:bookmarkStart w:id="36" w:name="shift-boundary-handling-open"/>
+    <w:bookmarkEnd w:id="74"/>
+    <w:bookmarkStart w:id="75" w:name="shift-boundary-handling-open"/>
     <w:p>
       <w:pPr>
         <w:pStyle w:val="Heading3"/>
@@ -3012,8 +5707,8 @@
         <w:t xml:space="preserve">Maps to OI-03.</w:t>
       </w:r>
     </w:p>
-    <w:bookmarkEnd w:id="36"/>
-    <w:bookmarkStart w:id="37" w:name="paper-to-screen-transition-open"/>
+    <w:bookmarkEnd w:id="75"/>
+    <w:bookmarkStart w:id="76" w:name="paper-to-screen-transition-open"/>
     <w:p>
       <w:pPr>
         <w:pStyle w:val="Heading3"/>
@@ -3058,8 +5753,8 @@
         <w:t xml:space="preserve">Flagged for discussion with Ben. Whether Perspective screens replace paper at point-of-action or some stations retain paper-first workflow is a process change that requires MPP commitment.</w:t>
       </w:r>
     </w:p>
-    <w:bookmarkEnd w:id="37"/>
-    <w:bookmarkStart w:id="38" w:name="Xe804a3ad95a44227a72a1c70b67b2009dab422f"/>
+    <w:bookmarkEnd w:id="76"/>
+    <w:bookmarkStart w:id="77" w:name="Xe804a3ad95a44227a72a1c70b67b2009dab422f"/>
     <w:p>
       <w:pPr>
         <w:pStyle w:val="Heading3"/>
@@ -3141,8 +5836,8 @@
         <w:t xml:space="preserve">Maps to OI-08.</w:t>
       </w:r>
     </w:p>
-    <w:bookmarkEnd w:id="38"/>
-    <w:bookmarkStart w:id="39" w:name="X8e24df2bda92e5ad3fb585d738c7c6e20f422e8"/>
+    <w:bookmarkEnd w:id="77"/>
+    <w:bookmarkStart w:id="78" w:name="X8e24df2bda92e5ad3fb585d738c7c6e20f422e8"/>
     <w:p>
       <w:pPr>
         <w:pStyle w:val="Heading3"/>
@@ -3224,8 +5919,8 @@
         <w:t xml:space="preserve">Maps to OI-02.</w:t>
       </w:r>
     </w:p>
-    <w:bookmarkEnd w:id="39"/>
-    <w:bookmarkStart w:id="40" w:name="X75c3ffd8ebfd8ddc104a3e286b8172282a721ca"/>
+    <w:bookmarkEnd w:id="78"/>
+    <w:bookmarkStart w:id="79" w:name="X75c3ffd8ebfd8ddc104a3e286b8172282a721ca"/>
     <w:p>
       <w:pPr>
         <w:pStyle w:val="Heading3"/>
@@ -3324,8 +6019,8 @@
         <w:t xml:space="preserve">. Needs review with Ben.</w:t>
       </w:r>
     </w:p>
-    <w:bookmarkEnd w:id="40"/>
-    <w:bookmarkStart w:id="41" w:name="multi-part-number-lines-resolved"/>
+    <w:bookmarkEnd w:id="79"/>
+    <w:bookmarkStart w:id="80" w:name="multi-part-number-lines-resolved"/>
     <w:p>
       <w:pPr>
         <w:pStyle w:val="Heading3"/>
@@ -3380,8 +6075,8 @@
         <w:t xml:space="preserve">Maps to OI-09.</w:t>
       </w:r>
     </w:p>
-    <w:bookmarkEnd w:id="41"/>
-    <w:bookmarkStart w:id="42" w:name="X85424eed8302993ab5871a0056003e0a784b765"/>
+    <w:bookmarkEnd w:id="80"/>
+    <w:bookmarkStart w:id="81" w:name="X85424eed8302993ab5871a0056003e0a784b765"/>
     <w:p>
       <w:pPr>
         <w:pStyle w:val="Heading3"/>
@@ -3492,8 +6187,8 @@
         <w:t xml:space="preserve">. The circumstances under which MPP bypasses the interlock are not yet understood. Both options flagged for discussion with Ben.</w:t>
       </w:r>
     </w:p>
-    <w:bookmarkEnd w:id="42"/>
-    <w:bookmarkStart w:id="43" w:name="X7711411ed0c744b11ef8373c23e3eb986c2f7d7"/>
+    <w:bookmarkEnd w:id="81"/>
+    <w:bookmarkStart w:id="82" w:name="X7711411ed0c744b11ef8373c23e3eb986c2f7d7"/>
     <w:p>
       <w:pPr>
         <w:pStyle w:val="Heading3"/>
@@ -3563,8 +6258,8 @@
         <w:t xml:space="preserve">Maps to OI-04.</w:t>
       </w:r>
     </w:p>
-    <w:bookmarkEnd w:id="43"/>
-    <w:bookmarkStart w:id="44" w:name="Xab206fe5b2e47cb27c7a3d7b41cdcb57343f541"/>
+    <w:bookmarkEnd w:id="82"/>
+    <w:bookmarkStart w:id="83" w:name="Xab206fe5b2e47cb27c7a3d7b41cdcb57343f541"/>
     <w:p>
       <w:pPr>
         <w:pStyle w:val="Heading3"/>
@@ -3631,8 +6326,8 @@
         <w:t xml:space="preserve">Maps to OI-01.</w:t>
       </w:r>
     </w:p>
-    <w:bookmarkEnd w:id="44"/>
-    <w:bookmarkStart w:id="45" w:name="Xc0ae84e509ec30bacfcc0a2e20bcc2db236d541"/>
+    <w:bookmarkEnd w:id="83"/>
+    <w:bookmarkStart w:id="84" w:name="Xc0ae84e509ec30bacfcc0a2e20bcc2db236d541"/>
     <w:p>
       <w:pPr>
         <w:pStyle w:val="Heading3"/>
@@ -3684,9 +6379,9 @@
         </w:pict>
       </w:r>
     </w:p>
-    <w:bookmarkEnd w:id="45"/>
-    <w:bookmarkEnd w:id="46"/>
-    <w:bookmarkStart w:id="47" w:name="impact-matrix"/>
+    <w:bookmarkEnd w:id="84"/>
+    <w:bookmarkEnd w:id="85"/>
+    <w:bookmarkStart w:id="86" w:name="impact-matrix"/>
     <w:p>
       <w:pPr>
         <w:pStyle w:val="Heading2"/>
@@ -3708,15 +6403,7 @@
         <w:tblStyle w:val="Table"/>
         <w:tblW w:type="pct" w:w="5000"/>
         <w:tblLayout w:type="fixed"/>
-        <w:tblBorders>
-          <w:top w:val="single" w:sz="4" w:space="0" w:color="808080"/>
-          <w:left w:val="single" w:sz="4" w:space="0" w:color="808080"/>
-          <w:bottom w:val="single" w:sz="4" w:space="0" w:color="808080"/>
-          <w:right w:val="single" w:sz="4" w:space="0" w:color="808080"/>
-          <w:insideH w:val="single" w:sz="4" w:space="0" w:color="BFBFBF"/>
-          <w:insideV w:val="single" w:sz="4" w:space="0" w:color="BFBFBF"/>
-        </w:tblBorders>
-        <w:tblLook w:firstRow="1" w:lastRow="0" w:firstColumn="0" w:lastColumn="0" w:noHBand="0" w:noVBand="1" w:val="0220"/>
+        <w:tblLook w:firstRow="1" w:lastRow="0" w:firstColumn="0" w:lastColumn="0" w:noHBand="0" w:noVBand="0" w:val="0020"/>
       </w:tblPr>
       <w:tblGrid>
         <w:gridCol w:w="2640"/>
@@ -3728,55 +6415,34 @@
           <w:tblHeader w:val="on"/>
         </w:trPr>
         <w:tc>
-          <w:tcPr>
-            <w:shd w:val="clear" w:color="auto" w:fill="1F4E79"/>
-          </w:tcPr>
-          <w:tcPr/>
-          <w:p>
-            <w:pPr>
-              <w:pStyle w:val="Compact"/>
-            </w:pPr>
-            <w:r>
-              <w:rPr>
-                <w:b/>
-                <w:color w:val="FFFFFF"/>
-              </w:rPr>
+          <w:tcPr/>
+          <w:p>
+            <w:pPr>
+              <w:pStyle w:val="Compact"/>
+            </w:pPr>
+            <w:r>
               <w:t xml:space="preserve">Decision Cluster</w:t>
             </w:r>
           </w:p>
         </w:tc>
         <w:tc>
-          <w:tcPr>
-            <w:shd w:val="clear" w:color="auto" w:fill="1F4E79"/>
-          </w:tcPr>
-          <w:tcPr/>
-          <w:p>
-            <w:pPr>
-              <w:pStyle w:val="Compact"/>
-            </w:pPr>
-            <w:r>
-              <w:rPr>
-                <w:b/>
-                <w:color w:val="FFFFFF"/>
-              </w:rPr>
+          <w:tcPr/>
+          <w:p>
+            <w:pPr>
+              <w:pStyle w:val="Compact"/>
+            </w:pPr>
+            <w:r>
               <w:t xml:space="preserve">Blocks</w:t>
             </w:r>
           </w:p>
         </w:tc>
         <w:tc>
-          <w:tcPr>
-            <w:shd w:val="clear" w:color="auto" w:fill="1F4E79"/>
-          </w:tcPr>
-          <w:tcPr/>
-          <w:p>
-            <w:pPr>
-              <w:pStyle w:val="Compact"/>
-            </w:pPr>
-            <w:r>
-              <w:rPr>
-                <w:b/>
-                <w:color w:val="FFFFFF"/>
-              </w:rPr>
+          <w:tcPr/>
+          <w:p>
+            <w:pPr>
+              <w:pStyle w:val="Compact"/>
+            </w:pPr>
+            <w:r>
               <w:t xml:space="preserve">Affected Screens</w:t>
             </w:r>
           </w:p>
@@ -3829,9 +6495,6 @@
       </w:tr>
       <w:tr>
         <w:tc>
-          <w:tcPr>
-            <w:shd w:val="clear" w:color="auto" w:fill="F2F2F2"/>
-          </w:tcPr>
           <w:tcPr/>
           <w:p>
             <w:pPr>
@@ -3853,9 +6516,6 @@
           </w:p>
         </w:tc>
         <w:tc>
-          <w:tcPr>
-            <w:shd w:val="clear" w:color="auto" w:fill="F2F2F2"/>
-          </w:tcPr>
           <w:tcPr/>
           <w:p>
             <w:pPr>
@@ -3867,9 +6527,6 @@
           </w:p>
         </w:tc>
         <w:tc>
-          <w:tcPr>
-            <w:shd w:val="clear" w:color="auto" w:fill="F2F2F2"/>
-          </w:tcPr>
           <w:tcPr/>
           <w:p>
             <w:pPr>
@@ -3928,9 +6585,6 @@
       </w:tr>
       <w:tr>
         <w:tc>
-          <w:tcPr>
-            <w:shd w:val="clear" w:color="auto" w:fill="F2F2F2"/>
-          </w:tcPr>
           <w:tcPr/>
           <w:p>
             <w:pPr>
@@ -3952,9 +6606,6 @@
           </w:p>
         </w:tc>
         <w:tc>
-          <w:tcPr>
-            <w:shd w:val="clear" w:color="auto" w:fill="F2F2F2"/>
-          </w:tcPr>
           <w:tcPr/>
           <w:p>
             <w:pPr>
@@ -3966,9 +6617,6 @@
           </w:p>
         </w:tc>
         <w:tc>
-          <w:tcPr>
-            <w:shd w:val="clear" w:color="auto" w:fill="F2F2F2"/>
-          </w:tcPr>
           <w:tcPr/>
           <w:p>
             <w:pPr>
@@ -4027,9 +6675,6 @@
       </w:tr>
       <w:tr>
         <w:tc>
-          <w:tcPr>
-            <w:shd w:val="clear" w:color="auto" w:fill="F2F2F2"/>
-          </w:tcPr>
           <w:tcPr/>
           <w:p>
             <w:pPr>
@@ -4051,9 +6696,6 @@
           </w:p>
         </w:tc>
         <w:tc>
-          <w:tcPr>
-            <w:shd w:val="clear" w:color="auto" w:fill="F2F2F2"/>
-          </w:tcPr>
           <w:tcPr/>
           <w:p>
             <w:pPr>
@@ -4065,9 +6707,6 @@
           </w:p>
         </w:tc>
         <w:tc>
-          <w:tcPr>
-            <w:shd w:val="clear" w:color="auto" w:fill="F2F2F2"/>
-          </w:tcPr>
           <w:tcPr/>
           <w:p>
             <w:pPr>
@@ -4126,9 +6765,6 @@
       </w:tr>
       <w:tr>
         <w:tc>
-          <w:tcPr>
-            <w:shd w:val="clear" w:color="auto" w:fill="F2F2F2"/>
-          </w:tcPr>
           <w:tcPr/>
           <w:p>
             <w:pPr>
@@ -4150,9 +6786,6 @@
           </w:p>
         </w:tc>
         <w:tc>
-          <w:tcPr>
-            <w:shd w:val="clear" w:color="auto" w:fill="F2F2F2"/>
-          </w:tcPr>
           <w:tcPr/>
           <w:p>
             <w:pPr>
@@ -4164,9 +6797,6 @@
           </w:p>
         </w:tc>
         <w:tc>
-          <w:tcPr>
-            <w:shd w:val="clear" w:color="auto" w:fill="F2F2F2"/>
-          </w:tcPr>
           <w:tcPr/>
           <w:p>
             <w:pPr>
@@ -4231,8 +6861,8 @@
         </w:pict>
       </w:r>
     </w:p>
-    <w:bookmarkEnd w:id="47"/>
-    <w:bookmarkStart w:id="48" w:name="related-documents"/>
+    <w:bookmarkEnd w:id="86"/>
+    <w:bookmarkStart w:id="87" w:name="related-documents"/>
     <w:p>
       <w:pPr>
         <w:pStyle w:val="Heading2"/>
@@ -4246,15 +6876,7 @@
         <w:tblStyle w:val="Table"/>
         <w:tblW w:type="pct" w:w="5000"/>
         <w:tblLayout w:type="fixed"/>
-        <w:tblBorders>
-          <w:top w:val="single" w:sz="4" w:space="0" w:color="808080"/>
-          <w:left w:val="single" w:sz="4" w:space="0" w:color="808080"/>
-          <w:bottom w:val="single" w:sz="4" w:space="0" w:color="808080"/>
-          <w:right w:val="single" w:sz="4" w:space="0" w:color="808080"/>
-          <w:insideH w:val="single" w:sz="4" w:space="0" w:color="BFBFBF"/>
-          <w:insideV w:val="single" w:sz="4" w:space="0" w:color="BFBFBF"/>
-        </w:tblBorders>
-        <w:tblLook w:firstRow="1" w:lastRow="0" w:firstColumn="0" w:lastColumn="0" w:noHBand="0" w:noVBand="1" w:val="0220"/>
+        <w:tblLook w:firstRow="1" w:lastRow="0" w:firstColumn="0" w:lastColumn="0" w:noHBand="0" w:noVBand="0" w:val="0020"/>
       </w:tblPr>
       <w:tblGrid>
         <w:gridCol w:w="3960"/>
@@ -4265,37 +6887,23 @@
           <w:tblHeader w:val="on"/>
         </w:trPr>
         <w:tc>
-          <w:tcPr>
-            <w:shd w:val="clear" w:color="auto" w:fill="1F4E79"/>
-          </w:tcPr>
-          <w:tcPr/>
-          <w:p>
-            <w:pPr>
-              <w:pStyle w:val="Compact"/>
-            </w:pPr>
-            <w:r>
-              <w:rPr>
-                <w:b/>
-                <w:color w:val="FFFFFF"/>
-              </w:rPr>
+          <w:tcPr/>
+          <w:p>
+            <w:pPr>
+              <w:pStyle w:val="Compact"/>
+            </w:pPr>
+            <w:r>
               <w:t xml:space="preserve">Document</w:t>
             </w:r>
           </w:p>
         </w:tc>
         <w:tc>
-          <w:tcPr>
-            <w:shd w:val="clear" w:color="auto" w:fill="1F4E79"/>
-          </w:tcPr>
-          <w:tcPr/>
-          <w:p>
-            <w:pPr>
-              <w:pStyle w:val="Compact"/>
-            </w:pPr>
-            <w:r>
-              <w:rPr>
-                <w:b/>
-                <w:color w:val="FFFFFF"/>
-              </w:rPr>
+          <w:tcPr/>
+          <w:p>
+            <w:pPr>
+              <w:pStyle w:val="Compact"/>
+            </w:pPr>
+            <w:r>
               <w:t xml:space="preserve">Relevance</w:t>
             </w:r>
           </w:p>
@@ -4330,9 +6938,6 @@
       </w:tr>
       <w:tr>
         <w:tc>
-          <w:tcPr>
-            <w:shd w:val="clear" w:color="auto" w:fill="F2F2F2"/>
-          </w:tcPr>
           <w:tcPr/>
           <w:p>
             <w:pPr>
@@ -4347,9 +6952,6 @@
           </w:p>
         </w:tc>
         <w:tc>
-          <w:tcPr>
-            <w:shd w:val="clear" w:color="auto" w:fill="F2F2F2"/>
-          </w:tcPr>
           <w:tcPr/>
           <w:p>
             <w:pPr>
@@ -4390,9 +6992,6 @@
       </w:tr>
       <w:tr>
         <w:tc>
-          <w:tcPr>
-            <w:shd w:val="clear" w:color="auto" w:fill="F2F2F2"/>
-          </w:tcPr>
           <w:tcPr/>
           <w:p>
             <w:pPr>
@@ -4407,9 +7006,6 @@
           </w:p>
         </w:tc>
         <w:tc>
-          <w:tcPr>
-            <w:shd w:val="clear" w:color="auto" w:fill="F2F2F2"/>
-          </w:tcPr>
           <w:tcPr/>
           <w:p>
             <w:pPr>
@@ -4450,9 +7046,6 @@
       </w:tr>
       <w:tr>
         <w:tc>
-          <w:tcPr>
-            <w:shd w:val="clear" w:color="auto" w:fill="F2F2F2"/>
-          </w:tcPr>
           <w:tcPr/>
           <w:p>
             <w:pPr>
@@ -4467,9 +7060,6 @@
           </w:p>
         </w:tc>
         <w:tc>
-          <w:tcPr>
-            <w:shd w:val="clear" w:color="auto" w:fill="F2F2F2"/>
-          </w:tcPr>
           <w:tcPr/>
           <w:p>
             <w:pPr>
@@ -4489,8 +7079,8 @@
         </w:pict>
       </w:r>
     </w:p>
-    <w:bookmarkEnd w:id="48"/>
-    <w:bookmarkStart w:id="49" w:name="validation-log-2026-04-06"/>
+    <w:bookmarkEnd w:id="87"/>
+    <w:bookmarkStart w:id="88" w:name="validation-log-2026-04-06"/>
     <w:p>
       <w:pPr>
         <w:pStyle w:val="Heading2"/>
@@ -4512,15 +7102,7 @@
         <w:tblStyle w:val="Table"/>
         <w:tblW w:type="pct" w:w="5000"/>
         <w:tblLayout w:type="fixed"/>
-        <w:tblBorders>
-          <w:top w:val="single" w:sz="4" w:space="0" w:color="808080"/>
-          <w:left w:val="single" w:sz="4" w:space="0" w:color="808080"/>
-          <w:bottom w:val="single" w:sz="4" w:space="0" w:color="808080"/>
-          <w:right w:val="single" w:sz="4" w:space="0" w:color="808080"/>
-          <w:insideH w:val="single" w:sz="4" w:space="0" w:color="BFBFBF"/>
-          <w:insideV w:val="single" w:sz="4" w:space="0" w:color="BFBFBF"/>
-        </w:tblBorders>
-        <w:tblLook w:firstRow="1" w:lastRow="0" w:firstColumn="0" w:lastColumn="0" w:noHBand="0" w:noVBand="1" w:val="0220"/>
+        <w:tblLook w:firstRow="1" w:lastRow="0" w:firstColumn="0" w:lastColumn="0" w:noHBand="0" w:noVBand="0" w:val="0020"/>
       </w:tblPr>
       <w:tblGrid>
         <w:gridCol w:w="2640"/>
@@ -4532,55 +7114,34 @@
           <w:tblHeader w:val="on"/>
         </w:trPr>
         <w:tc>
-          <w:tcPr>
-            <w:shd w:val="clear" w:color="auto" w:fill="1F4E79"/>
-          </w:tcPr>
-          <w:tcPr/>
-          <w:p>
-            <w:pPr>
-              <w:pStyle w:val="Compact"/>
-            </w:pPr>
-            <w:r>
-              <w:rPr>
-                <w:b/>
-                <w:color w:val="FFFFFF"/>
-              </w:rPr>
+          <w:tcPr/>
+          <w:p>
+            <w:pPr>
+              <w:pStyle w:val="Compact"/>
+            </w:pPr>
+            <w:r>
               <w:t xml:space="preserve">Source</w:t>
             </w:r>
           </w:p>
         </w:tc>
         <w:tc>
-          <w:tcPr>
-            <w:shd w:val="clear" w:color="auto" w:fill="1F4E79"/>
-          </w:tcPr>
-          <w:tcPr/>
-          <w:p>
-            <w:pPr>
-              <w:pStyle w:val="Compact"/>
-            </w:pPr>
-            <w:r>
-              <w:rPr>
-                <w:b/>
-                <w:color w:val="FFFFFF"/>
-              </w:rPr>
+          <w:tcPr/>
+          <w:p>
+            <w:pPr>
+              <w:pStyle w:val="Compact"/>
+            </w:pPr>
+            <w:r>
               <w:t xml:space="preserve">Finding</w:t>
             </w:r>
           </w:p>
         </w:tc>
         <w:tc>
-          <w:tcPr>
-            <w:shd w:val="clear" w:color="auto" w:fill="1F4E79"/>
-          </w:tcPr>
-          <w:tcPr/>
-          <w:p>
-            <w:pPr>
-              <w:pStyle w:val="Compact"/>
-            </w:pPr>
-            <w:r>
-              <w:rPr>
-                <w:b/>
-                <w:color w:val="FFFFFF"/>
-              </w:rPr>
+          <w:tcPr/>
+          <w:p>
+            <w:pPr>
+              <w:pStyle w:val="Compact"/>
+            </w:pPr>
+            <w:r>
               <w:t xml:space="preserve">Action Taken</w:t>
             </w:r>
           </w:p>
@@ -4633,9 +7194,6 @@
       </w:tr>
       <w:tr>
         <w:tc>
-          <w:tcPr>
-            <w:shd w:val="clear" w:color="auto" w:fill="F2F2F2"/>
-          </w:tcPr>
           <w:tcPr/>
           <w:p>
             <w:pPr>
@@ -4647,9 +7205,6 @@
           </w:p>
         </w:tc>
         <w:tc>
-          <w:tcPr>
-            <w:shd w:val="clear" w:color="auto" w:fill="F2F2F2"/>
-          </w:tcPr>
           <w:tcPr/>
           <w:p>
             <w:pPr>
@@ -4661,9 +7216,6 @@
           </w:p>
         </w:tc>
         <w:tc>
-          <w:tcPr>
-            <w:shd w:val="clear" w:color="auto" w:fill="F2F2F2"/>
-          </w:tcPr>
           <w:tcPr/>
           <w:p>
             <w:pPr>
@@ -4732,9 +7284,6 @@
       </w:tr>
       <w:tr>
         <w:tc>
-          <w:tcPr>
-            <w:shd w:val="clear" w:color="auto" w:fill="F2F2F2"/>
-          </w:tcPr>
           <w:tcPr/>
           <w:p>
             <w:pPr>
@@ -4746,9 +7295,6 @@
           </w:p>
         </w:tc>
         <w:tc>
-          <w:tcPr>
-            <w:shd w:val="clear" w:color="auto" w:fill="F2F2F2"/>
-          </w:tcPr>
           <w:tcPr/>
           <w:p>
             <w:pPr>
@@ -4769,9 +7315,6 @@
           </w:p>
         </w:tc>
         <w:tc>
-          <w:tcPr>
-            <w:shd w:val="clear" w:color="auto" w:fill="F2F2F2"/>
-          </w:tcPr>
           <w:tcPr/>
           <w:p>
             <w:pPr>
@@ -4849,9 +7392,6 @@
       </w:tr>
       <w:tr>
         <w:tc>
-          <w:tcPr>
-            <w:shd w:val="clear" w:color="auto" w:fill="F2F2F2"/>
-          </w:tcPr>
           <w:tcPr/>
           <w:p>
             <w:pPr>
@@ -4863,9 +7403,6 @@
           </w:p>
         </w:tc>
         <w:tc>
-          <w:tcPr>
-            <w:shd w:val="clear" w:color="auto" w:fill="F2F2F2"/>
-          </w:tcPr>
           <w:tcPr/>
           <w:p>
             <w:pPr>
@@ -4913,9 +7450,6 @@
           </w:p>
         </w:tc>
         <w:tc>
-          <w:tcPr>
-            <w:shd w:val="clear" w:color="auto" w:fill="F2F2F2"/>
-          </w:tcPr>
           <w:tcPr/>
           <w:p>
             <w:pPr>
@@ -4978,9 +7512,6 @@
       </w:tr>
       <w:tr>
         <w:tc>
-          <w:tcPr>
-            <w:shd w:val="clear" w:color="auto" w:fill="F2F2F2"/>
-          </w:tcPr>
           <w:tcPr/>
           <w:p>
             <w:pPr>
@@ -4992,9 +7523,6 @@
           </w:p>
         </w:tc>
         <w:tc>
-          <w:tcPr>
-            <w:shd w:val="clear" w:color="auto" w:fill="F2F2F2"/>
-          </w:tcPr>
           <w:tcPr/>
           <w:p>
             <w:pPr>
@@ -5006,9 +7534,6 @@
           </w:p>
         </w:tc>
         <w:tc>
-          <w:tcPr>
-            <w:shd w:val="clear" w:color="auto" w:fill="F2F2F2"/>
-          </w:tcPr>
           <w:tcPr/>
           <w:p>
             <w:pPr>
@@ -5077,9 +7602,6 @@
       </w:tr>
       <w:tr>
         <w:tc>
-          <w:tcPr>
-            <w:shd w:val="clear" w:color="auto" w:fill="F2F2F2"/>
-          </w:tcPr>
           <w:tcPr/>
           <w:p>
             <w:pPr>
@@ -5091,9 +7613,6 @@
           </w:p>
         </w:tc>
         <w:tc>
-          <w:tcPr>
-            <w:shd w:val="clear" w:color="auto" w:fill="F2F2F2"/>
-          </w:tcPr>
           <w:tcPr/>
           <w:p>
             <w:pPr>
@@ -5114,9 +7633,6 @@
           </w:p>
         </w:tc>
         <w:tc>
-          <w:tcPr>
-            <w:shd w:val="clear" w:color="auto" w:fill="F2F2F2"/>
-          </w:tcPr>
           <w:tcPr/>
           <w:p>
             <w:pPr>
@@ -5185,9 +7701,6 @@
       </w:tr>
       <w:tr>
         <w:tc>
-          <w:tcPr>
-            <w:shd w:val="clear" w:color="auto" w:fill="F2F2F2"/>
-          </w:tcPr>
           <w:tcPr/>
           <w:p>
             <w:pPr>
@@ -5199,9 +7712,6 @@
           </w:p>
         </w:tc>
         <w:tc>
-          <w:tcPr>
-            <w:shd w:val="clear" w:color="auto" w:fill="F2F2F2"/>
-          </w:tcPr>
           <w:tcPr/>
           <w:p>
             <w:pPr>
@@ -5213,9 +7723,6 @@
           </w:p>
         </w:tc>
         <w:tc>
-          <w:tcPr>
-            <w:shd w:val="clear" w:color="auto" w:fill="F2F2F2"/>
-          </w:tcPr>
           <w:tcPr/>
           <w:p>
             <w:pPr>
@@ -5284,9 +7791,6 @@
       </w:tr>
       <w:tr>
         <w:tc>
-          <w:tcPr>
-            <w:shd w:val="clear" w:color="auto" w:fill="F2F2F2"/>
-          </w:tcPr>
           <w:tcPr/>
           <w:p>
             <w:pPr>
@@ -5298,9 +7802,6 @@
           </w:p>
         </w:tc>
         <w:tc>
-          <w:tcPr>
-            <w:shd w:val="clear" w:color="auto" w:fill="F2F2F2"/>
-          </w:tcPr>
           <w:tcPr/>
           <w:p>
             <w:pPr>
@@ -5312,9 +7813,6 @@
           </w:p>
         </w:tc>
         <w:tc>
-          <w:tcPr>
-            <w:shd w:val="clear" w:color="auto" w:fill="F2F2F2"/>
-          </w:tcPr>
           <w:tcPr/>
           <w:p>
             <w:pPr>
@@ -5383,9 +7881,6 @@
       </w:tr>
       <w:tr>
         <w:tc>
-          <w:tcPr>
-            <w:shd w:val="clear" w:color="auto" w:fill="F2F2F2"/>
-          </w:tcPr>
           <w:tcPr/>
           <w:p>
             <w:pPr>
@@ -5397,9 +7892,6 @@
           </w:p>
         </w:tc>
         <w:tc>
-          <w:tcPr>
-            <w:shd w:val="clear" w:color="auto" w:fill="F2F2F2"/>
-          </w:tcPr>
           <w:tcPr/>
           <w:p>
             <w:pPr>
@@ -5411,9 +7903,6 @@
           </w:p>
         </w:tc>
         <w:tc>
-          <w:tcPr>
-            <w:shd w:val="clear" w:color="auto" w:fill="F2F2F2"/>
-          </w:tcPr>
           <w:tcPr/>
           <w:p>
             <w:pPr>
@@ -5482,9 +7971,6 @@
       </w:tr>
       <w:tr>
         <w:tc>
-          <w:tcPr>
-            <w:shd w:val="clear" w:color="auto" w:fill="F2F2F2"/>
-          </w:tcPr>
           <w:tcPr/>
           <w:p>
             <w:pPr>
@@ -5496,9 +7982,6 @@
           </w:p>
         </w:tc>
         <w:tc>
-          <w:tcPr>
-            <w:shd w:val="clear" w:color="auto" w:fill="F2F2F2"/>
-          </w:tcPr>
           <w:tcPr/>
           <w:p>
             <w:pPr>
@@ -5510,9 +7993,6 @@
           </w:p>
         </w:tc>
         <w:tc>
-          <w:tcPr>
-            <w:shd w:val="clear" w:color="auto" w:fill="F2F2F2"/>
-          </w:tcPr>
           <w:tcPr/>
           <w:p>
             <w:pPr>
@@ -5571,9 +8051,6 @@
       </w:tr>
       <w:tr>
         <w:tc>
-          <w:tcPr>
-            <w:shd w:val="clear" w:color="auto" w:fill="F2F2F2"/>
-          </w:tcPr>
           <w:tcPr/>
           <w:p>
             <w:pPr>
@@ -5585,9 +8062,6 @@
           </w:p>
         </w:tc>
         <w:tc>
-          <w:tcPr>
-            <w:shd w:val="clear" w:color="auto" w:fill="F2F2F2"/>
-          </w:tcPr>
           <w:tcPr/>
           <w:p>
             <w:pPr>
@@ -5599,9 +8073,6 @@
           </w:p>
         </w:tc>
         <w:tc>
-          <w:tcPr>
-            <w:shd w:val="clear" w:color="auto" w:fill="F2F2F2"/>
-          </w:tcPr>
           <w:tcPr/>
           <w:p>
             <w:pPr>
@@ -5650,9 +8121,6 @@
       </w:tr>
       <w:tr>
         <w:tc>
-          <w:tcPr>
-            <w:shd w:val="clear" w:color="auto" w:fill="F2F2F2"/>
-          </w:tcPr>
           <w:tcPr/>
           <w:p>
             <w:pPr>
@@ -5664,9 +8132,6 @@
           </w:p>
         </w:tc>
         <w:tc>
-          <w:tcPr>
-            <w:shd w:val="clear" w:color="auto" w:fill="F2F2F2"/>
-          </w:tcPr>
           <w:tcPr/>
           <w:p>
             <w:pPr>
@@ -5678,9 +8143,6 @@
           </w:p>
         </w:tc>
         <w:tc>
-          <w:tcPr>
-            <w:shd w:val="clear" w:color="auto" w:fill="F2F2F2"/>
-          </w:tcPr>
           <w:tcPr/>
           <w:p>
             <w:pPr>
@@ -5693,8 +8155,8 @@
         </w:tc>
       </w:tr>
     </w:tbl>
-    <w:bookmarkEnd w:id="49"/>
-    <w:bookmarkEnd w:id="50"/>
+    <w:bookmarkEnd w:id="88"/>
+    <w:bookmarkEnd w:id="89"/>
     <w:sectPr>
       <w:footnotePr>
         <w:numRestart w:val="eachSect"/>
@@ -6347,43 +8809,24 @@
   <w:style w:default="1" w:styleId="Table" w:type="table">
     <w:name w:val="Table"/>
     <w:basedOn w:val="TableNormal"/>
+    <w:semiHidden/>
+    <w:unhideWhenUsed/>
     <w:qFormat/>
     <w:tblPr>
       <w:tblInd w:type="dxa" w:w="0"/>
-      <w:tblBorders>
-        <w:top w:color="808080" w:space="0" w:sz="4" w:val="single"/>
-        <w:left w:color="808080" w:space="0" w:sz="4" w:val="single"/>
-        <w:bottom w:color="808080" w:space="0" w:sz="4" w:val="single"/>
-        <w:right w:color="808080" w:space="0" w:sz="4" w:val="single"/>
-        <w:insideH w:color="BFBFBF" w:space="0" w:sz="4" w:val="single"/>
-        <w:insideV w:color="BFBFBF" w:space="0" w:sz="4" w:val="single"/>
-      </w:tblBorders>
       <w:tblCellMar>
-        <w:top w:type="dxa" w:w="60"/>
+        <w:top w:type="dxa" w:w="0"/>
         <w:left w:type="dxa" w:w="108"/>
-        <w:bottom w:type="dxa" w:w="60"/>
+        <w:bottom w:type="dxa" w:w="0"/>
         <w:right w:type="dxa" w:w="108"/>
       </w:tblCellMar>
     </w:tblPr>
     <w:tblStylePr w:type="firstRow">
-      <w:pPr>
-        <w:keepNext/>
-      </w:pPr>
-      <w:rPr>
-        <w:b/>
-        <w:color w:val="FFFFFF"/>
-      </w:rPr>
       <w:tcPr>
-        <w:shd w:color="auto" w:fill="1F4E79" w:val="clear"/>
         <w:tcBorders>
-          <w:bottom w:color="1F4E79" w:space="0" w:sz="8" w:val="single"/>
+          <w:bottom w:val="single"/>
         </w:tcBorders>
-        <w:vAlign w:val="center"/>
-      </w:tcPr>
-    </w:tblStylePr>
-    <w:tblStylePr w:type="band2Horz">
-      <w:tcPr>
-        <w:shd w:color="auto" w:fill="F2F2F2" w:val="clear"/>
+        <w:vAlign w:val="bottom"/>
       </w:tcPr>
     </w:tblStylePr>
   </w:style>

</xml_diff>

<commit_message>
modified:   MPP_MES_USER_JOURNEYS.docx 	modified:   MPP_MES_USER_JOURNEYS.md
</commit_message>
<xml_diff>
--- a/MPP_MES_USER_JOURNEYS.docx
+++ b/MPP_MES_USER_JOURNEYS.docx
@@ -1257,13 +1257,13 @@
       </w:r>
     </w:p>
     <w:bookmarkEnd w:id="17"/>
-    <w:bookmarkStart w:id="36" w:name="defining-what-we-make"/>
+    <w:bookmarkStart w:id="21" w:name="defining-how-we-make-it"/>
     <w:p>
       <w:pPr>
         <w:pStyle w:val="Heading3"/>
       </w:pPr>
       <w:r>
-        <w:t xml:space="preserve">Defining What We Make</w:t>
+        <w:t xml:space="preserve">Defining How We Make It</w:t>
       </w:r>
     </w:p>
     <w:p>
@@ -1271,102 +1271,135 @@
         <w:pStyle w:val="FirstParagraph"/>
       </w:pPr>
       <w:r>
-        <w:t xml:space="preserve">Next, the item master. The engineer navigates to the</w:t>
-      </w:r>
-      <w:r>
-        <w:t xml:space="preserve"> </w:t>
-      </w:r>
-      <w:r>
-        <w:rPr>
-          <w:b/>
-          <w:bCs/>
-        </w:rPr>
-        <w:t xml:space="preserve">Parts</w:t>
-      </w:r>
-      <w:r>
-        <w:t xml:space="preserve"> </w:t>
-      </w:r>
-      <w:r>
-        <w:t xml:space="preserve">category in the left rail and opens the</w:t>
-      </w:r>
-      <w:r>
-        <w:t xml:space="preserve"> </w:t>
-      </w:r>
-      <w:r>
-        <w:rPr>
-          <w:b/>
-          <w:bCs/>
-        </w:rPr>
-        <w:t xml:space="preserve">Item Master</w:t>
-      </w:r>
-      <w:r>
-        <w:t xml:space="preserve"> </w:t>
-      </w:r>
-      <w:r>
-        <w:t xml:space="preserve">screen. The left panel shows a searchable, filterable list of all items — a</w:t>
-      </w:r>
-      <w:r>
-        <w:t xml:space="preserve"> </w:t>
-      </w:r>
-      <w:r>
-        <w:rPr>
-          <w:b/>
-          <w:bCs/>
-        </w:rPr>
-        <w:t xml:space="preserve">Search items…</w:t>
-      </w:r>
-      <w:r>
-        <w:t xml:space="preserve"> </w:t>
-      </w:r>
-      <w:r>
-        <w:t xml:space="preserve">bar at the top and an</w:t>
-      </w:r>
-      <w:r>
-        <w:t xml:space="preserve"> </w:t>
-      </w:r>
-      <w:r>
-        <w:rPr>
-          <w:b/>
-          <w:bCs/>
-        </w:rPr>
-        <w:t xml:space="preserve">All Types</w:t>
-      </w:r>
-      <w:r>
-        <w:t xml:space="preserve"> </w:t>
-      </w:r>
-      <w:r>
-        <w:t xml:space="preserve">dropdown to filter by item type (Finished Good, Component, Pass-Through, etc.). Each item in the list shows its part number, description, and a type badge (FG, COMP, PT).</w:t>
-      </w:r>
-    </w:p>
-    <w:p>
-      <w:pPr>
-        <w:pStyle w:val="BodyText"/>
-      </w:pPr>
-      <w:r>
-        <w:t xml:space="preserve">Clicking an item loads its detail panel on the right. The header shows the part number, name, and a status badge (e.g.,</w:t>
-      </w:r>
-      <w:r>
-        <w:t xml:space="preserve"> </w:t>
-      </w:r>
-      <w:r>
-        <w:rPr>
-          <w:b/>
-          <w:bCs/>
-        </w:rPr>
-        <w:t xml:space="preserve">Finished Good</w:t>
-      </w:r>
-      <w:r>
-        <w:t xml:space="preserve">), with</w:t>
-      </w:r>
-      <w:r>
-        <w:t xml:space="preserve"> </w:t>
-      </w:r>
-      <w:r>
-        <w:rPr>
-          <w:b/>
-          <w:bCs/>
-        </w:rPr>
-        <w:t xml:space="preserve">Save</w:t>
+        <w:t xml:space="preserve">Before items can have routes, the engineer needs to define the</w:t>
+      </w:r>
+      <w:r>
+        <w:t xml:space="preserve"> </w:t>
+      </w:r>
+      <w:r>
+        <w:rPr>
+          <w:b/>
+          <w:bCs/>
+        </w:rPr>
+        <w:t xml:space="preserve">Operation Templates</w:t>
+      </w:r>
+      <w:r>
+        <w:t xml:space="preserve"> </w:t>
+      </w:r>
+      <w:r>
+        <w:t xml:space="preserve">— the reusable data collection profiles that describe what each type of operation requires. The engineer navigates to</w:t>
+      </w:r>
+      <w:r>
+        <w:t xml:space="preserve"> </w:t>
+      </w:r>
+      <w:r>
+        <w:rPr>
+          <w:b/>
+          <w:bCs/>
+        </w:rPr>
+        <w:t xml:space="preserve">Parts › Operation Templates</w:t>
+      </w:r>
+      <w:r>
+        <w:t xml:space="preserve">. The left panel groups templates by area: Die Cast, Trim Shop, Machine Shop, Assembly. Each template in the list shows its name and version badge. Clicking a template loads its detail on the right:</w:t>
+      </w:r>
+      <w:r>
+        <w:t xml:space="preserve"> </w:t>
+      </w:r>
+      <w:r>
+        <w:rPr>
+          <w:b/>
+          <w:bCs/>
+        </w:rPr>
+        <w:t xml:space="preserve">Code</w:t>
+      </w:r>
+      <w:r>
+        <w:t xml:space="preserve"> </w:t>
+      </w:r>
+      <w:r>
+        <w:t xml:space="preserve">(e.g., DIE-CAST),</w:t>
+      </w:r>
+      <w:r>
+        <w:t xml:space="preserve"> </w:t>
+      </w:r>
+      <w:r>
+        <w:rPr>
+          <w:b/>
+          <w:bCs/>
+        </w:rPr>
+        <w:t xml:space="preserve">Name</w:t>
+      </w:r>
+      <w:r>
+        <w:t xml:space="preserve"> </w:t>
+      </w:r>
+      <w:r>
+        <w:t xml:space="preserve">(Die Cast Operation),</w:t>
+      </w:r>
+      <w:r>
+        <w:t xml:space="preserve"> </w:t>
+      </w:r>
+      <w:r>
+        <w:rPr>
+          <w:b/>
+          <w:bCs/>
+        </w:rPr>
+        <w:t xml:space="preserve">Area</w:t>
+      </w:r>
+      <w:r>
+        <w:t xml:space="preserve"> </w:t>
+      </w:r>
+      <w:r>
+        <w:t xml:space="preserve">(Die Cast dropdown), and</w:t>
+      </w:r>
+      <w:r>
+        <w:t xml:space="preserve"> </w:t>
+      </w:r>
+      <w:r>
+        <w:rPr>
+          <w:b/>
+          <w:bCs/>
+        </w:rPr>
+        <w:t xml:space="preserve">Description</w:t>
+      </w:r>
+      <w:r>
+        <w:t xml:space="preserve"> </w:t>
+      </w:r>
+      <w:r>
+        <w:t xml:space="preserve">(free-text summary, e.g.,</w:t>
+      </w:r>
+      <w:r>
+        <w:t xml:space="preserve"> </w:t>
+      </w:r>
+      <w:r>
+        <w:t xml:space="preserve">“Primary die cast operation with die, cavity, weight, and count collection.”</w:t>
+      </w:r>
+      <w:r>
+        <w:t xml:space="preserve">). Below, the</w:t>
+      </w:r>
+      <w:r>
+        <w:t xml:space="preserve"> </w:t>
+      </w:r>
+      <w:r>
+        <w:rPr>
+          <w:b/>
+          <w:bCs/>
+        </w:rPr>
+        <w:t xml:space="preserve">Data Collection Fields</w:t>
+      </w:r>
+      <w:r>
+        <w:t xml:space="preserve"> </w:t>
+      </w:r>
+      <w:r>
+        <w:t xml:space="preserve">table lists every field the operation captures — columns are</w:t>
+      </w:r>
+      <w:r>
+        <w:t xml:space="preserve"> </w:t>
+      </w:r>
+      <w:r>
+        <w:rPr>
+          <w:b/>
+          <w:bCs/>
+        </w:rPr>
+        <w:t xml:space="preserve">Field</w:t>
       </w:r>
       <w:r>
         <w:t xml:space="preserve"> </w:t>
@@ -1382,335 +1415,58 @@
           <w:b/>
           <w:bCs/>
         </w:rPr>
-        <w:t xml:space="preserve">Deprecate</w:t>
-      </w:r>
-      <w:r>
-        <w:t xml:space="preserve"> </w:t>
-      </w:r>
-      <w:r>
-        <w:t xml:space="preserve">buttons in the top-right corner. The core fields are:</w:t>
-      </w:r>
-      <w:r>
-        <w:t xml:space="preserve"> </w:t>
-      </w:r>
-      <w:r>
-        <w:rPr>
-          <w:b/>
-          <w:bCs/>
-        </w:rPr>
-        <w:t xml:space="preserve">Part Number</w:t>
-      </w:r>
-      <w:r>
-        <w:t xml:space="preserve">,</w:t>
-      </w:r>
-      <w:r>
-        <w:t xml:space="preserve"> </w:t>
-      </w:r>
-      <w:r>
-        <w:rPr>
-          <w:b/>
-          <w:bCs/>
-        </w:rPr>
-        <w:t xml:space="preserve">Item Type</w:t>
-      </w:r>
-      <w:r>
-        <w:t xml:space="preserve"> </w:t>
-      </w:r>
-      <w:r>
-        <w:t xml:space="preserve">(dropdown),</w:t>
-      </w:r>
-      <w:r>
-        <w:t xml:space="preserve"> </w:t>
-      </w:r>
-      <w:r>
-        <w:rPr>
-          <w:b/>
-          <w:bCs/>
-        </w:rPr>
-        <w:t xml:space="preserve">UOM</w:t>
-      </w:r>
-      <w:r>
-        <w:t xml:space="preserve"> </w:t>
-      </w:r>
-      <w:r>
-        <w:t xml:space="preserve">(dropdown),</w:t>
-      </w:r>
-      <w:r>
-        <w:t xml:space="preserve"> </w:t>
-      </w:r>
-      <w:r>
-        <w:rPr>
-          <w:b/>
-          <w:bCs/>
-        </w:rPr>
-        <w:t xml:space="preserve">Description</w:t>
-      </w:r>
-      <w:r>
-        <w:t xml:space="preserve">,</w:t>
-      </w:r>
-      <w:r>
-        <w:t xml:space="preserve"> </w:t>
-      </w:r>
-      <w:r>
-        <w:rPr>
-          <w:b/>
-          <w:bCs/>
-        </w:rPr>
-        <w:t xml:space="preserve">Macola Part #</w:t>
-      </w:r>
-      <w:r>
-        <w:t xml:space="preserve"> </w:t>
-      </w:r>
-      <w:r>
-        <w:t xml:space="preserve">(ERP cross-reference),</w:t>
-      </w:r>
-      <w:r>
-        <w:t xml:space="preserve"> </w:t>
-      </w:r>
-      <w:r>
-        <w:rPr>
-          <w:b/>
-          <w:bCs/>
-        </w:rPr>
-        <w:t xml:space="preserve">Unit Weight</w:t>
-      </w:r>
-      <w:r>
-        <w:t xml:space="preserve">,</w:t>
-      </w:r>
-      <w:r>
-        <w:t xml:space="preserve"> </w:t>
-      </w:r>
-      <w:r>
-        <w:rPr>
-          <w:b/>
-          <w:bCs/>
-        </w:rPr>
-        <w:t xml:space="preserve">Weight UOM</w:t>
-      </w:r>
-      <w:r>
-        <w:t xml:space="preserve">,</w:t>
-      </w:r>
-      <w:r>
-        <w:t xml:space="preserve"> </w:t>
-      </w:r>
-      <w:r>
-        <w:rPr>
-          <w:b/>
-          <w:bCs/>
-        </w:rPr>
-        <w:t xml:space="preserve">Default Sub-Lot Qty</w:t>
-      </w:r>
-      <w:r>
-        <w:t xml:space="preserve"> </w:t>
-      </w:r>
-      <w:r>
-        <w:t xml:space="preserve">(how many pieces per sub-LOT when a parent LOT splits at machining), and</w:t>
-      </w:r>
-      <w:r>
-        <w:t xml:space="preserve"> </w:t>
-      </w:r>
-      <w:r>
-        <w:rPr>
-          <w:b/>
-          <w:bCs/>
-        </w:rPr>
-        <w:t xml:space="preserve">Max Lot Size</w:t>
-      </w:r>
-      <w:r>
-        <w:t xml:space="preserve"> </w:t>
-      </w:r>
-      <w:r>
-        <w:t xml:space="preserve">(reasonability check ceiling).</w:t>
-      </w:r>
-    </w:p>
-    <w:p>
-      <w:pPr>
-        <w:pStyle w:val="BodyText"/>
-      </w:pPr>
-      <w:r>
-        <w:t xml:space="preserve">Below the core fields, a five-tab strip gives access to all item-related configuration:</w:t>
-      </w:r>
-      <w:r>
-        <w:t xml:space="preserve"> </w:t>
-      </w:r>
-      <w:r>
-        <w:rPr>
-          <w:b/>
-          <w:bCs/>
-        </w:rPr>
-        <w:t xml:space="preserve">Container Config</w:t>
-      </w:r>
-      <w:r>
-        <w:t xml:space="preserve">,</w:t>
-      </w:r>
-      <w:r>
-        <w:t xml:space="preserve"> </w:t>
-      </w:r>
-      <w:r>
-        <w:rPr>
-          <w:b/>
-          <w:bCs/>
-        </w:rPr>
-        <w:t xml:space="preserve">Routes</w:t>
-      </w:r>
-      <w:r>
-        <w:t xml:space="preserve">,</w:t>
-      </w:r>
-      <w:r>
-        <w:t xml:space="preserve"> </w:t>
-      </w:r>
-      <w:r>
-        <w:rPr>
-          <w:b/>
-          <w:bCs/>
-        </w:rPr>
-        <w:t xml:space="preserve">BOMs</w:t>
-      </w:r>
-      <w:r>
-        <w:t xml:space="preserve">,</w:t>
-      </w:r>
-      <w:r>
-        <w:t xml:space="preserve"> </w:t>
-      </w:r>
-      <w:r>
-        <w:rPr>
-          <w:b/>
-          <w:bCs/>
-        </w:rPr>
-        <w:t xml:space="preserve">Quality Specs</w:t>
-      </w:r>
-      <w:r>
-        <w:t xml:space="preserve">, and</w:t>
-      </w:r>
-      <w:r>
-        <w:t xml:space="preserve"> </w:t>
-      </w:r>
-      <w:r>
-        <w:rPr>
-          <w:b/>
-          <w:bCs/>
-        </w:rPr>
-        <w:t xml:space="preserve">Eligibility</w:t>
-      </w:r>
-      <w:r>
-        <w:t xml:space="preserve">.</w:t>
-      </w:r>
-    </w:p>
-    <w:p>
-      <w:pPr>
-        <w:pStyle w:val="BodyText"/>
-      </w:pPr>
-      <w:r>
-        <w:t xml:space="preserve">When the engineer clicks</w:t>
-      </w:r>
-      <w:r>
-        <w:t xml:space="preserve"> </w:t>
-      </w:r>
-      <w:r>
-        <w:rPr>
-          <w:b/>
-          <w:bCs/>
-        </w:rPr>
-        <w:t xml:space="preserve">+ Add Item</w:t>
-      </w:r>
-      <w:r>
-        <w:t xml:space="preserve">, a modal appears organized into four sections:</w:t>
-      </w:r>
-      <w:r>
-        <w:t xml:space="preserve"> </w:t>
-      </w:r>
-      <w:r>
-        <w:rPr>
-          <w:b/>
-          <w:bCs/>
-        </w:rPr>
-        <w:t xml:space="preserve">Identity</w:t>
-      </w:r>
-      <w:r>
-        <w:t xml:space="preserve"> </w:t>
-      </w:r>
-      <w:r>
-        <w:t xml:space="preserve">(Part Number — required, Item Type dropdown — required, UOM dropdown — required),</w:t>
-      </w:r>
-      <w:r>
-        <w:t xml:space="preserve"> </w:t>
-      </w:r>
-      <w:r>
-        <w:rPr>
-          <w:b/>
-          <w:bCs/>
-        </w:rPr>
-        <w:t xml:space="preserve">Description</w:t>
-      </w:r>
-      <w:r>
-        <w:t xml:space="preserve"> </w:t>
-      </w:r>
-      <w:r>
-        <w:t xml:space="preserve">(required),</w:t>
-      </w:r>
-      <w:r>
-        <w:t xml:space="preserve"> </w:t>
-      </w:r>
-      <w:r>
-        <w:rPr>
-          <w:b/>
-          <w:bCs/>
-        </w:rPr>
-        <w:t xml:space="preserve">Weight</w:t>
-      </w:r>
-      <w:r>
-        <w:t xml:space="preserve"> </w:t>
-      </w:r>
-      <w:r>
-        <w:t xml:space="preserve">(Unit Weight and Weight UOM dropdown),</w:t>
-      </w:r>
-      <w:r>
-        <w:t xml:space="preserve"> </w:t>
-      </w:r>
-      <w:r>
-        <w:rPr>
-          <w:b/>
-          <w:bCs/>
-        </w:rPr>
-        <w:t xml:space="preserve">Lot Configuration</w:t>
-      </w:r>
-      <w:r>
-        <w:t xml:space="preserve"> </w:t>
-      </w:r>
-      <w:r>
-        <w:t xml:space="preserve">(Default Sub-Lot Qty defaulting to 24, Max Lot Size defaulting to 100), and</w:t>
-      </w:r>
-      <w:r>
-        <w:t xml:space="preserve"> </w:t>
-      </w:r>
-      <w:r>
-        <w:rPr>
-          <w:b/>
-          <w:bCs/>
-        </w:rPr>
-        <w:t xml:space="preserve">ERP Integration</w:t>
-      </w:r>
-      <w:r>
-        <w:t xml:space="preserve"> </w:t>
-      </w:r>
-      <w:r>
-        <w:t xml:space="preserve">(Macola Part # — optional, for future Macola integration). Clicking</w:t>
-      </w:r>
-      <w:r>
-        <w:t xml:space="preserve"> </w:t>
-      </w:r>
-      <w:r>
-        <w:rPr>
-          <w:b/>
-          <w:bCs/>
-        </w:rPr>
-        <w:t xml:space="preserve">Create Item</w:t>
-      </w:r>
-      <w:r>
-        <w:t xml:space="preserve"> </w:t>
-      </w:r>
-      <w:r>
-        <w:t xml:space="preserve">adds the item and opens its detail panel.</w:t>
+        <w:t xml:space="preserve">Required</w:t>
+      </w:r>
+      <w:r>
+        <w:t xml:space="preserve">. For Die Cast Operation v2, five fields are configured: CollectsDieInfo ✓, CollectsCavityInfo ✓, CollectsWeight ✓, CollectsGoodCount ✓, CollectsBadCount □ (not required in this version). Each field row has up/down arrows for reordering and a</w:t>
+      </w:r>
+      <w:r>
+        <w:t xml:space="preserve"> </w:t>
+      </w:r>
+      <w:r>
+        <w:rPr>
+          <w:b/>
+          <w:bCs/>
+        </w:rPr>
+        <w:t xml:space="preserve">Remove</w:t>
+      </w:r>
+      <w:r>
+        <w:t xml:space="preserve"> </w:t>
+      </w:r>
+      <w:r>
+        <w:t xml:space="preserve">button; the</w:t>
+      </w:r>
+      <w:r>
+        <w:t xml:space="preserve"> </w:t>
+      </w:r>
+      <w:r>
+        <w:rPr>
+          <w:b/>
+          <w:bCs/>
+        </w:rPr>
+        <w:t xml:space="preserve">+ Add Field</w:t>
+      </w:r>
+      <w:r>
+        <w:t xml:space="preserve"> </w:t>
+      </w:r>
+      <w:r>
+        <w:t xml:space="preserve">button in the top right of the table adds a new field to the template. A</w:t>
+      </w:r>
+      <w:r>
+        <w:t xml:space="preserve"> </w:t>
+      </w:r>
+      <w:r>
+        <w:rPr>
+          <w:b/>
+          <w:bCs/>
+        </w:rPr>
+        <w:t xml:space="preserve">New Version</w:t>
+      </w:r>
+      <w:r>
+        <w:t xml:space="preserve"> </w:t>
+      </w:r>
+      <w:r>
+        <w:t xml:space="preserve">button clones the published template into a draft for editing — published templates are read-only.</w:t>
       </w:r>
     </w:p>
     <w:p>
@@ -1720,20 +1476,540 @@
       <w:r>
         <w:drawing>
           <wp:inline>
-            <wp:extent cx="5334000" cy="4161692"/>
+            <wp:extent cx="5334000" cy="2647492"/>
             <wp:effectExtent b="0" l="0" r="0" t="0"/>
-            <wp:docPr descr="Add Item Modal" title="" id="19" name="Picture"/>
+            <wp:docPr descr="Operation Templates Screen — Die Cast Operation v2 with Data Collection Fields" title="" id="19" name="Picture"/>
             <a:graphic>
               <a:graphicData uri="http://schemas.openxmlformats.org/drawingml/2006/picture">
                 <pic:pic>
                   <pic:nvPicPr>
-                    <pic:cNvPr descr="docs/screenshots/screen-add-item-modal.png" id="20" name="Picture"/>
+                    <pic:cNvPr descr="docs/screenshots/screen-operation-templates.png" id="20" name="Picture"/>
                     <pic:cNvPicPr>
                       <a:picLocks noChangeArrowheads="1" noChangeAspect="1"/>
                     </pic:cNvPicPr>
                   </pic:nvPicPr>
                   <pic:blipFill>
                     <a:blip r:embed="rId18"/>
+                    <a:stretch>
+                      <a:fillRect/>
+                    </a:stretch>
+                  </pic:blipFill>
+                  <pic:spPr bwMode="auto">
+                    <a:xfrm>
+                      <a:off x="0" y="0"/>
+                      <a:ext cx="5334000" cy="2647492"/>
+                    </a:xfrm>
+                    <a:prstGeom prst="rect">
+                      <a:avLst/>
+                    </a:prstGeom>
+                    <a:noFill/>
+                    <a:ln w="9525">
+                      <a:noFill/>
+                      <a:headEnd/>
+                      <a:tailEnd/>
+                    </a:ln>
+                  </pic:spPr>
+                </pic:pic>
+              </a:graphicData>
+            </a:graphic>
+          </wp:inline>
+        </w:drawing>
+      </w:r>
+    </w:p>
+    <w:p>
+      <w:pPr>
+        <w:pStyle w:val="ImageCaption"/>
+      </w:pPr>
+      <w:r>
+        <w:t xml:space="preserve">Operation Templates Screen — Die Cast Operation v2 with Data Collection Fields</w:t>
+      </w:r>
+    </w:p>
+    <w:p>
+      <w:pPr>
+        <w:pStyle w:val="BodyText"/>
+      </w:pPr>
+      <w:r>
+        <w:t xml:space="preserve">With templates defined, the engineer moves to the item master to create parts and attach routes that reference them.</w:t>
+      </w:r>
+    </w:p>
+    <w:bookmarkEnd w:id="21"/>
+    <w:bookmarkStart w:id="40" w:name="defining-what-we-make"/>
+    <w:p>
+      <w:pPr>
+        <w:pStyle w:val="Heading3"/>
+      </w:pPr>
+      <w:r>
+        <w:t xml:space="preserve">Defining What We Make</w:t>
+      </w:r>
+    </w:p>
+    <w:p>
+      <w:pPr>
+        <w:pStyle w:val="FirstParagraph"/>
+      </w:pPr>
+      <w:r>
+        <w:t xml:space="preserve">Next, the item master. The engineer navigates to the</w:t>
+      </w:r>
+      <w:r>
+        <w:t xml:space="preserve"> </w:t>
+      </w:r>
+      <w:r>
+        <w:rPr>
+          <w:b/>
+          <w:bCs/>
+        </w:rPr>
+        <w:t xml:space="preserve">Parts</w:t>
+      </w:r>
+      <w:r>
+        <w:t xml:space="preserve"> </w:t>
+      </w:r>
+      <w:r>
+        <w:t xml:space="preserve">category in the left rail and opens the</w:t>
+      </w:r>
+      <w:r>
+        <w:t xml:space="preserve"> </w:t>
+      </w:r>
+      <w:r>
+        <w:rPr>
+          <w:b/>
+          <w:bCs/>
+        </w:rPr>
+        <w:t xml:space="preserve">Item Master</w:t>
+      </w:r>
+      <w:r>
+        <w:t xml:space="preserve"> </w:t>
+      </w:r>
+      <w:r>
+        <w:t xml:space="preserve">screen. The left panel shows a searchable, filterable list of all items — a</w:t>
+      </w:r>
+      <w:r>
+        <w:t xml:space="preserve"> </w:t>
+      </w:r>
+      <w:r>
+        <w:rPr>
+          <w:b/>
+          <w:bCs/>
+        </w:rPr>
+        <w:t xml:space="preserve">Search items…</w:t>
+      </w:r>
+      <w:r>
+        <w:t xml:space="preserve"> </w:t>
+      </w:r>
+      <w:r>
+        <w:t xml:space="preserve">bar at the top and an</w:t>
+      </w:r>
+      <w:r>
+        <w:t xml:space="preserve"> </w:t>
+      </w:r>
+      <w:r>
+        <w:rPr>
+          <w:b/>
+          <w:bCs/>
+        </w:rPr>
+        <w:t xml:space="preserve">All Types</w:t>
+      </w:r>
+      <w:r>
+        <w:t xml:space="preserve"> </w:t>
+      </w:r>
+      <w:r>
+        <w:t xml:space="preserve">dropdown to filter by item type (Finished Good, Component, Pass-Through, etc.). Each item in the list shows its part number, description, and a type badge (FG, COMP, PT).</w:t>
+      </w:r>
+    </w:p>
+    <w:p>
+      <w:pPr>
+        <w:pStyle w:val="BodyText"/>
+      </w:pPr>
+      <w:r>
+        <w:t xml:space="preserve">Clicking an item loads its detail panel on the right. The header shows the part number, name, and a status badge (e.g.,</w:t>
+      </w:r>
+      <w:r>
+        <w:t xml:space="preserve"> </w:t>
+      </w:r>
+      <w:r>
+        <w:rPr>
+          <w:b/>
+          <w:bCs/>
+        </w:rPr>
+        <w:t xml:space="preserve">Finished Good</w:t>
+      </w:r>
+      <w:r>
+        <w:t xml:space="preserve">), with</w:t>
+      </w:r>
+      <w:r>
+        <w:t xml:space="preserve"> </w:t>
+      </w:r>
+      <w:r>
+        <w:rPr>
+          <w:b/>
+          <w:bCs/>
+        </w:rPr>
+        <w:t xml:space="preserve">Save</w:t>
+      </w:r>
+      <w:r>
+        <w:t xml:space="preserve"> </w:t>
+      </w:r>
+      <w:r>
+        <w:t xml:space="preserve">and</w:t>
+      </w:r>
+      <w:r>
+        <w:t xml:space="preserve"> </w:t>
+      </w:r>
+      <w:r>
+        <w:rPr>
+          <w:b/>
+          <w:bCs/>
+        </w:rPr>
+        <w:t xml:space="preserve">Deprecate</w:t>
+      </w:r>
+      <w:r>
+        <w:t xml:space="preserve"> </w:t>
+      </w:r>
+      <w:r>
+        <w:t xml:space="preserve">buttons in the top-right corner. The core fields are:</w:t>
+      </w:r>
+      <w:r>
+        <w:t xml:space="preserve"> </w:t>
+      </w:r>
+      <w:r>
+        <w:rPr>
+          <w:b/>
+          <w:bCs/>
+        </w:rPr>
+        <w:t xml:space="preserve">Part Number</w:t>
+      </w:r>
+      <w:r>
+        <w:t xml:space="preserve">,</w:t>
+      </w:r>
+      <w:r>
+        <w:t xml:space="preserve"> </w:t>
+      </w:r>
+      <w:r>
+        <w:rPr>
+          <w:b/>
+          <w:bCs/>
+        </w:rPr>
+        <w:t xml:space="preserve">Item Type</w:t>
+      </w:r>
+      <w:r>
+        <w:t xml:space="preserve"> </w:t>
+      </w:r>
+      <w:r>
+        <w:t xml:space="preserve">(dropdown),</w:t>
+      </w:r>
+      <w:r>
+        <w:t xml:space="preserve"> </w:t>
+      </w:r>
+      <w:r>
+        <w:rPr>
+          <w:b/>
+          <w:bCs/>
+        </w:rPr>
+        <w:t xml:space="preserve">UOM</w:t>
+      </w:r>
+      <w:r>
+        <w:t xml:space="preserve"> </w:t>
+      </w:r>
+      <w:r>
+        <w:t xml:space="preserve">(dropdown),</w:t>
+      </w:r>
+      <w:r>
+        <w:t xml:space="preserve"> </w:t>
+      </w:r>
+      <w:r>
+        <w:rPr>
+          <w:b/>
+          <w:bCs/>
+        </w:rPr>
+        <w:t xml:space="preserve">Description</w:t>
+      </w:r>
+      <w:r>
+        <w:t xml:space="preserve">,</w:t>
+      </w:r>
+      <w:r>
+        <w:t xml:space="preserve"> </w:t>
+      </w:r>
+      <w:r>
+        <w:rPr>
+          <w:b/>
+          <w:bCs/>
+        </w:rPr>
+        <w:t xml:space="preserve">Macola Part #</w:t>
+      </w:r>
+      <w:r>
+        <w:t xml:space="preserve"> </w:t>
+      </w:r>
+      <w:r>
+        <w:t xml:space="preserve">(ERP cross-reference),</w:t>
+      </w:r>
+      <w:r>
+        <w:t xml:space="preserve"> </w:t>
+      </w:r>
+      <w:r>
+        <w:rPr>
+          <w:b/>
+          <w:bCs/>
+        </w:rPr>
+        <w:t xml:space="preserve">Unit Weight</w:t>
+      </w:r>
+      <w:r>
+        <w:t xml:space="preserve">,</w:t>
+      </w:r>
+      <w:r>
+        <w:t xml:space="preserve"> </w:t>
+      </w:r>
+      <w:r>
+        <w:rPr>
+          <w:b/>
+          <w:bCs/>
+        </w:rPr>
+        <w:t xml:space="preserve">Weight UOM</w:t>
+      </w:r>
+      <w:r>
+        <w:t xml:space="preserve">,</w:t>
+      </w:r>
+      <w:r>
+        <w:t xml:space="preserve"> </w:t>
+      </w:r>
+      <w:r>
+        <w:rPr>
+          <w:b/>
+          <w:bCs/>
+        </w:rPr>
+        <w:t xml:space="preserve">Default Sub-Lot Qty</w:t>
+      </w:r>
+      <w:r>
+        <w:t xml:space="preserve"> </w:t>
+      </w:r>
+      <w:r>
+        <w:t xml:space="preserve">(how many pieces per sub-LOT when a parent LOT splits at machining), and</w:t>
+      </w:r>
+      <w:r>
+        <w:t xml:space="preserve"> </w:t>
+      </w:r>
+      <w:r>
+        <w:rPr>
+          <w:b/>
+          <w:bCs/>
+        </w:rPr>
+        <w:t xml:space="preserve">Max Lot Size</w:t>
+      </w:r>
+      <w:r>
+        <w:t xml:space="preserve"> </w:t>
+      </w:r>
+      <w:r>
+        <w:t xml:space="preserve">(reasonability check ceiling).</w:t>
+      </w:r>
+    </w:p>
+    <w:p>
+      <w:pPr>
+        <w:pStyle w:val="BodyText"/>
+      </w:pPr>
+      <w:r>
+        <w:t xml:space="preserve">Below the core fields, a five-tab strip gives access to all item-related configuration:</w:t>
+      </w:r>
+      <w:r>
+        <w:t xml:space="preserve"> </w:t>
+      </w:r>
+      <w:r>
+        <w:rPr>
+          <w:b/>
+          <w:bCs/>
+        </w:rPr>
+        <w:t xml:space="preserve">Container Config</w:t>
+      </w:r>
+      <w:r>
+        <w:t xml:space="preserve">,</w:t>
+      </w:r>
+      <w:r>
+        <w:t xml:space="preserve"> </w:t>
+      </w:r>
+      <w:r>
+        <w:rPr>
+          <w:b/>
+          <w:bCs/>
+        </w:rPr>
+        <w:t xml:space="preserve">Routes</w:t>
+      </w:r>
+      <w:r>
+        <w:t xml:space="preserve">,</w:t>
+      </w:r>
+      <w:r>
+        <w:t xml:space="preserve"> </w:t>
+      </w:r>
+      <w:r>
+        <w:rPr>
+          <w:b/>
+          <w:bCs/>
+        </w:rPr>
+        <w:t xml:space="preserve">BOMs</w:t>
+      </w:r>
+      <w:r>
+        <w:t xml:space="preserve">,</w:t>
+      </w:r>
+      <w:r>
+        <w:t xml:space="preserve"> </w:t>
+      </w:r>
+      <w:r>
+        <w:rPr>
+          <w:b/>
+          <w:bCs/>
+        </w:rPr>
+        <w:t xml:space="preserve">Quality Specs</w:t>
+      </w:r>
+      <w:r>
+        <w:t xml:space="preserve">, and</w:t>
+      </w:r>
+      <w:r>
+        <w:t xml:space="preserve"> </w:t>
+      </w:r>
+      <w:r>
+        <w:rPr>
+          <w:b/>
+          <w:bCs/>
+        </w:rPr>
+        <w:t xml:space="preserve">Eligibility</w:t>
+      </w:r>
+      <w:r>
+        <w:t xml:space="preserve">.</w:t>
+      </w:r>
+    </w:p>
+    <w:p>
+      <w:pPr>
+        <w:pStyle w:val="BodyText"/>
+      </w:pPr>
+      <w:r>
+        <w:t xml:space="preserve">When the engineer clicks</w:t>
+      </w:r>
+      <w:r>
+        <w:t xml:space="preserve"> </w:t>
+      </w:r>
+      <w:r>
+        <w:rPr>
+          <w:b/>
+          <w:bCs/>
+        </w:rPr>
+        <w:t xml:space="preserve">+ Add Item</w:t>
+      </w:r>
+      <w:r>
+        <w:t xml:space="preserve">, a modal appears organized into four sections:</w:t>
+      </w:r>
+      <w:r>
+        <w:t xml:space="preserve"> </w:t>
+      </w:r>
+      <w:r>
+        <w:rPr>
+          <w:b/>
+          <w:bCs/>
+        </w:rPr>
+        <w:t xml:space="preserve">Identity</w:t>
+      </w:r>
+      <w:r>
+        <w:t xml:space="preserve"> </w:t>
+      </w:r>
+      <w:r>
+        <w:t xml:space="preserve">(Part Number — required, Item Type dropdown — required, UOM dropdown — required),</w:t>
+      </w:r>
+      <w:r>
+        <w:t xml:space="preserve"> </w:t>
+      </w:r>
+      <w:r>
+        <w:rPr>
+          <w:b/>
+          <w:bCs/>
+        </w:rPr>
+        <w:t xml:space="preserve">Description</w:t>
+      </w:r>
+      <w:r>
+        <w:t xml:space="preserve"> </w:t>
+      </w:r>
+      <w:r>
+        <w:t xml:space="preserve">(required),</w:t>
+      </w:r>
+      <w:r>
+        <w:t xml:space="preserve"> </w:t>
+      </w:r>
+      <w:r>
+        <w:rPr>
+          <w:b/>
+          <w:bCs/>
+        </w:rPr>
+        <w:t xml:space="preserve">Weight</w:t>
+      </w:r>
+      <w:r>
+        <w:t xml:space="preserve"> </w:t>
+      </w:r>
+      <w:r>
+        <w:t xml:space="preserve">(Unit Weight and Weight UOM dropdown),</w:t>
+      </w:r>
+      <w:r>
+        <w:t xml:space="preserve"> </w:t>
+      </w:r>
+      <w:r>
+        <w:rPr>
+          <w:b/>
+          <w:bCs/>
+        </w:rPr>
+        <w:t xml:space="preserve">Lot Configuration</w:t>
+      </w:r>
+      <w:r>
+        <w:t xml:space="preserve"> </w:t>
+      </w:r>
+      <w:r>
+        <w:t xml:space="preserve">(Default Sub-Lot Qty defaulting to 24, Max Lot Size defaulting to 100), and</w:t>
+      </w:r>
+      <w:r>
+        <w:t xml:space="preserve"> </w:t>
+      </w:r>
+      <w:r>
+        <w:rPr>
+          <w:b/>
+          <w:bCs/>
+        </w:rPr>
+        <w:t xml:space="preserve">ERP Integration</w:t>
+      </w:r>
+      <w:r>
+        <w:t xml:space="preserve"> </w:t>
+      </w:r>
+      <w:r>
+        <w:t xml:space="preserve">(Macola Part # — optional, for future Macola integration). Clicking</w:t>
+      </w:r>
+      <w:r>
+        <w:t xml:space="preserve"> </w:t>
+      </w:r>
+      <w:r>
+        <w:rPr>
+          <w:b/>
+          <w:bCs/>
+        </w:rPr>
+        <w:t xml:space="preserve">Create Item</w:t>
+      </w:r>
+      <w:r>
+        <w:t xml:space="preserve"> </w:t>
+      </w:r>
+      <w:r>
+        <w:t xml:space="preserve">adds the item and opens its detail panel.</w:t>
+      </w:r>
+    </w:p>
+    <w:p>
+      <w:pPr>
+        <w:pStyle w:val="CaptionedFigure"/>
+      </w:pPr>
+      <w:r>
+        <w:drawing>
+          <wp:inline>
+            <wp:extent cx="5334000" cy="4161692"/>
+            <wp:effectExtent b="0" l="0" r="0" t="0"/>
+            <wp:docPr descr="Add Item Modal" title="" id="23" name="Picture"/>
+            <a:graphic>
+              <a:graphicData uri="http://schemas.openxmlformats.org/drawingml/2006/picture">
+                <pic:pic>
+                  <pic:nvPicPr>
+                    <pic:cNvPr descr="docs/screenshots/screen-add-item-modal.png" id="24" name="Picture"/>
+                    <pic:cNvPicPr>
+                      <a:picLocks noChangeArrowheads="1" noChangeAspect="1"/>
+                    </pic:cNvPicPr>
+                  </pic:nvPicPr>
+                  <pic:blipFill>
+                    <a:blip r:embed="rId22"/>
                     <a:stretch>
                       <a:fillRect/>
                     </a:stretch>
@@ -1881,18 +2157,18 @@
           <wp:inline>
             <wp:extent cx="5334000" cy="2639131"/>
             <wp:effectExtent b="0" l="0" r="0" t="0"/>
-            <wp:docPr descr="Item Master Screen — 5G0 Front Cover Assembly, Container Config tab" title="" id="22" name="Picture"/>
+            <wp:docPr descr="Item Master Screen — 5G0 Front Cover Assembly, Container Config tab" title="" id="26" name="Picture"/>
             <a:graphic>
               <a:graphicData uri="http://schemas.openxmlformats.org/drawingml/2006/picture">
                 <pic:pic>
                   <pic:nvPicPr>
-                    <pic:cNvPr descr="docs/screenshots/screen-item-master.png" id="23" name="Picture"/>
+                    <pic:cNvPr descr="docs/screenshots/screen-item-master.png" id="27" name="Picture"/>
                     <pic:cNvPicPr>
                       <a:picLocks noChangeArrowheads="1" noChangeAspect="1"/>
                     </pic:cNvPicPr>
                   </pic:nvPicPr>
                   <pic:blipFill>
-                    <a:blip r:embed="rId21"/>
+                    <a:blip r:embed="rId25"/>
                     <a:stretch>
                       <a:fillRect/>
                     </a:stretch>
@@ -2051,7 +2327,7 @@
         <w:t xml:space="preserve"> </w:t>
       </w:r>
       <w:r>
-        <w:t xml:space="preserve">— a summary of what data fields are collected at each step. For the 5G0, the published v2 route has 5 steps: Die Cast (Die Cast area — Die, Cavity, Weight, Good, Bad), Trim (Trim Shop — Weight, Good, Bad), CNC Machining (Machine Shop — Good, Bad), Assembly Front (Die Cast — Serial, Material Verify, Good, Bad), and Pack &amp; Ship (Prod Control — Good). A footer note reminds the user that published routes are read-only.</w:t>
+        <w:t xml:space="preserve">— a summary of what data fields are collected at each step. Each step references an operation template — the Die Cast step pulls from Die Cast Operation v2, which determines the specific fields shown in the Data Collection column. For the 5G0, the published v2 route has 5 steps: Die Cast (Die Cast area — Die, Cavity, Weight, Good, Bad), Trim (Trim Shop — Weight, Good, Bad), CNC Machining (Machine Shop — Good, Bad), Assembly Front (Die Cast — Serial, Material Verify, Good, Bad), and Pack &amp; Ship (Prod Control — Good). A footer note reminds the user that published routes are read-only.</w:t>
       </w:r>
     </w:p>
     <w:p>
@@ -2063,18 +2339,18 @@
           <wp:inline>
             <wp:extent cx="5334000" cy="1868765"/>
             <wp:effectExtent b="0" l="0" r="0" t="0"/>
-            <wp:docPr descr="Item Routes Tab — 5G0 v2 Published Route" title="" id="25" name="Picture"/>
+            <wp:docPr descr="Item Routes Tab — 5G0 v2 Published Route" title="" id="29" name="Picture"/>
             <a:graphic>
               <a:graphicData uri="http://schemas.openxmlformats.org/drawingml/2006/picture">
                 <pic:pic>
                   <pic:nvPicPr>
-                    <pic:cNvPr descr="docs/screenshots/screen-item-routes-tab.png" id="26" name="Picture"/>
+                    <pic:cNvPr descr="docs/screenshots/screen-item-routes-tab.png" id="30" name="Picture"/>
                     <pic:cNvPicPr>
                       <a:picLocks noChangeArrowheads="1" noChangeAspect="1"/>
                     </pic:cNvPicPr>
                   </pic:nvPicPr>
                   <pic:blipFill>
-                    <a:blip r:embed="rId24"/>
+                    <a:blip r:embed="rId28"/>
                     <a:stretch>
                       <a:fillRect/>
                     </a:stretch>
@@ -2158,18 +2434,18 @@
           <wp:inline>
             <wp:extent cx="5334000" cy="2321243"/>
             <wp:effectExtent b="0" l="0" r="0" t="0"/>
-            <wp:docPr descr="Item BOMs Tab — 5G0 v1 Published BOM" title="" id="28" name="Picture"/>
+            <wp:docPr descr="Item BOMs Tab — 5G0 v1 Published BOM" title="" id="32" name="Picture"/>
             <a:graphic>
               <a:graphicData uri="http://schemas.openxmlformats.org/drawingml/2006/picture">
                 <pic:pic>
                   <pic:nvPicPr>
-                    <pic:cNvPr descr="docs/screenshots/screen-item-boms-tab.png" id="29" name="Picture"/>
+                    <pic:cNvPr descr="docs/screenshots/screen-item-boms-tab.png" id="33" name="Picture"/>
                     <pic:cNvPicPr>
                       <a:picLocks noChangeArrowheads="1" noChangeAspect="1"/>
                     </pic:cNvPicPr>
                   </pic:nvPicPr>
                   <pic:blipFill>
-                    <a:blip r:embed="rId27"/>
+                    <a:blip r:embed="rId31"/>
                     <a:stretch>
                       <a:fillRect/>
                     </a:stretch>
@@ -2295,18 +2571,18 @@
           <wp:inline>
             <wp:extent cx="5334000" cy="2321902"/>
             <wp:effectExtent b="0" l="0" r="0" t="0"/>
-            <wp:docPr descr="Item Quality Specs Tab — Linked specs for 5G0 Front Cover" title="" id="31" name="Picture"/>
+            <wp:docPr descr="Item Quality Specs Tab — Linked specs for 5G0 Front Cover" title="" id="35" name="Picture"/>
             <a:graphic>
               <a:graphicData uri="http://schemas.openxmlformats.org/drawingml/2006/picture">
                 <pic:pic>
                   <pic:nvPicPr>
-                    <pic:cNvPr descr="docs/screenshots/screen-item-quality-specs-tab.png" id="32" name="Picture"/>
+                    <pic:cNvPr descr="docs/screenshots/screen-item-quality-specs-tab.png" id="36" name="Picture"/>
                     <pic:cNvPicPr>
                       <a:picLocks noChangeArrowheads="1" noChangeAspect="1"/>
                     </pic:cNvPicPr>
                   </pic:nvPicPr>
                   <pic:blipFill>
-                    <a:blip r:embed="rId30"/>
+                    <a:blip r:embed="rId34"/>
                     <a:stretch>
                       <a:fillRect/>
                     </a:stretch>
@@ -2406,18 +2682,18 @@
           <wp:inline>
             <wp:extent cx="5334000" cy="2333625"/>
             <wp:effectExtent b="0" l="0" r="0" t="0"/>
-            <wp:docPr descr="Item Eligibility Tab — Machine eligibility for 5G0 in Die Cast area" title="" id="34" name="Picture"/>
+            <wp:docPr descr="Item Eligibility Tab — Machine eligibility for 5G0 in Die Cast area" title="" id="38" name="Picture"/>
             <a:graphic>
               <a:graphicData uri="http://schemas.openxmlformats.org/drawingml/2006/picture">
                 <pic:pic>
                   <pic:nvPicPr>
-                    <pic:cNvPr descr="docs/screenshots/screen-item-eligibility-tab.png" id="35" name="Picture"/>
+                    <pic:cNvPr descr="docs/screenshots/screen-item-eligibility-tab.png" id="39" name="Picture"/>
                     <pic:cNvPicPr>
                       <a:picLocks noChangeArrowheads="1" noChangeAspect="1"/>
                     </pic:cNvPicPr>
                   </pic:nvPicPr>
                   <pic:blipFill>
-                    <a:blip r:embed="rId33"/>
+                    <a:blip r:embed="rId37"/>
                     <a:stretch>
                       <a:fillRect/>
                     </a:stretch>
@@ -2450,370 +2726,6 @@
       </w:pPr>
       <w:r>
         <w:t xml:space="preserve">Item Eligibility Tab — Machine eligibility for 5G0 in Die Cast area</w:t>
-      </w:r>
-    </w:p>
-    <w:bookmarkEnd w:id="36"/>
-    <w:bookmarkStart w:id="40" w:name="defining-how-we-make-it"/>
-    <w:p>
-      <w:pPr>
-        <w:pStyle w:val="Heading3"/>
-      </w:pPr>
-      <w:r>
-        <w:t xml:space="preserve">Defining How We Make It</w:t>
-      </w:r>
-    </w:p>
-    <w:p>
-      <w:pPr>
-        <w:pStyle w:val="FirstParagraph"/>
-      </w:pPr>
-      <w:r>
-        <w:t xml:space="preserve">Before routes can be assigned to items, the engineer needs to define the</w:t>
-      </w:r>
-      <w:r>
-        <w:t xml:space="preserve"> </w:t>
-      </w:r>
-      <w:r>
-        <w:rPr>
-          <w:b/>
-          <w:bCs/>
-        </w:rPr>
-        <w:t xml:space="preserve">Operation Templates</w:t>
-      </w:r>
-      <w:r>
-        <w:t xml:space="preserve"> </w:t>
-      </w:r>
-      <w:r>
-        <w:t xml:space="preserve">— the reusable data collection profiles that describe what each type of operation requires. The engineer navigates to</w:t>
-      </w:r>
-      <w:r>
-        <w:t xml:space="preserve"> </w:t>
-      </w:r>
-      <w:r>
-        <w:rPr>
-          <w:b/>
-          <w:bCs/>
-        </w:rPr>
-        <w:t xml:space="preserve">Parts › Operation Templates</w:t>
-      </w:r>
-      <w:r>
-        <w:t xml:space="preserve">. The left panel groups templates by area: Die Cast, Trim Shop, Machine Shop, Assembly. Each template in the list shows its name and version badge. Clicking a template loads its detail on the right:</w:t>
-      </w:r>
-      <w:r>
-        <w:t xml:space="preserve"> </w:t>
-      </w:r>
-      <w:r>
-        <w:rPr>
-          <w:b/>
-          <w:bCs/>
-        </w:rPr>
-        <w:t xml:space="preserve">Code</w:t>
-      </w:r>
-      <w:r>
-        <w:t xml:space="preserve"> </w:t>
-      </w:r>
-      <w:r>
-        <w:t xml:space="preserve">(e.g., DIE-CAST),</w:t>
-      </w:r>
-      <w:r>
-        <w:t xml:space="preserve"> </w:t>
-      </w:r>
-      <w:r>
-        <w:rPr>
-          <w:b/>
-          <w:bCs/>
-        </w:rPr>
-        <w:t xml:space="preserve">Name</w:t>
-      </w:r>
-      <w:r>
-        <w:t xml:space="preserve"> </w:t>
-      </w:r>
-      <w:r>
-        <w:t xml:space="preserve">(Die Cast Operation),</w:t>
-      </w:r>
-      <w:r>
-        <w:t xml:space="preserve"> </w:t>
-      </w:r>
-      <w:r>
-        <w:rPr>
-          <w:b/>
-          <w:bCs/>
-        </w:rPr>
-        <w:t xml:space="preserve">Area</w:t>
-      </w:r>
-      <w:r>
-        <w:t xml:space="preserve"> </w:t>
-      </w:r>
-      <w:r>
-        <w:t xml:space="preserve">(Die Cast dropdown), and</w:t>
-      </w:r>
-      <w:r>
-        <w:t xml:space="preserve"> </w:t>
-      </w:r>
-      <w:r>
-        <w:rPr>
-          <w:b/>
-          <w:bCs/>
-        </w:rPr>
-        <w:t xml:space="preserve">Description</w:t>
-      </w:r>
-      <w:r>
-        <w:t xml:space="preserve"> </w:t>
-      </w:r>
-      <w:r>
-        <w:t xml:space="preserve">(free-text summary, e.g.,</w:t>
-      </w:r>
-      <w:r>
-        <w:t xml:space="preserve"> </w:t>
-      </w:r>
-      <w:r>
-        <w:t xml:space="preserve">“Primary die cast operation with die, cavity, weight, and count collection.”</w:t>
-      </w:r>
-      <w:r>
-        <w:t xml:space="preserve">). Below, the</w:t>
-      </w:r>
-      <w:r>
-        <w:t xml:space="preserve"> </w:t>
-      </w:r>
-      <w:r>
-        <w:rPr>
-          <w:b/>
-          <w:bCs/>
-        </w:rPr>
-        <w:t xml:space="preserve">Data Collection Fields</w:t>
-      </w:r>
-      <w:r>
-        <w:t xml:space="preserve"> </w:t>
-      </w:r>
-      <w:r>
-        <w:t xml:space="preserve">table lists every field the operation captures — columns are</w:t>
-      </w:r>
-      <w:r>
-        <w:t xml:space="preserve"> </w:t>
-      </w:r>
-      <w:r>
-        <w:rPr>
-          <w:b/>
-          <w:bCs/>
-        </w:rPr>
-        <w:t xml:space="preserve">Field</w:t>
-      </w:r>
-      <w:r>
-        <w:t xml:space="preserve"> </w:t>
-      </w:r>
-      <w:r>
-        <w:t xml:space="preserve">and</w:t>
-      </w:r>
-      <w:r>
-        <w:t xml:space="preserve"> </w:t>
-      </w:r>
-      <w:r>
-        <w:rPr>
-          <w:b/>
-          <w:bCs/>
-        </w:rPr>
-        <w:t xml:space="preserve">Required</w:t>
-      </w:r>
-      <w:r>
-        <w:t xml:space="preserve">. For Die Cast Operation v2, five fields are configured: CollectsDieInfo ✓, CollectsCavityInfo ✓, CollectsWeight ✓, CollectsGoodCount ✓, CollectsBadCount □ (not required in this version). Each field row has up/down arrows for reordering and a</w:t>
-      </w:r>
-      <w:r>
-        <w:t xml:space="preserve"> </w:t>
-      </w:r>
-      <w:r>
-        <w:rPr>
-          <w:b/>
-          <w:bCs/>
-        </w:rPr>
-        <w:t xml:space="preserve">Remove</w:t>
-      </w:r>
-      <w:r>
-        <w:t xml:space="preserve"> </w:t>
-      </w:r>
-      <w:r>
-        <w:t xml:space="preserve">button; the</w:t>
-      </w:r>
-      <w:r>
-        <w:t xml:space="preserve"> </w:t>
-      </w:r>
-      <w:r>
-        <w:rPr>
-          <w:b/>
-          <w:bCs/>
-        </w:rPr>
-        <w:t xml:space="preserve">+ Add Field</w:t>
-      </w:r>
-      <w:r>
-        <w:t xml:space="preserve"> </w:t>
-      </w:r>
-      <w:r>
-        <w:t xml:space="preserve">button in the top right of the table adds a new field to the template. A</w:t>
-      </w:r>
-      <w:r>
-        <w:t xml:space="preserve"> </w:t>
-      </w:r>
-      <w:r>
-        <w:rPr>
-          <w:b/>
-          <w:bCs/>
-        </w:rPr>
-        <w:t xml:space="preserve">New Version</w:t>
-      </w:r>
-      <w:r>
-        <w:t xml:space="preserve"> </w:t>
-      </w:r>
-      <w:r>
-        <w:t xml:space="preserve">button clones the published template into a draft for editing — published templates are read-only.</w:t>
-      </w:r>
-    </w:p>
-    <w:p>
-      <w:pPr>
-        <w:pStyle w:val="CaptionedFigure"/>
-      </w:pPr>
-      <w:r>
-        <w:drawing>
-          <wp:inline>
-            <wp:extent cx="5334000" cy="2647492"/>
-            <wp:effectExtent b="0" l="0" r="0" t="0"/>
-            <wp:docPr descr="Operation Templates Screen — Die Cast Operation v2 with Data Collection Fields" title="" id="38" name="Picture"/>
-            <a:graphic>
-              <a:graphicData uri="http://schemas.openxmlformats.org/drawingml/2006/picture">
-                <pic:pic>
-                  <pic:nvPicPr>
-                    <pic:cNvPr descr="docs/screenshots/screen-operation-templates.png" id="39" name="Picture"/>
-                    <pic:cNvPicPr>
-                      <a:picLocks noChangeArrowheads="1" noChangeAspect="1"/>
-                    </pic:cNvPicPr>
-                  </pic:nvPicPr>
-                  <pic:blipFill>
-                    <a:blip r:embed="rId37"/>
-                    <a:stretch>
-                      <a:fillRect/>
-                    </a:stretch>
-                  </pic:blipFill>
-                  <pic:spPr bwMode="auto">
-                    <a:xfrm>
-                      <a:off x="0" y="0"/>
-                      <a:ext cx="5334000" cy="2647492"/>
-                    </a:xfrm>
-                    <a:prstGeom prst="rect">
-                      <a:avLst/>
-                    </a:prstGeom>
-                    <a:noFill/>
-                    <a:ln w="9525">
-                      <a:noFill/>
-                      <a:headEnd/>
-                      <a:tailEnd/>
-                    </a:ln>
-                  </pic:spPr>
-                </pic:pic>
-              </a:graphicData>
-            </a:graphic>
-          </wp:inline>
-        </w:drawing>
-      </w:r>
-    </w:p>
-    <w:p>
-      <w:pPr>
-        <w:pStyle w:val="ImageCaption"/>
-      </w:pPr>
-      <w:r>
-        <w:t xml:space="preserve">Operation Templates Screen — Die Cast Operation v2 with Data Collection Fields</w:t>
-      </w:r>
-    </w:p>
-    <w:p>
-      <w:pPr>
-        <w:pStyle w:val="BodyText"/>
-      </w:pPr>
-      <w:r>
-        <w:t xml:space="preserve">Routes, BOMs, quality specs, and machine eligibility are all managed directly from the Item Master’s tab strip — the engineer never needs to leave the item record to configure the full production picture for a part.</w:t>
-      </w:r>
-    </w:p>
-    <w:p>
-      <w:pPr>
-        <w:pStyle w:val="BodyText"/>
-      </w:pPr>
-      <w:r>
-        <w:t xml:space="preserve">Routes define the ordered sequence of operations an item passes through. The 5G0’s published v2 route has five steps — Die Cast → Trim → CNC Machining → Assembly Front → Pack &amp; Ship — each mapped to an area and a data collection profile. The data collection profile is driven by the operation template at that step: Die Cast collects die info, cavity, weight, good count, and bad count; Assembly Front collects serial number, material verification, good count, and bad count. These profiles drive the shop floor UI — the screen at an assembly station looks different from the one at a die cast press because the step’s data collection tells it what fields to show.</w:t>
-      </w:r>
-    </w:p>
-    <w:p>
-      <w:pPr>
-        <w:pStyle w:val="BodyText"/>
-      </w:pPr>
-      <w:r>
-        <w:t xml:space="preserve">Machine eligibility is managed on the</w:t>
-      </w:r>
-      <w:r>
-        <w:t xml:space="preserve"> </w:t>
-      </w:r>
-      <w:r>
-        <w:rPr>
-          <w:b/>
-          <w:bCs/>
-        </w:rPr>
-        <w:t xml:space="preserve">Eligibility</w:t>
-      </w:r>
-      <w:r>
-        <w:t xml:space="preserve"> </w:t>
-      </w:r>
-      <w:r>
-        <w:t xml:space="preserve">tab. The engineer selects an area from the dropdown and sees every machine in that area with its code, tonnage, and an</w:t>
-      </w:r>
-      <w:r>
-        <w:t xml:space="preserve"> </w:t>
-      </w:r>
-      <w:r>
-        <w:rPr>
-          <w:b/>
-          <w:bCs/>
-        </w:rPr>
-        <w:t xml:space="preserve">Eligible</w:t>
-      </w:r>
-      <w:r>
-        <w:t xml:space="preserve"> </w:t>
-      </w:r>
-      <w:r>
-        <w:t xml:space="preserve">checkbox. The 5G0 needs a 400-ton press — machines #3, #7, and #12 are checked; machine #15 (250 tons) is not. This is what lets the MES validate that when an operator starts producing 5G0 parts on machine #7, that’s a legal combination.</w:t>
-      </w:r>
-    </w:p>
-    <w:p>
-      <w:pPr>
-        <w:pStyle w:val="BodyText"/>
-      </w:pPr>
-      <w:r>
-        <w:t xml:space="preserve">BOMs are versioned and authored on the</w:t>
-      </w:r>
-      <w:r>
-        <w:t xml:space="preserve"> </w:t>
-      </w:r>
-      <w:r>
-        <w:rPr>
-          <w:b/>
-          <w:bCs/>
-        </w:rPr>
-        <w:t xml:space="preserve">BOMs</w:t>
-      </w:r>
-      <w:r>
-        <w:t xml:space="preserve"> </w:t>
-      </w:r>
-      <w:r>
-        <w:t xml:space="preserve">tab. The 5G0’s v1 BOM requires one Front Cover Casting (5G0-C) and two Mounting Pins (PNA). Version 1 is effective from January 2026. If engineering changes the design in March, they click</w:t>
-      </w:r>
-      <w:r>
-        <w:t xml:space="preserve"> </w:t>
-      </w:r>
-      <w:r>
-        <w:rPr>
-          <w:b/>
-          <w:bCs/>
-        </w:rPr>
-        <w:t xml:space="preserve">New Version</w:t>
-      </w:r>
-      <w:r>
-        <w:t xml:space="preserve"> </w:t>
-      </w:r>
-      <w:r>
-        <w:t xml:space="preserve">to clone the BOM into a new draft — but every production record from January still references v1, preserving historical accuracy.</w:t>
       </w:r>
     </w:p>
     <w:bookmarkEnd w:id="40"/>

</xml_diff>

<commit_message>
docs: regenerate ERD note + docx artifacts for v1.9 / v0.11 / v0.8 / v2.7
- OIR v2.7, Data Model v1.9, FDS v0.11, User Journeys v0.8 docx
  regenerated via pandoc + style_docx_tables.js.

- MPP_MES_ERD.html header updated to flag v1.9 changes (Lot.ToolId +
  Lot.ToolCavityId, ProductionEvent checkpoint reshape,
  Lots.IdentifierSequence, MaxLotSize repurpose). Per-schema diagram
  boxes still reflect v1.8 for Lots.Lot / ProductionEvent and do not
  yet include IdentifierSequence — flagged in the header; per-schema
  update pass queued.

- MPP_MES_PHASED_PLAN_PLANT_FLOOR.docx NOT regenerated this pass — the
  working tree carries pre-session drift on that file unrelated to
  the refresh. Regeneration deferred pending Jacques's decision on
  the drift.

Source: docs/superpowers/specs/2026-04-23-arc2-model-revisions.md §9.
</commit_message>
<xml_diff>
--- a/MPP_MES_USER_JOURNEYS.docx
+++ b/MPP_MES_USER_JOURNEYS.docx
@@ -836,6 +836,426 @@
           </w:p>
         </w:tc>
       </w:tr>
+      <w:tr>
+        <w:tc>
+          <w:tcPr/>
+          <w:p>
+            <w:pPr>
+              <w:pStyle w:val="Compact"/>
+            </w:pPr>
+            <w:r>
+              <w:t xml:space="preserve">0.8</w:t>
+            </w:r>
+          </w:p>
+        </w:tc>
+        <w:tc>
+          <w:tcPr/>
+          <w:p>
+            <w:pPr>
+              <w:pStyle w:val="Compact"/>
+            </w:pPr>
+            <w:r>
+              <w:t xml:space="preserve">2026-04-24</w:t>
+            </w:r>
+          </w:p>
+        </w:tc>
+        <w:tc>
+          <w:tcPr/>
+          <w:p>
+            <w:pPr>
+              <w:pStyle w:val="Compact"/>
+            </w:pPr>
+            <w:r>
+              <w:t xml:space="preserve">Blue Ridge Automation</w:t>
+            </w:r>
+          </w:p>
+        </w:tc>
+        <w:tc>
+          <w:tcPr/>
+          <w:p>
+            <w:pPr>
+              <w:pStyle w:val="Compact"/>
+            </w:pPr>
+            <w:r>
+              <w:rPr>
+                <w:b/>
+                <w:bCs/>
+              </w:rPr>
+              <w:t xml:space="preserve">Arc 2 model revisions (2026-04-23 session) — narrative alignment with Data Model v1.9 / FDS v0.11.</w:t>
+            </w:r>
+            <w:r>
+              <w:t xml:space="preserve"> </w:t>
+            </w:r>
+            <w:r>
+              <w:t xml:space="preserve">Arc 2 scenes updated:</w:t>
+            </w:r>
+            <w:r>
+              <w:t xml:space="preserve"> </w:t>
+            </w:r>
+            <w:r>
+              <w:rPr>
+                <w:b/>
+                <w:bCs/>
+              </w:rPr>
+              <w:t xml:space="preserve">6:20am Die Cast (Carlos)</w:t>
+            </w:r>
+            <w:r>
+              <w:t xml:space="preserve"> </w:t>
+            </w:r>
+            <w:r>
+              <w:t xml:space="preserve">— Tool auto-populates on Cell selection from the active</w:t>
+            </w:r>
+            <w:r>
+              <w:t xml:space="preserve"> </w:t>
+            </w:r>
+            <w:r>
+              <w:rPr>
+                <w:rStyle w:val="VerbatimChar"/>
+              </w:rPr>
+              <w:t xml:space="preserve">Tools.ToolAssignment</w:t>
+            </w:r>
+            <w:r>
+              <w:t xml:space="preserve">; Carlos confirms the populated die; an</w:t>
+            </w:r>
+            <w:r>
+              <w:t xml:space="preserve"> </w:t>
+            </w:r>
+            <w:r>
+              <w:rPr>
+                <w:b/>
+                <w:bCs/>
+              </w:rPr>
+              <w:t xml:space="preserve">Edit</w:t>
+            </w:r>
+            <w:r>
+              <w:t xml:space="preserve"> </w:t>
+            </w:r>
+            <w:r>
+              <w:t xml:space="preserve">button (elevated AD prompt) triggers inline</w:t>
+            </w:r>
+            <w:r>
+              <w:t xml:space="preserve"> </w:t>
+            </w:r>
+            <w:r>
+              <w:rPr>
+                <w:rStyle w:val="VerbatimChar"/>
+              </w:rPr>
+              <w:t xml:space="preserve">ToolAssignment_Release</w:t>
+            </w:r>
+            <w:r>
+              <w:t xml:space="preserve"> </w:t>
+            </w:r>
+            <w:r>
+              <w:t xml:space="preserve">+</w:t>
+            </w:r>
+            <w:r>
+              <w:t xml:space="preserve"> </w:t>
+            </w:r>
+            <w:r>
+              <w:rPr>
+                <w:rStyle w:val="VerbatimChar"/>
+              </w:rPr>
+              <w:t xml:space="preserve">_Assign</w:t>
+            </w:r>
+            <w:r>
+              <w:t xml:space="preserve"> </w:t>
+            </w:r>
+            <w:r>
+              <w:t xml:space="preserve">to correct the system of record when the physical die doesn’t match; LOT creation is</w:t>
+            </w:r>
+            <w:r>
+              <w:t xml:space="preserve"> </w:t>
+            </w:r>
+            <w:r>
+              <w:rPr>
+                <w:b/>
+                <w:bCs/>
+              </w:rPr>
+              <w:t xml:space="preserve">lazy and operator-driven</w:t>
+            </w:r>
+            <w:r>
+              <w:t xml:space="preserve"> </w:t>
+            </w:r>
+            <w:r>
+              <w:t xml:space="preserve">(Carlos logs a LOT whenever he gets to the terminal, not at a prescribed moment); the die’s multiple active cavities produce</w:t>
+            </w:r>
+            <w:r>
+              <w:t xml:space="preserve"> </w:t>
+            </w:r>
+            <w:r>
+              <w:rPr>
+                <w:b/>
+                <w:bCs/>
+              </w:rPr>
+              <w:t xml:space="preserve">N parallel independent LOTs, not sublots</w:t>
+            </w:r>
+            <w:r>
+              <w:t xml:space="preserve"> </w:t>
+            </w:r>
+            <w:r>
+              <w:t xml:space="preserve">(each LOT has its own</w:t>
+            </w:r>
+            <w:r>
+              <w:t xml:space="preserve"> </w:t>
+            </w:r>
+            <w:r>
+              <w:rPr>
+                <w:rStyle w:val="VerbatimChar"/>
+              </w:rPr>
+              <w:t xml:space="preserve">ToolCavityId</w:t>
+            </w:r>
+            <w:r>
+              <w:t xml:space="preserve"> </w:t>
+            </w:r>
+            <w:r>
+              <w:t xml:space="preserve">set at creation, fills at its own rate, closes independently via explicit Complete+Move).</w:t>
+            </w:r>
+            <w:r>
+              <w:t xml:space="preserve"> </w:t>
+            </w:r>
+            <w:r>
+              <w:rPr>
+                <w:b/>
+                <w:bCs/>
+              </w:rPr>
+              <w:t xml:space="preserve">8:30am Trim Shop (Diane)</w:t>
+            </w:r>
+            <w:r>
+              <w:t xml:space="preserve"> </w:t>
+            </w:r>
+            <w:r>
+              <w:t xml:space="preserve">—</w:t>
+            </w:r>
+            <w:r>
+              <w:t xml:space="preserve"> </w:t>
+            </w:r>
+            <w:r>
+              <w:t xml:space="preserve">“check-in”</w:t>
+            </w:r>
+            <w:r>
+              <w:t xml:space="preserve"> </w:t>
+            </w:r>
+            <w:r>
+              <w:t xml:space="preserve">fires a</w:t>
+            </w:r>
+            <w:r>
+              <w:t xml:space="preserve"> </w:t>
+            </w:r>
+            <w:r>
+              <w:rPr>
+                <w:rStyle w:val="VerbatimChar"/>
+              </w:rPr>
+              <w:t xml:space="preserve">Workorder.ProductionEvent</w:t>
+            </w:r>
+            <w:r>
+              <w:t xml:space="preserve"> </w:t>
+            </w:r>
+            <w:r>
+              <w:t xml:space="preserve">checkpoint row carrying cumulative</w:t>
+            </w:r>
+            <w:r>
+              <w:t xml:space="preserve"> </w:t>
+            </w:r>
+            <w:r>
+              <w:rPr>
+                <w:rStyle w:val="VerbatimChar"/>
+              </w:rPr>
+              <w:t xml:space="preserve">ShotCount</w:t>
+            </w:r>
+            <w:r>
+              <w:t xml:space="preserve"> </w:t>
+            </w:r>
+            <w:r>
+              <w:t xml:space="preserve">/</w:t>
+            </w:r>
+            <w:r>
+              <w:t xml:space="preserve"> </w:t>
+            </w:r>
+            <w:r>
+              <w:rPr>
+                <w:rStyle w:val="VerbatimChar"/>
+              </w:rPr>
+              <w:t xml:space="preserve">ScrapCount</w:t>
+            </w:r>
+            <w:r>
+              <w:t xml:space="preserve"> </w:t>
+            </w:r>
+            <w:r>
+              <w:t xml:space="preserve">as-of-this-moment; deltas since Carlos’s die-cast checkout are derived via</w:t>
+            </w:r>
+            <w:r>
+              <w:t xml:space="preserve"> </w:t>
+            </w:r>
+            <w:r>
+              <w:rPr>
+                <w:rStyle w:val="VerbatimChar"/>
+              </w:rPr>
+              <w:t xml:space="preserve">LAG()</w:t>
+            </w:r>
+            <w:r>
+              <w:t xml:space="preserve"> </w:t>
+            </w:r>
+            <w:r>
+              <w:t xml:space="preserve">at read time.</w:t>
+            </w:r>
+            <w:r>
+              <w:t xml:space="preserve"> </w:t>
+            </w:r>
+            <w:r>
+              <w:rPr>
+                <w:b/>
+                <w:bCs/>
+              </w:rPr>
+              <w:t xml:space="preserve">10:00am Machining</w:t>
+            </w:r>
+            <w:r>
+              <w:t xml:space="preserve"> </w:t>
+            </w:r>
+            <w:r>
+              <w:t xml:space="preserve">— sub-LOT split is still a sublot pattern (parent FK + split genealogy); parent LOT was Machining-origin so it already had NULL</w:t>
+            </w:r>
+            <w:r>
+              <w:t xml:space="preserve"> </w:t>
+            </w:r>
+            <w:r>
+              <w:rPr>
+                <w:rStyle w:val="VerbatimChar"/>
+              </w:rPr>
+              <w:t xml:space="preserve">ToolId</w:t>
+            </w:r>
+            <w:r>
+              <w:t xml:space="preserve">/</w:t>
+            </w:r>
+            <w:r>
+              <w:rPr>
+                <w:rStyle w:val="VerbatimChar"/>
+              </w:rPr>
+              <w:t xml:space="preserve">ToolCavityId</w:t>
+            </w:r>
+            <w:r>
+              <w:t xml:space="preserve">; children inherit NULL.</w:t>
+            </w:r>
+            <w:r>
+              <w:t xml:space="preserve"> </w:t>
+            </w:r>
+            <w:r>
+              <w:rPr>
+                <w:b/>
+                <w:bCs/>
+              </w:rPr>
+              <w:t xml:space="preserve">2:00pm Sort Cage</w:t>
+            </w:r>
+            <w:r>
+              <w:t xml:space="preserve"> </w:t>
+            </w:r>
+            <w:r>
+              <w:t xml:space="preserve">— merge narrative (when any is triggered) produces a merged LOT with NULL</w:t>
+            </w:r>
+            <w:r>
+              <w:t xml:space="preserve"> </w:t>
+            </w:r>
+            <w:r>
+              <w:rPr>
+                <w:rStyle w:val="VerbatimChar"/>
+              </w:rPr>
+              <w:t xml:space="preserve">ToolId</w:t>
+            </w:r>
+            <w:r>
+              <w:t xml:space="preserve"> </w:t>
+            </w:r>
+            <w:r>
+              <w:t xml:space="preserve">/</w:t>
+            </w:r>
+            <w:r>
+              <w:t xml:space="preserve"> </w:t>
+            </w:r>
+            <w:r>
+              <w:rPr>
+                <w:rStyle w:val="VerbatimChar"/>
+              </w:rPr>
+              <w:t xml:space="preserve">ToolCavityId</w:t>
+            </w:r>
+            <w:r>
+              <w:t xml:space="preserve"> </w:t>
+            </w:r>
+            <w:r>
+              <w:t xml:space="preserve">— Tool-specific trace reconstructed via</w:t>
+            </w:r>
+            <w:r>
+              <w:t xml:space="preserve"> </w:t>
+            </w:r>
+            <w:r>
+              <w:rPr>
+                <w:rStyle w:val="VerbatimChar"/>
+              </w:rPr>
+              <w:t xml:space="preserve">LotGenealogy</w:t>
+            </w:r>
+            <w:r>
+              <w:t xml:space="preserve"> </w:t>
+            </w:r>
+            <w:r>
+              <w:t xml:space="preserve">walk of pre-merge source LOTs. Also: every LOT</w:t>
+            </w:r>
+            <w:r>
+              <w:t xml:space="preserve"> </w:t>
+            </w:r>
+            <w:r>
+              <w:rPr>
+                <w:rStyle w:val="VerbatimChar"/>
+              </w:rPr>
+              <w:t xml:space="preserve">LotName</w:t>
+            </w:r>
+            <w:r>
+              <w:t xml:space="preserve"> </w:t>
+            </w:r>
+            <w:r>
+              <w:t xml:space="preserve">is minted from the new</w:t>
+            </w:r>
+            <w:r>
+              <w:t xml:space="preserve"> </w:t>
+            </w:r>
+            <w:r>
+              <w:rPr>
+                <w:rStyle w:val="VerbatimChar"/>
+              </w:rPr>
+              <w:t xml:space="preserve">Lots.IdentifierSequence_Next @Code='Lot'</w:t>
+            </w:r>
+            <w:r>
+              <w:t xml:space="preserve"> </w:t>
+            </w:r>
+            <w:r>
+              <w:t xml:space="preserve">proc per FDS-16-002 (replaces Flexware’s</w:t>
+            </w:r>
+            <w:r>
+              <w:t xml:space="preserve"> </w:t>
+            </w:r>
+            <w:r>
+              <w:rPr>
+                <w:rStyle w:val="VerbatimChar"/>
+              </w:rPr>
+              <w:t xml:space="preserve">IdentifierFormat</w:t>
+            </w:r>
+            <w:r>
+              <w:t xml:space="preserve"> </w:t>
+            </w:r>
+            <w:r>
+              <w:t xml:space="preserve">counter). Assumption UJ-02 (LOT creation) gains lazy-by-operator note. UJ-03 (sub-LOT split) clarified — sublots are the Machining split only; cavity-parallel Die Cast LOTs are not sublots. UJ-08 (merge) adds merged-LOT-has-NULL-Tool note. Source:</w:t>
+            </w:r>
+            <w:r>
+              <w:t xml:space="preserve"> </w:t>
+            </w:r>
+            <w:r>
+              <w:rPr>
+                <w:rStyle w:val="VerbatimChar"/>
+              </w:rPr>
+              <w:t xml:space="preserve">docs/superpowers/specs/2026-04-23-arc2-model-revisions.md</w:t>
+            </w:r>
+            <w:r>
+              <w:t xml:space="preserve">.</w:t>
+            </w:r>
+          </w:p>
+        </w:tc>
+      </w:tr>
     </w:tbl>
     <w:p>
       <w:r>
@@ -1462,30 +1882,7 @@
         <w:pStyle w:val="FirstParagraph"/>
       </w:pPr>
       <w:r>
-        <w:t xml:space="preserve">Carlos is running die cast machine #7 today. He’s making 5G0 Front Covers — die #42, cavity B. The furnace is hot, the die is locked, and the first shot cycle completes. The casting drops into the trim press, gets trimmed, and falls into the basket beside his station.</w:t>
-      </w:r>
-    </w:p>
-    <w:p>
-      <w:pPr>
-        <w:pStyle w:val="BodyText"/>
-      </w:pPr>
-      <w:r>
-        <w:t xml:space="preserve">Carlos has a stack of pre-printed LOT Tracking Tickets — barcoded labels, each with a unique LOT ID (MPP pre-prints these in batches per FRS 2.2.1). He peels one off — LOT</w:t>
-      </w:r>
-      <w:r>
-        <w:t xml:space="preserve"> </w:t>
-      </w:r>
-      <w:r>
-        <w:rPr>
-          <w:rStyle w:val="VerbatimChar"/>
-        </w:rPr>
-        <w:t xml:space="preserve">2026-04-06-0001</w:t>
-      </w:r>
-      <w:r>
-        <w:t xml:space="preserve"> </w:t>
-      </w:r>
-      <w:r>
-        <w:t xml:space="preserve">— and sticks it on the basket. He turns to the Ignition terminal next to his machine, scans the LTT barcode, and the MES opens the LOT creation screen. The terminal is dedicated to Machine #7, so it already has his operator presence set — he tapped his initials</w:t>
+        <w:t xml:space="preserve">Carlos is running die cast machine #7 today. He’s making 5G0 Front Covers — die</w:t>
       </w:r>
       <w:r>
         <w:t xml:space="preserve"> </w:t>
@@ -1495,37 +1892,34 @@
           <w:b/>
           <w:bCs/>
         </w:rPr>
+        <w:t xml:space="preserve">DC-042</w:t>
+      </w:r>
+      <w:r>
+        <w:t xml:space="preserve">, which is a 2-cavity die running both cavities A and B. The furnace is hot, the die is mounted, and the first shot cycle completes. Castings drop into the trim press, get trimmed, and fall into two separate baskets beside his station — one fed by cavity A, one by cavity B.</w:t>
+      </w:r>
+    </w:p>
+    <w:p>
+      <w:pPr>
+        <w:pStyle w:val="BodyText"/>
+      </w:pPr>
+      <w:r>
+        <w:t xml:space="preserve">Carlos doesn’t rush to the terminal at every shot. He lets the baskets fill while he walks other machines. Some time later the cavity-A basket is full. He peels a pre-printed LTT barcode label off his stack (MPP pre-prints these in batches per FRS 2.2.1) and sticks it on the cavity-A basket. He walks to the Ignition terminal — dedicated to Machine #7, his initials</w:t>
+      </w:r>
+      <w:r>
+        <w:t xml:space="preserve"> </w:t>
+      </w:r>
+      <w:r>
+        <w:rPr>
+          <w:b/>
+          <w:bCs/>
+        </w:rPr>
         <w:t xml:space="preserve">CM</w:t>
       </w:r>
       <w:r>
         <w:t xml:space="preserve"> </w:t>
       </w:r>
       <w:r>
-        <w:t xml:space="preserve">on the keypad when he started his shift, and the LOT creation screen pre-populates the Initials field with</w:t>
-      </w:r>
-      <w:r>
-        <w:t xml:space="preserve"> </w:t>
-      </w:r>
-      <w:r>
-        <w:rPr>
-          <w:rStyle w:val="VerbatimChar"/>
-        </w:rPr>
-        <w:t xml:space="preserve">CM</w:t>
-      </w:r>
-      <w:r>
-        <w:t xml:space="preserve"> </w:t>
-      </w:r>
-      <w:r>
-        <w:t xml:space="preserve">(he can override it before submitting if a pair-working partner is entering data on his behalf). He manually enters the production data: Part Number 5G0, Die #42, Cavity B, and the piece count — 48 parts in this basket (per FRS 2.2.2:</w:t>
-      </w:r>
-      <w:r>
-        <w:t xml:space="preserve"> </w:t>
-      </w:r>
-      <w:r>
-        <w:t xml:space="preserve">“operators manually key that data into the MES”</w:t>
-      </w:r>
-      <w:r>
-        <w:t xml:space="preserve">). The MES validates: is 48 ≤ max lot size for 5G0? Yes. Is 5G0 eligible to run on machine #7? Yes.</w:t>
+        <w:t xml:space="preserve">already set as the active operator presence. He scans the LTT barcode.</w:t>
       </w:r>
     </w:p>
     <w:p>
@@ -1533,7 +1927,116 @@
         <w:pStyle w:val="BodyText"/>
       </w:pPr>
       <w:r>
-        <w:t xml:space="preserve">He also enters shot counts — total shots, good shots, and warm-up shots. The paper production sheets (DCFM-1589/1785/2003) track warm-up shots separately from production shots because they affect yield calculations but aren’t part of the good count. The MES captures all three.</w:t>
+        <w:t xml:space="preserve">The MES opens the LOT creation screen. The</w:t>
+      </w:r>
+      <w:r>
+        <w:t xml:space="preserve"> </w:t>
+      </w:r>
+      <w:r>
+        <w:rPr>
+          <w:b/>
+          <w:bCs/>
+        </w:rPr>
+        <w:t xml:space="preserve">Cell</w:t>
+      </w:r>
+      <w:r>
+        <w:t xml:space="preserve"> </w:t>
+      </w:r>
+      <w:r>
+        <w:t xml:space="preserve">is auto-resolved to Machine #7 from the terminal’s machine context. The</w:t>
+      </w:r>
+      <w:r>
+        <w:t xml:space="preserve"> </w:t>
+      </w:r>
+      <w:r>
+        <w:rPr>
+          <w:b/>
+          <w:bCs/>
+        </w:rPr>
+        <w:t xml:space="preserve">Tool</w:t>
+      </w:r>
+      <w:r>
+        <w:t xml:space="preserve"> </w:t>
+      </w:r>
+      <w:r>
+        <w:t xml:space="preserve">field pre-populates with</w:t>
+      </w:r>
+      <w:r>
+        <w:t xml:space="preserve"> </w:t>
+      </w:r>
+      <w:r>
+        <w:rPr>
+          <w:b/>
+          <w:bCs/>
+        </w:rPr>
+        <w:t xml:space="preserve">DC-042</w:t>
+      </w:r>
+      <w:r>
+        <w:t xml:space="preserve"> </w:t>
+      </w:r>
+      <w:r>
+        <w:t xml:space="preserve">— this came from</w:t>
+      </w:r>
+      <w:r>
+        <w:t xml:space="preserve"> </w:t>
+      </w:r>
+      <w:r>
+        <w:rPr>
+          <w:rStyle w:val="VerbatimChar"/>
+        </w:rPr>
+        <w:t xml:space="preserve">Tools.ToolAssignment_ListActiveByCell(@CellLocationId)</w:t>
+      </w:r>
+      <w:r>
+        <w:t xml:space="preserve"> </w:t>
+      </w:r>
+      <w:r>
+        <w:t xml:space="preserve">which looked up the currently-mounted tool on Machine #7. Carlos glances at the die, confirms the system is right, and proceeds. (If the physical die had been swapped without anyone updating the MES, Carlos would hit the</w:t>
+      </w:r>
+      <w:r>
+        <w:t xml:space="preserve"> </w:t>
+      </w:r>
+      <w:r>
+        <w:rPr>
+          <w:b/>
+          <w:bCs/>
+        </w:rPr>
+        <w:t xml:space="preserve">Edit</w:t>
+      </w:r>
+      <w:r>
+        <w:t xml:space="preserve"> </w:t>
+      </w:r>
+      <w:r>
+        <w:t xml:space="preserve">button — an AD elevation prompt fires, a supervisor logs in, the inline</w:t>
+      </w:r>
+      <w:r>
+        <w:t xml:space="preserve"> </w:t>
+      </w:r>
+      <w:r>
+        <w:rPr>
+          <w:rStyle w:val="VerbatimChar"/>
+        </w:rPr>
+        <w:t xml:space="preserve">Tools.ToolAssignment_Release</w:t>
+      </w:r>
+      <w:r>
+        <w:t xml:space="preserve"> </w:t>
+      </w:r>
+      <w:r>
+        <w:t xml:space="preserve">+</w:t>
+      </w:r>
+      <w:r>
+        <w:t xml:space="preserve"> </w:t>
+      </w:r>
+      <w:r>
+        <w:rPr>
+          <w:rStyle w:val="VerbatimChar"/>
+        </w:rPr>
+        <w:t xml:space="preserve">_Assign</w:t>
+      </w:r>
+      <w:r>
+        <w:t xml:space="preserve"> </w:t>
+      </w:r>
+      <w:r>
+        <w:t xml:space="preserve">correct the system of record in one transaction, and the Tool field updates. No production data is captured against the wrong die.)</w:t>
       </w:r>
     </w:p>
     <w:p>
@@ -1541,52 +2044,50 @@
         <w:pStyle w:val="BodyText"/>
       </w:pPr>
       <w:r>
-        <w:t xml:space="preserve">The system creates the LOT. Origin type: MANUFACTURED. Status: GOOD. Location: Die Cast Machine #7. It writes a</w:t>
-      </w:r>
-      <w:r>
-        <w:t xml:space="preserve"> </w:t>
-      </w:r>
-      <w:r>
-        <w:rPr>
-          <w:rStyle w:val="VerbatimChar"/>
-        </w:rPr>
-        <w:t xml:space="preserve">ProductionEvent</w:t>
-      </w:r>
-      <w:r>
-        <w:t xml:space="preserve"> </w:t>
-      </w:r>
-      <w:r>
-        <w:t xml:space="preserve">— 48 good, 0 no-good. It fires the Zebra printer and the LTT label comes out with the barcode, part number, quantity, date, die, cavity. The</w:t>
-      </w:r>
-      <w:r>
-        <w:t xml:space="preserve"> </w:t>
-      </w:r>
-      <w:r>
-        <w:rPr>
-          <w:rStyle w:val="VerbatimChar"/>
-        </w:rPr>
-        <w:t xml:space="preserve">LotLabel</w:t>
-      </w:r>
-      <w:r>
-        <w:t xml:space="preserve"> </w:t>
-      </w:r>
-      <w:r>
-        <w:t xml:space="preserve">table records this print. The</w:t>
-      </w:r>
-      <w:r>
-        <w:t xml:space="preserve"> </w:t>
-      </w:r>
-      <w:r>
-        <w:rPr>
-          <w:rStyle w:val="VerbatimChar"/>
-        </w:rPr>
-        <w:t xml:space="preserve">OperationLog</w:t>
-      </w:r>
-      <w:r>
-        <w:t xml:space="preserve"> </w:t>
-      </w:r>
-      <w:r>
-        <w:t xml:space="preserve">records everything Carlos just did.</w:t>
+        <w:t xml:space="preserve">He picks</w:t>
+      </w:r>
+      <w:r>
+        <w:t xml:space="preserve"> </w:t>
+      </w:r>
+      <w:r>
+        <w:rPr>
+          <w:b/>
+          <w:bCs/>
+        </w:rPr>
+        <w:t xml:space="preserve">Cavity A</w:t>
+      </w:r>
+      <w:r>
+        <w:t xml:space="preserve"> </w:t>
+      </w:r>
+      <w:r>
+        <w:t xml:space="preserve">from the cavity dropdown (filtered to active cavities on DC-042), confirms piece count (48 pieces), and hits submit. The MES validates: is 48 ≤</w:t>
+      </w:r>
+      <w:r>
+        <w:t xml:space="preserve"> </w:t>
+      </w:r>
+      <w:r>
+        <w:rPr>
+          <w:rStyle w:val="VerbatimChar"/>
+        </w:rPr>
+        <w:t xml:space="preserve">PartsPerBasket</w:t>
+      </w:r>
+      <w:r>
+        <w:t xml:space="preserve"> </w:t>
+      </w:r>
+      <w:r>
+        <w:t xml:space="preserve">for 5G0 (the repurposed</w:t>
+      </w:r>
+      <w:r>
+        <w:t xml:space="preserve"> </w:t>
+      </w:r>
+      <w:r>
+        <w:rPr>
+          <w:rStyle w:val="VerbatimChar"/>
+        </w:rPr>
+        <w:t xml:space="preserve">Item.MaxLotSize</w:t>
+      </w:r>
+      <w:r>
+        <w:t xml:space="preserve">)? Yes. Is 5G0 eligible on Machine #7? Yes. Is the tool-cell assignment current? Yes. Is Cavity A active? Yes.</w:t>
       </w:r>
     </w:p>
     <w:p>
@@ -1594,7 +2095,222 @@
         <w:pStyle w:val="BodyText"/>
       </w:pPr>
       <w:r>
-        <w:t xml:space="preserve">Carlos had 3 no-good parts from an earlier shot — porosity. He enters the reject count and selects defect code DC-POR-01 (Die Cast Porosity), quantity 3. A</w:t>
+        <w:t xml:space="preserve">A LOT is created —</w:t>
+      </w:r>
+      <w:r>
+        <w:t xml:space="preserve"> </w:t>
+      </w:r>
+      <w:r>
+        <w:rPr>
+          <w:rStyle w:val="VerbatimChar"/>
+        </w:rPr>
+        <w:t xml:space="preserve">LotName</w:t>
+      </w:r>
+      <w:r>
+        <w:t xml:space="preserve"> </w:t>
+      </w:r>
+      <w:r>
+        <w:t xml:space="preserve">minted via</w:t>
+      </w:r>
+      <w:r>
+        <w:t xml:space="preserve"> </w:t>
+      </w:r>
+      <w:r>
+        <w:rPr>
+          <w:rStyle w:val="VerbatimChar"/>
+        </w:rPr>
+        <w:t xml:space="preserve">Lots.IdentifierSequence_Next @Code='Lot'</w:t>
+      </w:r>
+      <w:r>
+        <w:t xml:space="preserve"> </w:t>
+      </w:r>
+      <w:r>
+        <w:t xml:space="preserve">which returns</w:t>
+      </w:r>
+      <w:r>
+        <w:t xml:space="preserve"> </w:t>
+      </w:r>
+      <w:r>
+        <w:rPr>
+          <w:rStyle w:val="VerbatimChar"/>
+        </w:rPr>
+        <w:t xml:space="preserve">MESL1710935</w:t>
+      </w:r>
+      <w:r>
+        <w:t xml:space="preserve"> </w:t>
+      </w:r>
+      <w:r>
+        <w:t xml:space="preserve">(the counter continues from the Flexware cutover seed).</w:t>
+      </w:r>
+      <w:r>
+        <w:t xml:space="preserve"> </w:t>
+      </w:r>
+      <w:r>
+        <w:rPr>
+          <w:rStyle w:val="VerbatimChar"/>
+        </w:rPr>
+        <w:t xml:space="preserve">ToolId</w:t>
+      </w:r>
+      <w:r>
+        <w:t xml:space="preserve"> </w:t>
+      </w:r>
+      <w:r>
+        <w:t xml:space="preserve">points at DC-042.</w:t>
+      </w:r>
+      <w:r>
+        <w:t xml:space="preserve"> </w:t>
+      </w:r>
+      <w:r>
+        <w:rPr>
+          <w:rStyle w:val="VerbatimChar"/>
+        </w:rPr>
+        <w:t xml:space="preserve">ToolCavityId</w:t>
+      </w:r>
+      <w:r>
+        <w:t xml:space="preserve"> </w:t>
+      </w:r>
+      <w:r>
+        <w:t xml:space="preserve">points at Cavity A. Origin: Manufactured. Status: Good. Location: Machine #7. A first</w:t>
+      </w:r>
+      <w:r>
+        <w:t xml:space="preserve"> </w:t>
+      </w:r>
+      <w:r>
+        <w:rPr>
+          <w:rStyle w:val="VerbatimChar"/>
+        </w:rPr>
+        <w:t xml:space="preserve">Workorder.ProductionEvent</w:t>
+      </w:r>
+      <w:r>
+        <w:t xml:space="preserve"> </w:t>
+      </w:r>
+      <w:r>
+        <w:t xml:space="preserve">checkpoint row is written with cumulative</w:t>
+      </w:r>
+      <w:r>
+        <w:t xml:space="preserve"> </w:t>
+      </w:r>
+      <w:r>
+        <w:rPr>
+          <w:rStyle w:val="VerbatimChar"/>
+        </w:rPr>
+        <w:t xml:space="preserve">ShotCount</w:t>
+      </w:r>
+      <w:r>
+        <w:t xml:space="preserve"> </w:t>
+      </w:r>
+      <w:r>
+        <w:t xml:space="preserve">= total shots through cavity A so far today, cumulative</w:t>
+      </w:r>
+      <w:r>
+        <w:t xml:space="preserve"> </w:t>
+      </w:r>
+      <w:r>
+        <w:rPr>
+          <w:rStyle w:val="VerbatimChar"/>
+        </w:rPr>
+        <w:t xml:space="preserve">ScrapCount</w:t>
+      </w:r>
+      <w:r>
+        <w:t xml:space="preserve"> </w:t>
+      </w:r>
+      <w:r>
+        <w:t xml:space="preserve">= 3 (that porosity run earlier). Since this is the LOT’s first event, there’s no previous event to diff against yet — the next event will compute its delta via</w:t>
+      </w:r>
+      <w:r>
+        <w:t xml:space="preserve"> </w:t>
+      </w:r>
+      <w:r>
+        <w:rPr>
+          <w:rStyle w:val="VerbatimChar"/>
+        </w:rPr>
+        <w:t xml:space="preserve">LAG(ShotCount) OVER (PARTITION BY LotId ORDER BY EventAt)</w:t>
+      </w:r>
+      <w:r>
+        <w:t xml:space="preserve">.</w:t>
+      </w:r>
+    </w:p>
+    <w:p>
+      <w:pPr>
+        <w:pStyle w:val="BodyText"/>
+      </w:pPr>
+      <w:r>
+        <w:t xml:space="preserve">The cavity-B basket fills on its own rhythm. Later — maybe 40 minutes, maybe two hours — Carlos logs it separately. It gets its own LOT (e.g.,</w:t>
+      </w:r>
+      <w:r>
+        <w:t xml:space="preserve"> </w:t>
+      </w:r>
+      <w:r>
+        <w:rPr>
+          <w:rStyle w:val="VerbatimChar"/>
+        </w:rPr>
+        <w:t xml:space="preserve">MESL1710936</w:t>
+      </w:r>
+      <w:r>
+        <w:t xml:space="preserve">), its own</w:t>
+      </w:r>
+      <w:r>
+        <w:t xml:space="preserve"> </w:t>
+      </w:r>
+      <w:r>
+        <w:rPr>
+          <w:rStyle w:val="VerbatimChar"/>
+        </w:rPr>
+        <w:t xml:space="preserve">ToolCavityId = Cavity B</w:t>
+      </w:r>
+      <w:r>
+        <w:t xml:space="preserve">, its own LTT label.</w:t>
+      </w:r>
+      <w:r>
+        <w:t xml:space="preserve"> </w:t>
+      </w:r>
+      <w:r>
+        <w:rPr>
+          <w:b/>
+          <w:bCs/>
+        </w:rPr>
+        <w:t xml:space="preserve">The two LOTs are peers, not sublots.</w:t>
+      </w:r>
+      <w:r>
+        <w:t xml:space="preserve"> </w:t>
+      </w:r>
+      <w:r>
+        <w:t xml:space="preserve">They share a Tool but nothing else. Each fills independently. Each closes independently via an explicit</w:t>
+      </w:r>
+      <w:r>
+        <w:t xml:space="preserve"> </w:t>
+      </w:r>
+      <w:r>
+        <w:t xml:space="preserve">“Complete + Move”</w:t>
+      </w:r>
+      <w:r>
+        <w:t xml:space="preserve"> </w:t>
+      </w:r>
+      <w:r>
+        <w:t xml:space="preserve">when Carlos walks the finished basket away from the machine.</w:t>
+      </w:r>
+    </w:p>
+    <w:p>
+      <w:pPr>
+        <w:pStyle w:val="BodyText"/>
+      </w:pPr>
+      <w:r>
+        <w:t xml:space="preserve">Carlos had 3 no-good parts from an earlier shot — porosity. The</w:t>
+      </w:r>
+      <w:r>
+        <w:t xml:space="preserve"> </w:t>
+      </w:r>
+      <w:r>
+        <w:rPr>
+          <w:rStyle w:val="VerbatimChar"/>
+        </w:rPr>
+        <w:t xml:space="preserve">ScrapCount</w:t>
+      </w:r>
+      <w:r>
+        <w:t xml:space="preserve"> </w:t>
+      </w:r>
+      <w:r>
+        <w:t xml:space="preserve">on this first checkpoint already reflects them (cumulative counter). Against that ProductionEvent he also records a</w:t>
       </w:r>
       <w:r>
         <w:t xml:space="preserve"> </w:t>
@@ -1609,7 +2325,7 @@
         <w:t xml:space="preserve"> </w:t>
       </w:r>
       <w:r>
-        <w:t xml:space="preserve">is written. Per FRS Section 4, reject/scrap data is retained for analysis but is not considered part of the permanent production record in the same way good counts are — MPP may elect not to record rejects at every manufacturing step, and the MES allows but does not require reject entry at each operation. The LOT’s piece count doesn’t change — the rejects were never in the basket.</w:t>
+        <w:t xml:space="preserve">with defect code DC-POR-01 quantity 3. Per FRS Section 4, reject/scrap data is retained for analysis but is not considered part of the permanent production record in the same way good counts are — MPP may elect not to record rejects at every manufacturing step.</w:t>
       </w:r>
     </w:p>
     <w:p>
@@ -1659,7 +2375,7 @@
         <w:rPr>
           <w:rStyle w:val="VerbatimChar"/>
         </w:rPr>
-        <w:t xml:space="preserve">2026-04-06-0001</w:t>
+        <w:t xml:space="preserve">MESL1710935</w:t>
       </w:r>
       <w:r>
         <w:t xml:space="preserve"> </w:t>
@@ -1688,6 +2404,117 @@
         <w:pStyle w:val="BodyText"/>
       </w:pPr>
       <w:r>
+        <w:t xml:space="preserve">The scan-in also fires a</w:t>
+      </w:r>
+      <w:r>
+        <w:t xml:space="preserve"> </w:t>
+      </w:r>
+      <w:r>
+        <w:rPr>
+          <w:b/>
+          <w:bCs/>
+        </w:rPr>
+        <w:t xml:space="preserve">checkpoint</w:t>
+      </w:r>
+      <w:r>
+        <w:rPr>
+          <w:b/>
+          <w:bCs/>
+        </w:rPr>
+        <w:t xml:space="preserve"> </w:t>
+      </w:r>
+      <w:r>
+        <w:rPr>
+          <w:rStyle w:val="VerbatimChar"/>
+          <w:b/>
+          <w:bCs/>
+        </w:rPr>
+        <w:t xml:space="preserve">ProductionEvent</w:t>
+      </w:r>
+      <w:r>
+        <w:t xml:space="preserve"> </w:t>
+      </w:r>
+      <w:r>
+        <w:t xml:space="preserve">at the trim station — cumulative</w:t>
+      </w:r>
+      <w:r>
+        <w:t xml:space="preserve"> </w:t>
+      </w:r>
+      <w:r>
+        <w:rPr>
+          <w:rStyle w:val="VerbatimChar"/>
+        </w:rPr>
+        <w:t xml:space="preserve">ShotCount</w:t>
+      </w:r>
+      <w:r>
+        <w:t xml:space="preserve"> </w:t>
+      </w:r>
+      <w:r>
+        <w:t xml:space="preserve">and</w:t>
+      </w:r>
+      <w:r>
+        <w:t xml:space="preserve"> </w:t>
+      </w:r>
+      <w:r>
+        <w:rPr>
+          <w:rStyle w:val="VerbatimChar"/>
+        </w:rPr>
+        <w:t xml:space="preserve">ScrapCount</w:t>
+      </w:r>
+      <w:r>
+        <w:t xml:space="preserve"> </w:t>
+      </w:r>
+      <w:r>
+        <w:t xml:space="preserve">as-of-arrival. Because this is the LOT’s second event (the first was Carlos’s die-cast checkpoint), deltas pop out immediately from the reader’s</w:t>
+      </w:r>
+      <w:r>
+        <w:t xml:space="preserve"> </w:t>
+      </w:r>
+      <w:r>
+        <w:rPr>
+          <w:rStyle w:val="VerbatimChar"/>
+        </w:rPr>
+        <w:t xml:space="preserve">LAG()</w:t>
+      </w:r>
+      <w:r>
+        <w:t xml:space="preserve"> </w:t>
+      </w:r>
+      <w:r>
+        <w:t xml:space="preserve">window:</w:t>
+      </w:r>
+      <w:r>
+        <w:t xml:space="preserve"> </w:t>
+      </w:r>
+      <w:r>
+        <w:t xml:space="preserve">“since last event, this LOT accumulated X shots and Y scrap.”</w:t>
+      </w:r>
+      <w:r>
+        <w:t xml:space="preserve"> </w:t>
+      </w:r>
+      <w:r>
+        <w:t xml:space="preserve">Reports that want operator-facing per-event deltas SHALL compute them that way rather than storing per-event</w:t>
+      </w:r>
+      <w:r>
+        <w:t xml:space="preserve"> </w:t>
+      </w:r>
+      <w:r>
+        <w:rPr>
+          <w:rStyle w:val="VerbatimChar"/>
+        </w:rPr>
+        <w:t xml:space="preserve">GoodCount</w:t>
+      </w:r>
+      <w:r>
+        <w:t xml:space="preserve"> </w:t>
+      </w:r>
+      <w:r>
+        <w:t xml:space="preserve">on the event row. Checkpoints are coarse — operators aren’t at the terminal per shot, they log at natural breakpoints (basket close, area handoff, complete+move).</w:t>
+      </w:r>
+    </w:p>
+    <w:p>
+      <w:pPr>
+        <w:pStyle w:val="BodyText"/>
+      </w:pPr>
+      <w:r>
         <w:t xml:space="preserve">The Trim Shop has a different counting method than Die Cast. Parts come out of trim/deburr/wash in bulk, so the operator weighs the basket on a scale, reads the net weight, and the MES calculates a theoretical piece count based on the item’s</w:t>
       </w:r>
       <w:r>
@@ -1727,7 +2554,7 @@
         <w:t xml:space="preserve"> </w:t>
       </w:r>
       <w:r>
-        <w:t xml:space="preserve">table logs the old and new values. Another</w:t>
+        <w:t xml:space="preserve">table logs the old and new values. The checkpoint</w:t>
       </w:r>
       <w:r>
         <w:t xml:space="preserve"> </w:t>
@@ -1742,7 +2569,22 @@
         <w:t xml:space="preserve"> </w:t>
       </w:r>
       <w:r>
-        <w:t xml:space="preserve">records the Trim operation completion.</w:t>
+        <w:t xml:space="preserve">captured the current cumulative counters; no per-event good/bad count is recorded — the</w:t>
+      </w:r>
+      <w:r>
+        <w:t xml:space="preserve"> </w:t>
+      </w:r>
+      <w:r>
+        <w:rPr>
+          <w:rStyle w:val="VerbatimChar"/>
+        </w:rPr>
+        <w:t xml:space="preserve">PieceCount</w:t>
+      </w:r>
+      <w:r>
+        <w:t xml:space="preserve"> </w:t>
+      </w:r>
+      <w:r>
+        <w:t xml:space="preserve">adjustment itself carries the truth going forward.</w:t>
       </w:r>
     </w:p>
     <w:p>
@@ -3188,6 +4030,52 @@
         <w:t xml:space="preserve">LTT tags are pre-printed, but the first scan of a barcode creates the LOT record in the MES. No pre-registration of barcodes. No LOT tag inventory feature. Confirms FDS-05-002.</w:t>
       </w:r>
     </w:p>
+    <w:p>
+      <w:pPr>
+        <w:pStyle w:val="BodyText"/>
+      </w:pPr>
+      <w:r>
+        <w:rPr>
+          <w:b/>
+          <w:bCs/>
+        </w:rPr>
+        <w:t xml:space="preserve">Addendum (2026-04-23, v0.8):</w:t>
+      </w:r>
+      <w:r>
+        <w:t xml:space="preserve"> </w:t>
+      </w:r>
+      <w:r>
+        <w:t xml:space="preserve">LOT creation is</w:t>
+      </w:r>
+      <w:r>
+        <w:t xml:space="preserve"> </w:t>
+      </w:r>
+      <w:r>
+        <w:rPr>
+          <w:b/>
+          <w:bCs/>
+        </w:rPr>
+        <w:t xml:space="preserve">lazy and operator-driven</w:t>
+      </w:r>
+      <w:r>
+        <w:t xml:space="preserve">. The system does not prescribe when Carlos logs a LOT — it can be at basket-full, after the prior LOT is done, or any other moment he chooses. No auto-create of N LOTs at run start. Physical-but-unlogged baskets exist until the operator logs them. Tool + Cavity assignment happens at</w:t>
+      </w:r>
+      <w:r>
+        <w:t xml:space="preserve"> </w:t>
+      </w:r>
+      <w:r>
+        <w:rPr>
+          <w:rStyle w:val="VerbatimChar"/>
+        </w:rPr>
+        <w:t xml:space="preserve">Lot_Create</w:t>
+      </w:r>
+      <w:r>
+        <w:t xml:space="preserve"> </w:t>
+      </w:r>
+      <w:r>
+        <w:t xml:space="preserve">time (operator selects/confirms which cavity). See FDS-05-036.</w:t>
+      </w:r>
+    </w:p>
     <w:bookmarkEnd w:id="28"/>
     <w:bookmarkStart w:id="29" w:name="X02d9ed5b59999fee2ed9f775d0d739f5d3a01b0"/>
     <w:p>
@@ -3252,6 +4140,71 @@
         <w:t xml:space="preserve">with relationship_type = Split). Operator can adjust quantities or cancel the auto-split. Needs review with Ben.</w:t>
       </w:r>
     </w:p>
+    <w:p>
+      <w:pPr>
+        <w:pStyle w:val="BodyText"/>
+      </w:pPr>
+      <w:r>
+        <w:rPr>
+          <w:b/>
+          <w:bCs/>
+        </w:rPr>
+        <w:t xml:space="preserve">Clarification (2026-04-23, v0.8):</w:t>
+      </w:r>
+      <w:r>
+        <w:t xml:space="preserve"> </w:t>
+      </w:r>
+      <w:r>
+        <w:t xml:space="preserve">Sub-LOT split is the</w:t>
+      </w:r>
+      <w:r>
+        <w:t xml:space="preserve"> </w:t>
+      </w:r>
+      <w:r>
+        <w:rPr>
+          <w:b/>
+          <w:bCs/>
+        </w:rPr>
+        <w:t xml:space="preserve">Machining-only</w:t>
+      </w:r>
+      <w:r>
+        <w:t xml:space="preserve"> </w:t>
+      </w:r>
+      <w:r>
+        <w:t xml:space="preserve">sublot pattern (parent FK + split genealogy).</w:t>
+      </w:r>
+      <w:r>
+        <w:t xml:space="preserve"> </w:t>
+      </w:r>
+      <w:r>
+        <w:rPr>
+          <w:b/>
+          <w:bCs/>
+        </w:rPr>
+        <w:t xml:space="preserve">Cavity-parallel LOTs at Die Cast are NOT sublots</w:t>
+      </w:r>
+      <w:r>
+        <w:t xml:space="preserve"> </w:t>
+      </w:r>
+      <w:r>
+        <w:t xml:space="preserve">— a multi-cavity die produces N first-class peer LOTs, each with its own</w:t>
+      </w:r>
+      <w:r>
+        <w:t xml:space="preserve"> </w:t>
+      </w:r>
+      <w:r>
+        <w:rPr>
+          <w:rStyle w:val="VerbatimChar"/>
+        </w:rPr>
+        <w:t xml:space="preserve">ToolCavityId</w:t>
+      </w:r>
+      <w:r>
+        <w:t xml:space="preserve"> </w:t>
+      </w:r>
+      <w:r>
+        <w:t xml:space="preserve">set at creation. The 2026-04-20 meeting notes conflated the two concepts; OI-09 closes this by locking the cavity-parallel-as-peer model in Data Model v1.9. See FDS-05-022 (sublots, Machining) and FDS-05-034 (cavity-parallel LOTs, Die Cast).</w:t>
+      </w:r>
+    </w:p>
     <w:bookmarkEnd w:id="29"/>
     <w:bookmarkStart w:id="30" w:name="X8d9059566608ee12c9183bcb0fe5f5e27b15363"/>
     <w:p>
@@ -3570,6 +4523,99 @@
           <w:iCs/>
         </w:rPr>
         <w:t xml:space="preserve">Maps to OI-05.</w:t>
+      </w:r>
+    </w:p>
+    <w:p>
+      <w:pPr>
+        <w:pStyle w:val="BodyText"/>
+      </w:pPr>
+      <w:r>
+        <w:rPr>
+          <w:b/>
+          <w:bCs/>
+        </w:rPr>
+        <w:t xml:space="preserve">Addendum (2026-04-23, v0.8):</w:t>
+      </w:r>
+      <w:r>
+        <w:t xml:space="preserve"> </w:t>
+      </w:r>
+      <w:r>
+        <w:t xml:space="preserve">Post-merge LOT carries</w:t>
+      </w:r>
+      <w:r>
+        <w:t xml:space="preserve"> </w:t>
+      </w:r>
+      <w:r>
+        <w:rPr>
+          <w:b/>
+          <w:bCs/>
+        </w:rPr>
+        <w:t xml:space="preserve">NULL</w:t>
+      </w:r>
+      <w:r>
+        <w:rPr>
+          <w:b/>
+          <w:bCs/>
+        </w:rPr>
+        <w:t xml:space="preserve"> </w:t>
+      </w:r>
+      <w:r>
+        <w:rPr>
+          <w:rStyle w:val="VerbatimChar"/>
+          <w:b/>
+          <w:bCs/>
+        </w:rPr>
+        <w:t xml:space="preserve">ToolId</w:t>
+      </w:r>
+      <w:r>
+        <w:rPr>
+          <w:b/>
+          <w:bCs/>
+        </w:rPr>
+        <w:t xml:space="preserve"> </w:t>
+      </w:r>
+      <w:r>
+        <w:rPr>
+          <w:b/>
+          <w:bCs/>
+        </w:rPr>
+        <w:t xml:space="preserve">and</w:t>
+      </w:r>
+      <w:r>
+        <w:rPr>
+          <w:b/>
+          <w:bCs/>
+        </w:rPr>
+        <w:t xml:space="preserve"> </w:t>
+      </w:r>
+      <w:r>
+        <w:rPr>
+          <w:rStyle w:val="VerbatimChar"/>
+          <w:b/>
+          <w:bCs/>
+        </w:rPr>
+        <w:t xml:space="preserve">ToolCavityId</w:t>
+      </w:r>
+      <w:r>
+        <w:t xml:space="preserve"> </w:t>
+      </w:r>
+      <w:r>
+        <w:t xml:space="preserve">— blended-origin material can’t be denormalized into a single FK pair. Tool-specific trace reconstructed via</w:t>
+      </w:r>
+      <w:r>
+        <w:t xml:space="preserve"> </w:t>
+      </w:r>
+      <w:r>
+        <w:rPr>
+          <w:rStyle w:val="VerbatimChar"/>
+        </w:rPr>
+        <w:t xml:space="preserve">LotGenealogy</w:t>
+      </w:r>
+      <w:r>
+        <w:t xml:space="preserve"> </w:t>
+      </w:r>
+      <w:r>
+        <w:t xml:space="preserve">walk of the pre-merge source LOTs (each retains its own Tool/Cavity FKs immutably). See FDS-05-030.</w:t>
       </w:r>
     </w:p>
     <w:bookmarkEnd w:id="34"/>

</xml_diff>

<commit_message>
docs(uj): v0.9 — FDS v0.11m alignment + 22 mockup screenshots embedded
Co-Authored-By: Claude Sonnet 4.6 <noreply@anthropic.com>
</commit_message>
<xml_diff>
--- a/MPP_MES_USER_JOURNEYS.docx
+++ b/MPP_MES_USER_JOURNEYS.docx
@@ -2,7 +2,7 @@
 <file path=word/document.xml><?xml version="1.0" encoding="utf-8"?>
 <w:document xmlns:w="http://schemas.openxmlformats.org/wordprocessingml/2006/main" xmlns:m="http://schemas.openxmlformats.org/officeDocument/2006/math" xmlns:r="http://schemas.openxmlformats.org/officeDocument/2006/relationships" xmlns:o="urn:schemas-microsoft-com:office:office" xmlns:v="urn:schemas-microsoft-com:vml" xmlns:w10="urn:schemas-microsoft-com:office:word" xmlns:a="http://schemas.openxmlformats.org/drawingml/2006/main" xmlns:pic="http://schemas.openxmlformats.org/drawingml/2006/picture" xmlns:wp="http://schemas.openxmlformats.org/drawingml/2006/wordprocessingDrawing">
   <w:body>
-    <w:bookmarkStart w:id="50" w:name="mpp-mes-user-journeys"/>
+    <w:bookmarkStart w:id="117" w:name="mpp-mes-user-journeys"/>
     <w:p>
       <w:pPr>
         <w:pStyle w:val="Heading1"/>
@@ -844,11 +844,106 @@
               <w:pStyle w:val="Compact"/>
             </w:pPr>
             <w:r>
+              <w:t xml:space="preserve">0.9</w:t>
+            </w:r>
+          </w:p>
+        </w:tc>
+        <w:tc>
+          <w:tcPr/>
+          <w:p>
+            <w:pPr>
+              <w:pStyle w:val="Compact"/>
+            </w:pPr>
+            <w:r>
+              <w:t xml:space="preserve">2026-04-29</w:t>
+            </w:r>
+          </w:p>
+        </w:tc>
+        <w:tc>
+          <w:tcPr/>
+          <w:p>
+            <w:pPr>
+              <w:pStyle w:val="Compact"/>
+            </w:pPr>
+            <w:r>
+              <w:t xml:space="preserve">Blue Ridge Automation</w:t>
+            </w:r>
+          </w:p>
+        </w:tc>
+        <w:tc>
+          <w:tcPr/>
+          <w:p>
+            <w:pPr>
+              <w:pStyle w:val="Compact"/>
+            </w:pPr>
+            <w:r>
+              <w:rPr>
+                <w:b/>
+                <w:bCs/>
+              </w:rPr>
+              <w:t xml:space="preserve">FDS v0.11m alignment.</w:t>
+            </w:r>
+            <w:r>
+              <w:t xml:space="preserve"> </w:t>
+            </w:r>
+            <w:r>
+              <w:t xml:space="preserve">Arc 1: added</w:t>
+            </w:r>
+            <w:r>
+              <w:t xml:space="preserve"> </w:t>
+            </w:r>
+            <w:r>
+              <w:t xml:space="preserve">“Registering Tools (Dies)”</w:t>
+            </w:r>
+            <w:r>
+              <w:t xml:space="preserve"> </w:t>
+            </w:r>
+            <w:r>
+              <w:t xml:space="preserve">section covering die registration, cavities, Die Rank config, compatibility matrix, and tool assignment. Downtime code count corrected to ~353. Break configuration added to shift schedule description. Arc 2: Trim Shop scene updated — part-identity rename and sub-LOT split now correctly placed at Trim OUT (not Trim IN). Machining scene rewritten — split no longer happens at Machining OUT; Machining OUT is PLC auto-complete with auto-move to coupled Assembly Cell via</w:t>
+            </w:r>
+            <w:r>
+              <w:t xml:space="preserve"> </w:t>
+            </w:r>
+            <w:r>
+              <w:rPr>
+                <w:rStyle w:val="VerbatimChar"/>
+              </w:rPr>
+              <w:t xml:space="preserve">CoupledDownstreamCellLocationId</w:t>
+            </w:r>
+            <w:r>
+              <w:t xml:space="preserve">. Assembly AIM call updated to reference local pool (</w:t>
+            </w:r>
+            <w:r>
+              <w:rPr>
+                <w:rStyle w:val="VerbatimChar"/>
+              </w:rPr>
+              <w:t xml:space="preserve">Lots.AimShipperIdPool</w:t>
+            </w:r>
+            <w:r>
+              <w:t xml:space="preserve">) and async print dispatch. End of Shift rewritten — single button press time entry (FDS-09-013), auto-written DowntimeEvent rows for breaks, shift handover summary screen (FDS-09-015), available runtime derivation. Assumption #10 updated to Partially Resolved.</w:t>
+            </w:r>
+          </w:p>
+        </w:tc>
+      </w:tr>
+      <w:tr>
+        <w:tc>
+          <w:tcPr>
+            <w:shd w:val="clear" w:color="auto" w:fill="F2F2F2"/>
+          </w:tcPr>
+          <w:tcPr/>
+          <w:p>
+            <w:pPr>
+              <w:pStyle w:val="Compact"/>
+            </w:pPr>
+            <w:r>
               <w:t xml:space="preserve">0.8</w:t>
             </w:r>
           </w:p>
         </w:tc>
         <w:tc>
+          <w:tcPr>
+            <w:shd w:val="clear" w:color="auto" w:fill="F2F2F2"/>
+          </w:tcPr>
           <w:tcPr/>
           <w:p>
             <w:pPr>
@@ -860,6 +955,9 @@
           </w:p>
         </w:tc>
         <w:tc>
+          <w:tcPr>
+            <w:shd w:val="clear" w:color="auto" w:fill="F2F2F2"/>
+          </w:tcPr>
           <w:tcPr/>
           <w:p>
             <w:pPr>
@@ -871,6 +969,9 @@
           </w:p>
         </w:tc>
         <w:tc>
+          <w:tcPr>
+            <w:shd w:val="clear" w:color="auto" w:fill="F2F2F2"/>
+          </w:tcPr>
           <w:tcPr/>
           <w:p>
             <w:pPr>
@@ -1509,7 +1610,7 @@
       </w:r>
     </w:p>
     <w:bookmarkEnd w:id="10"/>
-    <w:bookmarkStart w:id="16" w:name="X8a62b6bbd3b7dbd28b80423735197bca531f61b"/>
+    <w:bookmarkStart w:id="83" w:name="X8a62b6bbd3b7dbd28b80423735197bca531f61b"/>
     <w:p>
       <w:pPr>
         <w:pStyle w:val="Heading2"/>
@@ -1532,7 +1633,7 @@
         <w:t xml:space="preserve">Before a single LOT can be created on the shop floor, an engineer at Madison Precision Products has to teach the MES what the plant looks like, what it makes, and how it makes it. This is the configuration tool — the Ignition Perspective application that probably lives behind a different navigation root than the shop floor screens, accessible only to users whose AD accounts carry an engineering or admin role in Ignition.</w:t>
       </w:r>
     </w:p>
-    <w:bookmarkStart w:id="11" w:name="building-the-plant"/>
+    <w:bookmarkStart w:id="20" w:name="building-the-plant"/>
     <w:p>
       <w:pPr>
         <w:pStyle w:val="Heading3"/>
@@ -1593,6 +1694,880 @@
         <w:t xml:space="preserve">Tonnage</w:t>
       </w:r>
       <w:r>
+        <w:t xml:space="preserve"> </w:t>
+      </w:r>
+      <w:r>
+        <w:t xml:space="preserve">and</w:t>
+      </w:r>
+      <w:r>
+        <w:t xml:space="preserve"> </w:t>
+      </w:r>
+      <w:r>
+        <w:rPr>
+          <w:rStyle w:val="VerbatimChar"/>
+        </w:rPr>
+        <w:t xml:space="preserve">RefCycleTimeSec</w:t>
+      </w:r>
+      <w:r>
+        <w:t xml:space="preserve">. A machining center might need</w:t>
+      </w:r>
+      <w:r>
+        <w:t xml:space="preserve"> </w:t>
+      </w:r>
+      <w:r>
+        <w:rPr>
+          <w:rStyle w:val="VerbatimChar"/>
+        </w:rPr>
+        <w:t xml:space="preserve">SpindleCount</w:t>
+      </w:r>
+      <w:r>
+        <w:t xml:space="preserve"> </w:t>
+      </w:r>
+      <w:r>
+        <w:t xml:space="preserve">and</w:t>
+      </w:r>
+      <w:r>
+        <w:t xml:space="preserve"> </w:t>
+      </w:r>
+      <w:r>
+        <w:rPr>
+          <w:rStyle w:val="VerbatimChar"/>
+        </w:rPr>
+        <w:t xml:space="preserve">CoolantType</w:t>
+      </w:r>
+      <w:r>
+        <w:t xml:space="preserve">. These attribute definitions were themselves configured earlier — someone decided what metadata each type of location carries. The engineer fills in the values. They also create the logical locations: Receiving Dock, Shipping Dock, WIP Storage, Sort Cage. These are Inventory Location types — they don’t have cycle times, but they’re real places where LOTs live.</w:t>
+      </w:r>
+    </w:p>
+    <w:p>
+      <w:pPr>
+        <w:pStyle w:val="CaptionedFigure"/>
+      </w:pPr>
+      <w:r>
+        <w:drawing>
+          <wp:inline>
+            <wp:extent cx="5334000" cy="2451048"/>
+            <wp:effectExtent b="0" l="0" r="0" t="0"/>
+            <wp:docPr descr="Location Type Definitions modal — DieCastMachine Cell type with Tonnage, RefCycleTimeSec, and ConfirmationMethod attribute definitions" title="" id="12" name="Picture"/>
+            <a:graphic>
+              <a:graphicData uri="http://schemas.openxmlformats.org/drawingml/2006/picture">
+                <pic:pic>
+                  <pic:nvPicPr>
+                    <pic:cNvPr descr="mockup_screenshots/Screenshot%202026-04-29%20151804.png" id="13" name="Picture"/>
+                    <pic:cNvPicPr>
+                      <a:picLocks noChangeArrowheads="1" noChangeAspect="1"/>
+                    </pic:cNvPicPr>
+                  </pic:nvPicPr>
+                  <pic:blipFill>
+                    <a:blip r:embed="rId11"/>
+                    <a:stretch>
+                      <a:fillRect/>
+                    </a:stretch>
+                  </pic:blipFill>
+                  <pic:spPr bwMode="auto">
+                    <a:xfrm>
+                      <a:off x="0" y="0"/>
+                      <a:ext cx="5334000" cy="2451048"/>
+                    </a:xfrm>
+                    <a:prstGeom prst="rect">
+                      <a:avLst/>
+                    </a:prstGeom>
+                    <a:noFill/>
+                    <a:ln w="9525">
+                      <a:noFill/>
+                      <a:headEnd/>
+                      <a:tailEnd/>
+                    </a:ln>
+                  </pic:spPr>
+                </pic:pic>
+              </a:graphicData>
+            </a:graphic>
+          </wp:inline>
+        </w:drawing>
+      </w:r>
+    </w:p>
+    <w:p>
+      <w:pPr>
+        <w:pStyle w:val="ImageCaption"/>
+      </w:pPr>
+      <w:r>
+        <w:t xml:space="preserve">Location Type Definitions modal — DieCastMachine Cell type with Tonnage, RefCycleTimeSec, and ConfirmationMethod attribute definitions</w:t>
+      </w:r>
+    </w:p>
+    <w:p>
+      <w:pPr>
+        <w:pStyle w:val="CaptionedFigure"/>
+      </w:pPr>
+      <w:r>
+        <w:drawing>
+          <wp:inline>
+            <wp:extent cx="5334000" cy="2640538"/>
+            <wp:effectExtent b="0" l="0" r="0" t="0"/>
+            <wp:docPr descr="Plant Hierarchy — DC Machine #7 with location attributes (Tonnage, RefCycleTimeSec, ConfirmationMethod)" title="" id="15" name="Picture"/>
+            <a:graphic>
+              <a:graphicData uri="http://schemas.openxmlformats.org/drawingml/2006/picture">
+                <pic:pic>
+                  <pic:nvPicPr>
+                    <pic:cNvPr descr="mockup_screenshots/Screenshot%202026-04-29%20142811.png" id="16" name="Picture"/>
+                    <pic:cNvPicPr>
+                      <a:picLocks noChangeArrowheads="1" noChangeAspect="1"/>
+                    </pic:cNvPicPr>
+                  </pic:nvPicPr>
+                  <pic:blipFill>
+                    <a:blip r:embed="rId14"/>
+                    <a:stretch>
+                      <a:fillRect/>
+                    </a:stretch>
+                  </pic:blipFill>
+                  <pic:spPr bwMode="auto">
+                    <a:xfrm>
+                      <a:off x="0" y="0"/>
+                      <a:ext cx="5334000" cy="2640538"/>
+                    </a:xfrm>
+                    <a:prstGeom prst="rect">
+                      <a:avLst/>
+                    </a:prstGeom>
+                    <a:noFill/>
+                    <a:ln w="9525">
+                      <a:noFill/>
+                      <a:headEnd/>
+                      <a:tailEnd/>
+                    </a:ln>
+                  </pic:spPr>
+                </pic:pic>
+              </a:graphicData>
+            </a:graphic>
+          </wp:inline>
+        </w:drawing>
+      </w:r>
+    </w:p>
+    <w:p>
+      <w:pPr>
+        <w:pStyle w:val="ImageCaption"/>
+      </w:pPr>
+      <w:r>
+        <w:t xml:space="preserve">Plant Hierarchy — DC Machine #7 with location attributes (Tonnage, RefCycleTimeSec, ConfirmationMethod)</w:t>
+      </w:r>
+    </w:p>
+    <w:p>
+      <w:pPr>
+        <w:pStyle w:val="CaptionedFigure"/>
+      </w:pPr>
+      <w:r>
+        <w:drawing>
+          <wp:inline>
+            <wp:extent cx="4312117" cy="2791326"/>
+            <wp:effectExtent b="0" l="0" r="0" t="0"/>
+            <wp:docPr descr="Add Location modal" title="" id="18" name="Picture"/>
+            <a:graphic>
+              <a:graphicData uri="http://schemas.openxmlformats.org/drawingml/2006/picture">
+                <pic:pic>
+                  <pic:nvPicPr>
+                    <pic:cNvPr descr="mockup_screenshots/Screenshot%202026-04-29%20143250.png" id="19" name="Picture"/>
+                    <pic:cNvPicPr>
+                      <a:picLocks noChangeArrowheads="1" noChangeAspect="1"/>
+                    </pic:cNvPicPr>
+                  </pic:nvPicPr>
+                  <pic:blipFill>
+                    <a:blip r:embed="rId17"/>
+                    <a:stretch>
+                      <a:fillRect/>
+                    </a:stretch>
+                  </pic:blipFill>
+                  <pic:spPr bwMode="auto">
+                    <a:xfrm>
+                      <a:off x="0" y="0"/>
+                      <a:ext cx="4312117" cy="2791326"/>
+                    </a:xfrm>
+                    <a:prstGeom prst="rect">
+                      <a:avLst/>
+                    </a:prstGeom>
+                    <a:noFill/>
+                    <a:ln w="9525">
+                      <a:noFill/>
+                      <a:headEnd/>
+                      <a:tailEnd/>
+                    </a:ln>
+                  </pic:spPr>
+                </pic:pic>
+              </a:graphicData>
+            </a:graphic>
+          </wp:inline>
+        </w:drawing>
+      </w:r>
+    </w:p>
+    <w:p>
+      <w:pPr>
+        <w:pStyle w:val="ImageCaption"/>
+      </w:pPr>
+      <w:r>
+        <w:t xml:space="preserve">Add Location modal</w:t>
+      </w:r>
+    </w:p>
+    <w:p>
+      <w:pPr>
+        <w:pStyle w:val="BodyText"/>
+      </w:pPr>
+      <w:r>
+        <w:t xml:space="preserve">Then they set up terminals. Each Ignition client station on the floor gets a</w:t>
+      </w:r>
+      <w:r>
+        <w:t xml:space="preserve"> </w:t>
+      </w:r>
+      <w:r>
+        <w:rPr>
+          <w:rStyle w:val="VerbatimChar"/>
+        </w:rPr>
+        <w:t xml:space="preserve">Terminal</w:t>
+      </w:r>
+      <w:r>
+        <w:t xml:space="preserve"> </w:t>
+      </w:r>
+      <w:r>
+        <w:t xml:space="preserve">record — its IP address, which location it’s at, which Zebra printer it talks to, whether it has a barcode scanner. This is how the system knows that when operator Maria scans a LOT at terminal DC-05, that action happened at Die Cast Machine #5, and any label it prints goes to the Zebra on the table next to her.</w:t>
+      </w:r>
+    </w:p>
+    <w:bookmarkEnd w:id="20"/>
+    <w:bookmarkStart w:id="27" w:name="defining-what-we-make"/>
+    <w:p>
+      <w:pPr>
+        <w:pStyle w:val="Heading3"/>
+      </w:pPr>
+      <w:r>
+        <w:t xml:space="preserve">Defining What We Make</w:t>
+      </w:r>
+    </w:p>
+    <w:p>
+      <w:pPr>
+        <w:pStyle w:val="FirstParagraph"/>
+      </w:pPr>
+      <w:r>
+        <w:t xml:space="preserve">Next, the item master. The engineer creates items — each one a part number that MPP either manufactures or receives from a vendor. They classify each item: Raw Material, Component, Sub-Assembly, Finished Good, Pass-Through. They set the Macola ERP cross-reference number for each part so the two systems can talk when that integration goes live. They set the default sub-lot quantity — how many pieces go into each sub-LOT when a parent LOT is split after machining. They set the max lot size for reasonability checks.</w:t>
+      </w:r>
+    </w:p>
+    <w:p>
+      <w:pPr>
+        <w:pStyle w:val="CaptionedFigure"/>
+      </w:pPr>
+      <w:r>
+        <w:drawing>
+          <wp:inline>
+            <wp:extent cx="5334000" cy="5202296"/>
+            <wp:effectExtent b="0" l="0" r="0" t="0"/>
+            <wp:docPr descr="Add Item modal" title="" id="22" name="Picture"/>
+            <a:graphic>
+              <a:graphicData uri="http://schemas.openxmlformats.org/drawingml/2006/picture">
+                <pic:pic>
+                  <pic:nvPicPr>
+                    <pic:cNvPr descr="mockup_screenshots/Screenshot%202026-04-29%20143326.png" id="23" name="Picture"/>
+                    <pic:cNvPicPr>
+                      <a:picLocks noChangeArrowheads="1" noChangeAspect="1"/>
+                    </pic:cNvPicPr>
+                  </pic:nvPicPr>
+                  <pic:blipFill>
+                    <a:blip r:embed="rId21"/>
+                    <a:stretch>
+                      <a:fillRect/>
+                    </a:stretch>
+                  </pic:blipFill>
+                  <pic:spPr bwMode="auto">
+                    <a:xfrm>
+                      <a:off x="0" y="0"/>
+                      <a:ext cx="5334000" cy="5202296"/>
+                    </a:xfrm>
+                    <a:prstGeom prst="rect">
+                      <a:avLst/>
+                    </a:prstGeom>
+                    <a:noFill/>
+                    <a:ln w="9525">
+                      <a:noFill/>
+                      <a:headEnd/>
+                      <a:tailEnd/>
+                    </a:ln>
+                  </pic:spPr>
+                </pic:pic>
+              </a:graphicData>
+            </a:graphic>
+          </wp:inline>
+        </w:drawing>
+      </w:r>
+    </w:p>
+    <w:p>
+      <w:pPr>
+        <w:pStyle w:val="ImageCaption"/>
+      </w:pPr>
+      <w:r>
+        <w:t xml:space="preserve">Add Item modal</w:t>
+      </w:r>
+    </w:p>
+    <w:p>
+      <w:pPr>
+        <w:pStyle w:val="BodyText"/>
+      </w:pPr>
+      <w:r>
+        <w:t xml:space="preserve">For each finished good that ships to Honda, they create a container configuration. The 5G0 Front Cover, for example, ships in containers with 4 trays, 12 parts per tray, serialized, with dunnage code RD-5G0F. The RPY Cam Holder ships 6 trays, 24 per tray, not serialized. These configs drive the container lifecycle on the floor — the MES knows when a container is full.</w:t>
+      </w:r>
+    </w:p>
+    <w:p>
+      <w:pPr>
+        <w:pStyle w:val="CaptionedFigure"/>
+      </w:pPr>
+      <w:r>
+        <w:drawing>
+          <wp:inline>
+            <wp:extent cx="5334000" cy="2653080"/>
+            <wp:effectExtent b="0" l="0" r="0" t="0"/>
+            <wp:docPr descr="Item Master — 5G0 Front Cover Assy, Container Config tab" title="" id="25" name="Picture"/>
+            <a:graphic>
+              <a:graphicData uri="http://schemas.openxmlformats.org/drawingml/2006/picture">
+                <pic:pic>
+                  <pic:nvPicPr>
+                    <pic:cNvPr descr="mockup_screenshots/Screenshot%202026-04-29%20143307.png" id="26" name="Picture"/>
+                    <pic:cNvPicPr>
+                      <a:picLocks noChangeArrowheads="1" noChangeAspect="1"/>
+                    </pic:cNvPicPr>
+                  </pic:nvPicPr>
+                  <pic:blipFill>
+                    <a:blip r:embed="rId24"/>
+                    <a:stretch>
+                      <a:fillRect/>
+                    </a:stretch>
+                  </pic:blipFill>
+                  <pic:spPr bwMode="auto">
+                    <a:xfrm>
+                      <a:off x="0" y="0"/>
+                      <a:ext cx="5334000" cy="2653080"/>
+                    </a:xfrm>
+                    <a:prstGeom prst="rect">
+                      <a:avLst/>
+                    </a:prstGeom>
+                    <a:noFill/>
+                    <a:ln w="9525">
+                      <a:noFill/>
+                      <a:headEnd/>
+                      <a:tailEnd/>
+                    </a:ln>
+                  </pic:spPr>
+                </pic:pic>
+              </a:graphicData>
+            </a:graphic>
+          </wp:inline>
+        </w:drawing>
+      </w:r>
+    </w:p>
+    <w:p>
+      <w:pPr>
+        <w:pStyle w:val="ImageCaption"/>
+      </w:pPr>
+      <w:r>
+        <w:t xml:space="preserve">Item Master — 5G0 Front Cover Assy, Container Config tab</w:t>
+      </w:r>
+    </w:p>
+    <w:bookmarkEnd w:id="27"/>
+    <w:bookmarkStart w:id="40" w:name="defining-how-we-make-it"/>
+    <w:p>
+      <w:pPr>
+        <w:pStyle w:val="Heading3"/>
+      </w:pPr>
+      <w:r>
+        <w:t xml:space="preserve">Defining How We Make It</w:t>
+      </w:r>
+    </w:p>
+    <w:p>
+      <w:pPr>
+        <w:pStyle w:val="FirstParagraph"/>
+      </w:pPr>
+      <w:r>
+        <w:t xml:space="preserve">Now routes. The engineer creates a route template for each item — the ordered sequence of operations it passes through. The 5G0 Front Cover route might be: Die Cast → Trim → Machine (CNC) → Assembly Front → Pack &amp; Ship. Each step in the route points to an operation template — a reusable definition of what data to collect at that type of operation. The Die Cast operation template says: collect die info, collect cavity info, collect weight, collect good count, collect bad count. The Assembly operation template says: requires serial number, requires material verification, collects good count. These flags drive the UI — the shop floor screen at an assembly station looks different from the one at a die cast press because the operation template tells it what fields to show.</w:t>
+      </w:r>
+    </w:p>
+    <w:p>
+      <w:pPr>
+        <w:pStyle w:val="BodyText"/>
+      </w:pPr>
+      <w:r>
+        <w:t xml:space="preserve">The engineer also creates the part-to-location eligibility map. Not every machine can run every part. The 5G0 can run on Die Cast machines 3, 7, and 12, but not on machine 15 (wrong tonnage). This map is what lets the MES validate that when an operator starts producing 5G0 parts on machine 7, that’s a legal combination.</w:t>
+      </w:r>
+    </w:p>
+    <w:p>
+      <w:pPr>
+        <w:pStyle w:val="CaptionedFigure"/>
+      </w:pPr>
+      <w:r>
+        <w:drawing>
+          <wp:inline>
+            <wp:extent cx="5334000" cy="2322870"/>
+            <wp:effectExtent b="0" l="0" r="0" t="0"/>
+            <wp:docPr descr="Item Master — Routes tab, 5G0 route (Die Cast → Trim → CNC Machining → Assembly Front → Pack &amp; Ship)" title="" id="29" name="Picture"/>
+            <a:graphic>
+              <a:graphicData uri="http://schemas.openxmlformats.org/drawingml/2006/picture">
+                <pic:pic>
+                  <pic:nvPicPr>
+                    <pic:cNvPr descr="mockup_screenshots/Screenshot%202026-04-29%20143345.png" id="30" name="Picture"/>
+                    <pic:cNvPicPr>
+                      <a:picLocks noChangeArrowheads="1" noChangeAspect="1"/>
+                    </pic:cNvPicPr>
+                  </pic:nvPicPr>
+                  <pic:blipFill>
+                    <a:blip r:embed="rId28"/>
+                    <a:stretch>
+                      <a:fillRect/>
+                    </a:stretch>
+                  </pic:blipFill>
+                  <pic:spPr bwMode="auto">
+                    <a:xfrm>
+                      <a:off x="0" y="0"/>
+                      <a:ext cx="5334000" cy="2322870"/>
+                    </a:xfrm>
+                    <a:prstGeom prst="rect">
+                      <a:avLst/>
+                    </a:prstGeom>
+                    <a:noFill/>
+                    <a:ln w="9525">
+                      <a:noFill/>
+                      <a:headEnd/>
+                      <a:tailEnd/>
+                    </a:ln>
+                  </pic:spPr>
+                </pic:pic>
+              </a:graphicData>
+            </a:graphic>
+          </wp:inline>
+        </w:drawing>
+      </w:r>
+    </w:p>
+    <w:p>
+      <w:pPr>
+        <w:pStyle w:val="ImageCaption"/>
+      </w:pPr>
+      <w:r>
+        <w:t xml:space="preserve">Item Master — Routes tab, 5G0 route (Die Cast → Trim → CNC Machining → Assembly Front → Pack &amp; Ship)</w:t>
+      </w:r>
+    </w:p>
+    <w:p>
+      <w:pPr>
+        <w:pStyle w:val="CaptionedFigure"/>
+      </w:pPr>
+      <w:r>
+        <w:drawing>
+          <wp:inline>
+            <wp:extent cx="5334000" cy="2310029"/>
+            <wp:effectExtent b="0" l="0" r="0" t="0"/>
+            <wp:docPr descr="Item Master — Eligibility tab, Die Cast area machine eligibility by tonnage" title="" id="32" name="Picture"/>
+            <a:graphic>
+              <a:graphicData uri="http://schemas.openxmlformats.org/drawingml/2006/picture">
+                <pic:pic>
+                  <pic:nvPicPr>
+                    <pic:cNvPr descr="mockup_screenshots/Screenshot%202026-04-29%20143420.png" id="33" name="Picture"/>
+                    <pic:cNvPicPr>
+                      <a:picLocks noChangeArrowheads="1" noChangeAspect="1"/>
+                    </pic:cNvPicPr>
+                  </pic:nvPicPr>
+                  <pic:blipFill>
+                    <a:blip r:embed="rId31"/>
+                    <a:stretch>
+                      <a:fillRect/>
+                    </a:stretch>
+                  </pic:blipFill>
+                  <pic:spPr bwMode="auto">
+                    <a:xfrm>
+                      <a:off x="0" y="0"/>
+                      <a:ext cx="5334000" cy="2310029"/>
+                    </a:xfrm>
+                    <a:prstGeom prst="rect">
+                      <a:avLst/>
+                    </a:prstGeom>
+                    <a:noFill/>
+                    <a:ln w="9525">
+                      <a:noFill/>
+                      <a:headEnd/>
+                      <a:tailEnd/>
+                    </a:ln>
+                  </pic:spPr>
+                </pic:pic>
+              </a:graphicData>
+            </a:graphic>
+          </wp:inline>
+        </w:drawing>
+      </w:r>
+    </w:p>
+    <w:p>
+      <w:pPr>
+        <w:pStyle w:val="ImageCaption"/>
+      </w:pPr>
+      <w:r>
+        <w:t xml:space="preserve">Item Master — Eligibility tab, Die Cast area machine eligibility by tonnage</w:t>
+      </w:r>
+    </w:p>
+    <w:p>
+      <w:pPr>
+        <w:pStyle w:val="BodyText"/>
+      </w:pPr>
+      <w:r>
+        <w:t xml:space="preserve">For assembled products with BOMs, the engineer creates versioned bills of material. The 5G0 Front Cover Assembly consumes one 5G0 casting and two PNA mounting pins. Version 1 of the BOM is effective from January 2026. If engineering changes the design in March, they create version 2 — but every production record from January still points to version 1.</w:t>
+      </w:r>
+    </w:p>
+    <w:p>
+      <w:pPr>
+        <w:pStyle w:val="CaptionedFigure"/>
+      </w:pPr>
+      <w:r>
+        <w:drawing>
+          <wp:inline>
+            <wp:extent cx="5334000" cy="2293993"/>
+            <wp:effectExtent b="0" l="0" r="0" t="0"/>
+            <wp:docPr descr="Item Master — BOMs tab, 5G0 v1 BOM (Front Cover Casting + Mounting Pin)" title="" id="35" name="Picture"/>
+            <a:graphic>
+              <a:graphicData uri="http://schemas.openxmlformats.org/drawingml/2006/picture">
+                <pic:pic>
+                  <pic:nvPicPr>
+                    <pic:cNvPr descr="mockup_screenshots/Screenshot%202026-04-29%20143356.png" id="36" name="Picture"/>
+                    <pic:cNvPicPr>
+                      <a:picLocks noChangeArrowheads="1" noChangeAspect="1"/>
+                    </pic:cNvPicPr>
+                  </pic:nvPicPr>
+                  <pic:blipFill>
+                    <a:blip r:embed="rId34"/>
+                    <a:stretch>
+                      <a:fillRect/>
+                    </a:stretch>
+                  </pic:blipFill>
+                  <pic:spPr bwMode="auto">
+                    <a:xfrm>
+                      <a:off x="0" y="0"/>
+                      <a:ext cx="5334000" cy="2293993"/>
+                    </a:xfrm>
+                    <a:prstGeom prst="rect">
+                      <a:avLst/>
+                    </a:prstGeom>
+                    <a:noFill/>
+                    <a:ln w="9525">
+                      <a:noFill/>
+                      <a:headEnd/>
+                      <a:tailEnd/>
+                    </a:ln>
+                  </pic:spPr>
+                </pic:pic>
+              </a:graphicData>
+            </a:graphic>
+          </wp:inline>
+        </w:drawing>
+      </w:r>
+    </w:p>
+    <w:p>
+      <w:pPr>
+        <w:pStyle w:val="ImageCaption"/>
+      </w:pPr>
+      <w:r>
+        <w:t xml:space="preserve">Item Master — BOMs tab, 5G0 v1 BOM (Front Cover Casting + Mounting Pin)</w:t>
+      </w:r>
+    </w:p>
+    <w:p>
+      <w:pPr>
+        <w:pStyle w:val="CaptionedFigure"/>
+      </w:pPr>
+      <w:r>
+        <w:drawing>
+          <wp:inline>
+            <wp:extent cx="5334000" cy="2646153"/>
+            <wp:effectExtent b="0" l="0" r="0" t="0"/>
+            <wp:docPr descr="Operation Templates — Die Cast Operation with data collection fields" title="" id="38" name="Picture"/>
+            <a:graphic>
+              <a:graphicData uri="http://schemas.openxmlformats.org/drawingml/2006/picture">
+                <pic:pic>
+                  <pic:nvPicPr>
+                    <pic:cNvPr descr="mockup_screenshots/Screenshot%202026-04-29%20143435.png" id="39" name="Picture"/>
+                    <pic:cNvPicPr>
+                      <a:picLocks noChangeArrowheads="1" noChangeAspect="1"/>
+                    </pic:cNvPicPr>
+                  </pic:nvPicPr>
+                  <pic:blipFill>
+                    <a:blip r:embed="rId37"/>
+                    <a:stretch>
+                      <a:fillRect/>
+                    </a:stretch>
+                  </pic:blipFill>
+                  <pic:spPr bwMode="auto">
+                    <a:xfrm>
+                      <a:off x="0" y="0"/>
+                      <a:ext cx="5334000" cy="2646153"/>
+                    </a:xfrm>
+                    <a:prstGeom prst="rect">
+                      <a:avLst/>
+                    </a:prstGeom>
+                    <a:noFill/>
+                    <a:ln w="9525">
+                      <a:noFill/>
+                      <a:headEnd/>
+                      <a:tailEnd/>
+                    </a:ln>
+                  </pic:spPr>
+                </pic:pic>
+              </a:graphicData>
+            </a:graphic>
+          </wp:inline>
+        </w:drawing>
+      </w:r>
+    </w:p>
+    <w:p>
+      <w:pPr>
+        <w:pStyle w:val="ImageCaption"/>
+      </w:pPr>
+      <w:r>
+        <w:t xml:space="preserve">Operation Templates — Die Cast Operation with data collection fields</w:t>
+      </w:r>
+    </w:p>
+    <w:bookmarkEnd w:id="40"/>
+    <w:bookmarkStart w:id="50" w:name="defining-quality-standards"/>
+    <w:p>
+      <w:pPr>
+        <w:pStyle w:val="Heading3"/>
+      </w:pPr>
+      <w:r>
+        <w:t xml:space="preserve">Defining Quality Standards</w:t>
+      </w:r>
+    </w:p>
+    <w:p>
+      <w:pPr>
+        <w:pStyle w:val="FirstParagraph"/>
+      </w:pPr>
+      <w:r>
+        <w:t xml:space="preserve">The engineer creates quality specs — also versioned. For the 5G0 Front Cover, the spec says: measure surface flatness (target 0.002”, lower limit 0.001”, upper limit 0.003”), check bore diameter (target 25.40mm ± 0.02mm), visual inspection for porosity (pass/fail). Each attribute has its data type, UOM, target, and limits. When an inspector on the floor takes a sample, the screen they see is generated from this spec — the system knows what to ask for because the engineer defined it here.</w:t>
+      </w:r>
+    </w:p>
+    <w:p>
+      <w:pPr>
+        <w:pStyle w:val="CaptionedFigure"/>
+      </w:pPr>
+      <w:r>
+        <w:drawing>
+          <wp:inline>
+            <wp:extent cx="5334000" cy="2655875"/>
+            <wp:effectExtent b="0" l="0" r="0" t="0"/>
+            <wp:docPr descr="Quality Specs — 5G0 Dimensional Spec v2 with Surface Flatness, Bore Diameter, Porosity Visual attributes" title="" id="42" name="Picture"/>
+            <a:graphic>
+              <a:graphicData uri="http://schemas.openxmlformats.org/drawingml/2006/picture">
+                <pic:pic>
+                  <pic:nvPicPr>
+                    <pic:cNvPr descr="mockup_screenshots/Screenshot%202026-04-29%20143639.png" id="43" name="Picture"/>
+                    <pic:cNvPicPr>
+                      <a:picLocks noChangeArrowheads="1" noChangeAspect="1"/>
+                    </pic:cNvPicPr>
+                  </pic:nvPicPr>
+                  <pic:blipFill>
+                    <a:blip r:embed="rId41"/>
+                    <a:stretch>
+                      <a:fillRect/>
+                    </a:stretch>
+                  </pic:blipFill>
+                  <pic:spPr bwMode="auto">
+                    <a:xfrm>
+                      <a:off x="0" y="0"/>
+                      <a:ext cx="5334000" cy="2655875"/>
+                    </a:xfrm>
+                    <a:prstGeom prst="rect">
+                      <a:avLst/>
+                    </a:prstGeom>
+                    <a:noFill/>
+                    <a:ln w="9525">
+                      <a:noFill/>
+                      <a:headEnd/>
+                      <a:tailEnd/>
+                    </a:ln>
+                  </pic:spPr>
+                </pic:pic>
+              </a:graphicData>
+            </a:graphic>
+          </wp:inline>
+        </w:drawing>
+      </w:r>
+    </w:p>
+    <w:p>
+      <w:pPr>
+        <w:pStyle w:val="ImageCaption"/>
+      </w:pPr>
+      <w:r>
+        <w:t xml:space="preserve">Quality Specs — 5G0 Dimensional Spec v2 with Surface Flatness, Bore Diameter, Porosity Visual attributes</w:t>
+      </w:r>
+    </w:p>
+    <w:p>
+      <w:pPr>
+        <w:pStyle w:val="CaptionedFigure"/>
+      </w:pPr>
+      <w:r>
+        <w:drawing>
+          <wp:inline>
+            <wp:extent cx="5334000" cy="2314261"/>
+            <wp:effectExtent b="0" l="0" r="0" t="0"/>
+            <wp:docPr descr="Item Master — Quality Specs tab showing linked specs for 5G0 Front Cover" title="" id="45" name="Picture"/>
+            <a:graphic>
+              <a:graphicData uri="http://schemas.openxmlformats.org/drawingml/2006/picture">
+                <pic:pic>
+                  <pic:nvPicPr>
+                    <pic:cNvPr descr="mockup_screenshots/Screenshot%202026-04-29%20143406.png" id="46" name="Picture"/>
+                    <pic:cNvPicPr>
+                      <a:picLocks noChangeArrowheads="1" noChangeAspect="1"/>
+                    </pic:cNvPicPr>
+                  </pic:nvPicPr>
+                  <pic:blipFill>
+                    <a:blip r:embed="rId44"/>
+                    <a:stretch>
+                      <a:fillRect/>
+                    </a:stretch>
+                  </pic:blipFill>
+                  <pic:spPr bwMode="auto">
+                    <a:xfrm>
+                      <a:off x="0" y="0"/>
+                      <a:ext cx="5334000" cy="2314261"/>
+                    </a:xfrm>
+                    <a:prstGeom prst="rect">
+                      <a:avLst/>
+                    </a:prstGeom>
+                    <a:noFill/>
+                    <a:ln w="9525">
+                      <a:noFill/>
+                      <a:headEnd/>
+                      <a:tailEnd/>
+                    </a:ln>
+                  </pic:spPr>
+                </pic:pic>
+              </a:graphicData>
+            </a:graphic>
+          </wp:inline>
+        </w:drawing>
+      </w:r>
+    </w:p>
+    <w:p>
+      <w:pPr>
+        <w:pStyle w:val="ImageCaption"/>
+      </w:pPr>
+      <w:r>
+        <w:t xml:space="preserve">Item Master — Quality Specs tab showing linked specs for 5G0 Front Cover</w:t>
+      </w:r>
+    </w:p>
+    <w:p>
+      <w:pPr>
+        <w:pStyle w:val="BodyText"/>
+      </w:pPr>
+      <w:r>
+        <w:t xml:space="preserve">They also load the defect codes — approximately 145 of them, organized by department. Die Cast gets codes for porosity (135), cold shut, flash, misrun. Machine Shop gets codes for out-of-tolerance (122</w:t>
+      </w:r>
+      <w:r>
+        <w:t xml:space="preserve"> </w:t>
+      </w:r>
+      <w:r>
+        <w:t xml:space="preserve">“Dimensional”</w:t>
+      </w:r>
+      <w:r>
+        <w:t xml:space="preserve">), tool marks (154), surface finish (143). There are also codes for Trim Shop, Production Control, Quality Control, and a High Speed Supplier Parts (HSP) department for vendor-part defects (codes 247–253). Each code carries an</w:t>
+      </w:r>
+      <w:r>
+        <w:t xml:space="preserve"> </w:t>
+      </w:r>
+      <w:r>
+        <w:rPr>
+          <w:rStyle w:val="VerbatimChar"/>
+        </w:rPr>
+        <w:t xml:space="preserve">IsExcused</w:t>
+      </w:r>
+      <w:r>
+        <w:t xml:space="preserve"> </w:t>
+      </w:r>
+      <w:r>
+        <w:t xml:space="preserve">flag for future OEE quality calculations.</w:t>
+      </w:r>
+    </w:p>
+    <w:p>
+      <w:pPr>
+        <w:pStyle w:val="CaptionedFigure"/>
+      </w:pPr>
+      <w:r>
+        <w:drawing>
+          <wp:inline>
+            <wp:extent cx="5334000" cy="2650313"/>
+            <wp:effectExtent b="0" l="0" r="0" t="0"/>
+            <wp:docPr descr="Defect Codes screen — codes across Die Cast, Machine Shop, Trim Shop, and HSP departments" title="" id="48" name="Picture"/>
+            <a:graphic>
+              <a:graphicData uri="http://schemas.openxmlformats.org/drawingml/2006/picture">
+                <pic:pic>
+                  <pic:nvPicPr>
+                    <pic:cNvPr descr="mockup_screenshots/Screenshot%202026-04-29%20143658.png" id="49" name="Picture"/>
+                    <pic:cNvPicPr>
+                      <a:picLocks noChangeArrowheads="1" noChangeAspect="1"/>
+                    </pic:cNvPicPr>
+                  </pic:nvPicPr>
+                  <pic:blipFill>
+                    <a:blip r:embed="rId47"/>
+                    <a:stretch>
+                      <a:fillRect/>
+                    </a:stretch>
+                  </pic:blipFill>
+                  <pic:spPr bwMode="auto">
+                    <a:xfrm>
+                      <a:off x="0" y="0"/>
+                      <a:ext cx="5334000" cy="2650313"/>
+                    </a:xfrm>
+                    <a:prstGeom prst="rect">
+                      <a:avLst/>
+                    </a:prstGeom>
+                    <a:noFill/>
+                    <a:ln w="9525">
+                      <a:noFill/>
+                      <a:headEnd/>
+                      <a:tailEnd/>
+                    </a:ln>
+                  </pic:spPr>
+                </pic:pic>
+              </a:graphicData>
+            </a:graphic>
+          </wp:inline>
+        </w:drawing>
+      </w:r>
+    </w:p>
+    <w:p>
+      <w:pPr>
+        <w:pStyle w:val="ImageCaption"/>
+      </w:pPr>
+      <w:r>
+        <w:t xml:space="preserve">Defect Codes screen — codes across Die Cast, Machine Shop, Trim Shop, and HSP departments</w:t>
+      </w:r>
+    </w:p>
+    <w:bookmarkEnd w:id="50"/>
+    <w:bookmarkStart w:id="69" w:name="registering-tools-dies"/>
+    <w:p>
+      <w:pPr>
+        <w:pStyle w:val="Heading3"/>
+      </w:pPr>
+      <w:r>
+        <w:t xml:space="preserve">Registering Tools (Dies)</w:t>
+      </w:r>
+    </w:p>
+    <w:p>
+      <w:pPr>
+        <w:pStyle w:val="FirstParagraph"/>
+      </w:pPr>
+      <w:r>
+        <w:t xml:space="preserve">Before any LOT can be created at a Die Cast machine, the dies that run on those machines must exist in the system. The engineer opens the Tools screen and registers each die — a code (e.g.,</w:t>
+      </w:r>
+      <w:r>
+        <w:t xml:space="preserve"> </w:t>
+      </w:r>
+      <w:r>
+        <w:rPr>
+          <w:rStyle w:val="VerbatimChar"/>
+        </w:rPr>
+        <w:t xml:space="preserve">DC-042</w:t>
+      </w:r>
+      <w:r>
+        <w:t xml:space="preserve">), a name, a Die Rank (</w:t>
+      </w:r>
+      <w:r>
+        <w:rPr>
+          <w:rStyle w:val="VerbatimChar"/>
+        </w:rPr>
+        <w:t xml:space="preserve">A — Premium</w:t>
+      </w:r>
+      <w:r>
         <w:t xml:space="preserve">,</w:t>
       </w:r>
       <w:r>
@@ -1602,49 +2577,272 @@
         <w:rPr>
           <w:rStyle w:val="VerbatimChar"/>
         </w:rPr>
+        <w:t xml:space="preserve">B — Standard</w:t>
+      </w:r>
+      <w:r>
+        <w:t xml:space="preserve">,</w:t>
+      </w:r>
+      <w:r>
+        <w:t xml:space="preserve"> </w:t>
+      </w:r>
+      <w:r>
+        <w:rPr>
+          <w:rStyle w:val="VerbatimChar"/>
+        </w:rPr>
+        <w:t xml:space="preserve">C — Marginal</w:t>
+      </w:r>
+      <w:r>
+        <w:t xml:space="preserve">), and a description. For each die they add its cavities: cavity number (immutable after creation), status (Active / Closed / Scrapped), and optional notes. Any custom attributes for dies — such as</w:t>
+      </w:r>
+      <w:r>
+        <w:t xml:space="preserve"> </w:t>
+      </w:r>
+      <w:r>
+        <w:rPr>
+          <w:rStyle w:val="VerbatimChar"/>
+        </w:rPr>
+        <w:t xml:space="preserve">Tonnage</w:t>
+      </w:r>
+      <w:r>
+        <w:t xml:space="preserve"> </w:t>
+      </w:r>
+      <w:r>
+        <w:t xml:space="preserve">or</w:t>
+      </w:r>
+      <w:r>
+        <w:t xml:space="preserve"> </w:t>
+      </w:r>
+      <w:r>
+        <w:rPr>
+          <w:rStyle w:val="VerbatimChar"/>
+        </w:rPr>
         <w:t xml:space="preserve">RefCycleTimeSec</w:t>
       </w:r>
       <w:r>
-        <w:t xml:space="preserve">, and</w:t>
-      </w:r>
-      <w:r>
-        <w:t xml:space="preserve"> </w:t>
-      </w:r>
-      <w:r>
-        <w:rPr>
-          <w:rStyle w:val="VerbatimChar"/>
-        </w:rPr>
-        <w:t xml:space="preserve">NumberOfCavities</w:t>
-      </w:r>
-      <w:r>
-        <w:t xml:space="preserve">. A machining center might need</w:t>
-      </w:r>
-      <w:r>
-        <w:t xml:space="preserve"> </w:t>
-      </w:r>
-      <w:r>
-        <w:rPr>
-          <w:rStyle w:val="VerbatimChar"/>
-        </w:rPr>
-        <w:t xml:space="preserve">SpindleCount</w:t>
-      </w:r>
-      <w:r>
-        <w:t xml:space="preserve"> </w:t>
-      </w:r>
-      <w:r>
-        <w:t xml:space="preserve">and</w:t>
-      </w:r>
-      <w:r>
-        <w:t xml:space="preserve"> </w:t>
-      </w:r>
-      <w:r>
-        <w:rPr>
-          <w:rStyle w:val="VerbatimChar"/>
-        </w:rPr>
-        <w:t xml:space="preserve">CoolantType</w:t>
-      </w:r>
-      <w:r>
-        <w:t xml:space="preserve">. These attribute definitions were themselves configured earlier — someone decided what metadata each type of location carries. The engineer fills in the values. They also create the logical locations: Receiving Dock, Shipping Dock, WIP Storage, Sort Cage. These are Inventory Location types — they don’t have cycle times, but they’re real places where LOTs live.</w:t>
+        <w:t xml:space="preserve"> </w:t>
+      </w:r>
+      <w:r>
+        <w:t xml:space="preserve">— are defined once in the Attribute Schema and then filled in per-die on the Attributes tab.</w:t>
+      </w:r>
+    </w:p>
+    <w:p>
+      <w:pPr>
+        <w:pStyle w:val="CaptionedFigure"/>
+      </w:pPr>
+      <w:r>
+        <w:drawing>
+          <wp:inline>
+            <wp:extent cx="4697128" cy="3147461"/>
+            <wp:effectExtent b="0" l="0" r="0" t="0"/>
+            <wp:docPr descr="Add Die modal" title="" id="52" name="Picture"/>
+            <a:graphic>
+              <a:graphicData uri="http://schemas.openxmlformats.org/drawingml/2006/picture">
+                <pic:pic>
+                  <pic:nvPicPr>
+                    <pic:cNvPr descr="mockup_screenshots/Screenshot%202026-04-29%20143549.png" id="53" name="Picture"/>
+                    <pic:cNvPicPr>
+                      <a:picLocks noChangeArrowheads="1" noChangeAspect="1"/>
+                    </pic:cNvPicPr>
+                  </pic:nvPicPr>
+                  <pic:blipFill>
+                    <a:blip r:embed="rId51"/>
+                    <a:stretch>
+                      <a:fillRect/>
+                    </a:stretch>
+                  </pic:blipFill>
+                  <pic:spPr bwMode="auto">
+                    <a:xfrm>
+                      <a:off x="0" y="0"/>
+                      <a:ext cx="4697128" cy="3147461"/>
+                    </a:xfrm>
+                    <a:prstGeom prst="rect">
+                      <a:avLst/>
+                    </a:prstGeom>
+                    <a:noFill/>
+                    <a:ln w="9525">
+                      <a:noFill/>
+                      <a:headEnd/>
+                      <a:tailEnd/>
+                    </a:ln>
+                  </pic:spPr>
+                </pic:pic>
+              </a:graphicData>
+            </a:graphic>
+          </wp:inline>
+        </w:drawing>
+      </w:r>
+    </w:p>
+    <w:p>
+      <w:pPr>
+        <w:pStyle w:val="ImageCaption"/>
+      </w:pPr>
+      <w:r>
+        <w:t xml:space="preserve">Add Die modal</w:t>
+      </w:r>
+    </w:p>
+    <w:p>
+      <w:pPr>
+        <w:pStyle w:val="CaptionedFigure"/>
+      </w:pPr>
+      <w:r>
+        <w:drawing>
+          <wp:inline>
+            <wp:extent cx="5334000" cy="1696710"/>
+            <wp:effectExtent b="0" l="0" r="0" t="0"/>
+            <wp:docPr descr="Tool Attribute Schema modal — defining Tonnage and RefCycleTimeSec for the Die type" title="" id="55" name="Picture"/>
+            <a:graphic>
+              <a:graphicData uri="http://schemas.openxmlformats.org/drawingml/2006/picture">
+                <pic:pic>
+                  <pic:nvPicPr>
+                    <pic:cNvPr descr="mockup_screenshots/Screenshot%202026-04-29%20143612.png" id="56" name="Picture"/>
+                    <pic:cNvPicPr>
+                      <a:picLocks noChangeArrowheads="1" noChangeAspect="1"/>
+                    </pic:cNvPicPr>
+                  </pic:nvPicPr>
+                  <pic:blipFill>
+                    <a:blip r:embed="rId54"/>
+                    <a:stretch>
+                      <a:fillRect/>
+                    </a:stretch>
+                  </pic:blipFill>
+                  <pic:spPr bwMode="auto">
+                    <a:xfrm>
+                      <a:off x="0" y="0"/>
+                      <a:ext cx="5334000" cy="1696710"/>
+                    </a:xfrm>
+                    <a:prstGeom prst="rect">
+                      <a:avLst/>
+                    </a:prstGeom>
+                    <a:noFill/>
+                    <a:ln w="9525">
+                      <a:noFill/>
+                      <a:headEnd/>
+                      <a:tailEnd/>
+                    </a:ln>
+                  </pic:spPr>
+                </pic:pic>
+              </a:graphicData>
+            </a:graphic>
+          </wp:inline>
+        </w:drawing>
+      </w:r>
+    </w:p>
+    <w:p>
+      <w:pPr>
+        <w:pStyle w:val="ImageCaption"/>
+      </w:pPr>
+      <w:r>
+        <w:t xml:space="preserve">Tool Attribute Schema modal — defining Tonnage and RefCycleTimeSec for the Die type</w:t>
+      </w:r>
+    </w:p>
+    <w:p>
+      <w:pPr>
+        <w:pStyle w:val="CaptionedFigure"/>
+      </w:pPr>
+      <w:r>
+        <w:drawing>
+          <wp:inline>
+            <wp:extent cx="5334000" cy="2653094"/>
+            <wp:effectExtent b="0" l="0" r="0" t="0"/>
+            <wp:docPr descr="Tools screen — DC-042 Front Cover Die, Attributes tab" title="" id="58" name="Picture"/>
+            <a:graphic>
+              <a:graphicData uri="http://schemas.openxmlformats.org/drawingml/2006/picture">
+                <pic:pic>
+                  <pic:nvPicPr>
+                    <pic:cNvPr descr="mockup_screenshots/Screenshot%202026-04-29%20143502.png" id="59" name="Picture"/>
+                    <pic:cNvPicPr>
+                      <a:picLocks noChangeArrowheads="1" noChangeAspect="1"/>
+                    </pic:cNvPicPr>
+                  </pic:nvPicPr>
+                  <pic:blipFill>
+                    <a:blip r:embed="rId57"/>
+                    <a:stretch>
+                      <a:fillRect/>
+                    </a:stretch>
+                  </pic:blipFill>
+                  <pic:spPr bwMode="auto">
+                    <a:xfrm>
+                      <a:off x="0" y="0"/>
+                      <a:ext cx="5334000" cy="2653094"/>
+                    </a:xfrm>
+                    <a:prstGeom prst="rect">
+                      <a:avLst/>
+                    </a:prstGeom>
+                    <a:noFill/>
+                    <a:ln w="9525">
+                      <a:noFill/>
+                      <a:headEnd/>
+                      <a:tailEnd/>
+                    </a:ln>
+                  </pic:spPr>
+                </pic:pic>
+              </a:graphicData>
+            </a:graphic>
+          </wp:inline>
+        </w:drawing>
+      </w:r>
+    </w:p>
+    <w:p>
+      <w:pPr>
+        <w:pStyle w:val="ImageCaption"/>
+      </w:pPr>
+      <w:r>
+        <w:t xml:space="preserve">Tools screen — DC-042 Front Cover Die, Attributes tab</w:t>
+      </w:r>
+    </w:p>
+    <w:p>
+      <w:pPr>
+        <w:pStyle w:val="CaptionedFigure"/>
+      </w:pPr>
+      <w:r>
+        <w:drawing>
+          <wp:inline>
+            <wp:extent cx="5334000" cy="2567246"/>
+            <wp:effectExtent b="0" l="0" r="0" t="0"/>
+            <wp:docPr descr="Tools screen — DC-042, Cavities tab showing 2 active cavities" title="" id="61" name="Picture"/>
+            <a:graphic>
+              <a:graphicData uri="http://schemas.openxmlformats.org/drawingml/2006/picture">
+                <pic:pic>
+                  <pic:nvPicPr>
+                    <pic:cNvPr descr="mockup_screenshots/Screenshot%202026-04-29%20143518.png" id="62" name="Picture"/>
+                    <pic:cNvPicPr>
+                      <a:picLocks noChangeArrowheads="1" noChangeAspect="1"/>
+                    </pic:cNvPicPr>
+                  </pic:nvPicPr>
+                  <pic:blipFill>
+                    <a:blip r:embed="rId60"/>
+                    <a:stretch>
+                      <a:fillRect/>
+                    </a:stretch>
+                  </pic:blipFill>
+                  <pic:spPr bwMode="auto">
+                    <a:xfrm>
+                      <a:off x="0" y="0"/>
+                      <a:ext cx="5334000" cy="2567246"/>
+                    </a:xfrm>
+                    <a:prstGeom prst="rect">
+                      <a:avLst/>
+                    </a:prstGeom>
+                    <a:noFill/>
+                    <a:ln w="9525">
+                      <a:noFill/>
+                      <a:headEnd/>
+                      <a:tailEnd/>
+                    </a:ln>
+                  </pic:spPr>
+                </pic:pic>
+              </a:graphicData>
+            </a:graphic>
+          </wp:inline>
+        </w:drawing>
+      </w:r>
+    </w:p>
+    <w:p>
+      <w:pPr>
+        <w:pStyle w:val="ImageCaption"/>
+      </w:pPr>
+      <w:r>
+        <w:t xml:space="preserve">Tools screen — DC-042, Cavities tab showing 2 active cavities</w:t>
       </w:r>
     </w:p>
     <w:p>
@@ -1652,32 +2850,165 @@
         <w:pStyle w:val="BodyText"/>
       </w:pPr>
       <w:r>
-        <w:t xml:space="preserve">Then they set up terminals. Each Ignition client station on the floor gets a</w:t>
-      </w:r>
-      <w:r>
-        <w:t xml:space="preserve"> </w:t>
-      </w:r>
-      <w:r>
-        <w:rPr>
-          <w:rStyle w:val="VerbatimChar"/>
-        </w:rPr>
-        <w:t xml:space="preserve">Terminal</w:t>
-      </w:r>
-      <w:r>
-        <w:t xml:space="preserve"> </w:t>
-      </w:r>
-      <w:r>
-        <w:t xml:space="preserve">record — its IP address, which location it’s at, which Zebra printer it talks to, whether it has a barcode scanner. This is how the system knows that when operator Maria scans a LOT at terminal DC-05, that action happened at Die Cast Machine #5, and any label it prints goes to the Zebra on the table next to her.</w:t>
-      </w:r>
-    </w:p>
-    <w:bookmarkEnd w:id="11"/>
-    <w:bookmarkStart w:id="12" w:name="defining-what-we-make"/>
+        <w:t xml:space="preserve">Die Ranks themselves are configured on the Die Ranks screen — the engineer creates rank codes and names, then uses the compatibility matrix to mark which rank combinations can run together in a merge. Green cells mean the pair can merge; red cells mean it is blocked. These rules are enforced at</w:t>
+      </w:r>
+      <w:r>
+        <w:t xml:space="preserve"> </w:t>
+      </w:r>
+      <w:r>
+        <w:rPr>
+          <w:rStyle w:val="VerbatimChar"/>
+        </w:rPr>
+        <w:t xml:space="preserve">Lot_Merge</w:t>
+      </w:r>
+      <w:r>
+        <w:t xml:space="preserve"> </w:t>
+      </w:r>
+      <w:r>
+        <w:t xml:space="preserve">time on the shop floor.</w:t>
+      </w:r>
+    </w:p>
+    <w:p>
+      <w:pPr>
+        <w:pStyle w:val="CaptionedFigure"/>
+      </w:pPr>
+      <w:r>
+        <w:drawing>
+          <wp:inline>
+            <wp:extent cx="5334000" cy="2654491"/>
+            <wp:effectExtent b="0" l="0" r="0" t="0"/>
+            <wp:docPr descr="Die Ranks screen — A/B/C ranks with color-block compatibility matrix" title="" id="64" name="Picture"/>
+            <a:graphic>
+              <a:graphicData uri="http://schemas.openxmlformats.org/drawingml/2006/picture">
+                <pic:pic>
+                  <pic:nvPicPr>
+                    <pic:cNvPr descr="mockup_screenshots/Screenshot%202026-04-29%20143627.png" id="65" name="Picture"/>
+                    <pic:cNvPicPr>
+                      <a:picLocks noChangeArrowheads="1" noChangeAspect="1"/>
+                    </pic:cNvPicPr>
+                  </pic:nvPicPr>
+                  <pic:blipFill>
+                    <a:blip r:embed="rId63"/>
+                    <a:stretch>
+                      <a:fillRect/>
+                    </a:stretch>
+                  </pic:blipFill>
+                  <pic:spPr bwMode="auto">
+                    <a:xfrm>
+                      <a:off x="0" y="0"/>
+                      <a:ext cx="5334000" cy="2654491"/>
+                    </a:xfrm>
+                    <a:prstGeom prst="rect">
+                      <a:avLst/>
+                    </a:prstGeom>
+                    <a:noFill/>
+                    <a:ln w="9525">
+                      <a:noFill/>
+                      <a:headEnd/>
+                      <a:tailEnd/>
+                    </a:ln>
+                  </pic:spPr>
+                </pic:pic>
+              </a:graphicData>
+            </a:graphic>
+          </wp:inline>
+        </w:drawing>
+      </w:r>
+    </w:p>
+    <w:p>
+      <w:pPr>
+        <w:pStyle w:val="ImageCaption"/>
+      </w:pPr>
+      <w:r>
+        <w:t xml:space="preserve">Die Ranks screen — A/B/C ranks with color-block compatibility matrix</w:t>
+      </w:r>
+    </w:p>
+    <w:p>
+      <w:pPr>
+        <w:pStyle w:val="BodyText"/>
+      </w:pPr>
+      <w:r>
+        <w:t xml:space="preserve">Tool assignment — mounting a die to a specific Die Cast Cell — is also done from the Tools screen (Assignments tab). Mounting creates a</w:t>
+      </w:r>
+      <w:r>
+        <w:t xml:space="preserve"> </w:t>
+      </w:r>
+      <w:r>
+        <w:rPr>
+          <w:rStyle w:val="VerbatimChar"/>
+        </w:rPr>
+        <w:t xml:space="preserve">Tools.ToolAssignment</w:t>
+      </w:r>
+      <w:r>
+        <w:t xml:space="preserve"> </w:t>
+      </w:r>
+      <w:r>
+        <w:t xml:space="preserve">record linking the die to the cell with a timestamp and the user’s initials. Only one die can be actively mounted per cell. The assignment is released from the same screen when the die is pulled.</w:t>
+      </w:r>
+    </w:p>
+    <w:p>
+      <w:pPr>
+        <w:pStyle w:val="CaptionedFigure"/>
+      </w:pPr>
+      <w:r>
+        <w:drawing>
+          <wp:inline>
+            <wp:extent cx="5334000" cy="2580360"/>
+            <wp:effectExtent b="0" l="0" r="0" t="0"/>
+            <wp:docPr descr="Tools screen — DC-042, Assignments tab showing mount history and active assignment to DC Machine #7" title="" id="67" name="Picture"/>
+            <a:graphic>
+              <a:graphicData uri="http://schemas.openxmlformats.org/drawingml/2006/picture">
+                <pic:pic>
+                  <pic:nvPicPr>
+                    <pic:cNvPr descr="mockup_screenshots/Screenshot%202026-04-29%20143530.png" id="68" name="Picture"/>
+                    <pic:cNvPicPr>
+                      <a:picLocks noChangeArrowheads="1" noChangeAspect="1"/>
+                    </pic:cNvPicPr>
+                  </pic:nvPicPr>
+                  <pic:blipFill>
+                    <a:blip r:embed="rId66"/>
+                    <a:stretch>
+                      <a:fillRect/>
+                    </a:stretch>
+                  </pic:blipFill>
+                  <pic:spPr bwMode="auto">
+                    <a:xfrm>
+                      <a:off x="0" y="0"/>
+                      <a:ext cx="5334000" cy="2580360"/>
+                    </a:xfrm>
+                    <a:prstGeom prst="rect">
+                      <a:avLst/>
+                    </a:prstGeom>
+                    <a:noFill/>
+                    <a:ln w="9525">
+                      <a:noFill/>
+                      <a:headEnd/>
+                      <a:tailEnd/>
+                    </a:ln>
+                  </pic:spPr>
+                </pic:pic>
+              </a:graphicData>
+            </a:graphic>
+          </wp:inline>
+        </w:drawing>
+      </w:r>
+    </w:p>
+    <w:p>
+      <w:pPr>
+        <w:pStyle w:val="ImageCaption"/>
+      </w:pPr>
+      <w:r>
+        <w:t xml:space="preserve">Tools screen — DC-042, Assignments tab showing mount history and active assignment to DC Machine #7</w:t>
+      </w:r>
+    </w:p>
+    <w:bookmarkEnd w:id="69"/>
+    <w:bookmarkStart w:id="82" w:name="defining-downtime-vocabulary"/>
     <w:p>
       <w:pPr>
         <w:pStyle w:val="Heading3"/>
       </w:pPr>
       <w:r>
-        <w:t xml:space="preserve">Defining What We Make</w:t>
+        <w:t xml:space="preserve">Defining Downtime Vocabulary</w:t>
       </w:r>
     </w:p>
     <w:p>
@@ -1685,7 +3016,147 @@
         <w:pStyle w:val="FirstParagraph"/>
       </w:pPr>
       <w:r>
-        <w:t xml:space="preserve">Next, the item master. The engineer creates items — each one a part number that MPP either manufactures or receives from a vendor. They classify each item: Raw Material, Component, Sub-Assembly, Finished Good, Pass-Through. They set the Macola ERP cross-reference number for each part so the two systems can talk when that integration goes live. They set the default sub-lot quantity — how many pieces go into each sub-LOT when a parent LOT is split after machining. They set the max lot size for reasonability checks.</w:t>
+        <w:t xml:space="preserve">Finally, the ~353 downtime reason codes. Equipment failure on the 400-ton press. Mold change on die #7. Quality hold on line 3. Scheduled maintenance. Each code belongs to a department and a type (Equipment, Mold, Quality, Setup, Miscellaneous, Unscheduled), and carries an</w:t>
+      </w:r>
+      <w:r>
+        <w:t xml:space="preserve"> </w:t>
+      </w:r>
+      <w:r>
+        <w:rPr>
+          <w:rStyle w:val="VerbatimChar"/>
+        </w:rPr>
+        <w:t xml:space="preserve">IsExcused</w:t>
+      </w:r>
+      <w:r>
+        <w:t xml:space="preserve"> </w:t>
+      </w:r>
+      <w:r>
+        <w:t xml:space="preserve">flag. Shift schedules get defined here too — first shift 6am–2pm Monday through Friday, second shift 2pm–10pm, weekend overtime pattern. Each schedule includes break configuration (lunch duration, morning break duration, afternoon break duration) — these durations are used by the system to write</w:t>
+      </w:r>
+      <w:r>
+        <w:t xml:space="preserve"> </w:t>
+      </w:r>
+      <w:r>
+        <w:rPr>
+          <w:rStyle w:val="VerbatimChar"/>
+        </w:rPr>
+        <w:t xml:space="preserve">DowntimeEvent</w:t>
+      </w:r>
+      <w:r>
+        <w:t xml:space="preserve"> </w:t>
+      </w:r>
+      <w:r>
+        <w:t xml:space="preserve">rows automatically when operators submit their end-of-shift time entry.</w:t>
+      </w:r>
+    </w:p>
+    <w:p>
+      <w:pPr>
+        <w:pStyle w:val="CaptionedFigure"/>
+      </w:pPr>
+      <w:r>
+        <w:drawing>
+          <wp:inline>
+            <wp:extent cx="5334000" cy="2643373"/>
+            <wp:effectExtent b="0" l="0" r="0" t="0"/>
+            <wp:docPr descr="Downtime Codes screen — codes across Die Cast, Machine Shop, and Trim Shop with type and excused flag" title="" id="71" name="Picture"/>
+            <a:graphic>
+              <a:graphicData uri="http://schemas.openxmlformats.org/drawingml/2006/picture">
+                <pic:pic>
+                  <pic:nvPicPr>
+                    <pic:cNvPr descr="mockup_screenshots/Screenshot%202026-04-29%20143712.png" id="72" name="Picture"/>
+                    <pic:cNvPicPr>
+                      <a:picLocks noChangeArrowheads="1" noChangeAspect="1"/>
+                    </pic:cNvPicPr>
+                  </pic:nvPicPr>
+                  <pic:blipFill>
+                    <a:blip r:embed="rId70"/>
+                    <a:stretch>
+                      <a:fillRect/>
+                    </a:stretch>
+                  </pic:blipFill>
+                  <pic:spPr bwMode="auto">
+                    <a:xfrm>
+                      <a:off x="0" y="0"/>
+                      <a:ext cx="5334000" cy="2643373"/>
+                    </a:xfrm>
+                    <a:prstGeom prst="rect">
+                      <a:avLst/>
+                    </a:prstGeom>
+                    <a:noFill/>
+                    <a:ln w="9525">
+                      <a:noFill/>
+                      <a:headEnd/>
+                      <a:tailEnd/>
+                    </a:ln>
+                  </pic:spPr>
+                </pic:pic>
+              </a:graphicData>
+            </a:graphic>
+          </wp:inline>
+        </w:drawing>
+      </w:r>
+    </w:p>
+    <w:p>
+      <w:pPr>
+        <w:pStyle w:val="ImageCaption"/>
+      </w:pPr>
+      <w:r>
+        <w:t xml:space="preserve">Downtime Codes screen — codes across Die Cast, Machine Shop, and Trim Shop with type and excused flag</w:t>
+      </w:r>
+    </w:p>
+    <w:p>
+      <w:pPr>
+        <w:pStyle w:val="CaptionedFigure"/>
+      </w:pPr>
+      <w:r>
+        <w:drawing>
+          <wp:inline>
+            <wp:extent cx="5334000" cy="2654491"/>
+            <wp:effectExtent b="0" l="0" r="0" t="0"/>
+            <wp:docPr descr="Shift Schedules screen — First Shift, Second Shift, Weekend OT" title="" id="74" name="Picture"/>
+            <a:graphic>
+              <a:graphicData uri="http://schemas.openxmlformats.org/drawingml/2006/picture">
+                <pic:pic>
+                  <pic:nvPicPr>
+                    <pic:cNvPr descr="mockup_screenshots/Screenshot%202026-04-29%20143722.png" id="75" name="Picture"/>
+                    <pic:cNvPicPr>
+                      <a:picLocks noChangeArrowheads="1" noChangeAspect="1"/>
+                    </pic:cNvPicPr>
+                  </pic:nvPicPr>
+                  <pic:blipFill>
+                    <a:blip r:embed="rId73"/>
+                    <a:stretch>
+                      <a:fillRect/>
+                    </a:stretch>
+                  </pic:blipFill>
+                  <pic:spPr bwMode="auto">
+                    <a:xfrm>
+                      <a:off x="0" y="0"/>
+                      <a:ext cx="5334000" cy="2654491"/>
+                    </a:xfrm>
+                    <a:prstGeom prst="rect">
+                      <a:avLst/>
+                    </a:prstGeom>
+                    <a:noFill/>
+                    <a:ln w="9525">
+                      <a:noFill/>
+                      <a:headEnd/>
+                      <a:tailEnd/>
+                    </a:ln>
+                  </pic:spPr>
+                </pic:pic>
+              </a:graphicData>
+            </a:graphic>
+          </wp:inline>
+        </w:drawing>
+      </w:r>
+    </w:p>
+    <w:p>
+      <w:pPr>
+        <w:pStyle w:val="ImageCaption"/>
+      </w:pPr>
+      <w:r>
+        <w:t xml:space="preserve">Shift Schedules screen — First Shift, Second Shift, Weekend OT</w:t>
       </w:r>
     </w:p>
     <w:p>
@@ -1693,131 +3164,6 @@
         <w:pStyle w:val="BodyText"/>
       </w:pPr>
       <w:r>
-        <w:t xml:space="preserve">For each finished good that ships to Honda, they create a container configuration. The 5G0 Front Cover, for example, ships in containers with 4 trays, 12 parts per tray, serialized, with dunnage code RD-5G0F. The RPY Cam Holder ships 6 trays, 24 per tray, not serialized. These configs drive the container lifecycle on the floor — the MES knows when a container is full.</w:t>
-      </w:r>
-    </w:p>
-    <w:bookmarkEnd w:id="12"/>
-    <w:bookmarkStart w:id="13" w:name="defining-how-we-make-it"/>
-    <w:p>
-      <w:pPr>
-        <w:pStyle w:val="Heading3"/>
-      </w:pPr>
-      <w:r>
-        <w:t xml:space="preserve">Defining How We Make It</w:t>
-      </w:r>
-    </w:p>
-    <w:p>
-      <w:pPr>
-        <w:pStyle w:val="FirstParagraph"/>
-      </w:pPr>
-      <w:r>
-        <w:t xml:space="preserve">Now routes. The engineer creates a route template for each item — the ordered sequence of operations it passes through. The 5G0 Front Cover route might be: Die Cast → Trim → Machine (CNC) → Assembly Front → Pack &amp; Ship. Each step in the route points to an operation template — a reusable definition of what data to collect at that type of operation. The Die Cast operation template says: collect die info, collect cavity info, collect weight, collect good count, collect bad count. The Assembly operation template says: requires serial number, requires material verification, collects good count. These flags drive the UI — the shop floor screen at an assembly station looks different from the one at a die cast press because the operation template tells it what fields to show.</w:t>
-      </w:r>
-    </w:p>
-    <w:p>
-      <w:pPr>
-        <w:pStyle w:val="BodyText"/>
-      </w:pPr>
-      <w:r>
-        <w:t xml:space="preserve">The engineer also creates the part-to-location eligibility map. Not every machine can run every part. The 5G0 can run on Die Cast machines 3, 7, and 12, but not on machine 15 (wrong tonnage). This map is what lets the MES validate that when an operator starts producing 5G0 parts on machine 7, that’s a legal combination.</w:t>
-      </w:r>
-    </w:p>
-    <w:p>
-      <w:pPr>
-        <w:pStyle w:val="BodyText"/>
-      </w:pPr>
-      <w:r>
-        <w:t xml:space="preserve">For assembled products with BOMs, the engineer creates versioned bills of material. The 5G0 Front Cover Assembly consumes one 5G0 casting and two PNA mounting pins. Version 1 of the BOM is effective from January 2026. If engineering changes the design in March, they create version 2 — but every production record from January still points to version 1.</w:t>
-      </w:r>
-    </w:p>
-    <w:bookmarkEnd w:id="13"/>
-    <w:bookmarkStart w:id="14" w:name="defining-quality-standards"/>
-    <w:p>
-      <w:pPr>
-        <w:pStyle w:val="Heading3"/>
-      </w:pPr>
-      <w:r>
-        <w:t xml:space="preserve">Defining Quality Standards</w:t>
-      </w:r>
-    </w:p>
-    <w:p>
-      <w:pPr>
-        <w:pStyle w:val="FirstParagraph"/>
-      </w:pPr>
-      <w:r>
-        <w:t xml:space="preserve">The engineer creates quality specs — also versioned. For the 5G0 Front Cover, the spec says: measure surface flatness (target 0.002”, lower limit 0.001”, upper limit 0.003”), check bore diameter (target 25.40mm ± 0.02mm), visual inspection for porosity (pass/fail). Each attribute has its data type, UOM, target, and limits. When an inspector on the floor takes a sample, the screen they see is generated from this spec — the system knows what to ask for because the engineer defined it here.</w:t>
-      </w:r>
-    </w:p>
-    <w:p>
-      <w:pPr>
-        <w:pStyle w:val="BodyText"/>
-      </w:pPr>
-      <w:r>
-        <w:t xml:space="preserve">They also load the defect codes — approximately 145 of them, organized by department. Die Cast gets codes for porosity (135), cold shut, flash, misrun. Machine Shop gets codes for out-of-tolerance (122</w:t>
-      </w:r>
-      <w:r>
-        <w:t xml:space="preserve"> </w:t>
-      </w:r>
-      <w:r>
-        <w:t xml:space="preserve">“Dimensional”</w:t>
-      </w:r>
-      <w:r>
-        <w:t xml:space="preserve">), tool marks (154), surface finish (143). There are also codes for Trim Shop, Production Control, Quality Control, and a High Speed Supplier Parts (HSP) department for vendor-part defects (codes 247–253). Each code carries an</w:t>
-      </w:r>
-      <w:r>
-        <w:t xml:space="preserve"> </w:t>
-      </w:r>
-      <w:r>
-        <w:rPr>
-          <w:rStyle w:val="VerbatimChar"/>
-        </w:rPr>
-        <w:t xml:space="preserve">IsExcused</w:t>
-      </w:r>
-      <w:r>
-        <w:t xml:space="preserve"> </w:t>
-      </w:r>
-      <w:r>
-        <w:t xml:space="preserve">flag for future OEE quality calculations.</w:t>
-      </w:r>
-    </w:p>
-    <w:bookmarkEnd w:id="14"/>
-    <w:bookmarkStart w:id="15" w:name="defining-downtime-vocabulary"/>
-    <w:p>
-      <w:pPr>
-        <w:pStyle w:val="Heading3"/>
-      </w:pPr>
-      <w:r>
-        <w:t xml:space="preserve">Defining Downtime Vocabulary</w:t>
-      </w:r>
-    </w:p>
-    <w:p>
-      <w:pPr>
-        <w:pStyle w:val="FirstParagraph"/>
-      </w:pPr>
-      <w:r>
-        <w:t xml:space="preserve">Finally, the ~660 downtime reason codes. Equipment failure on the 400-ton press. Mold change on die #7. Quality hold on line 3. Scheduled maintenance. Each code belongs to a department and a type (Equipment, Mold, Quality, Setup, Miscellaneous, Unscheduled), and carries an</w:t>
-      </w:r>
-      <w:r>
-        <w:t xml:space="preserve"> </w:t>
-      </w:r>
-      <w:r>
-        <w:rPr>
-          <w:rStyle w:val="VerbatimChar"/>
-        </w:rPr>
-        <w:t xml:space="preserve">IsExcused</w:t>
-      </w:r>
-      <w:r>
-        <w:t xml:space="preserve"> </w:t>
-      </w:r>
-      <w:r>
-        <w:t xml:space="preserve">flag. Shift schedules get defined here too — first shift 6am–2pm Monday through Friday, second shift 2pm–10pm, weekend overtime pattern.</w:t>
-      </w:r>
-    </w:p>
-    <w:p>
-      <w:pPr>
-        <w:pStyle w:val="BodyText"/>
-      </w:pPr>
-      <w:r>
         <w:t xml:space="preserve">Every one of these configuration changes is logged to</w:t>
       </w:r>
       <w:r>
@@ -1834,6 +3180,116 @@
       </w:r>
       <w:r>
         <w:t xml:space="preserve">— who changed what, when, what the old value was.</w:t>
+      </w:r>
+    </w:p>
+    <w:p>
+      <w:pPr>
+        <w:pStyle w:val="CaptionedFigure"/>
+      </w:pPr>
+      <w:r>
+        <w:drawing>
+          <wp:inline>
+            <wp:extent cx="5334000" cy="2662830"/>
+            <wp:effectExtent b="0" l="0" r="0" t="0"/>
+            <wp:docPr descr="Audit Log — timestamped record of every configuration change with user, entity, and description" title="" id="77" name="Picture"/>
+            <a:graphic>
+              <a:graphicData uri="http://schemas.openxmlformats.org/drawingml/2006/picture">
+                <pic:pic>
+                  <pic:nvPicPr>
+                    <pic:cNvPr descr="mockup_screenshots/Screenshot%202026-04-29%20143741.png" id="78" name="Picture"/>
+                    <pic:cNvPicPr>
+                      <a:picLocks noChangeArrowheads="1" noChangeAspect="1"/>
+                    </pic:cNvPicPr>
+                  </pic:nvPicPr>
+                  <pic:blipFill>
+                    <a:blip r:embed="rId76"/>
+                    <a:stretch>
+                      <a:fillRect/>
+                    </a:stretch>
+                  </pic:blipFill>
+                  <pic:spPr bwMode="auto">
+                    <a:xfrm>
+                      <a:off x="0" y="0"/>
+                      <a:ext cx="5334000" cy="2662830"/>
+                    </a:xfrm>
+                    <a:prstGeom prst="rect">
+                      <a:avLst/>
+                    </a:prstGeom>
+                    <a:noFill/>
+                    <a:ln w="9525">
+                      <a:noFill/>
+                      <a:headEnd/>
+                      <a:tailEnd/>
+                    </a:ln>
+                  </pic:spPr>
+                </pic:pic>
+              </a:graphicData>
+            </a:graphic>
+          </wp:inline>
+        </w:drawing>
+      </w:r>
+    </w:p>
+    <w:p>
+      <w:pPr>
+        <w:pStyle w:val="ImageCaption"/>
+      </w:pPr>
+      <w:r>
+        <w:t xml:space="preserve">Audit Log — timestamped record of every configuration change with user, entity, and description</w:t>
+      </w:r>
+    </w:p>
+    <w:p>
+      <w:pPr>
+        <w:pStyle w:val="CaptionedFigure"/>
+      </w:pPr>
+      <w:r>
+        <w:drawing>
+          <wp:inline>
+            <wp:extent cx="5334000" cy="2640594"/>
+            <wp:effectExtent b="0" l="0" r="0" t="0"/>
+            <wp:docPr descr="Failure Log — rejected proc calls with top rejection reasons and top failing procedures summary" title="" id="80" name="Picture"/>
+            <a:graphic>
+              <a:graphicData uri="http://schemas.openxmlformats.org/drawingml/2006/picture">
+                <pic:pic>
+                  <pic:nvPicPr>
+                    <pic:cNvPr descr="mockup_screenshots/Screenshot%202026-04-29%20143754.png" id="81" name="Picture"/>
+                    <pic:cNvPicPr>
+                      <a:picLocks noChangeArrowheads="1" noChangeAspect="1"/>
+                    </pic:cNvPicPr>
+                  </pic:nvPicPr>
+                  <pic:blipFill>
+                    <a:blip r:embed="rId79"/>
+                    <a:stretch>
+                      <a:fillRect/>
+                    </a:stretch>
+                  </pic:blipFill>
+                  <pic:spPr bwMode="auto">
+                    <a:xfrm>
+                      <a:off x="0" y="0"/>
+                      <a:ext cx="5334000" cy="2640594"/>
+                    </a:xfrm>
+                    <a:prstGeom prst="rect">
+                      <a:avLst/>
+                    </a:prstGeom>
+                    <a:noFill/>
+                    <a:ln w="9525">
+                      <a:noFill/>
+                      <a:headEnd/>
+                      <a:tailEnd/>
+                    </a:ln>
+                  </pic:spPr>
+                </pic:pic>
+              </a:graphicData>
+            </a:graphic>
+          </wp:inline>
+        </w:drawing>
+      </w:r>
+    </w:p>
+    <w:p>
+      <w:pPr>
+        <w:pStyle w:val="ImageCaption"/>
+      </w:pPr>
+      <w:r>
+        <w:t xml:space="preserve">Failure Log — rejected proc calls with top rejection reasons and top failing procedures summary</w:t>
       </w:r>
     </w:p>
     <w:p>
@@ -1843,9 +3299,9 @@
         </w:pict>
       </w:r>
     </w:p>
-    <w:bookmarkEnd w:id="15"/>
-    <w:bookmarkEnd w:id="16"/>
-    <w:bookmarkStart w:id="26" w:name="X9d3dbf4d142c75b298042d81841f871b0d06ec6"/>
+    <w:bookmarkEnd w:id="82"/>
+    <w:bookmarkEnd w:id="83"/>
+    <w:bookmarkStart w:id="93" w:name="X9d3dbf4d142c75b298042d81841f871b0d06ec6"/>
     <w:p>
       <w:pPr>
         <w:pStyle w:val="Heading2"/>
@@ -1868,7 +3324,7 @@
         <w:t xml:space="preserve">It’s 6:15am on a Tuesday. First shift has started. The aluminum is already molten.</w:t>
       </w:r>
     </w:p>
-    <w:bookmarkStart w:id="17" w:name="am-die-cast-a-lot-is-born"/>
+    <w:bookmarkStart w:id="84" w:name="am-die-cast-a-lot-is-born"/>
     <w:p>
       <w:pPr>
         <w:pStyle w:val="Heading3"/>
@@ -2351,14 +3807,14 @@
         <w:t xml:space="preserve">would have been created automatically with source=PLC, and Carlos would just need to assign the reason code. Note: the legacy paper forms track downtime as cumulative minutes subtracted from a 425-minute base runtime (with adjustments for lunch, breaks, and overtime). The new MES captures discrete start/end events, which is a more granular model — the cumulative shift total is derived from the events rather than entered directly.</w:t>
       </w:r>
     </w:p>
-    <w:bookmarkEnd w:id="17"/>
-    <w:bookmarkStart w:id="18" w:name="Xcdd0e2985736a1da659a0c9e6efc28a353afad3"/>
+    <w:bookmarkEnd w:id="84"/>
+    <w:bookmarkStart w:id="85" w:name="am-trim-shop-lot-moves-through-the-plant"/>
     <w:p>
       <w:pPr>
         <w:pStyle w:val="Heading3"/>
       </w:pPr>
       <w:r>
-        <w:t xml:space="preserve">8:30am — Trim Shop: LOT Moves Through the Plant — and Changes Identity</w:t>
+        <w:t xml:space="preserve">8:30am — Trim Shop: LOT Moves Through the Plant</w:t>
       </w:r>
     </w:p>
     <w:p>
@@ -2592,32 +4048,23 @@
         <w:pStyle w:val="BodyText"/>
       </w:pPr>
       <w:r>
+        <w:t xml:space="preserve">When the Trim operator is done processing the basket, they complete the LOT at Trim OUT. At this point two things happen: first, the sub-LOT split occurs — the MES creates child LOTs from the parent based on the default sub-lot quantity for the part (e.g., 24 pieces each for 5G0). Second, the</w:t>
+      </w:r>
+      <w:r>
+        <w:t xml:space="preserve"> </w:t>
+      </w:r>
+      <w:r>
         <w:rPr>
           <w:b/>
           <w:bCs/>
         </w:rPr>
-        <w:t xml:space="preserve">Part-identity change (OI-11):</w:t>
-      </w:r>
-      <w:r>
-        <w:t xml:space="preserve"> </w:t>
-      </w:r>
-      <w:r>
-        <w:t xml:space="preserve">MPP parts change part number as they cross into the Trim Shop — the cast part is</w:t>
-      </w:r>
-      <w:r>
-        <w:t xml:space="preserve"> </w:t>
-      </w:r>
-      <w:r>
-        <w:rPr>
-          <w:rStyle w:val="VerbatimChar"/>
-        </w:rPr>
-        <w:t xml:space="preserve">5G0-CAST-4102</w:t>
-      </w:r>
-      <w:r>
-        <w:t xml:space="preserve">, the trim part is</w:t>
-      </w:r>
-      <w:r>
-        <w:t xml:space="preserve"> </w:t>
+        <w:t xml:space="preserve">part-identity change</w:t>
+      </w:r>
+      <w:r>
+        <w:t xml:space="preserve"> </w:t>
+      </w:r>
+      <w:r>
+        <w:t xml:space="preserve">fires: MPP parts change part number at the Trim → Machining boundary — the trim part (</w:t>
       </w:r>
       <w:r>
         <w:rPr>
@@ -2626,7 +4073,16 @@
         <w:t xml:space="preserve">5G0-TRIM-4102</w:t>
       </w:r>
       <w:r>
-        <w:t xml:space="preserve">. The MES prompts:</w:t>
+        <w:t xml:space="preserve">) becomes the machining part (</w:t>
+      </w:r>
+      <w:r>
+        <w:rPr>
+          <w:rStyle w:val="VerbatimChar"/>
+        </w:rPr>
+        <w:t xml:space="preserve">5G0-MACH-4102</w:t>
+      </w:r>
+      <w:r>
+        <w:t xml:space="preserve">). The MES prompts:</w:t>
       </w:r>
       <w:r>
         <w:t xml:space="preserve"> </w:t>
@@ -2636,7 +4092,7 @@
           <w:i/>
           <w:iCs/>
         </w:rPr>
-        <w:t xml:space="preserve">“This LOT is 5G0-CAST-4102. Receive as 5G0-TRIM-4102?”</w:t>
+        <w:t xml:space="preserve">“Complete as 5G0-MACH-4102?”</w:t>
       </w:r>
       <w:r>
         <w:t xml:space="preserve">. The operator confirms. Under the hood this is a normal</w:t>
@@ -2652,7 +4108,7 @@
         <w:t xml:space="preserve">1-line BOM consumption</w:t>
       </w:r>
       <w:r>
-        <w:t xml:space="preserve">: the trim part’s BOM has a single line pointing back to the cast part at QtyPer=1. The MES creates a new destination LOT under the trim part, writes a</w:t>
+        <w:t xml:space="preserve">: the machining part’s BOM has a single line pointing back to the trim part at QtyPer=1. The MES creates new destination LOTs under the machining part, writes</w:t>
       </w:r>
       <w:r>
         <w:t xml:space="preserve"> </w:t>
@@ -2667,7 +4123,7 @@
         <w:t xml:space="preserve"> </w:t>
       </w:r>
       <w:r>
-        <w:t xml:space="preserve">(consumed cast / produced trim, piece-for-piece), and a</w:t>
+        <w:t xml:space="preserve">rows (consumed trim / produced machining, piece-for-piece), and</w:t>
       </w:r>
       <w:r>
         <w:t xml:space="preserve"> </w:t>
@@ -2682,7 +4138,7 @@
         <w:t xml:space="preserve"> </w:t>
       </w:r>
       <w:r>
-        <w:t xml:space="preserve">row with</w:t>
+        <w:t xml:space="preserve">rows with</w:t>
       </w:r>
       <w:r>
         <w:t xml:space="preserve"> </w:t>
@@ -2697,78 +4153,17 @@
         <w:t xml:space="preserve"> </w:t>
       </w:r>
       <w:r>
-        <w:t xml:space="preserve">links the two LOTs. Honda backward trace walks the genealogy from shipped trim LOT → cast LOT → die / cavity / Carlos — same code path as any assembly consumption (FDS-05-033).</w:t>
-      </w:r>
-      <w:r>
-        <w:t xml:space="preserve"> </w:t>
-      </w:r>
-      <w:r>
-        <w:rPr>
-          <w:i/>
-          <w:iCs/>
-        </w:rPr>
-        <w:t xml:space="preserve">(An earlier v0.10 FDS draft added a dedicated</w:t>
-      </w:r>
-      <w:r>
-        <w:rPr>
-          <w:i/>
-          <w:iCs/>
-        </w:rPr>
-        <w:t xml:space="preserve"> </w:t>
-      </w:r>
-      <w:r>
-        <w:rPr>
-          <w:rStyle w:val="VerbatimChar"/>
-          <w:i/>
-          <w:iCs/>
-        </w:rPr>
-        <w:t xml:space="preserve">Parts.ItemTransform</w:t>
-      </w:r>
-      <w:r>
-        <w:rPr>
-          <w:i/>
-          <w:iCs/>
-        </w:rPr>
-        <w:t xml:space="preserve"> </w:t>
-      </w:r>
-      <w:r>
-        <w:rPr>
-          <w:i/>
-          <w:iCs/>
-        </w:rPr>
-        <w:t xml:space="preserve">table; it was removed as redundant with</w:t>
-      </w:r>
-      <w:r>
-        <w:rPr>
-          <w:i/>
-          <w:iCs/>
-        </w:rPr>
-        <w:t xml:space="preserve"> </w:t>
-      </w:r>
-      <w:r>
-        <w:rPr>
-          <w:rStyle w:val="VerbatimChar"/>
-          <w:i/>
-          <w:iCs/>
-        </w:rPr>
-        <w:t xml:space="preserve">ConsumptionEvent</w:t>
-      </w:r>
-      <w:r>
-        <w:rPr>
-          <w:i/>
-          <w:iCs/>
-        </w:rPr>
-        <w:t xml:space="preserve">.)</w:t>
-      </w:r>
-    </w:p>
-    <w:bookmarkEnd w:id="18"/>
-    <w:bookmarkStart w:id="19" w:name="am-machining-the-lot-splits"/>
+        <w:t xml:space="preserve">link the generations. Honda backward trace walks the genealogy from shipped part → machining LOT → trim LOT → cast LOT → die / cavity / Carlos — same code path as any assembly consumption (FDS-05-033).</w:t>
+      </w:r>
+    </w:p>
+    <w:bookmarkEnd w:id="85"/>
+    <w:bookmarkStart w:id="86" w:name="am-machining-sub-lots-run-through-cnc"/>
     <w:p>
       <w:pPr>
         <w:pStyle w:val="Heading3"/>
       </w:pPr>
       <w:r>
-        <w:t xml:space="preserve">10:00am — Machining: The LOT Splits</w:t>
+        <w:t xml:space="preserve">10:00am — Machining: Sub-LOTs Run Through CNC</w:t>
       </w:r>
     </w:p>
     <w:p>
@@ -2776,15 +4171,7 @@
         <w:pStyle w:val="FirstParagraph"/>
       </w:pPr>
       <w:r>
-        <w:t xml:space="preserve">The basket arrives at the Machine Shop and enters the FIFO queue — LOTs are processed first-in-first-out, though the operator can override the order if production needs require it (per FRS 2.2.4).</w:t>
-      </w:r>
-    </w:p>
-    <w:p>
-      <w:pPr>
-        <w:pStyle w:val="BodyText"/>
-      </w:pPr>
-      <w:r>
-        <w:t xml:space="preserve">The machining operator uses the</w:t>
+        <w:t xml:space="preserve">The sub-LOT baskets created at Trim OUT arrive at the Machine Shop already split and re-labeled. The FIFO queue is already populated — the split happened upstream. The machining operator uses the</w:t>
       </w:r>
       <w:r>
         <w:t xml:space="preserve"> </w:t>
@@ -2800,7 +4187,15 @@
         <w:t xml:space="preserve"> </w:t>
       </w:r>
       <w:r>
-        <w:t xml:space="preserve">screen to scan the parent LOT and receive it into the machine. But CNC machining runs in smaller batches — the default sub-lot quantity for 5G0 is 24. At the</w:t>
+        <w:t xml:space="preserve">screen to scan each sub-LOT barcode and receive it into a CNC machine (per FRS 2.2.4). The operator can override FIFO order if production needs require it.</w:t>
+      </w:r>
+    </w:p>
+    <w:p>
+      <w:pPr>
+        <w:pStyle w:val="BodyText"/>
+      </w:pPr>
+      <w:r>
+        <w:t xml:space="preserve">Sub-LOT A goes to CNC machine 12. The operator loads the parts, the machine runs.</w:t>
       </w:r>
       <w:r>
         <w:t xml:space="preserve"> </w:t>
@@ -2810,405 +4205,89 @@
           <w:b/>
           <w:bCs/>
         </w:rPr>
-        <w:t xml:space="preserve">Machining OUT</w:t>
-      </w:r>
-      <w:r>
-        <w:t xml:space="preserve"> </w:t>
-      </w:r>
-      <w:r>
-        <w:t xml:space="preserve">screen (per FRS 2.2.5), the operator initiates a split. The MES creates two child LOTs:</w:t>
-      </w:r>
-      <w:r>
-        <w:t xml:space="preserve"> </w:t>
-      </w:r>
-      <w:r>
-        <w:rPr>
-          <w:rStyle w:val="VerbatimChar"/>
-        </w:rPr>
-        <w:t xml:space="preserve">2026-04-06-0001-A</w:t>
-      </w:r>
-      <w:r>
-        <w:t xml:space="preserve"> </w:t>
-      </w:r>
-      <w:r>
-        <w:t xml:space="preserve">(24 pieces) and</w:t>
-      </w:r>
-      <w:r>
-        <w:t xml:space="preserve"> </w:t>
-      </w:r>
-      <w:r>
-        <w:rPr>
-          <w:rStyle w:val="VerbatimChar"/>
-        </w:rPr>
-        <w:t xml:space="preserve">2026-04-06-0001-B</w:t>
-      </w:r>
-      <w:r>
-        <w:t xml:space="preserve"> </w:t>
-      </w:r>
-      <w:r>
-        <w:t xml:space="preserve">(24 pieces). The parent LOT’s piece count drops to 0, status goes to CLOSED. Two new LTT labels print — one for each sub-LOT basket. The</w:t>
-      </w:r>
-      <w:r>
-        <w:t xml:space="preserve"> </w:t>
-      </w:r>
-      <w:r>
-        <w:rPr>
-          <w:rStyle w:val="VerbatimChar"/>
-        </w:rPr>
-        <w:t xml:space="preserve">LotGenealogy</w:t>
-      </w:r>
-      <w:r>
-        <w:t xml:space="preserve"> </w:t>
-      </w:r>
-      <w:r>
-        <w:t xml:space="preserve">table records both SPLIT relationships, permanently linking children to parent.</w:t>
-      </w:r>
-    </w:p>
-    <w:p>
-      <w:pPr>
-        <w:pStyle w:val="BodyText"/>
-      </w:pPr>
-      <w:r>
-        <w:t xml:space="preserve">Each sub-LOT now has its own journey. Sub-LOT A goes to CNC machine 12. The operator loads the parts, the machine runs, 23 come out good, 1 is out-of-tolerance. Production event: 23 good, 1 no-good. Reject event: code MS-OOT-01, quantity 1. Sub-LOT A now has 23 pieces.</w:t>
-      </w:r>
-    </w:p>
-    <w:bookmarkEnd w:id="19"/>
-    <w:bookmarkStart w:id="20" w:name="Xe45f8832e7997e311c5f47e21b87e7afa8aeaa5"/>
-    <w:p>
-      <w:pPr>
-        <w:pStyle w:val="Heading3"/>
-      </w:pPr>
-      <w:r>
-        <w:t xml:space="preserve">11:30am — Assembly: Parts Are Consumed Into Finished Goods</w:t>
-      </w:r>
-    </w:p>
-    <w:p>
-      <w:pPr>
-        <w:pStyle w:val="FirstParagraph"/>
-      </w:pPr>
-      <w:r>
-        <w:t xml:space="preserve">Sub-LOT A (23 x 5G0 castings, machined) arrives at the 5G0 Assembly Front line. This is a serialized line — every finished assembly gets a laser-etched serial number. The line also needs PNA mounting pins — there’s a LOT of those staged at the lineside location.</w:t>
-      </w:r>
-    </w:p>
-    <w:p>
-      <w:pPr>
-        <w:pStyle w:val="BodyText"/>
-      </w:pPr>
-      <w:r>
-        <w:t xml:space="preserve">This is where the PLC integration kicks in. The Machine Integration Panel (MIP) is the handshake layer between the assembly automation and the MES. The assembly machine loads a casting from sub-LOT A, presses in two PNA pins, and the laser etches serial number</w:t>
-      </w:r>
-      <w:r>
-        <w:t xml:space="preserve"> </w:t>
-      </w:r>
-      <w:r>
-        <w:rPr>
-          <w:rStyle w:val="VerbatimChar"/>
-        </w:rPr>
-        <w:t xml:space="preserve">5G0F-240406-00147</w:t>
-      </w:r>
-      <w:r>
-        <w:t xml:space="preserve">. The PLC writes</w:t>
-      </w:r>
-      <w:r>
-        <w:t xml:space="preserve"> </w:t>
-      </w:r>
-      <w:r>
-        <w:rPr>
-          <w:rStyle w:val="VerbatimChar"/>
-        </w:rPr>
-        <w:t xml:space="preserve">DataReady=1</w:t>
-      </w:r>
-      <w:r>
-        <w:t xml:space="preserve">. The MES reads the serial number from</w:t>
-      </w:r>
-      <w:r>
-        <w:t xml:space="preserve"> </w:t>
-      </w:r>
-      <w:r>
-        <w:rPr>
-          <w:rStyle w:val="VerbatimChar"/>
-        </w:rPr>
-        <w:t xml:space="preserve">PartSN</w:t>
-      </w:r>
-      <w:r>
-        <w:t xml:space="preserve">, validates it (not a duplicate, correct format), writes</w:t>
-      </w:r>
-      <w:r>
-        <w:t xml:space="preserve"> </w:t>
-      </w:r>
-      <w:r>
-        <w:rPr>
-          <w:rStyle w:val="VerbatimChar"/>
-        </w:rPr>
-        <w:t xml:space="preserve">PartValid=1</w:t>
-      </w:r>
-      <w:r>
-        <w:t xml:space="preserve"> </w:t>
-      </w:r>
-      <w:r>
-        <w:t xml:space="preserve">back to the PLC, and the machine releases the part.</w:t>
-      </w:r>
-    </w:p>
-    <w:p>
-      <w:pPr>
-        <w:pStyle w:val="BodyText"/>
-      </w:pPr>
-      <w:r>
-        <w:t xml:space="preserve">One important mode: the PLC also exposes a</w:t>
-      </w:r>
-      <w:r>
-        <w:t xml:space="preserve"> </w:t>
-      </w:r>
-      <w:r>
-        <w:rPr>
-          <w:rStyle w:val="VerbatimChar"/>
-        </w:rPr>
-        <w:t xml:space="preserve">HardwareInterlockEnable</w:t>
-      </w:r>
-      <w:r>
-        <w:t xml:space="preserve"> </w:t>
-      </w:r>
-      <w:r>
-        <w:t xml:space="preserve">flag (per touchpoint agreement 1.1). When the automation sets this to false, the MES validation is bypassed — the MIP writes</w:t>
-      </w:r>
-      <w:r>
-        <w:t xml:space="preserve"> </w:t>
-      </w:r>
-      <w:r>
-        <w:rPr>
-          <w:rStyle w:val="VerbatimChar"/>
-        </w:rPr>
-        <w:t xml:space="preserve">PartSN="NoRead"</w:t>
-      </w:r>
-      <w:r>
-        <w:t xml:space="preserve"> </w:t>
-      </w:r>
-      <w:r>
-        <w:t xml:space="preserve">and the machine proceeds without MES confirmation. This is an alternative operating mode, not an error state, and the MES must handle</w:t>
-      </w:r>
-      <w:r>
-        <w:t xml:space="preserve"> </w:t>
-      </w:r>
-      <w:r>
-        <w:rPr>
-          <w:rStyle w:val="VerbatimChar"/>
-        </w:rPr>
-        <w:t xml:space="preserve">NoRead</w:t>
-      </w:r>
-      <w:r>
-        <w:t xml:space="preserve"> </w:t>
-      </w:r>
-      <w:r>
-        <w:t xml:space="preserve">serial numbers gracefully.</w:t>
-      </w:r>
-    </w:p>
-    <w:p>
-      <w:pPr>
-        <w:pStyle w:val="BodyText"/>
-      </w:pPr>
-      <w:r>
-        <w:t xml:space="preserve">Behind the scenes, the MES has just written a</w:t>
-      </w:r>
-      <w:r>
-        <w:t xml:space="preserve"> </w:t>
-      </w:r>
-      <w:r>
-        <w:rPr>
-          <w:rStyle w:val="VerbatimChar"/>
-        </w:rPr>
-        <w:t xml:space="preserve">ConsumptionEvent</w:t>
-      </w:r>
-      <w:r>
-        <w:t xml:space="preserve"> </w:t>
-      </w:r>
-      <w:r>
-        <w:t xml:space="preserve">— 1 piece consumed from sub-LOT A (5G0 casting) and 2 pieces consumed from the PNA pin LOT, producing serial number</w:t>
-      </w:r>
-      <w:r>
-        <w:t xml:space="preserve"> </w:t>
-      </w:r>
-      <w:r>
-        <w:rPr>
-          <w:rStyle w:val="VerbatimChar"/>
-        </w:rPr>
-        <w:t xml:space="preserve">5G0F-240406-00147</w:t>
-      </w:r>
-      <w:r>
-        <w:t xml:space="preserve">. A</w:t>
-      </w:r>
-      <w:r>
-        <w:t xml:space="preserve"> </w:t>
-      </w:r>
-      <w:r>
-        <w:rPr>
-          <w:rStyle w:val="VerbatimChar"/>
-        </w:rPr>
-        <w:t xml:space="preserve">SerializedPart</w:t>
-      </w:r>
-      <w:r>
-        <w:t xml:space="preserve"> </w:t>
-      </w:r>
-      <w:r>
-        <w:t xml:space="preserve">record is created, permanently linking that serial to sub-LOT A and the PNA LOT. Genealogy: this serial traces back through sub-LOT A → parent LOT</w:t>
-      </w:r>
-      <w:r>
-        <w:t xml:space="preserve"> </w:t>
-      </w:r>
-      <w:r>
-        <w:rPr>
-          <w:rStyle w:val="VerbatimChar"/>
-        </w:rPr>
-        <w:t xml:space="preserve">2026-04-06-0001</w:t>
-      </w:r>
-      <w:r>
-        <w:t xml:space="preserve"> </w:t>
-      </w:r>
-      <w:r>
-        <w:t xml:space="preserve">→ Die Cast Machine #7, Die #42, Cavity B, Carlos, 6:20am Tuesday. Honda can ask about any serial number and get the full tree.</w:t>
-      </w:r>
-    </w:p>
-    <w:p>
-      <w:pPr>
-        <w:pStyle w:val="BodyText"/>
-      </w:pPr>
-      <w:r>
-        <w:t xml:space="preserve">The finished part drops into a container tray. The MES tracks which tray position it went into via</w:t>
-      </w:r>
-      <w:r>
-        <w:t xml:space="preserve"> </w:t>
-      </w:r>
-      <w:r>
-        <w:rPr>
-          <w:rStyle w:val="VerbatimChar"/>
-        </w:rPr>
-        <w:t xml:space="preserve">ContainerSerial</w:t>
-      </w:r>
-      <w:r>
-        <w:t xml:space="preserve">. When the container hits 48 parts (4 trays x 12 parts), the MES closes the container and calls AIM — Honda’s EDI system — to get a shipping ID.</w:t>
-      </w:r>
-      <w:r>
-        <w:t xml:space="preserve"> </w:t>
-      </w:r>
-      <w:r>
-        <w:rPr>
-          <w:rStyle w:val="VerbatimChar"/>
-        </w:rPr>
-        <w:t xml:space="preserve">GetNextNumber</w:t>
-      </w:r>
-      <w:r>
-        <w:t xml:space="preserve"> </w:t>
-      </w:r>
-      <w:r>
-        <w:t xml:space="preserve">returns shipper ID</w:t>
-      </w:r>
-      <w:r>
-        <w:t xml:space="preserve"> </w:t>
-      </w:r>
-      <w:r>
-        <w:rPr>
-          <w:rStyle w:val="VerbatimChar"/>
-        </w:rPr>
-        <w:t xml:space="preserve">SH-240406-0089</w:t>
-      </w:r>
-      <w:r>
-        <w:t xml:space="preserve">. The Zebra prints a ZPL shipping label. The</w:t>
-      </w:r>
-      <w:r>
-        <w:t xml:space="preserve"> </w:t>
-      </w:r>
-      <w:r>
-        <w:rPr>
-          <w:rStyle w:val="VerbatimChar"/>
-        </w:rPr>
-        <w:t xml:space="preserve">ShippingLabel</w:t>
-      </w:r>
-      <w:r>
-        <w:t xml:space="preserve"> </w:t>
-      </w:r>
-      <w:r>
-        <w:t xml:space="preserve">table records the print. The container status goes from OPEN to COMPLETE.</w:t>
-      </w:r>
-    </w:p>
-    <w:p>
-      <w:pPr>
-        <w:pStyle w:val="BlockText"/>
-      </w:pPr>
+        <w:t xml:space="preserve">Machining OUT is PLC-driven</w:t>
+      </w:r>
+      <w:r>
+        <w:t xml:space="preserve"> </w:t>
+      </w:r>
+      <w:r>
+        <w:t xml:space="preserve">— when the machine cycle completes, the PLC signals completion and the MES auto-completes the operation without requiring a separate operator submission (FDS-06-028). The MES writes the production event, updates piece count (23 good, 1 out-of-tolerance), records a reject event (code MS-OOT-01, quantity 1), and</w:t>
+      </w:r>
+      <w:r>
+        <w:t xml:space="preserve"> </w:t>
+      </w:r>
       <w:r>
         <w:rPr>
           <w:b/>
           <w:bCs/>
         </w:rPr>
-        <w:t xml:space="preserve">Note on non-serialized lines:</w:t>
-      </w:r>
-      <w:r>
-        <w:t xml:space="preserve"> </w:t>
-      </w:r>
-      <w:r>
-        <w:t xml:space="preserve">The flow above describes the 5G0 serialized assembly line with full PLC/MIP integration. Non-serialized lines (e.g., 6B2 Cam Holder, RPY Assembly Sets) use a simpler validation model — OPC tags show</w:t>
-      </w:r>
-      <w:r>
-        <w:t xml:space="preserve"> </w:t>
-      </w:r>
-      <w:r>
-        <w:rPr>
-          <w:rStyle w:val="VerbatimChar"/>
-        </w:rPr>
-        <w:t xml:space="preserve">PartDisposition</w:t>
-      </w:r>
-      <w:r>
-        <w:t xml:space="preserve"> </w:t>
-      </w:r>
-      <w:r>
-        <w:t xml:space="preserve">flags and</w:t>
-      </w:r>
-      <w:r>
-        <w:t xml:space="preserve"> </w:t>
-      </w:r>
-      <w:r>
-        <w:rPr>
-          <w:rStyle w:val="VerbatimChar"/>
-        </w:rPr>
-        <w:t xml:space="preserve">ContainerName</w:t>
-      </w:r>
-      <w:r>
-        <w:t xml:space="preserve"> </w:t>
-      </w:r>
-      <w:r>
-        <w:t xml:space="preserve">rather than individual serial numbers (per Appendix C OPC tags for MicroLogix1400 PLCs). On these lines, the operator identifies the source LOT(s), enters a good count, and the MES fills containers by count rather than part-by-part. Some inspection lines also use weight-based container closure (</w:t>
-      </w:r>
-      <w:r>
-        <w:rPr>
-          <w:rStyle w:val="VerbatimChar"/>
-        </w:rPr>
-        <w:t xml:space="preserve">TargetWeightValue</w:t>
-      </w:r>
-      <w:r>
-        <w:t xml:space="preserve">,</w:t>
-      </w:r>
-      <w:r>
-        <w:t xml:space="preserve"> </w:t>
-      </w:r>
-      <w:r>
-        <w:rPr>
-          <w:rStyle w:val="VerbatimChar"/>
-        </w:rPr>
-        <w:t xml:space="preserve">TargetWeightMetFlag</w:t>
-      </w:r>
-      <w:r>
-        <w:t xml:space="preserve"> </w:t>
-      </w:r>
-      <w:r>
-        <w:t xml:space="preserve">via OmniServer) rather than piece count.</w:t>
-      </w:r>
-    </w:p>
-    <w:bookmarkEnd w:id="20"/>
-    <w:bookmarkStart w:id="21" w:name="pm-a-quality-hold"/>
+        <w:t xml:space="preserve">automatically moves the sub-LOT to the coupled downstream Assembly Cell</w:t>
+      </w:r>
+      <w:r>
+        <w:t xml:space="preserve"> </w:t>
+      </w:r>
+      <w:r>
+        <w:t xml:space="preserve">defined by the</w:t>
+      </w:r>
+      <w:r>
+        <w:t xml:space="preserve"> </w:t>
+      </w:r>
+      <w:r>
+        <w:rPr>
+          <w:rStyle w:val="VerbatimChar"/>
+        </w:rPr>
+        <w:t xml:space="preserve">CoupledDownstreamCellLocationId</w:t>
+      </w:r>
+      <w:r>
+        <w:t xml:space="preserve"> </w:t>
+      </w:r>
+      <w:r>
+        <w:t xml:space="preserve">location attribute on the Machining Cell. No separate</w:t>
+      </w:r>
+      <w:r>
+        <w:t xml:space="preserve"> </w:t>
+      </w:r>
+      <w:r>
+        <w:t xml:space="preserve">“move”</w:t>
+      </w:r>
+      <w:r>
+        <w:t xml:space="preserve"> </w:t>
+      </w:r>
+      <w:r>
+        <w:t xml:space="preserve">action is required from the operator — the LOT lands in the Assembly queue as soon as the machine signals done.</w:t>
+      </w:r>
+    </w:p>
+    <w:p>
+      <w:pPr>
+        <w:pStyle w:val="BodyText"/>
+      </w:pPr>
+      <w:r>
+        <w:t xml:space="preserve">Two new LTT labels were printed at the Trim OUT split — one for each sub-LOT basket. The</w:t>
+      </w:r>
+      <w:r>
+        <w:t xml:space="preserve"> </w:t>
+      </w:r>
+      <w:r>
+        <w:rPr>
+          <w:rStyle w:val="VerbatimChar"/>
+        </w:rPr>
+        <w:t xml:space="preserve">LotGenealogy</w:t>
+      </w:r>
+      <w:r>
+        <w:t xml:space="preserve"> </w:t>
+      </w:r>
+      <w:r>
+        <w:t xml:space="preserve">table records both SPLIT relationships, permanently linking children to parent.</w:t>
+      </w:r>
+    </w:p>
+    <w:bookmarkEnd w:id="86"/>
+    <w:bookmarkStart w:id="87" w:name="Xe45f8832e7997e311c5f47e21b87e7afa8aeaa5"/>
     <w:p>
       <w:pPr>
         <w:pStyle w:val="Heading3"/>
       </w:pPr>
       <w:r>
-        <w:t xml:space="preserve">1:15pm — A Quality Hold</w:t>
+        <w:t xml:space="preserve">11:30am — Assembly: Parts Are Consumed Into Finished Goods</w:t>
       </w:r>
     </w:p>
     <w:p>
@@ -3216,7 +4295,7 @@
         <w:pStyle w:val="FirstParagraph"/>
       </w:pPr>
       <w:r>
-        <w:t xml:space="preserve">The quality supervisor, Diane, gets a call from Honda. They’ve found a dimensional issue on 5G0 parts from yesterday’s shipment. Diane doesn’t know yet which LOTs are affected, but she needs to stop everything precautionary.</w:t>
+        <w:t xml:space="preserve">Sub-LOT A (23 x 5G0 castings, machined) arrives at the 5G0 Assembly Front line. This is a serialized line — every finished assembly gets a laser-etched serial number. The line also needs PNA mounting pins — there’s a LOT of those staged at the lineside location.</w:t>
       </w:r>
     </w:p>
     <w:p>
@@ -3224,64 +4303,58 @@
         <w:pStyle w:val="BodyText"/>
       </w:pPr>
       <w:r>
-        <w:t xml:space="preserve">She goes to her terminal, opens the Hold Management screen, and searches for all open 5G0 LOTs and containers. She selects them and places a hold — type: CUSTOMER_COMPLAINT, reason:</w:t>
-      </w:r>
-      <w:r>
-        <w:t xml:space="preserve"> </w:t>
-      </w:r>
-      <w:r>
-        <w:t xml:space="preserve">“Honda dimensional concern, pending investigation.”</w:t>
-      </w:r>
-      <w:r>
-        <w:t xml:space="preserve"> </w:t>
-      </w:r>
-      <w:r>
-        <w:t xml:space="preserve">The MES writes a</w:t>
-      </w:r>
-      <w:r>
-        <w:t xml:space="preserve"> </w:t>
-      </w:r>
-      <w:r>
-        <w:rPr>
-          <w:rStyle w:val="VerbatimChar"/>
-        </w:rPr>
-        <w:t xml:space="preserve">HoldEvent</w:t>
-      </w:r>
-      <w:r>
-        <w:t xml:space="preserve"> </w:t>
-      </w:r>
-      <w:r>
-        <w:t xml:space="preserve">for each LOT. Each LOT’s status transitions from GOOD to HOLD. The</w:t>
-      </w:r>
-      <w:r>
-        <w:t xml:space="preserve"> </w:t>
-      </w:r>
-      <w:r>
-        <w:rPr>
-          <w:rStyle w:val="VerbatimChar"/>
-        </w:rPr>
-        <w:t xml:space="preserve">LotStatusHistory</w:t>
-      </w:r>
-      <w:r>
-        <w:t xml:space="preserve"> </w:t>
-      </w:r>
-      <w:r>
-        <w:t xml:space="preserve">records each transition. The</w:t>
-      </w:r>
-      <w:r>
-        <w:t xml:space="preserve"> </w:t>
-      </w:r>
-      <w:r>
-        <w:rPr>
-          <w:rStyle w:val="VerbatimChar"/>
-        </w:rPr>
-        <w:t xml:space="preserve">BlocksProduction</w:t>
-      </w:r>
-      <w:r>
-        <w:t xml:space="preserve"> </w:t>
-      </w:r>
-      <w:r>
-        <w:t xml:space="preserve">flag on the HOLD status code is true — from this moment, the MES prevents any further manufacturing operation completion activities against these LOTs (per FRS 3.16.10). The exact interlock point — whether the MES blocks at LOT selection time or at operation completion — is a design decision, but the effect is the same: held LOTs cannot progress through production.</w:t>
+        <w:t xml:space="preserve">This is where the PLC integration kicks in. The Machine Integration Panel (MIP) is the handshake layer between the assembly automation and the MES. The assembly machine loads a casting from sub-LOT A, presses in two PNA pins, and the laser etches serial number</w:t>
+      </w:r>
+      <w:r>
+        <w:t xml:space="preserve"> </w:t>
+      </w:r>
+      <w:r>
+        <w:rPr>
+          <w:rStyle w:val="VerbatimChar"/>
+        </w:rPr>
+        <w:t xml:space="preserve">5G0F-240406-00147</w:t>
+      </w:r>
+      <w:r>
+        <w:t xml:space="preserve">. The PLC writes</w:t>
+      </w:r>
+      <w:r>
+        <w:t xml:space="preserve"> </w:t>
+      </w:r>
+      <w:r>
+        <w:rPr>
+          <w:rStyle w:val="VerbatimChar"/>
+        </w:rPr>
+        <w:t xml:space="preserve">DataReady=1</w:t>
+      </w:r>
+      <w:r>
+        <w:t xml:space="preserve">. The MES reads the serial number from</w:t>
+      </w:r>
+      <w:r>
+        <w:t xml:space="preserve"> </w:t>
+      </w:r>
+      <w:r>
+        <w:rPr>
+          <w:rStyle w:val="VerbatimChar"/>
+        </w:rPr>
+        <w:t xml:space="preserve">PartSN</w:t>
+      </w:r>
+      <w:r>
+        <w:t xml:space="preserve">, validates it (not a duplicate, correct format), writes</w:t>
+      </w:r>
+      <w:r>
+        <w:t xml:space="preserve"> </w:t>
+      </w:r>
+      <w:r>
+        <w:rPr>
+          <w:rStyle w:val="VerbatimChar"/>
+        </w:rPr>
+        <w:t xml:space="preserve">PartValid=1</w:t>
+      </w:r>
+      <w:r>
+        <w:t xml:space="preserve"> </w:t>
+      </w:r>
+      <w:r>
+        <w:t xml:space="preserve">back to the PLC, and the machine releases the part.</w:t>
       </w:r>
     </w:p>
     <w:p>
@@ -3289,64 +4362,137 @@
         <w:pStyle w:val="BodyText"/>
       </w:pPr>
       <w:r>
-        <w:t xml:space="preserve">There’s a container already packed and staged at the Shipping Dock — container</w:t>
-      </w:r>
-      <w:r>
-        <w:t xml:space="preserve"> </w:t>
-      </w:r>
-      <w:r>
-        <w:rPr>
-          <w:rStyle w:val="VerbatimChar"/>
-        </w:rPr>
-        <w:t xml:space="preserve">CTR-5G0-0412</w:t>
-      </w:r>
-      <w:r>
-        <w:t xml:space="preserve">, shipper ID</w:t>
-      </w:r>
-      <w:r>
-        <w:t xml:space="preserve"> </w:t>
-      </w:r>
-      <w:r>
-        <w:rPr>
-          <w:rStyle w:val="VerbatimChar"/>
-        </w:rPr>
-        <w:t xml:space="preserve">SH-240406-0089</w:t>
-      </w:r>
-      <w:r>
-        <w:t xml:space="preserve">. Diane places that on hold too. The MES calls AIM:</w:t>
-      </w:r>
-      <w:r>
-        <w:t xml:space="preserve"> </w:t>
-      </w:r>
-      <w:r>
-        <w:rPr>
-          <w:rStyle w:val="VerbatimChar"/>
-        </w:rPr>
-        <w:t xml:space="preserve">PlaceOnHold</w:t>
-      </w:r>
-      <w:r>
-        <w:t xml:space="preserve"> </w:t>
-      </w:r>
-      <w:r>
-        <w:t xml:space="preserve">with the shipper ID. AIM acknowledges. The container status goes to HOLD. It’s not going on the truck.</w:t>
-      </w:r>
-    </w:p>
-    <w:bookmarkEnd w:id="21"/>
-    <w:bookmarkStart w:id="22" w:name="pm-the-sort-cage"/>
-    <w:p>
-      <w:pPr>
-        <w:pStyle w:val="Heading3"/>
-      </w:pPr>
-      <w:r>
-        <w:t xml:space="preserve">2:00pm — The Sort Cage</w:t>
-      </w:r>
-    </w:p>
-    <w:p>
-      <w:pPr>
-        <w:pStyle w:val="FirstParagraph"/>
-      </w:pPr>
-      <w:r>
-        <w:t xml:space="preserve">After investigation, Diane determines the issue is isolated to cavity A of die #42, from yesterday’s second shift only. From her desk she clicks the</w:t>
+        <w:t xml:space="preserve">One important mode: the PLC also exposes a</w:t>
+      </w:r>
+      <w:r>
+        <w:t xml:space="preserve"> </w:t>
+      </w:r>
+      <w:r>
+        <w:rPr>
+          <w:rStyle w:val="VerbatimChar"/>
+        </w:rPr>
+        <w:t xml:space="preserve">HardwareInterlockEnable</w:t>
+      </w:r>
+      <w:r>
+        <w:t xml:space="preserve"> </w:t>
+      </w:r>
+      <w:r>
+        <w:t xml:space="preserve">flag (per touchpoint agreement 1.1). When the automation sets this to false, the MES validation is bypassed — the MIP writes</w:t>
+      </w:r>
+      <w:r>
+        <w:t xml:space="preserve"> </w:t>
+      </w:r>
+      <w:r>
+        <w:rPr>
+          <w:rStyle w:val="VerbatimChar"/>
+        </w:rPr>
+        <w:t xml:space="preserve">PartSN="NoRead"</w:t>
+      </w:r>
+      <w:r>
+        <w:t xml:space="preserve"> </w:t>
+      </w:r>
+      <w:r>
+        <w:t xml:space="preserve">and the machine proceeds without MES confirmation. This is an alternative operating mode, not an error state, and the MES must handle</w:t>
+      </w:r>
+      <w:r>
+        <w:t xml:space="preserve"> </w:t>
+      </w:r>
+      <w:r>
+        <w:rPr>
+          <w:rStyle w:val="VerbatimChar"/>
+        </w:rPr>
+        <w:t xml:space="preserve">NoRead</w:t>
+      </w:r>
+      <w:r>
+        <w:t xml:space="preserve"> </w:t>
+      </w:r>
+      <w:r>
+        <w:t xml:space="preserve">serial numbers gracefully.</w:t>
+      </w:r>
+    </w:p>
+    <w:p>
+      <w:pPr>
+        <w:pStyle w:val="BodyText"/>
+      </w:pPr>
+      <w:r>
+        <w:t xml:space="preserve">Behind the scenes, the MES has just written a</w:t>
+      </w:r>
+      <w:r>
+        <w:t xml:space="preserve"> </w:t>
+      </w:r>
+      <w:r>
+        <w:rPr>
+          <w:rStyle w:val="VerbatimChar"/>
+        </w:rPr>
+        <w:t xml:space="preserve">ConsumptionEvent</w:t>
+      </w:r>
+      <w:r>
+        <w:t xml:space="preserve"> </w:t>
+      </w:r>
+      <w:r>
+        <w:t xml:space="preserve">— 1 piece consumed from sub-LOT A (5G0 casting) and 2 pieces consumed from the PNA pin LOT, producing serial number</w:t>
+      </w:r>
+      <w:r>
+        <w:t xml:space="preserve"> </w:t>
+      </w:r>
+      <w:r>
+        <w:rPr>
+          <w:rStyle w:val="VerbatimChar"/>
+        </w:rPr>
+        <w:t xml:space="preserve">5G0F-240406-00147</w:t>
+      </w:r>
+      <w:r>
+        <w:t xml:space="preserve">. A</w:t>
+      </w:r>
+      <w:r>
+        <w:t xml:space="preserve"> </w:t>
+      </w:r>
+      <w:r>
+        <w:rPr>
+          <w:rStyle w:val="VerbatimChar"/>
+        </w:rPr>
+        <w:t xml:space="preserve">SerializedPart</w:t>
+      </w:r>
+      <w:r>
+        <w:t xml:space="preserve"> </w:t>
+      </w:r>
+      <w:r>
+        <w:t xml:space="preserve">record is created, permanently linking that serial to sub-LOT A and the PNA LOT. Genealogy: this serial traces back through sub-LOT A → parent LOT</w:t>
+      </w:r>
+      <w:r>
+        <w:t xml:space="preserve"> </w:t>
+      </w:r>
+      <w:r>
+        <w:rPr>
+          <w:rStyle w:val="VerbatimChar"/>
+        </w:rPr>
+        <w:t xml:space="preserve">MESL1710935</w:t>
+      </w:r>
+      <w:r>
+        <w:t xml:space="preserve"> </w:t>
+      </w:r>
+      <w:r>
+        <w:t xml:space="preserve">→ Die Cast Machine #7, Die DC-042, Cavity A, Carlos, 6:20am Tuesday. Honda can ask about any serial number and get the full tree.</w:t>
+      </w:r>
+    </w:p>
+    <w:p>
+      <w:pPr>
+        <w:pStyle w:val="BodyText"/>
+      </w:pPr>
+      <w:r>
+        <w:t xml:space="preserve">The finished part drops into a container tray. The MES tracks which tray position it went into via</w:t>
+      </w:r>
+      <w:r>
+        <w:t xml:space="preserve"> </w:t>
+      </w:r>
+      <w:r>
+        <w:rPr>
+          <w:rStyle w:val="VerbatimChar"/>
+        </w:rPr>
+        <w:t xml:space="preserve">ContainerSerial</w:t>
+      </w:r>
+      <w:r>
+        <w:t xml:space="preserve">. When the container hits 48 parts (4 trays x 12 parts), the MES closes the container and assigns a shipper ID from the</w:t>
       </w:r>
       <w:r>
         <w:t xml:space="preserve"> </w:t>
@@ -3356,231 +4502,327 @@
           <w:b/>
           <w:bCs/>
         </w:rPr>
-        <w:t xml:space="preserve">Track</w:t>
-      </w:r>
-      <w:r>
-        <w:t xml:space="preserve"> </w:t>
-      </w:r>
-      <w:r>
-        <w:t xml:space="preserve">tile on the MES home page (FDS-12-012), types in one of the Honda-reported serial numbers, and immediately sees the full genealogy tree — cavity, die, Carlos, timestamp, and forward through to the containers and shipper IDs where that serial landed. From that tree she pivots into a search on</w:t>
-      </w:r>
-      <w:r>
-        <w:t xml:space="preserve"> </w:t>
-      </w:r>
-      <w:r>
-        <w:rPr>
-          <w:rStyle w:val="VerbatimChar"/>
-        </w:rPr>
-        <w:t xml:space="preserve">die=42 AND cavity=A AND createdAt BETWEEN yesterday 14:00 AND 22:00</w:t>
-      </w:r>
-      <w:r>
-        <w:t xml:space="preserve">. Three LOTs come back. Two are already in containers at the dock. One is still in WIP storage at the Machine Shop.</w:t>
-      </w:r>
-    </w:p>
-    <w:p>
-      <w:pPr>
-        <w:pStyle w:val="BodyText"/>
-      </w:pPr>
-      <w:r>
-        <w:t xml:space="preserve">The WIP LOT is easy — she splits it. The MES creates a new child LOT with the 12 suspect pieces, leaves the remaining 36 in the original. She scraps the suspect child from the</w:t>
-      </w:r>
-      <w:r>
-        <w:t xml:space="preserve"> </w:t>
-      </w:r>
+        <w:t xml:space="preserve">local AIM pool</w:t>
+      </w:r>
+      <w:r>
+        <w:t xml:space="preserve"> </w:t>
+      </w:r>
+      <w:r>
+        <w:t xml:space="preserve">(</w:t>
+      </w:r>
+      <w:r>
+        <w:rPr>
+          <w:rStyle w:val="VerbatimChar"/>
+        </w:rPr>
+        <w:t xml:space="preserve">Lots.AimShipperIdPool</w:t>
+      </w:r>
+      <w:r>
+        <w:t xml:space="preserve">) — a pre-fetched block of IDs that was pulled from Honda’s</w:t>
+      </w:r>
+      <w:r>
+        <w:t xml:space="preserve"> </w:t>
+      </w:r>
+      <w:r>
+        <w:rPr>
+          <w:rStyle w:val="VerbatimChar"/>
+        </w:rPr>
+        <w:t xml:space="preserve">GetNextNumber</w:t>
+      </w:r>
+      <w:r>
+        <w:t xml:space="preserve"> </w:t>
+      </w:r>
+      <w:r>
+        <w:t xml:space="preserve">endpoint by a background Gateway script. Using the pool means container closure is never blocked waiting on a live AIM call. The assigned shipper ID is</w:t>
+      </w:r>
+      <w:r>
+        <w:t xml:space="preserve"> </w:t>
+      </w:r>
+      <w:r>
+        <w:rPr>
+          <w:rStyle w:val="VerbatimChar"/>
+        </w:rPr>
+        <w:t xml:space="preserve">SH-240406-0089</w:t>
+      </w:r>
+      <w:r>
+        <w:t xml:space="preserve">. The MES dispatches a label print asynchronously via</w:t>
+      </w:r>
+      <w:r>
+        <w:t xml:space="preserve"> </w:t>
+      </w:r>
+      <w:r>
+        <w:rPr>
+          <w:rStyle w:val="VerbatimChar"/>
+        </w:rPr>
+        <w:t xml:space="preserve">system.util.sendMessageAsync</w:t>
+      </w:r>
+      <w:r>
+        <w:t xml:space="preserve"> </w:t>
+      </w:r>
+      <w:r>
+        <w:t xml:space="preserve">to the Gateway print handler, which formats the ZPL and sends it to the Zebra. The</w:t>
+      </w:r>
+      <w:r>
+        <w:t xml:space="preserve"> </w:t>
+      </w:r>
+      <w:r>
+        <w:rPr>
+          <w:rStyle w:val="VerbatimChar"/>
+        </w:rPr>
+        <w:t xml:space="preserve">ShippingLabel</w:t>
+      </w:r>
+      <w:r>
+        <w:t xml:space="preserve"> </w:t>
+      </w:r>
+      <w:r>
+        <w:t xml:space="preserve">table records the print request and its completion state. The container status goes from OPEN to COMPLETE.</w:t>
+      </w:r>
+    </w:p>
+    <w:p>
+      <w:pPr>
+        <w:pStyle w:val="BlockText"/>
+      </w:pPr>
       <w:r>
         <w:rPr>
           <w:b/>
           <w:bCs/>
         </w:rPr>
-        <w:t xml:space="preserve">Selected Location</w:t>
-      </w:r>
-      <w:r>
-        <w:t xml:space="preserve"> </w:t>
-      </w:r>
-      <w:r>
-        <w:t xml:space="preserve">(the Machine Shop Cell where the in-process pieces are) — not from Inventory — because the parts haven’t yet returned to unallocated LOT stock. The</w:t>
-      </w:r>
-      <w:r>
-        <w:t xml:space="preserve"> </w:t>
-      </w:r>
-      <w:r>
-        <w:rPr>
-          <w:rStyle w:val="VerbatimChar"/>
-        </w:rPr>
-        <w:t xml:space="preserve">Workorder.ProductionEvent.ScrapSourceId</w:t>
-      </w:r>
-      <w:r>
-        <w:t xml:space="preserve"> </w:t>
-      </w:r>
-      <w:r>
-        <w:t xml:space="preserve">on the resulting scrap event records</w:t>
-      </w:r>
-      <w:r>
-        <w:t xml:space="preserve"> </w:t>
-      </w:r>
-      <w:r>
-        <w:rPr>
-          <w:rStyle w:val="VerbatimChar"/>
-        </w:rPr>
-        <w:t xml:space="preserve">Location</w:t>
-      </w:r>
-      <w:r>
-        <w:t xml:space="preserve"> </w:t>
-      </w:r>
-      <w:r>
-        <w:t xml:space="preserve">per FDS-06-023a so the scrap-rate analytics tie cleanly to the Machine Shop Cell. The suspect child LOT’s status goes to SCRAP. The original stays on HOLD until she releases it.</w:t>
-      </w:r>
-    </w:p>
-    <w:p>
-      <w:pPr>
-        <w:pStyle w:val="BlockText"/>
-      </w:pPr>
+        <w:t xml:space="preserve">Note on non-serialized lines:</w:t>
+      </w:r>
+      <w:r>
+        <w:t xml:space="preserve"> </w:t>
+      </w:r>
+      <w:r>
+        <w:t xml:space="preserve">The flow above describes the 5G0 serialized assembly line with full PLC/MIP integration. Non-serialized lines (e.g., 6B2 Cam Holder, RPY Assembly Sets) use a simpler validation model — OPC tags show</w:t>
+      </w:r>
+      <w:r>
+        <w:t xml:space="preserve"> </w:t>
+      </w:r>
+      <w:r>
+        <w:rPr>
+          <w:rStyle w:val="VerbatimChar"/>
+        </w:rPr>
+        <w:t xml:space="preserve">PartDisposition</w:t>
+      </w:r>
+      <w:r>
+        <w:t xml:space="preserve"> </w:t>
+      </w:r>
+      <w:r>
+        <w:t xml:space="preserve">flags and</w:t>
+      </w:r>
+      <w:r>
+        <w:t xml:space="preserve"> </w:t>
+      </w:r>
+      <w:r>
+        <w:rPr>
+          <w:rStyle w:val="VerbatimChar"/>
+        </w:rPr>
+        <w:t xml:space="preserve">ContainerName</w:t>
+      </w:r>
+      <w:r>
+        <w:t xml:space="preserve"> </w:t>
+      </w:r>
+      <w:r>
+        <w:t xml:space="preserve">rather than individual serial numbers (per Appendix C OPC tags for MicroLogix1400 PLCs). On these lines, the operator identifies the source LOT(s), enters a good count, and the MES fills containers by count rather than part-by-part. Some inspection lines also use weight-based container closure (</w:t>
+      </w:r>
+      <w:r>
+        <w:rPr>
+          <w:rStyle w:val="VerbatimChar"/>
+        </w:rPr>
+        <w:t xml:space="preserve">TargetWeightValue</w:t>
+      </w:r>
+      <w:r>
+        <w:t xml:space="preserve">,</w:t>
+      </w:r>
+      <w:r>
+        <w:t xml:space="preserve"> </w:t>
+      </w:r>
+      <w:r>
+        <w:rPr>
+          <w:rStyle w:val="VerbatimChar"/>
+        </w:rPr>
+        <w:t xml:space="preserve">TargetWeightMetFlag</w:t>
+      </w:r>
+      <w:r>
+        <w:t xml:space="preserve"> </w:t>
+      </w:r>
+      <w:r>
+        <w:t xml:space="preserve">via OmniServer) rather than piece count.</w:t>
+      </w:r>
+    </w:p>
+    <w:bookmarkEnd w:id="87"/>
+    <w:bookmarkStart w:id="88" w:name="pm-a-quality-hold"/>
+    <w:p>
+      <w:pPr>
+        <w:pStyle w:val="Heading3"/>
+      </w:pPr>
+      <w:r>
+        <w:t xml:space="preserve">1:15pm — A Quality Hold</w:t>
+      </w:r>
+    </w:p>
+    <w:p>
+      <w:pPr>
+        <w:pStyle w:val="FirstParagraph"/>
+      </w:pPr>
+      <w:r>
+        <w:t xml:space="preserve">The quality supervisor, Diane, gets a call from Honda. They’ve found a dimensional issue on 5G0 parts from yesterday’s shipment. Diane doesn’t know yet which LOTs are affected, but she needs to stop everything precautionary.</w:t>
+      </w:r>
+    </w:p>
+    <w:p>
+      <w:pPr>
+        <w:pStyle w:val="BodyText"/>
+      </w:pPr>
+      <w:r>
+        <w:t xml:space="preserve">She goes to her terminal, opens the Hold Management screen, and searches for all open 5G0 LOTs and containers. She selects them and places a hold — type: CUSTOMER_COMPLAINT, reason:</w:t>
+      </w:r>
+      <w:r>
+        <w:t xml:space="preserve"> </w:t>
+      </w:r>
+      <w:r>
+        <w:t xml:space="preserve">“Honda dimensional concern, pending investigation.”</w:t>
+      </w:r>
+      <w:r>
+        <w:t xml:space="preserve"> </w:t>
+      </w:r>
+      <w:r>
+        <w:t xml:space="preserve">The MES writes a</w:t>
+      </w:r>
+      <w:r>
+        <w:t xml:space="preserve"> </w:t>
+      </w:r>
+      <w:r>
+        <w:rPr>
+          <w:rStyle w:val="VerbatimChar"/>
+        </w:rPr>
+        <w:t xml:space="preserve">HoldEvent</w:t>
+      </w:r>
+      <w:r>
+        <w:t xml:space="preserve"> </w:t>
+      </w:r>
+      <w:r>
+        <w:t xml:space="preserve">for each LOT. Each LOT’s status transitions from GOOD to HOLD. The</w:t>
+      </w:r>
+      <w:r>
+        <w:t xml:space="preserve"> </w:t>
+      </w:r>
+      <w:r>
+        <w:rPr>
+          <w:rStyle w:val="VerbatimChar"/>
+        </w:rPr>
+        <w:t xml:space="preserve">LotStatusHistory</w:t>
+      </w:r>
+      <w:r>
+        <w:t xml:space="preserve"> </w:t>
+      </w:r>
+      <w:r>
+        <w:t xml:space="preserve">records each transition. The</w:t>
+      </w:r>
+      <w:r>
+        <w:t xml:space="preserve"> </w:t>
+      </w:r>
+      <w:r>
+        <w:rPr>
+          <w:rStyle w:val="VerbatimChar"/>
+        </w:rPr>
+        <w:t xml:space="preserve">BlocksProduction</w:t>
+      </w:r>
+      <w:r>
+        <w:t xml:space="preserve"> </w:t>
+      </w:r>
+      <w:r>
+        <w:t xml:space="preserve">flag on the HOLD status code is true — from this moment, the MES prevents any further manufacturing operation completion activities against these LOTs (per FRS 3.16.10). The exact interlock point — whether the MES blocks at LOT selection time or at operation completion — is a design decision, but the effect is the same: held LOTs cannot progress through production.</w:t>
+      </w:r>
+    </w:p>
+    <w:p>
+      <w:pPr>
+        <w:pStyle w:val="BodyText"/>
+      </w:pPr>
+      <w:r>
+        <w:t xml:space="preserve">There’s a container already packed and staged at the Shipping Dock — container</w:t>
+      </w:r>
+      <w:r>
+        <w:t xml:space="preserve"> </w:t>
+      </w:r>
+      <w:r>
+        <w:rPr>
+          <w:rStyle w:val="VerbatimChar"/>
+        </w:rPr>
+        <w:t xml:space="preserve">CTR-5G0-0412</w:t>
+      </w:r>
+      <w:r>
+        <w:t xml:space="preserve">, shipper ID</w:t>
+      </w:r>
+      <w:r>
+        <w:t xml:space="preserve"> </w:t>
+      </w:r>
+      <w:r>
+        <w:rPr>
+          <w:rStyle w:val="VerbatimChar"/>
+        </w:rPr>
+        <w:t xml:space="preserve">SH-240406-0089</w:t>
+      </w:r>
+      <w:r>
+        <w:t xml:space="preserve">. Diane places that on hold too. The MES calls AIM:</w:t>
+      </w:r>
+      <w:r>
+        <w:t xml:space="preserve"> </w:t>
+      </w:r>
+      <w:r>
+        <w:rPr>
+          <w:rStyle w:val="VerbatimChar"/>
+        </w:rPr>
+        <w:t xml:space="preserve">PlaceOnHold</w:t>
+      </w:r>
+      <w:r>
+        <w:t xml:space="preserve"> </w:t>
+      </w:r>
+      <w:r>
+        <w:t xml:space="preserve">with the shipper ID. AIM acknowledges. The container status goes to HOLD. It’s not going on the truck.</w:t>
+      </w:r>
+    </w:p>
+    <w:bookmarkEnd w:id="88"/>
+    <w:bookmarkStart w:id="89" w:name="pm-the-sort-cage"/>
+    <w:p>
+      <w:pPr>
+        <w:pStyle w:val="Heading3"/>
+      </w:pPr>
+      <w:r>
+        <w:t xml:space="preserve">2:00pm — The Sort Cage</w:t>
+      </w:r>
+    </w:p>
+    <w:p>
+      <w:pPr>
+        <w:pStyle w:val="FirstParagraph"/>
+      </w:pPr>
+      <w:r>
+        <w:t xml:space="preserve">After investigation, Diane determines the issue is isolated to cavity A of die #42, from yesterday’s second shift only. From her desk she clicks the</w:t>
+      </w:r>
+      <w:r>
+        <w:t xml:space="preserve"> </w:t>
+      </w:r>
       <w:r>
         <w:rPr>
           <w:b/>
           <w:bCs/>
         </w:rPr>
-        <w:t xml:space="preserve">Scope note:</w:t>
-      </w:r>
-      <w:r>
-        <w:t xml:space="preserve"> </w:t>
-      </w:r>
-      <w:r>
-        <w:t xml:space="preserve">This split-and-scrap workflow uses the LOT split and hold mechanisms, both of which are MVP. Formal NCM disposition codes (USE_AS_IS, REWORK, SCRAP, RETURN_TO_VENDOR) and structured failure analysis are FUTURE capabilities. In MVP, Diane uses holds and LOT splits as the operational tools for quality disposition; the</w:t>
-      </w:r>
-      <w:r>
-        <w:t xml:space="preserve"> </w:t>
-      </w:r>
-      <w:r>
-        <w:rPr>
-          <w:rStyle w:val="VerbatimChar"/>
-        </w:rPr>
-        <w:t xml:space="preserve">NonConformance</w:t>
-      </w:r>
-      <w:r>
-        <w:t xml:space="preserve"> </w:t>
-      </w:r>
-      <w:r>
-        <w:t xml:space="preserve">table is not populated. MPP currently uses Intelex for formal NCM/failure analysis tracking, separate from the MES.</w:t>
-      </w:r>
-    </w:p>
-    <w:p>
-      <w:pPr>
-        <w:pStyle w:val="FirstParagraph"/>
-      </w:pPr>
-      <w:r>
-        <w:t xml:space="preserve">The two containers go to the Sort Cage — a physical location in the plant where containers are unpacked, parts re-inspected, and re-packed. The containers move (location: Sort Cage). Operators unpack them, inspect each part. Good parts get re-packed into new containers — the MES must support</w:t>
-      </w:r>
-      <w:r>
-        <w:t xml:space="preserve"> </w:t>
-      </w:r>
-      <w:r>
-        <w:t xml:space="preserve">“part replacement”</w:t>
-      </w:r>
-      <w:r>
-        <w:t xml:space="preserve"> </w:t>
-      </w:r>
-      <w:r>
-        <w:t xml:space="preserve">within containers (per FRS 2.1.10 and 2.2.7). For serialized parts, the MES handles serial number migration — the</w:t>
-      </w:r>
-      <w:r>
-        <w:t xml:space="preserve"> </w:t>
-      </w:r>
-      <w:r>
-        <w:rPr>
-          <w:rStyle w:val="VerbatimChar"/>
-        </w:rPr>
-        <w:t xml:space="preserve">ContainerSerial</w:t>
-      </w:r>
-      <w:r>
-        <w:t xml:space="preserve"> </w:t>
-      </w:r>
-      <w:r>
-        <w:t xml:space="preserve">records are updated to point to the new containers and tray positions. When containers are re-packed, AIM must also be updated via</w:t>
-      </w:r>
-      <w:r>
-        <w:t xml:space="preserve"> </w:t>
-      </w:r>
-      <w:r>
-        <w:rPr>
-          <w:rStyle w:val="VerbatimChar"/>
-        </w:rPr>
-        <w:t xml:space="preserve">UpdateAim</w:t>
-      </w:r>
-      <w:r>
-        <w:t xml:space="preserve"> </w:t>
-      </w:r>
-      <w:r>
-        <w:t xml:space="preserve">(which accepts</w:t>
-      </w:r>
-      <w:r>
-        <w:t xml:space="preserve"> </w:t>
-      </w:r>
-      <w:r>
-        <w:rPr>
-          <w:rStyle w:val="VerbatimChar"/>
-        </w:rPr>
-        <w:t xml:space="preserve">serial</w:t>
-      </w:r>
-      <w:r>
-        <w:t xml:space="preserve"> </w:t>
-      </w:r>
-      <w:r>
-        <w:t xml:space="preserve">and</w:t>
-      </w:r>
-      <w:r>
-        <w:t xml:space="preserve"> </w:t>
-      </w:r>
-      <w:r>
-        <w:rPr>
-          <w:rStyle w:val="VerbatimChar"/>
-        </w:rPr>
-        <w:t xml:space="preserve">previousSerial</w:t>
-      </w:r>
-      <w:r>
-        <w:t xml:space="preserve"> </w:t>
-      </w:r>
-      <w:r>
-        <w:t xml:space="preserve">parameters, per Appendix L). New LTT labels print for any new LOTs created during re-sort. New shipping labels print for the re-packed containers. Old shipping labels are voided (</w:t>
-      </w:r>
-      <w:r>
-        <w:rPr>
-          <w:rStyle w:val="VerbatimChar"/>
-        </w:rPr>
-        <w:t xml:space="preserve">is_void=1</w:t>
-      </w:r>
-      <w:r>
-        <w:t xml:space="preserve">,</w:t>
-      </w:r>
-      <w:r>
-        <w:t xml:space="preserve"> </w:t>
-      </w:r>
-      <w:r>
-        <w:rPr>
-          <w:rStyle w:val="VerbatimChar"/>
-        </w:rPr>
-        <w:t xml:space="preserve">VoidedAt</w:t>
-      </w:r>
-      <w:r>
-        <w:t xml:space="preserve"> </w:t>
-      </w:r>
-      <w:r>
-        <w:t xml:space="preserve">recorded). AIM gets updated:</w:t>
-      </w:r>
-      <w:r>
-        <w:t xml:space="preserve"> </w:t>
-      </w:r>
-      <w:r>
-        <w:rPr>
-          <w:rStyle w:val="VerbatimChar"/>
-        </w:rPr>
-        <w:t xml:space="preserve">ReleaseFromHold</w:t>
-      </w:r>
-      <w:r>
-        <w:t xml:space="preserve"> </w:t>
-      </w:r>
-      <w:r>
-        <w:t xml:space="preserve">for the new good containers, the old shipper IDs are cancelled.</w:t>
+        <w:t xml:space="preserve">Track</w:t>
+      </w:r>
+      <w:r>
+        <w:t xml:space="preserve"> </w:t>
+      </w:r>
+      <w:r>
+        <w:t xml:space="preserve">tile on the MES home page (FDS-12-012), types in one of the Honda-reported serial numbers, and immediately sees the full genealogy tree — cavity, die, Carlos, timestamp, and forward through to the containers and shipper IDs where that serial landed. From that tree she pivots into a search on</w:t>
+      </w:r>
+      <w:r>
+        <w:t xml:space="preserve"> </w:t>
+      </w:r>
+      <w:r>
+        <w:rPr>
+          <w:rStyle w:val="VerbatimChar"/>
+        </w:rPr>
+        <w:t xml:space="preserve">die=42 AND cavity=A AND createdAt BETWEEN yesterday 14:00 AND 22:00</w:t>
+      </w:r>
+      <w:r>
+        <w:t xml:space="preserve">. Three LOTs come back. Two are already in containers at the dock. One is still in WIP storage at the Machine Shop.</w:t>
       </w:r>
     </w:p>
     <w:p>
@@ -3588,99 +4830,305 @@
         <w:pStyle w:val="BodyText"/>
       </w:pPr>
       <w:r>
-        <w:t xml:space="preserve">Diane releases the hold on the good LOTs. The</w:t>
-      </w:r>
-      <w:r>
-        <w:t xml:space="preserve"> </w:t>
-      </w:r>
-      <w:r>
-        <w:rPr>
-          <w:rStyle w:val="VerbatimChar"/>
-        </w:rPr>
-        <w:t xml:space="preserve">HoldEvent</w:t>
-      </w:r>
-      <w:r>
-        <w:t xml:space="preserve"> </w:t>
-      </w:r>
-      <w:r>
-        <w:t xml:space="preserve">gets</w:t>
-      </w:r>
-      <w:r>
-        <w:t xml:space="preserve"> </w:t>
-      </w:r>
-      <w:r>
-        <w:rPr>
-          <w:rStyle w:val="VerbatimChar"/>
-        </w:rPr>
-        <w:t xml:space="preserve">ReleasedByUserId</w:t>
-      </w:r>
-      <w:r>
-        <w:t xml:space="preserve"> </w:t>
-      </w:r>
-      <w:r>
-        <w:t xml:space="preserve">and</w:t>
-      </w:r>
-      <w:r>
-        <w:t xml:space="preserve"> </w:t>
-      </w:r>
-      <w:r>
-        <w:rPr>
-          <w:rStyle w:val="VerbatimChar"/>
-        </w:rPr>
-        <w:t xml:space="preserve">ReleasedAt</w:t>
-      </w:r>
-      <w:r>
-        <w:t xml:space="preserve"> </w:t>
-      </w:r>
-      <w:r>
-        <w:t xml:space="preserve">populated. LOT status goes back to GOOD. Production can resume.</w:t>
-      </w:r>
-    </w:p>
-    <w:bookmarkEnd w:id="22"/>
-    <w:bookmarkStart w:id="23" w:name="Xef0509370e552f9e4610b8262e70be2381c36f2"/>
-    <w:p>
-      <w:pPr>
-        <w:pStyle w:val="Heading3"/>
-      </w:pPr>
-      <w:r>
-        <w:t xml:space="preserve">3:30pm — Receiving Dock: A Pass-Through Part Arrives</w:t>
-      </w:r>
-    </w:p>
-    <w:p>
-      <w:pPr>
-        <w:pStyle w:val="FirstParagraph"/>
-      </w:pPr>
-      <w:r>
-        <w:t xml:space="preserve">A truck pulls up with a delivery of 6MA Cam Holder housings from an outside supplier. These are pass-through parts — MPP doesn’t manufacture them, just assembles them. The receiving operator scans the packing slip, creates a LOT in the MES: origin type Received, vendor lot number</w:t>
-      </w:r>
-      <w:r>
-        <w:t xml:space="preserve"> </w:t>
-      </w:r>
-      <w:r>
-        <w:rPr>
-          <w:rStyle w:val="VerbatimChar"/>
-        </w:rPr>
-        <w:t xml:space="preserve">VND-88721</w:t>
-      </w:r>
-      <w:r>
-        <w:t xml:space="preserve">, piece count 500, part number 6MA-HSG. The LOT enters the system at the Receiving Dock location.</w:t>
-      </w:r>
-    </w:p>
-    <w:p>
-      <w:pPr>
-        <w:pStyle w:val="BlockText"/>
-      </w:pPr>
+        <w:t xml:space="preserve">The WIP LOT is easy — she splits it. The MES creates a new child LOT with the 12 suspect pieces, leaves the remaining 36 in the original. She scraps the suspect child from the</w:t>
+      </w:r>
+      <w:r>
+        <w:t xml:space="preserve"> </w:t>
+      </w:r>
       <w:r>
         <w:rPr>
           <w:b/>
           <w:bCs/>
         </w:rPr>
+        <w:t xml:space="preserve">Selected Location</w:t>
+      </w:r>
+      <w:r>
+        <w:t xml:space="preserve"> </w:t>
+      </w:r>
+      <w:r>
+        <w:t xml:space="preserve">(the Machine Shop Cell where the in-process pieces are) — not from Inventory — because the parts haven’t yet returned to unallocated LOT stock. The</w:t>
+      </w:r>
+      <w:r>
+        <w:t xml:space="preserve"> </w:t>
+      </w:r>
+      <w:r>
+        <w:rPr>
+          <w:rStyle w:val="VerbatimChar"/>
+        </w:rPr>
+        <w:t xml:space="preserve">Workorder.ProductionEvent.ScrapSourceId</w:t>
+      </w:r>
+      <w:r>
+        <w:t xml:space="preserve"> </w:t>
+      </w:r>
+      <w:r>
+        <w:t xml:space="preserve">on the resulting scrap event records</w:t>
+      </w:r>
+      <w:r>
+        <w:t xml:space="preserve"> </w:t>
+      </w:r>
+      <w:r>
+        <w:rPr>
+          <w:rStyle w:val="VerbatimChar"/>
+        </w:rPr>
+        <w:t xml:space="preserve">Location</w:t>
+      </w:r>
+      <w:r>
+        <w:t xml:space="preserve"> </w:t>
+      </w:r>
+      <w:r>
+        <w:t xml:space="preserve">per FDS-06-023a so the scrap-rate analytics tie cleanly to the Machine Shop Cell. The suspect child LOT’s status goes to SCRAP. The original stays on HOLD until she releases it.</w:t>
+      </w:r>
+    </w:p>
+    <w:p>
+      <w:pPr>
+        <w:pStyle w:val="BlockText"/>
+      </w:pPr>
+      <w:r>
+        <w:rPr>
+          <w:b/>
+          <w:bCs/>
+        </w:rPr>
         <w:t xml:space="preserve">Scope note:</w:t>
       </w:r>
       <w:r>
         <w:t xml:space="preserve"> </w:t>
       </w:r>
       <w:r>
+        <w:t xml:space="preserve">This split-and-scrap workflow uses the LOT split and hold mechanisms, both of which are MVP. Formal NCM disposition codes (USE_AS_IS, REWORK, SCRAP, RETURN_TO_VENDOR) and structured failure analysis are FUTURE capabilities. In MVP, Diane uses holds and LOT splits as the operational tools for quality disposition; the</w:t>
+      </w:r>
+      <w:r>
+        <w:t xml:space="preserve"> </w:t>
+      </w:r>
+      <w:r>
+        <w:rPr>
+          <w:rStyle w:val="VerbatimChar"/>
+        </w:rPr>
+        <w:t xml:space="preserve">NonConformance</w:t>
+      </w:r>
+      <w:r>
+        <w:t xml:space="preserve"> </w:t>
+      </w:r>
+      <w:r>
+        <w:t xml:space="preserve">table is not populated. MPP currently uses Intelex for formal NCM/failure analysis tracking, separate from the MES.</w:t>
+      </w:r>
+    </w:p>
+    <w:p>
+      <w:pPr>
+        <w:pStyle w:val="FirstParagraph"/>
+      </w:pPr>
+      <w:r>
+        <w:t xml:space="preserve">The two containers go to the Sort Cage — a physical location in the plant where containers are unpacked, parts re-inspected, and re-packed. The containers move (location: Sort Cage). Operators unpack them, inspect each part. Good parts get re-packed into new containers — the MES must support</w:t>
+      </w:r>
+      <w:r>
+        <w:t xml:space="preserve"> </w:t>
+      </w:r>
+      <w:r>
+        <w:t xml:space="preserve">“part replacement”</w:t>
+      </w:r>
+      <w:r>
+        <w:t xml:space="preserve"> </w:t>
+      </w:r>
+      <w:r>
+        <w:t xml:space="preserve">within containers (per FRS 2.1.10 and 2.2.7). For serialized parts, the MES handles serial number migration — the</w:t>
+      </w:r>
+      <w:r>
+        <w:t xml:space="preserve"> </w:t>
+      </w:r>
+      <w:r>
+        <w:rPr>
+          <w:rStyle w:val="VerbatimChar"/>
+        </w:rPr>
+        <w:t xml:space="preserve">ContainerSerial</w:t>
+      </w:r>
+      <w:r>
+        <w:t xml:space="preserve"> </w:t>
+      </w:r>
+      <w:r>
+        <w:t xml:space="preserve">records are updated to point to the new containers and tray positions. When containers are re-packed, AIM must also be updated via</w:t>
+      </w:r>
+      <w:r>
+        <w:t xml:space="preserve"> </w:t>
+      </w:r>
+      <w:r>
+        <w:rPr>
+          <w:rStyle w:val="VerbatimChar"/>
+        </w:rPr>
+        <w:t xml:space="preserve">UpdateAim</w:t>
+      </w:r>
+      <w:r>
+        <w:t xml:space="preserve"> </w:t>
+      </w:r>
+      <w:r>
+        <w:t xml:space="preserve">(which accepts</w:t>
+      </w:r>
+      <w:r>
+        <w:t xml:space="preserve"> </w:t>
+      </w:r>
+      <w:r>
+        <w:rPr>
+          <w:rStyle w:val="VerbatimChar"/>
+        </w:rPr>
+        <w:t xml:space="preserve">serial</w:t>
+      </w:r>
+      <w:r>
+        <w:t xml:space="preserve"> </w:t>
+      </w:r>
+      <w:r>
+        <w:t xml:space="preserve">and</w:t>
+      </w:r>
+      <w:r>
+        <w:t xml:space="preserve"> </w:t>
+      </w:r>
+      <w:r>
+        <w:rPr>
+          <w:rStyle w:val="VerbatimChar"/>
+        </w:rPr>
+        <w:t xml:space="preserve">previousSerial</w:t>
+      </w:r>
+      <w:r>
+        <w:t xml:space="preserve"> </w:t>
+      </w:r>
+      <w:r>
+        <w:t xml:space="preserve">parameters, per Appendix L). New LTT labels print for any new LOTs created during re-sort. New shipping labels print for the re-packed containers. Old shipping labels are voided (</w:t>
+      </w:r>
+      <w:r>
+        <w:rPr>
+          <w:rStyle w:val="VerbatimChar"/>
+        </w:rPr>
+        <w:t xml:space="preserve">is_void=1</w:t>
+      </w:r>
+      <w:r>
+        <w:t xml:space="preserve">,</w:t>
+      </w:r>
+      <w:r>
+        <w:t xml:space="preserve"> </w:t>
+      </w:r>
+      <w:r>
+        <w:rPr>
+          <w:rStyle w:val="VerbatimChar"/>
+        </w:rPr>
+        <w:t xml:space="preserve">VoidedAt</w:t>
+      </w:r>
+      <w:r>
+        <w:t xml:space="preserve"> </w:t>
+      </w:r>
+      <w:r>
+        <w:t xml:space="preserve">recorded). AIM gets updated:</w:t>
+      </w:r>
+      <w:r>
+        <w:t xml:space="preserve"> </w:t>
+      </w:r>
+      <w:r>
+        <w:rPr>
+          <w:rStyle w:val="VerbatimChar"/>
+        </w:rPr>
+        <w:t xml:space="preserve">ReleaseFromHold</w:t>
+      </w:r>
+      <w:r>
+        <w:t xml:space="preserve"> </w:t>
+      </w:r>
+      <w:r>
+        <w:t xml:space="preserve">for the new good containers, the old shipper IDs are cancelled.</w:t>
+      </w:r>
+    </w:p>
+    <w:p>
+      <w:pPr>
+        <w:pStyle w:val="BodyText"/>
+      </w:pPr>
+      <w:r>
+        <w:t xml:space="preserve">Diane releases the hold on the good LOTs. The</w:t>
+      </w:r>
+      <w:r>
+        <w:t xml:space="preserve"> </w:t>
+      </w:r>
+      <w:r>
+        <w:rPr>
+          <w:rStyle w:val="VerbatimChar"/>
+        </w:rPr>
+        <w:t xml:space="preserve">HoldEvent</w:t>
+      </w:r>
+      <w:r>
+        <w:t xml:space="preserve"> </w:t>
+      </w:r>
+      <w:r>
+        <w:t xml:space="preserve">gets</w:t>
+      </w:r>
+      <w:r>
+        <w:t xml:space="preserve"> </w:t>
+      </w:r>
+      <w:r>
+        <w:rPr>
+          <w:rStyle w:val="VerbatimChar"/>
+        </w:rPr>
+        <w:t xml:space="preserve">ReleasedByUserId</w:t>
+      </w:r>
+      <w:r>
+        <w:t xml:space="preserve"> </w:t>
+      </w:r>
+      <w:r>
+        <w:t xml:space="preserve">and</w:t>
+      </w:r>
+      <w:r>
+        <w:t xml:space="preserve"> </w:t>
+      </w:r>
+      <w:r>
+        <w:rPr>
+          <w:rStyle w:val="VerbatimChar"/>
+        </w:rPr>
+        <w:t xml:space="preserve">ReleasedAt</w:t>
+      </w:r>
+      <w:r>
+        <w:t xml:space="preserve"> </w:t>
+      </w:r>
+      <w:r>
+        <w:t xml:space="preserve">populated. LOT status goes back to GOOD. Production can resume.</w:t>
+      </w:r>
+    </w:p>
+    <w:bookmarkEnd w:id="89"/>
+    <w:bookmarkStart w:id="90" w:name="Xef0509370e552f9e4610b8262e70be2381c36f2"/>
+    <w:p>
+      <w:pPr>
+        <w:pStyle w:val="Heading3"/>
+      </w:pPr>
+      <w:r>
+        <w:t xml:space="preserve">3:30pm — Receiving Dock: A Pass-Through Part Arrives</w:t>
+      </w:r>
+    </w:p>
+    <w:p>
+      <w:pPr>
+        <w:pStyle w:val="FirstParagraph"/>
+      </w:pPr>
+      <w:r>
+        <w:t xml:space="preserve">A truck pulls up with a delivery of 6MA Cam Holder housings from an outside supplier. These are pass-through parts — MPP doesn’t manufacture them, just assembles them. The receiving operator scans the packing slip, creates a LOT in the MES: origin type Received, vendor lot number</w:t>
+      </w:r>
+      <w:r>
+        <w:t xml:space="preserve"> </w:t>
+      </w:r>
+      <w:r>
+        <w:rPr>
+          <w:rStyle w:val="VerbatimChar"/>
+        </w:rPr>
+        <w:t xml:space="preserve">VND-88721</w:t>
+      </w:r>
+      <w:r>
+        <w:t xml:space="preserve">, piece count 500, part number 6MA-HSG. The LOT enters the system at the Receiving Dock location.</w:t>
+      </w:r>
+    </w:p>
+    <w:p>
+      <w:pPr>
+        <w:pStyle w:val="BlockText"/>
+      </w:pPr>
+      <w:r>
+        <w:rPr>
+          <w:b/>
+          <w:bCs/>
+        </w:rPr>
+        <w:t xml:space="preserve">Scope note:</w:t>
+      </w:r>
+      <w:r>
+        <w:t xml:space="preserve"> </w:t>
+      </w:r>
+      <w:r>
         <w:t xml:space="preserve">Receiving pass-through parts into the MES is MVP (Scope Matrix row 3). Once created, a received LOT is identical to a manufactured LOT — same movement tracking, hold management, consumption, and genealogy. The data model makes no distinction beyond</w:t>
       </w:r>
       <w:r>
@@ -3708,8 +5156,8 @@
         <w:t xml:space="preserve">note on Scope Matrix row 20 refers to the dedicated operational workflows — Perspective screens for receiving inspection, vendor lot verification, and staging procedures specific to pass-through parts — not to the underlying tracking capability.</w:t>
       </w:r>
     </w:p>
-    <w:bookmarkEnd w:id="23"/>
-    <w:bookmarkStart w:id="24" w:name="pm-shipping-the-truck-leaves"/>
+    <w:bookmarkEnd w:id="90"/>
+    <w:bookmarkStart w:id="91" w:name="pm-shipping-the-truck-leaves"/>
     <w:p>
       <w:pPr>
         <w:pStyle w:val="Heading3"/>
@@ -3726,8 +5174,8 @@
         <w:t xml:space="preserve">The released containers — the good ones from this morning’s production, plus the re-sorted containers from the Sort Cage — are loaded onto the Honda truck. The shipping operator scans each container’s shipping label. The MES confirms: status Complete (not HOLD, not VOID), AIM shipper ID valid. Each container’s location moves to Shipping Dock → Shipped. The truck rolls out. Honda can trace every part on it back to the melt.</w:t>
       </w:r>
     </w:p>
-    <w:bookmarkEnd w:id="24"/>
-    <w:bookmarkStart w:id="25" w:name="end-of-shift"/>
+    <w:bookmarkEnd w:id="91"/>
+    <w:bookmarkStart w:id="92" w:name="end-of-shift"/>
     <w:p>
       <w:pPr>
         <w:pStyle w:val="Heading3"/>
@@ -3741,28 +5189,107 @@
         <w:pStyle w:val="FirstParagraph"/>
       </w:pPr>
       <w:r>
-        <w:t xml:space="preserve">Second shift badges in. The shift boundary isn’t perfectly clean — the paper production sheets show operators adjusting base runtime for running through lunch (+30 min), breaks (+10 min), or overtime (+110 min for a 10-hour day). The MES captures this through the shift schedule and actual shift instances (</w:t>
-      </w:r>
-      <w:r>
-        <w:rPr>
-          <w:rStyle w:val="VerbatimChar"/>
-        </w:rPr>
-        <w:t xml:space="preserve">Shift.ActualStart</w:t>
-      </w:r>
-      <w:r>
-        <w:t xml:space="preserve">,</w:t>
-      </w:r>
-      <w:r>
-        <w:t xml:space="preserve"> </w:t>
-      </w:r>
-      <w:r>
-        <w:rPr>
-          <w:rStyle w:val="VerbatimChar"/>
-        </w:rPr>
-        <w:t xml:space="preserve">Shift.ActualEnd</w:t>
-      </w:r>
-      <w:r>
-        <w:t xml:space="preserve">), but the micro-adjustments that affect downtime/runtime calculations need to be captured somewhere. The downtime events themselves sum to total downtime; available runtime is derived from the shift boundary minus downtime.</w:t>
+        <w:t xml:space="preserve">About 15 minutes before 2pm, a time-entry control appears in the terminal header on every first-shift terminal. Carlos presses it. Because he’s on a</w:t>
+      </w:r>
+      <w:r>
+        <w:t xml:space="preserve"> </w:t>
+      </w:r>
+      <w:r>
+        <w:rPr>
+          <w:b/>
+          <w:bCs/>
+        </w:rPr>
+        <w:t xml:space="preserve">dedicated terminal</w:t>
+      </w:r>
+      <w:r>
+        <w:t xml:space="preserve"> </w:t>
+      </w:r>
+      <w:r>
+        <w:t xml:space="preserve">(one-to-one with Machine #7), the submission is a single button press — no prompts, no selection. The MES records whether he took lunch and which breaks he took using the schedule defaults, and automatically writes</w:t>
+      </w:r>
+      <w:r>
+        <w:t xml:space="preserve"> </w:t>
+      </w:r>
+      <w:r>
+        <w:rPr>
+          <w:rStyle w:val="VerbatimChar"/>
+        </w:rPr>
+        <w:t xml:space="preserve">Oee.DowntimeEvent</w:t>
+      </w:r>
+      <w:r>
+        <w:t xml:space="preserve"> </w:t>
+      </w:r>
+      <w:r>
+        <w:t xml:space="preserve">rows for each — using the durations configured on the shift schedule (e.g., 30 minutes for lunch, 10 minutes for each break). Carlos doesn’t enter any durations; the system already knows them. On a</w:t>
+      </w:r>
+      <w:r>
+        <w:t xml:space="preserve"> </w:t>
+      </w:r>
+      <w:r>
+        <w:rPr>
+          <w:b/>
+          <w:bCs/>
+        </w:rPr>
+        <w:t xml:space="preserve">shared terminal</w:t>
+      </w:r>
+      <w:r>
+        <w:t xml:space="preserve">, the operator would additionally enter their initials and confirm each break taken before submitting.</w:t>
+      </w:r>
+    </w:p>
+    <w:p>
+      <w:pPr>
+        <w:pStyle w:val="BodyText"/>
+      </w:pPr>
+      <w:r>
+        <w:t xml:space="preserve">At 2pm, Carlos triggers the</w:t>
+      </w:r>
+      <w:r>
+        <w:t xml:space="preserve"> </w:t>
+      </w:r>
+      <w:r>
+        <w:rPr>
+          <w:b/>
+          <w:bCs/>
+        </w:rPr>
+        <w:t xml:space="preserve">Shift Handover</w:t>
+      </w:r>
+      <w:r>
+        <w:t xml:space="preserve"> </w:t>
+      </w:r>
+      <w:r>
+        <w:t xml:space="preserve">action. The MES presents a one-screen summary of in-flight state at his terminal: open LOTs still at his machine, open downtime events, and any open containers. Carlos reviews it, acknowledges it, and the system logs the handover to</w:t>
+      </w:r>
+      <w:r>
+        <w:t xml:space="preserve"> </w:t>
+      </w:r>
+      <w:r>
+        <w:rPr>
+          <w:rStyle w:val="VerbatimChar"/>
+        </w:rPr>
+        <w:t xml:space="preserve">Audit.OperationLog</w:t>
+      </w:r>
+      <w:r>
+        <w:t xml:space="preserve">. The incoming second-shift operator is prompted for their initials to establish a new presence context (per FDS-04-009). Open LOTs, paused LOTs, and in-process events are not auto-closed at the shift boundary — they persist and carry into second shift.</w:t>
+      </w:r>
+    </w:p>
+    <w:p>
+      <w:pPr>
+        <w:pStyle w:val="BodyText"/>
+      </w:pPr>
+      <w:r>
+        <w:t xml:space="preserve">Available runtime for OEE purposes is derived from</w:t>
+      </w:r>
+      <w:r>
+        <w:t xml:space="preserve"> </w:t>
+      </w:r>
+      <w:r>
+        <w:rPr>
+          <w:rStyle w:val="VerbatimChar"/>
+        </w:rPr>
+        <w:t xml:space="preserve">(ScheduledEnd − ScheduledStart) − SUM(DowntimeEvent durations within the shift window)</w:t>
+      </w:r>
+      <w:r>
+        <w:t xml:space="preserve">. No manual runtime adjustment column exists — the downtime events are the source of truth.</w:t>
       </w:r>
     </w:p>
     <w:p>
@@ -3855,9 +5382,9 @@
         </w:pict>
       </w:r>
     </w:p>
-    <w:bookmarkEnd w:id="25"/>
-    <w:bookmarkEnd w:id="26"/>
-    <w:bookmarkStart w:id="46" w:name="assumptions-open-decisions"/>
+    <w:bookmarkEnd w:id="92"/>
+    <w:bookmarkEnd w:id="93"/>
+    <w:bookmarkStart w:id="113" w:name="assumptions-open-decisions"/>
     <w:p>
       <w:pPr>
         <w:pStyle w:val="Heading2"/>
@@ -3892,7 +5419,7 @@
         <w:t xml:space="preserve">✅ Resolved | 🔶 Pending Customer Validation / Pending Internal Review | ⬜ Open</w:t>
       </w:r>
     </w:p>
-    <w:bookmarkStart w:id="27" w:name="X5b90eb551c604f4716bb765ca587f0c2360571b"/>
+    <w:bookmarkStart w:id="94" w:name="X5b90eb551c604f4716bb765ca587f0c2360571b"/>
     <w:p>
       <w:pPr>
         <w:pStyle w:val="Heading3"/>
@@ -3984,8 +5511,8 @@
         <w:t xml:space="preserve">See FDS §4.</w:t>
       </w:r>
     </w:p>
-    <w:bookmarkEnd w:id="27"/>
-    <w:bookmarkStart w:id="28" w:name="X8a97f2b45aacffcfde53291572bcd0cf661d011"/>
+    <w:bookmarkEnd w:id="94"/>
+    <w:bookmarkStart w:id="95" w:name="X8a97f2b45aacffcfde53291572bcd0cf661d011"/>
     <w:p>
       <w:pPr>
         <w:pStyle w:val="Heading3"/>
@@ -4076,8 +5603,8 @@
         <w:t xml:space="preserve">time (operator selects/confirms which cavity). See FDS-05-036.</w:t>
       </w:r>
     </w:p>
-    <w:bookmarkEnd w:id="28"/>
-    <w:bookmarkStart w:id="29" w:name="X02d9ed5b59999fee2ed9f775d0d739f5d3a01b0"/>
+    <w:bookmarkEnd w:id="95"/>
+    <w:bookmarkStart w:id="96" w:name="X02d9ed5b59999fee2ed9f775d0d739f5d3a01b0"/>
     <w:p>
       <w:pPr>
         <w:pStyle w:val="Heading3"/>
@@ -4125,7 +5652,7 @@
         <w:t xml:space="preserve"> </w:t>
       </w:r>
       <w:r>
-        <w:t xml:space="preserve">On arrival at machining, the system auto-splits the LOT evenly into 2 sublots with a confirmation dialog. Sublots are treated identically to lot splits in the data model (</w:t>
+        <w:t xml:space="preserve">Auto-split at the boundary into N sublots based on the item’s default sub-lot quantity, with a confirmation dialog. Sublots are treated identically to lot splits in the data model (</w:t>
       </w:r>
       <w:r>
         <w:rPr>
@@ -4165,13 +5692,13 @@
           <w:b/>
           <w:bCs/>
         </w:rPr>
-        <w:t xml:space="preserve">Machining-only</w:t>
-      </w:r>
-      <w:r>
-        <w:t xml:space="preserve"> </w:t>
-      </w:r>
-      <w:r>
-        <w:t xml:space="preserve">sublot pattern (parent FK + split genealogy).</w:t>
+        <w:t xml:space="preserve">Trim OUT</w:t>
+      </w:r>
+      <w:r>
+        <w:t xml:space="preserve"> </w:t>
+      </w:r>
+      <w:r>
+        <w:t xml:space="preserve">sublot pattern (parent FK + split genealogy). Split happens when the Trim operator completes the LOT at Trim OUT — not on arrival at Machining. Sub-LOTs arrive at Machining already split and re-labeled.</w:t>
       </w:r>
       <w:r>
         <w:t xml:space="preserve"> </w:t>
@@ -4205,8 +5732,8 @@
         <w:t xml:space="preserve">set at creation. The 2026-04-20 meeting notes conflated the two concepts; OI-09 closes this by locking the cavity-parallel-as-peer model in Data Model v1.9. See FDS-05-022 (sublots, Machining) and FDS-05-034 (cavity-parallel LOTs, Die Cast).</w:t>
       </w:r>
     </w:p>
-    <w:bookmarkEnd w:id="29"/>
-    <w:bookmarkStart w:id="30" w:name="X8d9059566608ee12c9183bcb0fe5f5e27b15363"/>
+    <w:bookmarkEnd w:id="96"/>
+    <w:bookmarkStart w:id="97" w:name="X8d9059566608ee12c9183bcb0fe5f5e27b15363"/>
     <w:p>
       <w:pPr>
         <w:pStyle w:val="Heading3"/>
@@ -4261,8 +5788,8 @@
         <w:t xml:space="preserve">Maps to OI-02.</w:t>
       </w:r>
     </w:p>
-    <w:bookmarkEnd w:id="30"/>
-    <w:bookmarkStart w:id="31" w:name="sort-cage-serial-number-migration-open"/>
+    <w:bookmarkEnd w:id="97"/>
+    <w:bookmarkStart w:id="98" w:name="sort-cage-serial-number-migration-open"/>
     <w:p>
       <w:pPr>
         <w:pStyle w:val="Heading3"/>
@@ -4337,8 +5864,8 @@
         <w:t xml:space="preserve">table is needed.</w:t>
       </w:r>
     </w:p>
-    <w:bookmarkEnd w:id="31"/>
-    <w:bookmarkStart w:id="32" w:name="off-site-receiving-resolved"/>
+    <w:bookmarkEnd w:id="98"/>
+    <w:bookmarkStart w:id="99" w:name="off-site-receiving-resolved"/>
     <w:p>
       <w:pPr>
         <w:pStyle w:val="Heading3"/>
@@ -4383,8 +5910,8 @@
         <w:t xml:space="preserve">Online capability confirmed. No concerns about network reliability or offline requirements. Standard Ignition Perspective via VPN/published gateway.</w:t>
       </w:r>
     </w:p>
-    <w:bookmarkEnd w:id="32"/>
-    <w:bookmarkStart w:id="33" w:name="work-order-visibility-and-lifecycle-open"/>
+    <w:bookmarkEnd w:id="99"/>
+    <w:bookmarkStart w:id="100" w:name="work-order-visibility-and-lifecycle-open"/>
     <w:p>
       <w:pPr>
         <w:pStyle w:val="Heading3"/>
@@ -4451,8 +5978,8 @@
         <w:t xml:space="preserve">Maps to OI-07.</w:t>
       </w:r>
     </w:p>
-    <w:bookmarkEnd w:id="33"/>
-    <w:bookmarkStart w:id="34" w:name="lot-merge-business-rules-open"/>
+    <w:bookmarkEnd w:id="100"/>
+    <w:bookmarkStart w:id="101" w:name="lot-merge-business-rules-open"/>
     <w:p>
       <w:pPr>
         <w:pStyle w:val="Heading3"/>
@@ -4618,8 +6145,8 @@
         <w:t xml:space="preserve">walk of the pre-merge source LOTs (each retains its own Tool/Cavity FKs immutably). See FDS-05-030.</w:t>
       </w:r>
     </w:p>
-    <w:bookmarkEnd w:id="34"/>
-    <w:bookmarkStart w:id="35" w:name="Xaf546f60fbb4131369bf8f225358aae274b9155"/>
+    <w:bookmarkEnd w:id="101"/>
+    <w:bookmarkStart w:id="102" w:name="Xaf546f60fbb4131369bf8f225358aae274b9155"/>
     <w:p>
       <w:pPr>
         <w:pStyle w:val="Heading3"/>
@@ -4691,14 +6218,14 @@
         <w:t xml:space="preserve">BOM-based check. The scanned source LOT’s part number must match a component in the active BOM version. Substitute parts are rejected. Needs MPP confirmation.</w:t>
       </w:r>
     </w:p>
-    <w:bookmarkEnd w:id="35"/>
-    <w:bookmarkStart w:id="36" w:name="shift-boundary-handling-open"/>
+    <w:bookmarkEnd w:id="102"/>
+    <w:bookmarkStart w:id="103" w:name="X995e1e4ac5d76a23e79fd42d716037cc2767524"/>
     <w:p>
       <w:pPr>
         <w:pStyle w:val="Heading3"/>
       </w:pPr>
       <w:r>
-        <w:t xml:space="preserve">10. Shift Boundary Handling — ⬜ Open</w:t>
+        <w:t xml:space="preserve">10. Shift Boundary Handling — 🔶 Partially Resolved</w:t>
       </w:r>
     </w:p>
     <w:p>
@@ -4747,89 +6274,122 @@
         <w:t xml:space="preserve">Maps to OI-03.</w:t>
       </w:r>
     </w:p>
-    <w:bookmarkEnd w:id="36"/>
-    <w:bookmarkStart w:id="37" w:name="paper-to-screen-transition-open"/>
-    <w:p>
-      <w:pPr>
-        <w:pStyle w:val="Heading3"/>
-      </w:pPr>
-      <w:r>
-        <w:t xml:space="preserve">11. Paper to Screen Transition — ⬜ Open</w:t>
-      </w:r>
-    </w:p>
-    <w:p>
-      <w:pPr>
-        <w:pStyle w:val="FirstParagraph"/>
+    <w:p>
+      <w:pPr>
+        <w:pStyle w:val="BodyText"/>
       </w:pPr>
       <w:r>
         <w:rPr>
           <w:b/>
           <w:bCs/>
         </w:rPr>
-        <w:t xml:space="preserve">Assumption made:</w:t>
-      </w:r>
-      <w:r>
-        <w:t xml:space="preserve"> </w:t>
-      </w:r>
-      <w:r>
-        <w:t xml:space="preserve">The narrative assumed clean digital workflows where operators enter data in real time at the machine.</w:t>
-      </w:r>
-    </w:p>
-    <w:p>
-      <w:pPr>
-        <w:pStyle w:val="BodyText"/>
+        <w:t xml:space="preserve">Addendum (2026-04-29, v0.9):</w:t>
+      </w:r>
+      <w:r>
+        <w:t xml:space="preserve"> </w:t>
+      </w:r>
+      <w:r>
+        <w:t xml:space="preserve">End-of-shift time entry is now specified (FDS-09-013) — single button press ~15 min before shift end; dedicated terminals auto-submit with schedule defaults; shared terminals prompt initials + break selection. System writes</w:t>
+      </w:r>
+      <w:r>
+        <w:t xml:space="preserve"> </w:t>
+      </w:r>
+      <w:r>
+        <w:rPr>
+          <w:rStyle w:val="VerbatimChar"/>
+        </w:rPr>
+        <w:t xml:space="preserve">DowntimeEvent</w:t>
+      </w:r>
+      <w:r>
+        <w:t xml:space="preserve"> </w:t>
+      </w:r>
+      <w:r>
+        <w:t xml:space="preserve">rows for each break automatically. Shift-end handover summary screen specified (FDS-09-015) — outgoing operator reviews in-flight LOTs / open events / open containers, acknowledges, and the incoming operator’s initials prompt fires. Open events and LOTs are NOT auto-closed at shift boundary. Remaining open question is the full treatment of multi-shift downtime events that span the boundary (FDS-09-010: associated to the shift they started in, not split).</w:t>
+      </w:r>
+    </w:p>
+    <w:bookmarkEnd w:id="103"/>
+    <w:bookmarkStart w:id="104" w:name="paper-to-screen-transition-open"/>
+    <w:p>
+      <w:pPr>
+        <w:pStyle w:val="Heading3"/>
+      </w:pPr>
+      <w:r>
+        <w:t xml:space="preserve">11. Paper to Screen Transition — ⬜ Open</w:t>
+      </w:r>
+    </w:p>
+    <w:p>
+      <w:pPr>
+        <w:pStyle w:val="FirstParagraph"/>
       </w:pPr>
       <w:r>
         <w:rPr>
           <w:b/>
           <w:bCs/>
         </w:rPr>
-        <w:t xml:space="preserve">Decision (2026-04-09):</w:t>
-      </w:r>
-      <w:r>
-        <w:t xml:space="preserve"> </w:t>
-      </w:r>
-      <w:r>
-        <w:t xml:space="preserve">Flagged for discussion with Ben. Whether Perspective screens replace paper at point-of-action or some stations retain paper-first workflow is a process change that requires MPP commitment.</w:t>
-      </w:r>
-    </w:p>
-    <w:bookmarkEnd w:id="37"/>
-    <w:bookmarkStart w:id="38" w:name="Xe804a3ad95a44227a72a1c70b67b2009dab422f"/>
-    <w:p>
-      <w:pPr>
-        <w:pStyle w:val="Heading3"/>
-      </w:pPr>
-      <w:r>
-        <w:t xml:space="preserve">12. Terminal-to-Machine Mapping — 🔶 Pending Customer Validation</w:t>
-      </w:r>
-    </w:p>
-    <w:p>
-      <w:pPr>
-        <w:pStyle w:val="FirstParagraph"/>
+        <w:t xml:space="preserve">Assumption made:</w:t>
+      </w:r>
+      <w:r>
+        <w:t xml:space="preserve"> </w:t>
+      </w:r>
+      <w:r>
+        <w:t xml:space="preserve">The narrative assumed clean digital workflows where operators enter data in real time at the machine.</w:t>
+      </w:r>
+    </w:p>
+    <w:p>
+      <w:pPr>
+        <w:pStyle w:val="BodyText"/>
       </w:pPr>
       <w:r>
         <w:rPr>
           <w:b/>
           <w:bCs/>
         </w:rPr>
-        <w:t xml:space="preserve">Assumption made:</w:t>
-      </w:r>
-      <w:r>
-        <w:t xml:space="preserve"> </w:t>
-      </w:r>
-      <w:r>
-        <w:t xml:space="preserve">Each terminal is at a fixed location (one terminal per machine, or per small group of machines).</w:t>
-      </w:r>
-    </w:p>
-    <w:p>
-      <w:pPr>
-        <w:pStyle w:val="BodyText"/>
+        <w:t xml:space="preserve">Decision (2026-04-09):</w:t>
+      </w:r>
+      <w:r>
+        <w:t xml:space="preserve"> </w:t>
+      </w:r>
+      <w:r>
+        <w:t xml:space="preserve">Flagged for discussion with Ben. Whether Perspective screens replace paper at point-of-action or some stations retain paper-first workflow is a process change that requires MPP commitment.</w:t>
+      </w:r>
+    </w:p>
+    <w:bookmarkEnd w:id="104"/>
+    <w:bookmarkStart w:id="105" w:name="Xe804a3ad95a44227a72a1c70b67b2009dab422f"/>
+    <w:p>
+      <w:pPr>
+        <w:pStyle w:val="Heading3"/>
+      </w:pPr>
+      <w:r>
+        <w:t xml:space="preserve">12. Terminal-to-Machine Mapping — 🔶 Pending Customer Validation</w:t>
+      </w:r>
+    </w:p>
+    <w:p>
+      <w:pPr>
+        <w:pStyle w:val="FirstParagraph"/>
       </w:pPr>
       <w:r>
         <w:rPr>
           <w:b/>
           <w:bCs/>
         </w:rPr>
+        <w:t xml:space="preserve">Assumption made:</w:t>
+      </w:r>
+      <w:r>
+        <w:t xml:space="preserve"> </w:t>
+      </w:r>
+      <w:r>
+        <w:t xml:space="preserve">Each terminal is at a fixed location (one terminal per machine, or per small group of machines).</w:t>
+      </w:r>
+    </w:p>
+    <w:p>
+      <w:pPr>
+        <w:pStyle w:val="BodyText"/>
+      </w:pPr>
+      <w:r>
+        <w:rPr>
+          <w:b/>
+          <w:bCs/>
+        </w:rPr>
         <w:t xml:space="preserve">Decision (2026-04-09):</w:t>
       </w:r>
       <w:r>
@@ -4876,8 +6436,8 @@
         <w:t xml:space="preserve">Maps to OI-08.</w:t>
       </w:r>
     </w:p>
-    <w:bookmarkEnd w:id="38"/>
-    <w:bookmarkStart w:id="39" w:name="X8e24df2bda92e5ad3fb585d738c7c6e20f422e8"/>
+    <w:bookmarkEnd w:id="105"/>
+    <w:bookmarkStart w:id="106" w:name="X8e24df2bda92e5ad3fb585d738c7c6e20f422e8"/>
     <w:p>
       <w:pPr>
         <w:pStyle w:val="Heading3"/>
@@ -4959,8 +6519,8 @@
         <w:t xml:space="preserve">Maps to OI-02.</w:t>
       </w:r>
     </w:p>
-    <w:bookmarkEnd w:id="39"/>
-    <w:bookmarkStart w:id="40" w:name="X75c3ffd8ebfd8ddc104a3e286b8172282a721ca"/>
+    <w:bookmarkEnd w:id="106"/>
+    <w:bookmarkStart w:id="107" w:name="X75c3ffd8ebfd8ddc104a3e286b8172282a721ca"/>
     <w:p>
       <w:pPr>
         <w:pStyle w:val="Heading3"/>
@@ -5059,8 +6619,8 @@
         <w:t xml:space="preserve">. Needs review with Ben.</w:t>
       </w:r>
     </w:p>
-    <w:bookmarkEnd w:id="40"/>
-    <w:bookmarkStart w:id="41" w:name="multi-part-number-lines-resolved"/>
+    <w:bookmarkEnd w:id="107"/>
+    <w:bookmarkStart w:id="108" w:name="multi-part-number-lines-resolved"/>
     <w:p>
       <w:pPr>
         <w:pStyle w:val="Heading3"/>
@@ -5115,8 +6675,8 @@
         <w:t xml:space="preserve">Maps to OI-09.</w:t>
       </w:r>
     </w:p>
-    <w:bookmarkEnd w:id="41"/>
-    <w:bookmarkStart w:id="42" w:name="X85424eed8302993ab5871a0056003e0a784b765"/>
+    <w:bookmarkEnd w:id="108"/>
+    <w:bookmarkStart w:id="109" w:name="X85424eed8302993ab5871a0056003e0a784b765"/>
     <w:p>
       <w:pPr>
         <w:pStyle w:val="Heading3"/>
@@ -5227,8 +6787,8 @@
         <w:t xml:space="preserve">. The circumstances under which MPP bypasses the interlock are not yet understood. Both options flagged for discussion with Ben.</w:t>
       </w:r>
     </w:p>
-    <w:bookmarkEnd w:id="42"/>
-    <w:bookmarkStart w:id="43" w:name="X7711411ed0c744b11ef8373c23e3eb986c2f7d7"/>
+    <w:bookmarkEnd w:id="109"/>
+    <w:bookmarkStart w:id="110" w:name="X7711411ed0c744b11ef8373c23e3eb986c2f7d7"/>
     <w:p>
       <w:pPr>
         <w:pStyle w:val="Heading3"/>
@@ -5298,8 +6858,8 @@
         <w:t xml:space="preserve">Maps to OI-04.</w:t>
       </w:r>
     </w:p>
-    <w:bookmarkEnd w:id="43"/>
-    <w:bookmarkStart w:id="44" w:name="Xab206fe5b2e47cb27c7a3d7b41cdcb57343f541"/>
+    <w:bookmarkEnd w:id="110"/>
+    <w:bookmarkStart w:id="111" w:name="Xab206fe5b2e47cb27c7a3d7b41cdcb57343f541"/>
     <w:p>
       <w:pPr>
         <w:pStyle w:val="Heading3"/>
@@ -5366,8 +6926,8 @@
         <w:t xml:space="preserve">Maps to OI-01.</w:t>
       </w:r>
     </w:p>
-    <w:bookmarkEnd w:id="44"/>
-    <w:bookmarkStart w:id="45" w:name="Xc0ae84e509ec30bacfcc0a2e20bcc2db236d541"/>
+    <w:bookmarkEnd w:id="111"/>
+    <w:bookmarkStart w:id="112" w:name="Xc0ae84e509ec30bacfcc0a2e20bcc2db236d541"/>
     <w:p>
       <w:pPr>
         <w:pStyle w:val="Heading3"/>
@@ -5419,9 +6979,9 @@
         </w:pict>
       </w:r>
     </w:p>
-    <w:bookmarkEnd w:id="45"/>
-    <w:bookmarkEnd w:id="46"/>
-    <w:bookmarkStart w:id="47" w:name="impact-matrix"/>
+    <w:bookmarkEnd w:id="112"/>
+    <w:bookmarkEnd w:id="113"/>
+    <w:bookmarkStart w:id="114" w:name="impact-matrix"/>
     <w:p>
       <w:pPr>
         <w:pStyle w:val="Heading2"/>
@@ -5966,8 +7526,8 @@
         </w:pict>
       </w:r>
     </w:p>
-    <w:bookmarkEnd w:id="47"/>
-    <w:bookmarkStart w:id="48" w:name="related-documents"/>
+    <w:bookmarkEnd w:id="114"/>
+    <w:bookmarkStart w:id="115" w:name="related-documents"/>
     <w:p>
       <w:pPr>
         <w:pStyle w:val="Heading2"/>
@@ -6224,8 +7784,8 @@
         </w:pict>
       </w:r>
     </w:p>
-    <w:bookmarkEnd w:id="48"/>
-    <w:bookmarkStart w:id="49" w:name="validation-log-2026-04-06"/>
+    <w:bookmarkEnd w:id="115"/>
+    <w:bookmarkStart w:id="116" w:name="validation-log-2026-04-06"/>
     <w:p>
       <w:pPr>
         <w:pStyle w:val="Heading2"/>
@@ -7428,8 +8988,8 @@
         </w:tc>
       </w:tr>
     </w:tbl>
-    <w:bookmarkEnd w:id="49"/>
-    <w:bookmarkEnd w:id="50"/>
+    <w:bookmarkEnd w:id="116"/>
+    <w:bookmarkEnd w:id="117"/>
     <w:sectPr>
       <w:footnotePr>
         <w:numRestart w:val="eachSect"/>

</xml_diff>

<commit_message>
docs(uj): v0.9 review pass — 8 corrections + Tools config section + assumptions #4/#13 resolved
- Sub-lot split: "after machining" → "at Trim OUT" (line 54 + Assumption #3 decision + clarification)
- MaxLotSize → PartsPerBasket in item master description and LOT creation validation text
- Container config example: add ClosureMethod (ByCount for 5G0, ByWeight for RPY)
- Genealogy at Assembly scene: LOT name 2026-04-06-0001 → MESL1710935; Cavity B → Cavity A
- Add "Configuring Dies and Tooling" section to Arc 1 (die catalog, cavities, die ranks, ToolAssignment as runtime)
- Assumptions #4 and #13 (container closure) → Resolved, referencing FDS-06-014 ClosureMethod model

Co-Authored-By: Claude Sonnet 4.6 <noreply@anthropic.com>
</commit_message>
<xml_diff>
--- a/MPP_MES_USER_JOURNEYS.docx
+++ b/MPP_MES_USER_JOURNEYS.docx
@@ -2,7 +2,7 @@
 <file path=word/document.xml><?xml version="1.0" encoding="utf-8"?>
 <w:document xmlns:w="http://schemas.openxmlformats.org/wordprocessingml/2006/main" xmlns:m="http://schemas.openxmlformats.org/officeDocument/2006/math" xmlns:r="http://schemas.openxmlformats.org/officeDocument/2006/relationships" xmlns:o="urn:schemas-microsoft-com:office:office" xmlns:v="urn:schemas-microsoft-com:vml" xmlns:w10="urn:schemas-microsoft-com:office:word" xmlns:a="http://schemas.openxmlformats.org/drawingml/2006/main" xmlns:pic="http://schemas.openxmlformats.org/drawingml/2006/picture" xmlns:wp="http://schemas.openxmlformats.org/drawingml/2006/wordprocessingDrawing">
   <w:body>
-    <w:bookmarkStart w:id="50" w:name="mpp-mes-user-journeys"/>
+    <w:bookmarkStart w:id="51" w:name="mpp-mes-user-journeys"/>
     <w:p>
       <w:pPr>
         <w:pStyle w:val="Heading1"/>
@@ -2077,7 +2077,7 @@
       </w:r>
     </w:p>
     <w:bookmarkEnd w:id="10"/>
-    <w:bookmarkStart w:id="16" w:name="X8a62b6bbd3b7dbd28b80423735197bca531f61b"/>
+    <w:bookmarkStart w:id="17" w:name="X8a62b6bbd3b7dbd28b80423735197bca531f61b"/>
     <w:p>
       <w:pPr>
         <w:pStyle w:val="Heading2"/>
@@ -2391,12 +2391,76 @@
       </w:r>
     </w:p>
     <w:bookmarkEnd w:id="11"/>
-    <w:bookmarkStart w:id="12" w:name="defining-what-we-make"/>
+    <w:bookmarkStart w:id="12" w:name="configuring-dies-and-tooling"/>
     <w:p>
       <w:pPr>
         <w:pStyle w:val="Heading3"/>
       </w:pPr>
       <w:r>
+        <w:t xml:space="preserve">Configuring Dies and Tooling</w:t>
+      </w:r>
+    </w:p>
+    <w:p>
+      <w:pPr>
+        <w:pStyle w:val="FirstParagraph"/>
+      </w:pPr>
+      <w:r>
+        <w:t xml:space="preserve">Before the first shot runs, someone has to load the die catalog. MPP’s production depends on a small number of aluminum die cast dies — each die is a tool that runs in a specific press tonnage range, has between one and four cavities, and has a die rank that determines which other dies it can be blended with at the Sort Cage. The engineer opens the Tools screen and creates a record for each die: part number, type, and the custom attributes for that type (Tonnage, RefCycleTimeSec, ConfirmationMethod). Under each die they configure its cavities — Cavity A, Cavity B, etc. Cavities are the actual production units; the Die Cast scene on the floor will ask Carlos which cavity he’s logging each LOT against.</w:t>
+      </w:r>
+    </w:p>
+    <w:p>
+      <w:pPr>
+        <w:pStyle w:val="BodyText"/>
+      </w:pPr>
+      <w:r>
+        <w:t xml:space="preserve">Then they configure the Die Rank Compatibility matrix. Die ranks are categories (Rank 1, Rank 2, Rank 3, etc.) used to control which LOTs can be merged at the Sort Cage — only LOTs from compatible-rank dies can be combined without a quality escalation. The matrix is symmetric: if Rank 1 can merge with Rank 2, then Rank 2 can merge with Rank 1. The upper triangle is editable; the lower triangle is a read-only mirror. This config lives in</w:t>
+      </w:r>
+      <w:r>
+        <w:t xml:space="preserve"> </w:t>
+      </w:r>
+      <w:r>
+        <w:rPr>
+          <w:rStyle w:val="VerbatimChar"/>
+        </w:rPr>
+        <w:t xml:space="preserve">Tools.DieRankCompatibility</w:t>
+      </w:r>
+      <w:r>
+        <w:t xml:space="preserve"> </w:t>
+      </w:r>
+      <w:r>
+        <w:t xml:space="preserve">and is referenced when the Sort Cage operator attempts a merge.</w:t>
+      </w:r>
+    </w:p>
+    <w:p>
+      <w:pPr>
+        <w:pStyle w:val="BodyText"/>
+      </w:pPr>
+      <w:r>
+        <w:t xml:space="preserve">Die assignment to a press (which die is physically in which machine right now) is a runtime action, not a config-time action. The floor handles that via</w:t>
+      </w:r>
+      <w:r>
+        <w:t xml:space="preserve"> </w:t>
+      </w:r>
+      <w:r>
+        <w:rPr>
+          <w:rStyle w:val="VerbatimChar"/>
+        </w:rPr>
+        <w:t xml:space="preserve">Tools.ToolAssignment</w:t>
+      </w:r>
+      <w:r>
+        <w:t xml:space="preserve"> </w:t>
+      </w:r>
+      <w:r>
+        <w:t xml:space="preserve">— see the 6:20am Die Cast scene.</w:t>
+      </w:r>
+    </w:p>
+    <w:bookmarkEnd w:id="12"/>
+    <w:bookmarkStart w:id="13" w:name="defining-what-we-make"/>
+    <w:p>
+      <w:pPr>
+        <w:pStyle w:val="Heading3"/>
+      </w:pPr>
+      <w:r>
         <w:t xml:space="preserve">Defining What We Make</w:t>
       </w:r>
     </w:p>
@@ -2405,7 +2469,22 @@
         <w:pStyle w:val="FirstParagraph"/>
       </w:pPr>
       <w:r>
-        <w:t xml:space="preserve">Next, the item master. The engineer creates items — each one a part number that MPP either manufactures or receives from a vendor. They classify each item: Raw Material, Component, Sub-Assembly, Finished Good, Pass-Through. They set the Macola ERP cross-reference number for each part so the two systems can talk when that integration goes live. They set the default sub-lot quantity — how many pieces go into each sub-LOT when a parent LOT is split after machining. They set the max lot size for reasonability checks.</w:t>
+        <w:t xml:space="preserve">Next, the item master. The engineer creates items — each one a part number that MPP either manufactures or receives from a vendor. They classify each item: Raw Material, Component, Sub-Assembly, Finished Good, Pass-Through. They set the Macola ERP cross-reference number for each part so the two systems can talk when that integration goes live. They set the default sub-lot quantity — how many pieces go into each sub-LOT when a parent LOT is split at Trim OUT (FDS-05-009). They set</w:t>
+      </w:r>
+      <w:r>
+        <w:t xml:space="preserve"> </w:t>
+      </w:r>
+      <w:r>
+        <w:rPr>
+          <w:rStyle w:val="VerbatimChar"/>
+        </w:rPr>
+        <w:t xml:space="preserve">PartsPerBasket</w:t>
+      </w:r>
+      <w:r>
+        <w:t xml:space="preserve"> </w:t>
+      </w:r>
+      <w:r>
+        <w:t xml:space="preserve">— the maximum pieces per basket — for reasonability checks at LOT creation.</w:t>
       </w:r>
     </w:p>
     <w:p>
@@ -2413,11 +2492,38 @@
         <w:pStyle w:val="BodyText"/>
       </w:pPr>
       <w:r>
-        <w:t xml:space="preserve">For each finished good that ships to Honda, they create a container configuration. The 5G0 Front Cover, for example, ships in containers with 4 trays, 12 parts per tray, serialized, with dunnage code RD-5G0F. The RPY Cam Holder ships 6 trays, 24 per tray, not serialized. These configs drive the container lifecycle on the floor — the MES knows when a container is full.</w:t>
-      </w:r>
-    </w:p>
-    <w:bookmarkEnd w:id="12"/>
-    <w:bookmarkStart w:id="13" w:name="defining-how-we-make-it"/>
+        <w:t xml:space="preserve">For each finished good that ships to Honda, they create a container configuration. The 5G0 Front Cover, for example, ships in containers with 4 trays, 12 parts per tray, closure method</w:t>
+      </w:r>
+      <w:r>
+        <w:t xml:space="preserve"> </w:t>
+      </w:r>
+      <w:r>
+        <w:rPr>
+          <w:rStyle w:val="VerbatimChar"/>
+        </w:rPr>
+        <w:t xml:space="preserve">ByCount</w:t>
+      </w:r>
+      <w:r>
+        <w:t xml:space="preserve"> </w:t>
+      </w:r>
+      <w:r>
+        <w:t xml:space="preserve">(serial validation), serialized, dunnage code RD-5G0F. The RPY Cam Holder ships 6 trays, 24 per tray, closure method</w:t>
+      </w:r>
+      <w:r>
+        <w:t xml:space="preserve"> </w:t>
+      </w:r>
+      <w:r>
+        <w:rPr>
+          <w:rStyle w:val="VerbatimChar"/>
+        </w:rPr>
+        <w:t xml:space="preserve">ByWeight</w:t>
+      </w:r>
+      <w:r>
+        <w:t xml:space="preserve">, not serialized. These configs drive the container lifecycle on the floor — the MES knows when a container is full.</w:t>
+      </w:r>
+    </w:p>
+    <w:bookmarkEnd w:id="13"/>
+    <w:bookmarkStart w:id="14" w:name="defining-how-we-make-it"/>
     <w:p>
       <w:pPr>
         <w:pStyle w:val="Heading3"/>
@@ -2450,8 +2556,8 @@
         <w:t xml:space="preserve">For assembled products with BOMs, the engineer creates versioned bills of material. The 5G0 Front Cover Assembly consumes one 5G0 casting and two PNA mounting pins. Version 1 of the BOM is effective from January 2026. If engineering changes the design in March, they create version 2 — but every production record from January still points to version 1.</w:t>
       </w:r>
     </w:p>
-    <w:bookmarkEnd w:id="13"/>
-    <w:bookmarkStart w:id="14" w:name="defining-quality-standards"/>
+    <w:bookmarkEnd w:id="14"/>
+    <w:bookmarkStart w:id="15" w:name="defining-quality-standards"/>
     <w:p>
       <w:pPr>
         <w:pStyle w:val="Heading3"/>
@@ -2500,8 +2606,8 @@
         <w:t xml:space="preserve">flag for future OEE quality calculations.</w:t>
       </w:r>
     </w:p>
-    <w:bookmarkEnd w:id="14"/>
-    <w:bookmarkStart w:id="15" w:name="defining-downtime-vocabulary"/>
+    <w:bookmarkEnd w:id="15"/>
+    <w:bookmarkStart w:id="16" w:name="defining-downtime-vocabulary"/>
     <w:p>
       <w:pPr>
         <w:pStyle w:val="Heading3"/>
@@ -2563,9 +2669,9 @@
         </w:pict>
       </w:r>
     </w:p>
-    <w:bookmarkEnd w:id="15"/>
     <w:bookmarkEnd w:id="16"/>
-    <w:bookmarkStart w:id="26" w:name="X9d3dbf4d142c75b298042d81841f871b0d06ec6"/>
+    <w:bookmarkEnd w:id="17"/>
+    <w:bookmarkStart w:id="27" w:name="X9d3dbf4d142c75b298042d81841f871b0d06ec6"/>
     <w:p>
       <w:pPr>
         <w:pStyle w:val="Heading2"/>
@@ -2588,7 +2694,7 @@
         <w:t xml:space="preserve">It’s 6:15am on a Tuesday. First shift has started. The aluminum is already molten.</w:t>
       </w:r>
     </w:p>
-    <w:bookmarkStart w:id="17" w:name="am-die-cast-a-lot-is-born"/>
+    <w:bookmarkStart w:id="18" w:name="am-die-cast-a-lot-is-born"/>
     <w:p>
       <w:pPr>
         <w:pStyle w:val="Heading3"/>
@@ -2795,16 +2901,13 @@
         <w:t xml:space="preserve"> </w:t>
       </w:r>
       <w:r>
-        <w:t xml:space="preserve">for 5G0 (the repurposed</w:t>
-      </w:r>
-      <w:r>
-        <w:t xml:space="preserve"> </w:t>
-      </w:r>
-      <w:r>
-        <w:rPr>
-          <w:rStyle w:val="VerbatimChar"/>
-        </w:rPr>
-        <w:t xml:space="preserve">Item.MaxLotSize</w:t>
+        <w:t xml:space="preserve">for 5G0 (</w:t>
+      </w:r>
+      <w:r>
+        <w:rPr>
+          <w:rStyle w:val="VerbatimChar"/>
+        </w:rPr>
+        <w:t xml:space="preserve">Item.PartsPerBasket</w:t>
       </w:r>
       <w:r>
         <w:t xml:space="preserve">)? Yes. Is 5G0 eligible on Machine #7? Yes. Is the tool-cell assignment current? Yes. Is Cavity A active? Yes.</w:t>
@@ -3071,8 +3174,8 @@
         <w:t xml:space="preserve">would have been created automatically with source=PLC, and Carlos would just need to assign the reason code. Note: the legacy paper forms track downtime as cumulative minutes subtracted from a 425-minute base runtime (with adjustments for lunch, breaks, and overtime). The new MES captures discrete start/end events, which is a more granular model — the cumulative shift total is derived from the events rather than entered directly.</w:t>
       </w:r>
     </w:p>
-    <w:bookmarkEnd w:id="17"/>
-    <w:bookmarkStart w:id="18" w:name="am-trim-shop-lot-moves-through-the-plant"/>
+    <w:bookmarkEnd w:id="18"/>
+    <w:bookmarkStart w:id="19" w:name="am-trim-shop-lot-moves-through-the-plant"/>
     <w:p>
       <w:pPr>
         <w:pStyle w:val="Heading3"/>
@@ -3498,8 +3601,8 @@
         <w:t xml:space="preserve">(FDS-05-024).</w:t>
       </w:r>
     </w:p>
-    <w:bookmarkEnd w:id="18"/>
-    <w:bookmarkStart w:id="19" w:name="X33b4f3c9a0224f726c67dbc69ec4a6e4d562a08"/>
+    <w:bookmarkEnd w:id="19"/>
+    <w:bookmarkStart w:id="20" w:name="X33b4f3c9a0224f726c67dbc69ec4a6e4d562a08"/>
     <w:p>
       <w:pPr>
         <w:pStyle w:val="Heading3"/>
@@ -3905,8 +4008,8 @@
         <w:t xml:space="preserve">, and the LOT stays at the Machining Cell awaiting an operator-driven movement.)</w:t>
       </w:r>
     </w:p>
-    <w:bookmarkEnd w:id="19"/>
-    <w:bookmarkStart w:id="20" w:name="Xe45f8832e7997e311c5f47e21b87e7afa8aeaa5"/>
+    <w:bookmarkEnd w:id="20"/>
+    <w:bookmarkStart w:id="21" w:name="Xe45f8832e7997e311c5f47e21b87e7afa8aeaa5"/>
     <w:p>
       <w:pPr>
         <w:pStyle w:val="Heading3"/>
@@ -4091,13 +4194,13 @@
         <w:rPr>
           <w:rStyle w:val="VerbatimChar"/>
         </w:rPr>
-        <w:t xml:space="preserve">2026-04-06-0001</w:t>
-      </w:r>
-      <w:r>
-        <w:t xml:space="preserve"> </w:t>
-      </w:r>
-      <w:r>
-        <w:t xml:space="preserve">→ Die Cast Machine #7, Die #42, Cavity B, Carlos, 6:20am Tuesday. Honda can ask about any serial number and get the full tree.</w:t>
+        <w:t xml:space="preserve">MESL1710935</w:t>
+      </w:r>
+      <w:r>
+        <w:t xml:space="preserve"> </w:t>
+      </w:r>
+      <w:r>
+        <w:t xml:space="preserve">→ Die Cast Machine #7, Die DC-042, Cavity A, Carlos, 6:20am Tuesday. Honda can ask about any serial number and get the full tree.</w:t>
       </w:r>
     </w:p>
     <w:p>
@@ -4459,8 +4562,8 @@
         <w:t xml:space="preserve">carry the configured capacities per Item.</w:t>
       </w:r>
     </w:p>
-    <w:bookmarkEnd w:id="20"/>
-    <w:bookmarkStart w:id="21" w:name="pm-a-quality-hold"/>
+    <w:bookmarkEnd w:id="21"/>
+    <w:bookmarkStart w:id="22" w:name="pm-a-quality-hold"/>
     <w:p>
       <w:pPr>
         <w:pStyle w:val="Heading3"/>
@@ -4589,8 +4692,8 @@
         <w:t xml:space="preserve">with the shipper ID. AIM acknowledges. The container status goes to HOLD. It’s not going on the truck.</w:t>
       </w:r>
     </w:p>
-    <w:bookmarkEnd w:id="21"/>
-    <w:bookmarkStart w:id="22" w:name="pm-the-sort-cage"/>
+    <w:bookmarkEnd w:id="22"/>
+    <w:bookmarkStart w:id="23" w:name="pm-the-sort-cage"/>
     <w:p>
       <w:pPr>
         <w:pStyle w:val="Heading3"/>
@@ -4894,8 +4997,8 @@
         <w:t xml:space="preserve">populated. LOT status goes back to GOOD. Production can resume.</w:t>
       </w:r>
     </w:p>
-    <w:bookmarkEnd w:id="22"/>
-    <w:bookmarkStart w:id="23" w:name="Xef0509370e552f9e4610b8262e70be2381c36f2"/>
+    <w:bookmarkEnd w:id="23"/>
+    <w:bookmarkStart w:id="24" w:name="Xef0509370e552f9e4610b8262e70be2381c36f2"/>
     <w:p>
       <w:pPr>
         <w:pStyle w:val="Heading3"/>
@@ -4966,8 +5069,8 @@
         <w:t xml:space="preserve">note on Scope Matrix row 20 refers to the dedicated operational workflows — Perspective screens for receiving inspection, vendor lot verification, and staging procedures specific to pass-through parts — not to the underlying tracking capability.</w:t>
       </w:r>
     </w:p>
-    <w:bookmarkEnd w:id="23"/>
-    <w:bookmarkStart w:id="24" w:name="pm-shipping-the-truck-leaves"/>
+    <w:bookmarkEnd w:id="24"/>
+    <w:bookmarkStart w:id="25" w:name="pm-shipping-the-truck-leaves"/>
     <w:p>
       <w:pPr>
         <w:pStyle w:val="Heading3"/>
@@ -4984,8 +5087,8 @@
         <w:t xml:space="preserve">The released containers — the good ones from this morning’s production, plus the re-sorted containers from the Sort Cage — are loaded onto the Honda truck. The shipping operator scans each container’s shipping label. The MES confirms: status Complete (not HOLD, not VOID), AIM shipper ID valid. Each container’s location moves to Shipping Dock → Shipped. The truck rolls out. Honda can trace every part on it back to the melt.</w:t>
       </w:r>
     </w:p>
-    <w:bookmarkEnd w:id="24"/>
-    <w:bookmarkStart w:id="25" w:name="end-of-shift"/>
+    <w:bookmarkEnd w:id="25"/>
+    <w:bookmarkStart w:id="26" w:name="end-of-shift"/>
     <w:p>
       <w:pPr>
         <w:pStyle w:val="Heading3"/>
@@ -5214,9 +5317,9 @@
         </w:pict>
       </w:r>
     </w:p>
-    <w:bookmarkEnd w:id="25"/>
     <w:bookmarkEnd w:id="26"/>
-    <w:bookmarkStart w:id="46" w:name="assumptions-open-decisions"/>
+    <w:bookmarkEnd w:id="27"/>
+    <w:bookmarkStart w:id="47" w:name="assumptions-open-decisions"/>
     <w:p>
       <w:pPr>
         <w:pStyle w:val="Heading2"/>
@@ -5251,7 +5354,7 @@
         <w:t xml:space="preserve">✅ Resolved | 🔶 Pending Customer Validation / Pending Internal Review | ⬜ Open</w:t>
       </w:r>
     </w:p>
-    <w:bookmarkStart w:id="27" w:name="X5b90eb551c604f4716bb765ca587f0c2360571b"/>
+    <w:bookmarkStart w:id="28" w:name="X5b90eb551c604f4716bb765ca587f0c2360571b"/>
     <w:p>
       <w:pPr>
         <w:pStyle w:val="Heading3"/>
@@ -5343,8 +5446,8 @@
         <w:t xml:space="preserve">See FDS §4.</w:t>
       </w:r>
     </w:p>
-    <w:bookmarkEnd w:id="27"/>
-    <w:bookmarkStart w:id="28" w:name="X8a97f2b45aacffcfde53291572bcd0cf661d011"/>
+    <w:bookmarkEnd w:id="28"/>
+    <w:bookmarkStart w:id="29" w:name="X8a97f2b45aacffcfde53291572bcd0cf661d011"/>
     <w:p>
       <w:pPr>
         <w:pStyle w:val="Heading3"/>
@@ -5435,8 +5538,8 @@
         <w:t xml:space="preserve">time (operator selects/confirms which cavity). See FDS-05-036.</w:t>
       </w:r>
     </w:p>
-    <w:bookmarkEnd w:id="28"/>
-    <w:bookmarkStart w:id="29" w:name="X02d9ed5b59999fee2ed9f775d0d739f5d3a01b0"/>
+    <w:bookmarkEnd w:id="29"/>
+    <w:bookmarkStart w:id="30" w:name="X02d9ed5b59999fee2ed9f775d0d739f5d3a01b0"/>
     <w:p>
       <w:pPr>
         <w:pStyle w:val="Heading3"/>
@@ -5478,59 +5581,68 @@
           <w:b/>
           <w:bCs/>
         </w:rPr>
-        <w:t xml:space="preserve">Decision (2026-04-09):</w:t>
-      </w:r>
-      <w:r>
-        <w:t xml:space="preserve"> </w:t>
-      </w:r>
-      <w:r>
-        <w:t xml:space="preserve">On arrival at machining, the system auto-splits the LOT evenly into 2 sublots with a confirmation dialog. Sublots are treated identically to lot splits in the data model (</w:t>
-      </w:r>
-      <w:r>
-        <w:rPr>
-          <w:rStyle w:val="VerbatimChar"/>
-        </w:rPr>
-        <w:t xml:space="preserve">LotGenealogy</w:t>
-      </w:r>
-      <w:r>
-        <w:t xml:space="preserve"> </w:t>
-      </w:r>
-      <w:r>
-        <w:t xml:space="preserve">with relationship_type = Split). Operator can adjust quantities or cancel the auto-split. Needs review with Ben.</w:t>
-      </w:r>
-    </w:p>
-    <w:p>
-      <w:pPr>
-        <w:pStyle w:val="BodyText"/>
-      </w:pPr>
+        <w:t xml:space="preserve">Decision (2026-04-09, corrected 2026-04-29 per FDS v0.11m):</w:t>
+      </w:r>
+      <w:r>
+        <w:t xml:space="preserve"> </w:t>
+      </w:r>
+      <w:r>
+        <w:t xml:space="preserve">At</w:t>
+      </w:r>
+      <w:r>
+        <w:t xml:space="preserve"> </w:t>
+      </w:r>
       <w:r>
         <w:rPr>
           <w:b/>
           <w:bCs/>
         </w:rPr>
-        <w:t xml:space="preserve">Clarification (2026-04-23, v0.8):</w:t>
-      </w:r>
-      <w:r>
-        <w:t xml:space="preserve"> </w:t>
-      </w:r>
-      <w:r>
-        <w:t xml:space="preserve">Sub-LOT split is the</w:t>
-      </w:r>
-      <w:r>
-        <w:t xml:space="preserve"> </w:t>
-      </w:r>
+        <w:t xml:space="preserve">Trim OUT</w:t>
+      </w:r>
+      <w:r>
+        <w:t xml:space="preserve">, the Trim operator triggers the sub-LOT split. The system presents a confirmation dialog — default N=2 sublots, evenly split — and the operator selects a destination Machining Cell for each child by scan or dropdown. Sublots are treated as LOT splits in the data model (</w:t>
+      </w:r>
+      <w:r>
+        <w:rPr>
+          <w:rStyle w:val="VerbatimChar"/>
+        </w:rPr>
+        <w:t xml:space="preserve">LotGenealogy</w:t>
+      </w:r>
+      <w:r>
+        <w:t xml:space="preserve"> </w:t>
+      </w:r>
+      <w:r>
+        <w:t xml:space="preserve">with</w:t>
+      </w:r>
+      <w:r>
+        <w:t xml:space="preserve"> </w:t>
+      </w:r>
+      <w:r>
+        <w:rPr>
+          <w:rStyle w:val="VerbatimChar"/>
+        </w:rPr>
+        <w:t xml:space="preserve">RelationshipType = Split</w:t>
+      </w:r>
+      <w:r>
+        <w:t xml:space="preserve">). Operator can adjust quantities or sublot count before confirming; total must equal parent piece count. Needs review with Ben on per-Item override quantities.</w:t>
+      </w:r>
+    </w:p>
+    <w:p>
+      <w:pPr>
+        <w:pStyle w:val="BodyText"/>
+      </w:pPr>
       <w:r>
         <w:rPr>
           <w:b/>
           <w:bCs/>
         </w:rPr>
-        <w:t xml:space="preserve">Machining-only</w:t>
-      </w:r>
-      <w:r>
-        <w:t xml:space="preserve"> </w:t>
-      </w:r>
-      <w:r>
-        <w:t xml:space="preserve">sublot pattern (parent FK + split genealogy).</w:t>
+        <w:t xml:space="preserve">Clarification (2026-04-23, v0.8):</w:t>
+      </w:r>
+      <w:r>
+        <w:t xml:space="preserve"> </w:t>
+      </w:r>
+      <w:r>
+        <w:t xml:space="preserve">Sub-LOT split is the</w:t>
       </w:r>
       <w:r>
         <w:t xml:space="preserve"> </w:t>
@@ -5540,74 +5652,241 @@
           <w:b/>
           <w:bCs/>
         </w:rPr>
-        <w:t xml:space="preserve">Cavity-parallel LOTs at Die Cast are NOT sublots</w:t>
-      </w:r>
-      <w:r>
-        <w:t xml:space="preserve"> </w:t>
-      </w:r>
-      <w:r>
-        <w:t xml:space="preserve">— a multi-cavity die produces N first-class peer LOTs, each with its own</w:t>
-      </w:r>
-      <w:r>
-        <w:t xml:space="preserve"> </w:t>
-      </w:r>
-      <w:r>
-        <w:rPr>
-          <w:rStyle w:val="VerbatimChar"/>
-        </w:rPr>
-        <w:t xml:space="preserve">ToolCavityId</w:t>
-      </w:r>
-      <w:r>
-        <w:t xml:space="preserve"> </w:t>
-      </w:r>
-      <w:r>
-        <w:t xml:space="preserve">set at creation. The 2026-04-20 meeting notes conflated the two concepts; OI-09 closes this by locking the cavity-parallel-as-peer model in Data Model v1.9. See FDS-05-022 (sublots, Machining) and FDS-05-034 (cavity-parallel LOTs, Die Cast).</w:t>
-      </w:r>
-    </w:p>
-    <w:bookmarkEnd w:id="29"/>
-    <w:bookmarkStart w:id="30" w:name="X8d9059566608ee12c9183bcb0fe5f5e27b15363"/>
-    <w:p>
-      <w:pPr>
-        <w:pStyle w:val="Heading3"/>
-      </w:pPr>
-      <w:r>
-        <w:t xml:space="preserve">4. Container Lifecycle on Non-Serialized Lines — ⬜ Open</w:t>
-      </w:r>
-    </w:p>
-    <w:p>
-      <w:pPr>
-        <w:pStyle w:val="FirstParagraph"/>
-      </w:pPr>
+        <w:t xml:space="preserve">Trim OUT</w:t>
+      </w:r>
+      <w:r>
+        <w:t xml:space="preserve"> </w:t>
+      </w:r>
+      <w:r>
+        <w:t xml:space="preserve">sublot pattern (parent FK + split genealogy).</w:t>
+      </w:r>
+      <w:r>
+        <w:t xml:space="preserve"> </w:t>
+      </w:r>
       <w:r>
         <w:rPr>
           <w:b/>
           <w:bCs/>
         </w:rPr>
-        <w:t xml:space="preserve">Assumption made:</w:t>
-      </w:r>
-      <w:r>
-        <w:t xml:space="preserve"> </w:t>
-      </w:r>
-      <w:r>
-        <w:t xml:space="preserve">The narrative focused heavily on the serialized assembly line (5G0) where the PLC handshake fills containers part-by-part. For non-serialized lines, the story is much less clear.</w:t>
-      </w:r>
-    </w:p>
-    <w:p>
-      <w:pPr>
-        <w:pStyle w:val="BodyText"/>
+        <w:t xml:space="preserve">Cavity-parallel LOTs at Die Cast are NOT sublots</w:t>
+      </w:r>
+      <w:r>
+        <w:t xml:space="preserve"> </w:t>
+      </w:r>
+      <w:r>
+        <w:t xml:space="preserve">— a multi-cavity die produces N first-class peer LOTs, each with its own</w:t>
+      </w:r>
+      <w:r>
+        <w:t xml:space="preserve"> </w:t>
+      </w:r>
+      <w:r>
+        <w:rPr>
+          <w:rStyle w:val="VerbatimChar"/>
+        </w:rPr>
+        <w:t xml:space="preserve">ToolCavityId</w:t>
+      </w:r>
+      <w:r>
+        <w:t xml:space="preserve"> </w:t>
+      </w:r>
+      <w:r>
+        <w:t xml:space="preserve">set at creation. The 2026-04-20 meeting notes conflated the two concepts; OI-09 closes this by locking the cavity-parallel-as-peer model in Data Model v1.9. See FDS-05-022 (sublots, Machining) and FDS-05-034 (cavity-parallel LOTs, Die Cast).</w:t>
+      </w:r>
+    </w:p>
+    <w:bookmarkEnd w:id="30"/>
+    <w:bookmarkStart w:id="31" w:name="Xc36c0c0c40ec76e485664de89aee6242e09b3d6"/>
+    <w:p>
+      <w:pPr>
+        <w:pStyle w:val="Heading3"/>
+      </w:pPr>
+      <w:r>
+        <w:t xml:space="preserve">4. Container Lifecycle on Non-Serialized Lines — ✅ Resolved</w:t>
+      </w:r>
+    </w:p>
+    <w:p>
+      <w:pPr>
+        <w:pStyle w:val="FirstParagraph"/>
       </w:pPr>
       <w:r>
         <w:rPr>
           <w:b/>
           <w:bCs/>
         </w:rPr>
-        <w:t xml:space="preserve">Decision (2026-04-09):</w:t>
-      </w:r>
-      <w:r>
-        <w:t xml:space="preserve"> </w:t>
-      </w:r>
-      <w:r>
-        <w:t xml:space="preserve">Assumption is containers are auto-created on LOT arrival. AIM shipper ID requested at the last route step for the part, prior to LOT closure. Needs discussion with Ben.</w:t>
+        <w:t xml:space="preserve">Assumption made:</w:t>
+      </w:r>
+      <w:r>
+        <w:t xml:space="preserve"> </w:t>
+      </w:r>
+      <w:r>
+        <w:t xml:space="preserve">The narrative focused heavily on the serialized assembly line (5G0) where the PLC handshake fills containers part-by-part. For non-serialized lines, the story is much less clear.</w:t>
+      </w:r>
+    </w:p>
+    <w:p>
+      <w:pPr>
+        <w:pStyle w:val="BodyText"/>
+      </w:pPr>
+      <w:r>
+        <w:rPr>
+          <w:b/>
+          <w:bCs/>
+        </w:rPr>
+        <w:t xml:space="preserve">Decision (2026-04-29, FDS-06-014):</w:t>
+      </w:r>
+      <w:r>
+        <w:t xml:space="preserve"> </w:t>
+      </w:r>
+      <w:r>
+        <w:t xml:space="preserve">Non-serialized lines use the same</w:t>
+      </w:r>
+      <w:r>
+        <w:t xml:space="preserve"> </w:t>
+      </w:r>
+      <w:r>
+        <w:rPr>
+          <w:b/>
+          <w:bCs/>
+        </w:rPr>
+        <w:t xml:space="preserve">tray-level</w:t>
+      </w:r>
+      <w:r>
+        <w:t xml:space="preserve"> </w:t>
+      </w:r>
+      <w:r>
+        <w:t xml:space="preserve">closure model as serialized lines, but with a different</w:t>
+      </w:r>
+      <w:r>
+        <w:t xml:space="preserve"> </w:t>
+      </w:r>
+      <w:r>
+        <w:rPr>
+          <w:rStyle w:val="VerbatimChar"/>
+        </w:rPr>
+        <w:t xml:space="preserve">ClosureMethod</w:t>
+      </w:r>
+      <w:r>
+        <w:t xml:space="preserve"> </w:t>
+      </w:r>
+      <w:r>
+        <w:t xml:space="preserve">configured per Item on</w:t>
+      </w:r>
+      <w:r>
+        <w:t xml:space="preserve"> </w:t>
+      </w:r>
+      <w:r>
+        <w:rPr>
+          <w:rStyle w:val="VerbatimChar"/>
+        </w:rPr>
+        <w:t xml:space="preserve">Parts.ContainerConfig</w:t>
+      </w:r>
+      <w:r>
+        <w:t xml:space="preserve">. Three peer methods:</w:t>
+      </w:r>
+      <w:r>
+        <w:t xml:space="preserve"> </w:t>
+      </w:r>
+      <w:r>
+        <w:rPr>
+          <w:rStyle w:val="VerbatimChar"/>
+        </w:rPr>
+        <w:t xml:space="preserve">ByCount</w:t>
+      </w:r>
+      <w:r>
+        <w:t xml:space="preserve"> </w:t>
+      </w:r>
+      <w:r>
+        <w:t xml:space="preserve">(operator confirms tray quantity at a terminal),</w:t>
+      </w:r>
+      <w:r>
+        <w:t xml:space="preserve"> </w:t>
+      </w:r>
+      <w:r>
+        <w:rPr>
+          <w:rStyle w:val="VerbatimChar"/>
+        </w:rPr>
+        <w:t xml:space="preserve">ByWeight</w:t>
+      </w:r>
+      <w:r>
+        <w:t xml:space="preserve"> </w:t>
+      </w:r>
+      <w:r>
+        <w:t xml:space="preserve">(OmniServer scale asserts</w:t>
+      </w:r>
+      <w:r>
+        <w:t xml:space="preserve"> </w:t>
+      </w:r>
+      <w:r>
+        <w:rPr>
+          <w:rStyle w:val="VerbatimChar"/>
+        </w:rPr>
+        <w:t xml:space="preserve">TargetWeightMetFlag</w:t>
+      </w:r>
+      <w:r>
+        <w:t xml:space="preserve">),</w:t>
+      </w:r>
+      <w:r>
+        <w:t xml:space="preserve"> </w:t>
+      </w:r>
+      <w:r>
+        <w:rPr>
+          <w:rStyle w:val="VerbatimChar"/>
+        </w:rPr>
+        <w:t xml:space="preserve">ByVision</w:t>
+      </w:r>
+      <w:r>
+        <w:t xml:space="preserve"> </w:t>
+      </w:r>
+      <w:r>
+        <w:t xml:space="preserve">(camera validates each part pass/fail, PLC asserts</w:t>
+      </w:r>
+      <w:r>
+        <w:t xml:space="preserve"> </w:t>
+      </w:r>
+      <w:r>
+        <w:rPr>
+          <w:rStyle w:val="VerbatimChar"/>
+        </w:rPr>
+        <w:t xml:space="preserve">TrayFullFlag</w:t>
+      </w:r>
+      <w:r>
+        <w:t xml:space="preserve">). Container fill is MES-side accumulation of closed trays —</w:t>
+      </w:r>
+      <w:r>
+        <w:t xml:space="preserve"> </w:t>
+      </w:r>
+      <w:r>
+        <w:rPr>
+          <w:rStyle w:val="VerbatimChar"/>
+        </w:rPr>
+        <w:t xml:space="preserve">TraysPerContainer × PartsPerTray</w:t>
+      </w:r>
+      <w:r>
+        <w:t xml:space="preserve"> </w:t>
+      </w:r>
+      <w:r>
+        <w:t xml:space="preserve">per</w:t>
+      </w:r>
+      <w:r>
+        <w:t xml:space="preserve"> </w:t>
+      </w:r>
+      <w:r>
+        <w:rPr>
+          <w:rStyle w:val="VerbatimChar"/>
+        </w:rPr>
+        <w:t xml:space="preserve">ContainerConfig</w:t>
+      </w:r>
+      <w:r>
+        <w:t xml:space="preserve">. AIM shipper ID is claimed atomically at container close from the</w:t>
+      </w:r>
+      <w:r>
+        <w:t xml:space="preserve"> </w:t>
+      </w:r>
+      <w:r>
+        <w:rPr>
+          <w:rStyle w:val="VerbatimChar"/>
+        </w:rPr>
+        <w:t xml:space="preserve">AimShipperIdPool</w:t>
+      </w:r>
+      <w:r>
+        <w:t xml:space="preserve">.</w:t>
       </w:r>
       <w:r>
         <w:t xml:space="preserve"> </w:t>
@@ -5617,11 +5896,11 @@
           <w:i/>
           <w:iCs/>
         </w:rPr>
-        <w:t xml:space="preserve">Maps to OI-02.</w:t>
-      </w:r>
-    </w:p>
-    <w:bookmarkEnd w:id="30"/>
-    <w:bookmarkStart w:id="31" w:name="sort-cage-serial-number-migration-open"/>
+        <w:t xml:space="preserve">OI-02 closed.</w:t>
+      </w:r>
+    </w:p>
+    <w:bookmarkEnd w:id="31"/>
+    <w:bookmarkStart w:id="32" w:name="sort-cage-serial-number-migration-open"/>
     <w:p>
       <w:pPr>
         <w:pStyle w:val="Heading3"/>
@@ -5696,8 +5975,8 @@
         <w:t xml:space="preserve">table is needed.</w:t>
       </w:r>
     </w:p>
-    <w:bookmarkEnd w:id="31"/>
-    <w:bookmarkStart w:id="32" w:name="off-site-receiving-resolved"/>
+    <w:bookmarkEnd w:id="32"/>
+    <w:bookmarkStart w:id="33" w:name="off-site-receiving-resolved"/>
     <w:p>
       <w:pPr>
         <w:pStyle w:val="Heading3"/>
@@ -5742,8 +6021,8 @@
         <w:t xml:space="preserve">Online capability confirmed. No concerns about network reliability or offline requirements. Standard Ignition Perspective via VPN/published gateway.</w:t>
       </w:r>
     </w:p>
-    <w:bookmarkEnd w:id="32"/>
-    <w:bookmarkStart w:id="33" w:name="work-order-visibility-and-lifecycle-open"/>
+    <w:bookmarkEnd w:id="33"/>
+    <w:bookmarkStart w:id="34" w:name="work-order-visibility-and-lifecycle-open"/>
     <w:p>
       <w:pPr>
         <w:pStyle w:val="Heading3"/>
@@ -5810,8 +6089,8 @@
         <w:t xml:space="preserve">Maps to OI-07.</w:t>
       </w:r>
     </w:p>
-    <w:bookmarkEnd w:id="33"/>
-    <w:bookmarkStart w:id="34" w:name="lot-merge-business-rules-open"/>
+    <w:bookmarkEnd w:id="34"/>
+    <w:bookmarkStart w:id="35" w:name="lot-merge-business-rules-open"/>
     <w:p>
       <w:pPr>
         <w:pStyle w:val="Heading3"/>
@@ -5977,8 +6256,8 @@
         <w:t xml:space="preserve">walk of the pre-merge source LOTs (each retains its own Tool/Cavity FKs immutably). See FDS-05-030.</w:t>
       </w:r>
     </w:p>
-    <w:bookmarkEnd w:id="34"/>
-    <w:bookmarkStart w:id="35" w:name="Xaf546f60fbb4131369bf8f225358aae274b9155"/>
+    <w:bookmarkEnd w:id="35"/>
+    <w:bookmarkStart w:id="36" w:name="Xaf546f60fbb4131369bf8f225358aae274b9155"/>
     <w:p>
       <w:pPr>
         <w:pStyle w:val="Heading3"/>
@@ -6050,8 +6329,8 @@
         <w:t xml:space="preserve">BOM-based check. The scanned source LOT’s part number must match a component in the active BOM version. Substitute parts are rejected. Needs MPP confirmation.</w:t>
       </w:r>
     </w:p>
-    <w:bookmarkEnd w:id="35"/>
-    <w:bookmarkStart w:id="36" w:name="shift-boundary-handling-open"/>
+    <w:bookmarkEnd w:id="36"/>
+    <w:bookmarkStart w:id="37" w:name="shift-boundary-handling-open"/>
     <w:p>
       <w:pPr>
         <w:pStyle w:val="Heading3"/>
@@ -6106,8 +6385,8 @@
         <w:t xml:space="preserve">Maps to OI-03.</w:t>
       </w:r>
     </w:p>
-    <w:bookmarkEnd w:id="36"/>
-    <w:bookmarkStart w:id="37" w:name="paper-to-screen-transition-open"/>
+    <w:bookmarkEnd w:id="37"/>
+    <w:bookmarkStart w:id="38" w:name="paper-to-screen-transition-open"/>
     <w:p>
       <w:pPr>
         <w:pStyle w:val="Heading3"/>
@@ -6152,8 +6431,8 @@
         <w:t xml:space="preserve">Flagged for discussion with Ben. Whether Perspective screens replace paper at point-of-action or some stations retain paper-first workflow is a process change that requires MPP commitment.</w:t>
       </w:r>
     </w:p>
-    <w:bookmarkEnd w:id="37"/>
-    <w:bookmarkStart w:id="38" w:name="terminal-to-machine-mapping-resolved"/>
+    <w:bookmarkEnd w:id="38"/>
+    <w:bookmarkStart w:id="39" w:name="terminal-to-machine-mapping-resolved"/>
     <w:p>
       <w:pPr>
         <w:pStyle w:val="Heading3"/>
@@ -6288,14 +6567,14 @@
         <w:t xml:space="preserve">entries on the Terminal Location row.</w:t>
       </w:r>
     </w:p>
-    <w:bookmarkEnd w:id="38"/>
-    <w:bookmarkStart w:id="39" w:name="X8e24df2bda92e5ad3fb585d738c7c6e20f422e8"/>
+    <w:bookmarkEnd w:id="39"/>
+    <w:bookmarkStart w:id="40" w:name="Xc0a5eb28306015653f1346584140a8b0bcc5f4a"/>
     <w:p>
       <w:pPr>
         <w:pStyle w:val="Heading3"/>
       </w:pPr>
       <w:r>
-        <w:t xml:space="preserve">13. Weight vs. Count-Based Container Closure — ⬜ Open</w:t>
+        <w:t xml:space="preserve">13. Weight vs. Count-Based Container Closure — ✅ Resolved</w:t>
       </w:r>
     </w:p>
     <w:p>
@@ -6352,13 +6631,109 @@
           <w:b/>
           <w:bCs/>
         </w:rPr>
-        <w:t xml:space="preserve">Decision (2026-04-09):</w:t>
-      </w:r>
-      <w:r>
-        <w:t xml:space="preserve"> </w:t>
-      </w:r>
-      <w:r>
-        <w:t xml:space="preserve">Flagged for discussion with Ben. Non-serialized lines should receive scale feedback (per OI-02), but the full dual-closure logic (count vs. weight, per-product config) needs design review.</w:t>
+        <w:t xml:space="preserve">Decision (2026-04-29, FDS-06-014):</w:t>
+      </w:r>
+      <w:r>
+        <w:t xml:space="preserve"> </w:t>
+      </w:r>
+      <w:r>
+        <w:t xml:space="preserve">Resolved alongside #4. Three peer</w:t>
+      </w:r>
+      <w:r>
+        <w:t xml:space="preserve"> </w:t>
+      </w:r>
+      <w:r>
+        <w:rPr>
+          <w:rStyle w:val="VerbatimChar"/>
+        </w:rPr>
+        <w:t xml:space="preserve">ClosureMethod</w:t>
+      </w:r>
+      <w:r>
+        <w:t xml:space="preserve"> </w:t>
+      </w:r>
+      <w:r>
+        <w:t xml:space="preserve">values are configured per Item on</w:t>
+      </w:r>
+      <w:r>
+        <w:t xml:space="preserve"> </w:t>
+      </w:r>
+      <w:r>
+        <w:rPr>
+          <w:rStyle w:val="VerbatimChar"/>
+        </w:rPr>
+        <w:t xml:space="preserve">Parts.ContainerConfig</w:t>
+      </w:r>
+      <w:r>
+        <w:t xml:space="preserve"> </w:t>
+      </w:r>
+      <w:r>
+        <w:t xml:space="preserve">—</w:t>
+      </w:r>
+      <w:r>
+        <w:t xml:space="preserve"> </w:t>
+      </w:r>
+      <w:r>
+        <w:rPr>
+          <w:rStyle w:val="VerbatimChar"/>
+        </w:rPr>
+        <w:t xml:space="preserve">ByCount</w:t>
+      </w:r>
+      <w:r>
+        <w:t xml:space="preserve">,</w:t>
+      </w:r>
+      <w:r>
+        <w:t xml:space="preserve"> </w:t>
+      </w:r>
+      <w:r>
+        <w:rPr>
+          <w:rStyle w:val="VerbatimChar"/>
+        </w:rPr>
+        <w:t xml:space="preserve">ByWeight</w:t>
+      </w:r>
+      <w:r>
+        <w:t xml:space="preserve">,</w:t>
+      </w:r>
+      <w:r>
+        <w:t xml:space="preserve"> </w:t>
+      </w:r>
+      <w:r>
+        <w:rPr>
+          <w:rStyle w:val="VerbatimChar"/>
+        </w:rPr>
+        <w:t xml:space="preserve">ByVision</w:t>
+      </w:r>
+      <w:r>
+        <w:t xml:space="preserve">. Each is a first-class tray-level closure method. The validation gate is always the tray; the container-full signal is always the MES-side accumulation of closed trays. The OPC</w:t>
+      </w:r>
+      <w:r>
+        <w:t xml:space="preserve"> </w:t>
+      </w:r>
+      <w:r>
+        <w:rPr>
+          <w:rStyle w:val="VerbatimChar"/>
+        </w:rPr>
+        <w:t xml:space="preserve">TargetWeightMetFlag</w:t>
+      </w:r>
+      <w:r>
+        <w:t xml:space="preserve"> </w:t>
+      </w:r>
+      <w:r>
+        <w:t xml:space="preserve">is the PLC side of the</w:t>
+      </w:r>
+      <w:r>
+        <w:t xml:space="preserve"> </w:t>
+      </w:r>
+      <w:r>
+        <w:rPr>
+          <w:rStyle w:val="VerbatimChar"/>
+        </w:rPr>
+        <w:t xml:space="preserve">ByWeight</w:t>
+      </w:r>
+      <w:r>
+        <w:t xml:space="preserve"> </w:t>
+      </w:r>
+      <w:r>
+        <w:t xml:space="preserve">path.</w:t>
       </w:r>
       <w:r>
         <w:t xml:space="preserve"> </w:t>
@@ -6368,11 +6743,11 @@
           <w:i/>
           <w:iCs/>
         </w:rPr>
-        <w:t xml:space="preserve">Maps to OI-02.</w:t>
-      </w:r>
-    </w:p>
-    <w:bookmarkEnd w:id="39"/>
-    <w:bookmarkStart w:id="40" w:name="Xfe8f85755c74df97db4328170e4f07503f02ed7"/>
+        <w:t xml:space="preserve">OI-02 closed.</w:t>
+      </w:r>
+    </w:p>
+    <w:bookmarkEnd w:id="40"/>
+    <w:bookmarkStart w:id="41" w:name="Xfe8f85755c74df97db4328170e4f07503f02ed7"/>
     <w:p>
       <w:pPr>
         <w:pStyle w:val="Heading3"/>
@@ -6513,8 +6888,8 @@
         <w:t xml:space="preserve">) so warm-up time and shot count stay in a single record.</w:t>
       </w:r>
     </w:p>
-    <w:bookmarkEnd w:id="40"/>
-    <w:bookmarkStart w:id="41" w:name="multi-part-number-lines-resolved"/>
+    <w:bookmarkEnd w:id="41"/>
+    <w:bookmarkStart w:id="42" w:name="multi-part-number-lines-resolved"/>
     <w:p>
       <w:pPr>
         <w:pStyle w:val="Heading3"/>
@@ -6569,8 +6944,8 @@
         <w:t xml:space="preserve">Maps to OI-09.</w:t>
       </w:r>
     </w:p>
-    <w:bookmarkEnd w:id="41"/>
-    <w:bookmarkStart w:id="42" w:name="hardware-interlock-bypass-mode-resolved"/>
+    <w:bookmarkEnd w:id="42"/>
+    <w:bookmarkStart w:id="43" w:name="hardware-interlock-bypass-mode-resolved"/>
     <w:p>
       <w:pPr>
         <w:pStyle w:val="Heading3"/>
@@ -6729,8 +7104,8 @@
         <w:t xml:space="preserve">would lose the per-piece granularity. Schema add deferred to Arc 2 Phase 7 alongside the rest of the Container schema CREATE.</w:t>
       </w:r>
     </w:p>
-    <w:bookmarkEnd w:id="42"/>
-    <w:bookmarkStart w:id="43" w:name="X7711411ed0c744b11ef8373c23e3eb986c2f7d7"/>
+    <w:bookmarkEnd w:id="43"/>
+    <w:bookmarkStart w:id="44" w:name="X7711411ed0c744b11ef8373c23e3eb986c2f7d7"/>
     <w:p>
       <w:pPr>
         <w:pStyle w:val="Heading3"/>
@@ -6800,8 +7175,8 @@
         <w:t xml:space="preserve">Maps to OI-04.</w:t>
       </w:r>
     </w:p>
-    <w:bookmarkEnd w:id="43"/>
-    <w:bookmarkStart w:id="44" w:name="X280b68ff8bcbd45e5069f035e24c9fb94030f71"/>
+    <w:bookmarkEnd w:id="44"/>
+    <w:bookmarkStart w:id="45" w:name="X280b68ff8bcbd45e5069f035e24c9fb94030f71"/>
     <w:p>
       <w:pPr>
         <w:pStyle w:val="Heading3"/>
@@ -6935,8 +7310,8 @@
         <w:t xml:space="preserve">(when the caller needs error surfacing — print path, AIM Hold/Update). The label-printing latency concern at container close is addressed by extracting print dispatch from the atomic close transaction (FDS-07-005/006a/b) — the close commits with the AIM ID claimed from the local pool (UJ-04), then a Gateway message handler fires the print with 3 retries (2s gap) and surfaces failures via a per-terminal banner with Acknowledge action (FDS-07-006b).</w:t>
       </w:r>
     </w:p>
-    <w:bookmarkEnd w:id="44"/>
-    <w:bookmarkStart w:id="45" w:name="Xc0ae84e509ec30bacfcc0a2e20bcc2db236d541"/>
+    <w:bookmarkEnd w:id="45"/>
+    <w:bookmarkStart w:id="46" w:name="Xc0ae84e509ec30bacfcc0a2e20bcc2db236d541"/>
     <w:p>
       <w:pPr>
         <w:pStyle w:val="Heading3"/>
@@ -6988,9 +7363,9 @@
         </w:pict>
       </w:r>
     </w:p>
-    <w:bookmarkEnd w:id="45"/>
     <w:bookmarkEnd w:id="46"/>
-    <w:bookmarkStart w:id="47" w:name="impact-matrix"/>
+    <w:bookmarkEnd w:id="47"/>
+    <w:bookmarkStart w:id="48" w:name="impact-matrix"/>
     <w:p>
       <w:pPr>
         <w:pStyle w:val="Heading2"/>
@@ -7535,8 +7910,8 @@
         </w:pict>
       </w:r>
     </w:p>
-    <w:bookmarkEnd w:id="47"/>
-    <w:bookmarkStart w:id="48" w:name="related-documents"/>
+    <w:bookmarkEnd w:id="48"/>
+    <w:bookmarkStart w:id="49" w:name="related-documents"/>
     <w:p>
       <w:pPr>
         <w:pStyle w:val="Heading2"/>
@@ -7793,8 +8168,8 @@
         </w:pict>
       </w:r>
     </w:p>
-    <w:bookmarkEnd w:id="48"/>
-    <w:bookmarkStart w:id="49" w:name="validation-log-2026-04-06"/>
+    <w:bookmarkEnd w:id="49"/>
+    <w:bookmarkStart w:id="50" w:name="validation-log-2026-04-06"/>
     <w:p>
       <w:pPr>
         <w:pStyle w:val="Heading2"/>
@@ -8997,8 +9372,8 @@
         </w:tc>
       </w:tr>
     </w:tbl>
-    <w:bookmarkEnd w:id="49"/>
     <w:bookmarkEnd w:id="50"/>
+    <w:bookmarkEnd w:id="51"/>
     <w:sectPr>
       <w:footnotePr>
         <w:numRestart w:val="eachSect"/>

</xml_diff>

<commit_message>
docs(uj): v0.9-rev screenshot refresh — 5 replaced, 3 new (Cavities, Assignments, Lineside Inventory)
Replace 5 existing screenshots with updated 2026-05-01 captures:
- Plant Hierarchy: attribute values now filled in (Tonnage/ConfirmationMethod/RefCycleTimeSec)
- Item Master Container Config tab: updated capture
- Item Master Routes tab: caption now names all 4 route steps explicitly
- Operation Templates: DC-5G0 v1 with RequiresSubLotSplit checkbox visible
- Trim Station idle: renamed "Lineside Inventory" section with real LOT queue data

Add 3 new screenshots:
- Tools Cavities tab (DC-042): 2 active + 1 closed for porosity — "Configuring Dies" section
- Tools Assignments tab (DC-042): current mount + full assignment history — after Cavities
- Lineside Inventory supervisory view (ASSY-FRONT Cell #3): BRG-INSERT-M8 empty /
  SLV-GASKET-5G0 low — inserted in 11:30am Assembly scene after PNA pins mention

Co-Authored-By: Claude Sonnet 4.6 <noreply@anthropic.com>
</commit_message>
<xml_diff>
--- a/MPP_MES_USER_JOURNEYS.docx
+++ b/MPP_MES_USER_JOURNEYS.docx
@@ -2,7 +2,7 @@
 <file path=word/document.xml><?xml version="1.0" encoding="utf-8"?>
 <w:document xmlns:w="http://schemas.openxmlformats.org/wordprocessingml/2006/main" xmlns:m="http://schemas.openxmlformats.org/officeDocument/2006/math" xmlns:r="http://schemas.openxmlformats.org/officeDocument/2006/relationships" xmlns:o="urn:schemas-microsoft-com:office:office" xmlns:v="urn:schemas-microsoft-com:vml" xmlns:w10="urn:schemas-microsoft-com:office:word" xmlns:a="http://schemas.openxmlformats.org/drawingml/2006/main" xmlns:pic="http://schemas.openxmlformats.org/drawingml/2006/picture" xmlns:wp="http://schemas.openxmlformats.org/drawingml/2006/wordprocessingDrawing">
   <w:body>
-    <w:bookmarkStart w:id="51" w:name="mpp-mes-user-journeys"/>
+    <w:bookmarkStart w:id="192" w:name="mpp-mes-user-journeys"/>
     <w:p>
       <w:pPr>
         <w:pStyle w:val="Heading1"/>
@@ -844,11 +844,73 @@
               <w:pStyle w:val="Compact"/>
             </w:pPr>
             <w:r>
+              <w:t xml:space="preserve">0.9-rev</w:t>
+            </w:r>
+          </w:p>
+        </w:tc>
+        <w:tc>
+          <w:tcPr/>
+          <w:p>
+            <w:pPr>
+              <w:pStyle w:val="Compact"/>
+            </w:pPr>
+            <w:r>
+              <w:t xml:space="preserve">2026-05-01</w:t>
+            </w:r>
+          </w:p>
+        </w:tc>
+        <w:tc>
+          <w:tcPr/>
+          <w:p>
+            <w:pPr>
+              <w:pStyle w:val="Compact"/>
+            </w:pPr>
+            <w:r>
+              <w:t xml:space="preserve">Blue Ridge Automation</w:t>
+            </w:r>
+          </w:p>
+        </w:tc>
+        <w:tc>
+          <w:tcPr/>
+          <w:p>
+            <w:pPr>
+              <w:pStyle w:val="Compact"/>
+            </w:pPr>
+            <w:r>
+              <w:rPr>
+                <w:b/>
+                <w:bCs/>
+              </w:rPr>
+              <w:t xml:space="preserve">Screenshot refresh from updated mockup (plantFloor.html + Config Tool).</w:t>
+            </w:r>
+            <w:r>
+              <w:t xml:space="preserve"> </w:t>
+            </w:r>
+            <w:r>
+              <w:t xml:space="preserve">Five existing screenshots replaced with updated captures: Plant Hierarchy (attribute values filled in), Item Master Container Config + Routes tabs, Operation Templates (DC-5G0 v1 with RequiresSubLotSplit checkbox visible), Tools Attributes tab (Maintenance Interval / Last Maintained / Tonnage values). Three new screenshots added: Tools Cavities tab (DC-042 showing 2 active cavities + 1 closed for porosity), Tools Assignments tab (current mount on DC Machine #7 + full assignment history), and Lineside Inventory supervisory view (ASSY-FRONT Cell #3 with BRG-INSERT-M8 empty and SLV-GASKET-5G0 low — inserted into the 11:30am Assembly section).</w:t>
+            </w:r>
+          </w:p>
+        </w:tc>
+      </w:tr>
+      <w:tr>
+        <w:tc>
+          <w:tcPr>
+            <w:shd w:val="clear" w:color="auto" w:fill="F2F2F2"/>
+          </w:tcPr>
+          <w:tcPr/>
+          <w:p>
+            <w:pPr>
+              <w:pStyle w:val="Compact"/>
+            </w:pPr>
+            <w:r>
               <w:t xml:space="preserve">0.9</w:t>
             </w:r>
           </w:p>
         </w:tc>
         <w:tc>
+          <w:tcPr>
+            <w:shd w:val="clear" w:color="auto" w:fill="F2F2F2"/>
+          </w:tcPr>
           <w:tcPr/>
           <w:p>
             <w:pPr>
@@ -860,6 +922,9 @@
           </w:p>
         </w:tc>
         <w:tc>
+          <w:tcPr>
+            <w:shd w:val="clear" w:color="auto" w:fill="F2F2F2"/>
+          </w:tcPr>
           <w:tcPr/>
           <w:p>
             <w:pPr>
@@ -871,6 +936,9 @@
           </w:p>
         </w:tc>
         <w:tc>
+          <w:tcPr>
+            <w:shd w:val="clear" w:color="auto" w:fill="F2F2F2"/>
+          </w:tcPr>
           <w:tcPr/>
           <w:p>
             <w:pPr>
@@ -1394,9 +1462,6 @@
       </w:tr>
       <w:tr>
         <w:tc>
-          <w:tcPr>
-            <w:shd w:val="clear" w:color="auto" w:fill="F2F2F2"/>
-          </w:tcPr>
           <w:tcPr/>
           <w:p>
             <w:pPr>
@@ -1408,9 +1473,6 @@
           </w:p>
         </w:tc>
         <w:tc>
-          <w:tcPr>
-            <w:shd w:val="clear" w:color="auto" w:fill="F2F2F2"/>
-          </w:tcPr>
           <w:tcPr/>
           <w:p>
             <w:pPr>
@@ -1422,9 +1484,6 @@
           </w:p>
         </w:tc>
         <w:tc>
-          <w:tcPr>
-            <w:shd w:val="clear" w:color="auto" w:fill="F2F2F2"/>
-          </w:tcPr>
           <w:tcPr/>
           <w:p>
             <w:pPr>
@@ -1436,9 +1495,6 @@
           </w:p>
         </w:tc>
         <w:tc>
-          <w:tcPr>
-            <w:shd w:val="clear" w:color="auto" w:fill="F2F2F2"/>
-          </w:tcPr>
           <w:tcPr/>
           <w:p>
             <w:pPr>
@@ -2077,7 +2133,7 @@
       </w:r>
     </w:p>
     <w:bookmarkEnd w:id="10"/>
-    <w:bookmarkStart w:id="17" w:name="X8a62b6bbd3b7dbd28b80423735197bca531f61b"/>
+    <w:bookmarkStart w:id="83" w:name="X8a62b6bbd3b7dbd28b80423735197bca531f61b"/>
     <w:p>
       <w:pPr>
         <w:pStyle w:val="Heading2"/>
@@ -2100,7 +2156,7 @@
         <w:t xml:space="preserve">Before a single LOT can be created on the shop floor, an engineer at Madison Precision Products has to teach the MES what the plant looks like, what it makes, and how it makes it. This is the configuration tool — the Ignition Perspective application that probably lives behind a different navigation root than the shop floor screens, accessible only to users whose AD accounts carry an engineering or admin role in Ignition.</w:t>
       </w:r>
     </w:p>
-    <w:bookmarkStart w:id="11" w:name="building-the-plant"/>
+    <w:bookmarkStart w:id="20" w:name="building-the-plant"/>
     <w:p>
       <w:pPr>
         <w:pStyle w:val="Heading3"/>
@@ -2289,9 +2345,76 @@
     </w:p>
     <w:p>
       <w:pPr>
+        <w:pStyle w:val="CaptionedFigure"/>
+      </w:pPr>
+      <w:r>
+        <w:drawing>
+          <wp:inline>
+            <wp:extent cx="5334000" cy="2648876"/>
+            <wp:effectExtent b="0" l="0" r="0" t="0"/>
+            <wp:docPr descr="Plant Hierarchy — DC Machine #7 selected, Location Details + Attributes panels" title="" id="12" name="Picture"/>
+            <a:graphic>
+              <a:graphicData uri="http://schemas.openxmlformats.org/drawingml/2006/picture">
+                <pic:pic>
+                  <pic:nvPicPr>
+                    <pic:cNvPr descr="mockup_screenshots/Screenshot%202026-05-01%20141117.png" id="13" name="Picture"/>
+                    <pic:cNvPicPr>
+                      <a:picLocks noChangeArrowheads="1" noChangeAspect="1"/>
+                    </pic:cNvPicPr>
+                  </pic:nvPicPr>
+                  <pic:blipFill>
+                    <a:blip r:embed="rId11"/>
+                    <a:stretch>
+                      <a:fillRect/>
+                    </a:stretch>
+                  </pic:blipFill>
+                  <pic:spPr bwMode="auto">
+                    <a:xfrm>
+                      <a:off x="0" y="0"/>
+                      <a:ext cx="5334000" cy="2648876"/>
+                    </a:xfrm>
+                    <a:prstGeom prst="rect">
+                      <a:avLst/>
+                    </a:prstGeom>
+                    <a:noFill/>
+                    <a:ln w="9525">
+                      <a:noFill/>
+                      <a:headEnd/>
+                      <a:tailEnd/>
+                    </a:ln>
+                  </pic:spPr>
+                </pic:pic>
+              </a:graphicData>
+            </a:graphic>
+          </wp:inline>
+        </w:drawing>
+      </w:r>
+    </w:p>
+    <w:p>
+      <w:pPr>
+        <w:pStyle w:val="ImageCaption"/>
+      </w:pPr>
+      <w:r>
+        <w:t xml:space="preserve">Plant Hierarchy — DC Machine #7 selected, Location Details + Attributes panels</w:t>
+      </w:r>
+    </w:p>
+    <w:p>
+      <w:pPr>
         <w:pStyle w:val="BodyText"/>
       </w:pPr>
       <w:r>
+        <w:rPr>
+          <w:i/>
+          <w:iCs/>
+        </w:rPr>
+        <w:t xml:space="preserve">Plant Hierarchy screen: ISA-95 tree on the left (Enterprise → Site → Area → WorkCenter → Cell); Location Details panel on the right with Name, Code, Parent, Description, and Sort Order; Attributes panel below showing filled-in DieCastMachine attribute values (Tonnage = 400 tons, ConfirmationMethod = None, RefCycleTimeSec = 62.5 sec).</w:t>
+      </w:r>
+    </w:p>
+    <w:p>
+      <w:pPr>
+        <w:pStyle w:val="BodyText"/>
+      </w:pPr>
+      <w:r>
         <w:t xml:space="preserve">As they create each machine, the system shows them the attribute definitions for that location type. A Die Cast press might need</w:t>
       </w:r>
       <w:r>
@@ -2364,7 +2487,62 @@
         <w:t xml:space="preserve">CoolantType</w:t>
       </w:r>
       <w:r>
-        <w:t xml:space="preserve">. These attribute definitions were themselves configured earlier — someone decided what metadata each type of location carries. The engineer fills in the values. They also create the logical locations: Receiving Dock, Shipping Dock, WIP Storage, Sort Cage. These are Inventory Location types — they don’t have cycle times, but they’re real places where LOTs live.</w:t>
+        <w:t xml:space="preserve">. These attribute definitions were themselves configured earlier — someone decided what metadata each type of location carries. The engineer fills in the values. They also create the logical locations: Receiving Dock, Shipping Dock, WIP Storage, Sort Cage.</w:t>
+      </w:r>
+    </w:p>
+    <w:p>
+      <w:pPr>
+        <w:pStyle w:val="CaptionedFigure"/>
+      </w:pPr>
+      <w:r>
+        <w:drawing>
+          <wp:inline>
+            <wp:extent cx="4321743" cy="3003082"/>
+            <wp:effectExtent b="0" l="0" r="0" t="0"/>
+            <wp:docPr descr="Add Location modal" title="" id="15" name="Picture"/>
+            <a:graphic>
+              <a:graphicData uri="http://schemas.openxmlformats.org/drawingml/2006/picture">
+                <pic:pic>
+                  <pic:nvPicPr>
+                    <pic:cNvPr descr="mockup_screenshots/Screenshot%202026-04-30%20122618.png" id="16" name="Picture"/>
+                    <pic:cNvPicPr>
+                      <a:picLocks noChangeArrowheads="1" noChangeAspect="1"/>
+                    </pic:cNvPicPr>
+                  </pic:nvPicPr>
+                  <pic:blipFill>
+                    <a:blip r:embed="rId14"/>
+                    <a:stretch>
+                      <a:fillRect/>
+                    </a:stretch>
+                  </pic:blipFill>
+                  <pic:spPr bwMode="auto">
+                    <a:xfrm>
+                      <a:off x="0" y="0"/>
+                      <a:ext cx="4321743" cy="3003082"/>
+                    </a:xfrm>
+                    <a:prstGeom prst="rect">
+                      <a:avLst/>
+                    </a:prstGeom>
+                    <a:noFill/>
+                    <a:ln w="9525">
+                      <a:noFill/>
+                      <a:headEnd/>
+                      <a:tailEnd/>
+                    </a:ln>
+                  </pic:spPr>
+                </pic:pic>
+              </a:graphicData>
+            </a:graphic>
+          </wp:inline>
+        </w:drawing>
+      </w:r>
+    </w:p>
+    <w:p>
+      <w:pPr>
+        <w:pStyle w:val="ImageCaption"/>
+      </w:pPr>
+      <w:r>
+        <w:t xml:space="preserve">Add Location modal</w:t>
       </w:r>
     </w:p>
     <w:p>
@@ -2372,6 +2550,91 @@
         <w:pStyle w:val="BodyText"/>
       </w:pPr>
       <w:r>
+        <w:rPr>
+          <w:i/>
+          <w:iCs/>
+        </w:rPr>
+        <w:t xml:space="preserve">Add Location modal: selects the LocationTypeDefinition from a dropdown, then fills Name, Code, and an optional Description. The new row lands in the tree under its parent.</w:t>
+      </w:r>
+    </w:p>
+    <w:p>
+      <w:pPr>
+        <w:pStyle w:val="CaptionedFigure"/>
+      </w:pPr>
+      <w:r>
+        <w:drawing>
+          <wp:inline>
+            <wp:extent cx="5334000" cy="3259131"/>
+            <wp:effectExtent b="0" l="0" r="0" t="0"/>
+            <wp:docPr descr="Location Type Definitions modal — Cell tier, DieCastMachine selected" title="" id="18" name="Picture"/>
+            <a:graphic>
+              <a:graphicData uri="http://schemas.openxmlformats.org/drawingml/2006/picture">
+                <pic:pic>
+                  <pic:nvPicPr>
+                    <pic:cNvPr descr="mockup_screenshots/Screenshot%202026-04-30%20122635.png" id="19" name="Picture"/>
+                    <pic:cNvPicPr>
+                      <a:picLocks noChangeArrowheads="1" noChangeAspect="1"/>
+                    </pic:cNvPicPr>
+                  </pic:nvPicPr>
+                  <pic:blipFill>
+                    <a:blip r:embed="rId17"/>
+                    <a:stretch>
+                      <a:fillRect/>
+                    </a:stretch>
+                  </pic:blipFill>
+                  <pic:spPr bwMode="auto">
+                    <a:xfrm>
+                      <a:off x="0" y="0"/>
+                      <a:ext cx="5334000" cy="3259131"/>
+                    </a:xfrm>
+                    <a:prstGeom prst="rect">
+                      <a:avLst/>
+                    </a:prstGeom>
+                    <a:noFill/>
+                    <a:ln w="9525">
+                      <a:noFill/>
+                      <a:headEnd/>
+                      <a:tailEnd/>
+                    </a:ln>
+                  </pic:spPr>
+                </pic:pic>
+              </a:graphicData>
+            </a:graphic>
+          </wp:inline>
+        </w:drawing>
+      </w:r>
+    </w:p>
+    <w:p>
+      <w:pPr>
+        <w:pStyle w:val="ImageCaption"/>
+      </w:pPr>
+      <w:r>
+        <w:t xml:space="preserve">Location Type Definitions modal — Cell tier, DieCastMachine selected</w:t>
+      </w:r>
+    </w:p>
+    <w:p>
+      <w:pPr>
+        <w:pStyle w:val="BodyText"/>
+      </w:pPr>
+      <w:r>
+        <w:rPr>
+          <w:i/>
+          <w:iCs/>
+        </w:rPr>
+        <w:t xml:space="preserve">Location Type Definitions modal: the engineer picks an ISA-95 tier (Cell shown), selects a definition (DieCastMachine), and manages the attribute schema — Name, Data Type, Required, Default Value, UOM, and Description per attribute. Changes here affect all locations of that type immediately.</w:t>
+      </w:r>
+      <w:r>
+        <w:t xml:space="preserve"> </w:t>
+      </w:r>
+      <w:r>
+        <w:t xml:space="preserve">These are Inventory Location types — they don’t have cycle times, but they’re real places where LOTs live.</w:t>
+      </w:r>
+    </w:p>
+    <w:p>
+      <w:pPr>
+        <w:pStyle w:val="BodyText"/>
+      </w:pPr>
+      <w:r>
         <w:t xml:space="preserve">Then they set up terminals. Each Ignition client station on the floor gets a</w:t>
       </w:r>
       <w:r>
@@ -2390,8 +2653,8 @@
         <w:t xml:space="preserve">record — its IP address, which location it’s at, which Zebra printer it talks to, whether it has a barcode scanner. This is how the system knows that when operator Maria scans a LOT at terminal DC-05, that action happened at Die Cast Machine #5, and any label it prints goes to the Zebra on the table next to her.</w:t>
       </w:r>
     </w:p>
-    <w:bookmarkEnd w:id="11"/>
-    <w:bookmarkStart w:id="12" w:name="configuring-dies-and-tooling"/>
+    <w:bookmarkEnd w:id="20"/>
+    <w:bookmarkStart w:id="39" w:name="configuring-dies-and-tooling"/>
     <w:p>
       <w:pPr>
         <w:pStyle w:val="Heading3"/>
@@ -2454,8 +2717,459 @@
         <w:t xml:space="preserve">— see the 6:20am Die Cast scene.</w:t>
       </w:r>
     </w:p>
-    <w:bookmarkEnd w:id="12"/>
-    <w:bookmarkStart w:id="13" w:name="defining-what-we-make"/>
+    <w:p>
+      <w:pPr>
+        <w:pStyle w:val="CaptionedFigure"/>
+      </w:pPr>
+      <w:r>
+        <w:drawing>
+          <wp:inline>
+            <wp:extent cx="5334000" cy="2641918"/>
+            <wp:effectExtent b="0" l="0" r="0" t="0"/>
+            <wp:docPr descr="Tools screen — DC-042 Front Cover Die, Attributes tab" title="" id="22" name="Picture"/>
+            <a:graphic>
+              <a:graphicData uri="http://schemas.openxmlformats.org/drawingml/2006/picture">
+                <pic:pic>
+                  <pic:nvPicPr>
+                    <pic:cNvPr descr="mockup_screenshots/Screenshot%202026-05-01%20141430.png" id="23" name="Picture"/>
+                    <pic:cNvPicPr>
+                      <a:picLocks noChangeArrowheads="1" noChangeAspect="1"/>
+                    </pic:cNvPicPr>
+                  </pic:nvPicPr>
+                  <pic:blipFill>
+                    <a:blip r:embed="rId21"/>
+                    <a:stretch>
+                      <a:fillRect/>
+                    </a:stretch>
+                  </pic:blipFill>
+                  <pic:spPr bwMode="auto">
+                    <a:xfrm>
+                      <a:off x="0" y="0"/>
+                      <a:ext cx="5334000" cy="2641918"/>
+                    </a:xfrm>
+                    <a:prstGeom prst="rect">
+                      <a:avLst/>
+                    </a:prstGeom>
+                    <a:noFill/>
+                    <a:ln w="9525">
+                      <a:noFill/>
+                      <a:headEnd/>
+                      <a:tailEnd/>
+                    </a:ln>
+                  </pic:spPr>
+                </pic:pic>
+              </a:graphicData>
+            </a:graphic>
+          </wp:inline>
+        </w:drawing>
+      </w:r>
+    </w:p>
+    <w:p>
+      <w:pPr>
+        <w:pStyle w:val="ImageCaption"/>
+      </w:pPr>
+      <w:r>
+        <w:t xml:space="preserve">Tools screen — DC-042 Front Cover Die, Attributes tab</w:t>
+      </w:r>
+    </w:p>
+    <w:p>
+      <w:pPr>
+        <w:pStyle w:val="BodyText"/>
+      </w:pPr>
+      <w:r>
+        <w:rPr>
+          <w:i/>
+          <w:iCs/>
+        </w:rPr>
+        <w:t xml:space="preserve">Tools screen: die list on the left with status badges (ACTIVE, UNDER REPAIR, RETIRED). Detail panel shows Code, Name, Tool Type, Die Rank, Status, and Description. Attributes tab displays custom attribute values — Maintenance Interval = 25,000 shots, Last Maintained = 04/01/2026, Tonnage = 800. Shot counts are derived at runtime from production events, not stored on the tool record.</w:t>
+      </w:r>
+    </w:p>
+    <w:p>
+      <w:pPr>
+        <w:pStyle w:val="CaptionedFigure"/>
+      </w:pPr>
+      <w:r>
+        <w:drawing>
+          <wp:inline>
+            <wp:extent cx="5334000" cy="2502557"/>
+            <wp:effectExtent b="0" l="0" r="0" t="0"/>
+            <wp:docPr descr="Tools — DC-042 Cavities tab, 2 active 1 closed" title="" id="25" name="Picture"/>
+            <a:graphic>
+              <a:graphicData uri="http://schemas.openxmlformats.org/drawingml/2006/picture">
+                <pic:pic>
+                  <pic:nvPicPr>
+                    <pic:cNvPr descr="mockup_screenshots/Screenshot%202026-05-01%20141440.png" id="26" name="Picture"/>
+                    <pic:cNvPicPr>
+                      <a:picLocks noChangeArrowheads="1" noChangeAspect="1"/>
+                    </pic:cNvPicPr>
+                  </pic:nvPicPr>
+                  <pic:blipFill>
+                    <a:blip r:embed="rId24"/>
+                    <a:stretch>
+                      <a:fillRect/>
+                    </a:stretch>
+                  </pic:blipFill>
+                  <pic:spPr bwMode="auto">
+                    <a:xfrm>
+                      <a:off x="0" y="0"/>
+                      <a:ext cx="5334000" cy="2502557"/>
+                    </a:xfrm>
+                    <a:prstGeom prst="rect">
+                      <a:avLst/>
+                    </a:prstGeom>
+                    <a:noFill/>
+                    <a:ln w="9525">
+                      <a:noFill/>
+                      <a:headEnd/>
+                      <a:tailEnd/>
+                    </a:ln>
+                  </pic:spPr>
+                </pic:pic>
+              </a:graphicData>
+            </a:graphic>
+          </wp:inline>
+        </w:drawing>
+      </w:r>
+    </w:p>
+    <w:p>
+      <w:pPr>
+        <w:pStyle w:val="ImageCaption"/>
+      </w:pPr>
+      <w:r>
+        <w:t xml:space="preserve">Tools — DC-042 Cavities tab, 2 active 1 closed</w:t>
+      </w:r>
+    </w:p>
+    <w:p>
+      <w:pPr>
+        <w:pStyle w:val="BodyText"/>
+      </w:pPr>
+      <w:r>
+        <w:rPr>
+          <w:i/>
+          <w:iCs/>
+        </w:rPr>
+        <w:t xml:space="preserve">Cavities tab on DC-042: three numbered cavities — #1 and #2 ACTIVE (each with optional notes field, Close and Scrap buttons), #3 CLOSED (</w:t>
+      </w:r>
+      <w:r>
+        <w:rPr>
+          <w:i/>
+          <w:iCs/>
+        </w:rPr>
+        <w:t xml:space="preserve">“Shut off 2026-03-14 — porosity defects,”</w:t>
+      </w:r>
+      <w:r>
+        <w:rPr>
+          <w:i/>
+          <w:iCs/>
+        </w:rPr>
+        <w:t xml:space="preserve"> </w:t>
+      </w:r>
+      <w:r>
+        <w:rPr>
+          <w:i/>
+          <w:iCs/>
+        </w:rPr>
+        <w:t xml:space="preserve">with Reactivate and Scrap buttons). Active cavities appear in the Cavity dropdown on the Die Cast LOT entry screen; closed cavities are excluded.</w:t>
+      </w:r>
+    </w:p>
+    <w:p>
+      <w:pPr>
+        <w:pStyle w:val="CaptionedFigure"/>
+      </w:pPr>
+      <w:r>
+        <w:drawing>
+          <wp:inline>
+            <wp:extent cx="5334000" cy="2500784"/>
+            <wp:effectExtent b="0" l="0" r="0" t="0"/>
+            <wp:docPr descr="Tools — DC-042 Assignments tab, currently mounted on DC Machine #7" title="" id="28" name="Picture"/>
+            <a:graphic>
+              <a:graphicData uri="http://schemas.openxmlformats.org/drawingml/2006/picture">
+                <pic:pic>
+                  <pic:nvPicPr>
+                    <pic:cNvPr descr="mockup_screenshots/Screenshot%202026-05-01%20141452.png" id="29" name="Picture"/>
+                    <pic:cNvPicPr>
+                      <a:picLocks noChangeArrowheads="1" noChangeAspect="1"/>
+                    </pic:cNvPicPr>
+                  </pic:nvPicPr>
+                  <pic:blipFill>
+                    <a:blip r:embed="rId27"/>
+                    <a:stretch>
+                      <a:fillRect/>
+                    </a:stretch>
+                  </pic:blipFill>
+                  <pic:spPr bwMode="auto">
+                    <a:xfrm>
+                      <a:off x="0" y="0"/>
+                      <a:ext cx="5334000" cy="2500784"/>
+                    </a:xfrm>
+                    <a:prstGeom prst="rect">
+                      <a:avLst/>
+                    </a:prstGeom>
+                    <a:noFill/>
+                    <a:ln w="9525">
+                      <a:noFill/>
+                      <a:headEnd/>
+                      <a:tailEnd/>
+                    </a:ln>
+                  </pic:spPr>
+                </pic:pic>
+              </a:graphicData>
+            </a:graphic>
+          </wp:inline>
+        </w:drawing>
+      </w:r>
+    </w:p>
+    <w:p>
+      <w:pPr>
+        <w:pStyle w:val="ImageCaption"/>
+      </w:pPr>
+      <w:r>
+        <w:t xml:space="preserve">Tools — DC-042 Assignments tab, currently mounted on DC Machine #7</w:t>
+      </w:r>
+    </w:p>
+    <w:p>
+      <w:pPr>
+        <w:pStyle w:val="BodyText"/>
+      </w:pPr>
+      <w:r>
+        <w:rPr>
+          <w:i/>
+          <w:iCs/>
+        </w:rPr>
+        <w:t xml:space="preserve">Assignments tab on DC-042: green active banner shows the die is currently mounted on DC Machine #7 (assigned 2026-04-29 06:02 by CM, Release button). Historical assignment log shows Cell, Assigned At, Released At, Assigned By, Released By, and Notes — including a</w:t>
+      </w:r>
+      <w:r>
+        <w:rPr>
+          <w:i/>
+          <w:iCs/>
+        </w:rPr>
+        <w:t xml:space="preserve"> </w:t>
+      </w:r>
+      <w:r>
+        <w:rPr>
+          <w:i/>
+          <w:iCs/>
+        </w:rPr>
+        <w:t xml:space="preserve">“Loan from line 7”</w:t>
+      </w:r>
+      <w:r>
+        <w:rPr>
+          <w:i/>
+          <w:iCs/>
+        </w:rPr>
+        <w:t xml:space="preserve"> </w:t>
+      </w:r>
+      <w:r>
+        <w:rPr>
+          <w:i/>
+          <w:iCs/>
+        </w:rPr>
+        <w:t xml:space="preserve">period on DC Machine #3. Mount to Cell triggers ToolAssignment_Release + ToolAssignment_Assign in one transaction.</w:t>
+      </w:r>
+    </w:p>
+    <w:p>
+      <w:pPr>
+        <w:pStyle w:val="CaptionedFigure"/>
+      </w:pPr>
+      <w:r>
+        <w:drawing>
+          <wp:inline>
+            <wp:extent cx="4398745" cy="3176336"/>
+            <wp:effectExtent b="0" l="0" r="0" t="0"/>
+            <wp:docPr descr="Add Die modal" title="" id="31" name="Picture"/>
+            <a:graphic>
+              <a:graphicData uri="http://schemas.openxmlformats.org/drawingml/2006/picture">
+                <pic:pic>
+                  <pic:nvPicPr>
+                    <pic:cNvPr descr="mockup_screenshots/Screenshot%202026-04-30%20122911.png" id="32" name="Picture"/>
+                    <pic:cNvPicPr>
+                      <a:picLocks noChangeArrowheads="1" noChangeAspect="1"/>
+                    </pic:cNvPicPr>
+                  </pic:nvPicPr>
+                  <pic:blipFill>
+                    <a:blip r:embed="rId30"/>
+                    <a:stretch>
+                      <a:fillRect/>
+                    </a:stretch>
+                  </pic:blipFill>
+                  <pic:spPr bwMode="auto">
+                    <a:xfrm>
+                      <a:off x="0" y="0"/>
+                      <a:ext cx="4398745" cy="3176336"/>
+                    </a:xfrm>
+                    <a:prstGeom prst="rect">
+                      <a:avLst/>
+                    </a:prstGeom>
+                    <a:noFill/>
+                    <a:ln w="9525">
+                      <a:noFill/>
+                      <a:headEnd/>
+                      <a:tailEnd/>
+                    </a:ln>
+                  </pic:spPr>
+                </pic:pic>
+              </a:graphicData>
+            </a:graphic>
+          </wp:inline>
+        </w:drawing>
+      </w:r>
+    </w:p>
+    <w:p>
+      <w:pPr>
+        <w:pStyle w:val="ImageCaption"/>
+      </w:pPr>
+      <w:r>
+        <w:t xml:space="preserve">Add Die modal</w:t>
+      </w:r>
+    </w:p>
+    <w:p>
+      <w:pPr>
+        <w:pStyle w:val="BodyText"/>
+      </w:pPr>
+      <w:r>
+        <w:rPr>
+          <w:i/>
+          <w:iCs/>
+        </w:rPr>
+        <w:t xml:space="preserve">Add Die modal: Code, Name, Die Rank dropdown, and optional Description. Creates the die record; cavities and assignments are added on the detail screen.</w:t>
+      </w:r>
+    </w:p>
+    <w:p>
+      <w:pPr>
+        <w:pStyle w:val="CaptionedFigure"/>
+      </w:pPr>
+      <w:r>
+        <w:drawing>
+          <wp:inline>
+            <wp:extent cx="5334000" cy="1685349"/>
+            <wp:effectExtent b="0" l="0" r="0" t="0"/>
+            <wp:docPr descr="Tool Attribute Schema — Die" title="" id="34" name="Picture"/>
+            <a:graphic>
+              <a:graphicData uri="http://schemas.openxmlformats.org/drawingml/2006/picture">
+                <pic:pic>
+                  <pic:nvPicPr>
+                    <pic:cNvPr descr="mockup_screenshots/Screenshot%202026-04-30%20122928.png" id="35" name="Picture"/>
+                    <pic:cNvPicPr>
+                      <a:picLocks noChangeArrowheads="1" noChangeAspect="1"/>
+                    </pic:cNvPicPr>
+                  </pic:nvPicPr>
+                  <pic:blipFill>
+                    <a:blip r:embed="rId33"/>
+                    <a:stretch>
+                      <a:fillRect/>
+                    </a:stretch>
+                  </pic:blipFill>
+                  <pic:spPr bwMode="auto">
+                    <a:xfrm>
+                      <a:off x="0" y="0"/>
+                      <a:ext cx="5334000" cy="1685349"/>
+                    </a:xfrm>
+                    <a:prstGeom prst="rect">
+                      <a:avLst/>
+                    </a:prstGeom>
+                    <a:noFill/>
+                    <a:ln w="9525">
+                      <a:noFill/>
+                      <a:headEnd/>
+                      <a:tailEnd/>
+                    </a:ln>
+                  </pic:spPr>
+                </pic:pic>
+              </a:graphicData>
+            </a:graphic>
+          </wp:inline>
+        </w:drawing>
+      </w:r>
+    </w:p>
+    <w:p>
+      <w:pPr>
+        <w:pStyle w:val="ImageCaption"/>
+      </w:pPr>
+      <w:r>
+        <w:t xml:space="preserve">Tool Attribute Schema — Die</w:t>
+      </w:r>
+    </w:p>
+    <w:p>
+      <w:pPr>
+        <w:pStyle w:val="BodyText"/>
+      </w:pPr>
+      <w:r>
+        <w:rPr>
+          <w:i/>
+          <w:iCs/>
+        </w:rPr>
+        <w:t xml:space="preserve">Tool Attribute Schema modal: defines the custom attributes that appear on every die’s Attributes tab. Schema changes affect all dies immediately. Shown with Tonnage (DECIMAL, required), RefCycleTimeSec (DECIMAL, default 60.0), and ConfirmationMethod (NVARCHAR, default None).</w:t>
+      </w:r>
+    </w:p>
+    <w:p>
+      <w:pPr>
+        <w:pStyle w:val="CaptionedFigure"/>
+      </w:pPr>
+      <w:r>
+        <w:drawing>
+          <wp:inline>
+            <wp:extent cx="5334000" cy="2635001"/>
+            <wp:effectExtent b="0" l="0" r="0" t="0"/>
+            <wp:docPr descr="Die Ranks — merge compatibility matrix" title="" id="37" name="Picture"/>
+            <a:graphic>
+              <a:graphicData uri="http://schemas.openxmlformats.org/drawingml/2006/picture">
+                <pic:pic>
+                  <pic:nvPicPr>
+                    <pic:cNvPr descr="mockup_screenshots/Screenshot%202026-04-30%20122952.png" id="38" name="Picture"/>
+                    <pic:cNvPicPr>
+                      <a:picLocks noChangeArrowheads="1" noChangeAspect="1"/>
+                    </pic:cNvPicPr>
+                  </pic:nvPicPr>
+                  <pic:blipFill>
+                    <a:blip r:embed="rId36"/>
+                    <a:stretch>
+                      <a:fillRect/>
+                    </a:stretch>
+                  </pic:blipFill>
+                  <pic:spPr bwMode="auto">
+                    <a:xfrm>
+                      <a:off x="0" y="0"/>
+                      <a:ext cx="5334000" cy="2635001"/>
+                    </a:xfrm>
+                    <a:prstGeom prst="rect">
+                      <a:avLst/>
+                    </a:prstGeom>
+                    <a:noFill/>
+                    <a:ln w="9525">
+                      <a:noFill/>
+                      <a:headEnd/>
+                      <a:tailEnd/>
+                    </a:ln>
+                  </pic:spPr>
+                </pic:pic>
+              </a:graphicData>
+            </a:graphic>
+          </wp:inline>
+        </w:drawing>
+      </w:r>
+    </w:p>
+    <w:p>
+      <w:pPr>
+        <w:pStyle w:val="ImageCaption"/>
+      </w:pPr>
+      <w:r>
+        <w:t xml:space="preserve">Die Ranks — merge compatibility matrix</w:t>
+      </w:r>
+    </w:p>
+    <w:p>
+      <w:pPr>
+        <w:pStyle w:val="BodyText"/>
+      </w:pPr>
+      <w:r>
+        <w:rPr>
+          <w:i/>
+          <w:iCs/>
+        </w:rPr>
+        <w:t xml:space="preserve">Die Ranks screen: left panel lists ranks with Edit buttons. Right panel is the merge compatibility matrix — click a cell to toggle green (can merge) / red (blocked). The lower triangle mirrors the upper automatically. This matrix governs which LOTs can be combined at the Sort Cage.</w:t>
+      </w:r>
+    </w:p>
+    <w:bookmarkEnd w:id="39"/>
+    <w:bookmarkStart w:id="46" w:name="defining-what-we-make"/>
     <w:p>
       <w:pPr>
         <w:pStyle w:val="Heading3"/>
@@ -2522,8 +3236,142 @@
         <w:t xml:space="preserve">, not serialized. These configs drive the container lifecycle on the floor — the MES knows when a container is full.</w:t>
       </w:r>
     </w:p>
-    <w:bookmarkEnd w:id="13"/>
-    <w:bookmarkStart w:id="14" w:name="defining-how-we-make-it"/>
+    <w:p>
+      <w:pPr>
+        <w:pStyle w:val="CaptionedFigure"/>
+      </w:pPr>
+      <w:r>
+        <w:drawing>
+          <wp:inline>
+            <wp:extent cx="5334000" cy="2633627"/>
+            <wp:effectExtent b="0" l="0" r="0" t="0"/>
+            <wp:docPr descr="Item Master — 5G0 Front Cover Assy, Container Config tab" title="" id="41" name="Picture"/>
+            <a:graphic>
+              <a:graphicData uri="http://schemas.openxmlformats.org/drawingml/2006/picture">
+                <pic:pic>
+                  <pic:nvPicPr>
+                    <pic:cNvPr descr="mockup_screenshots/Screenshot%202026-05-01%20141134.png" id="42" name="Picture"/>
+                    <pic:cNvPicPr>
+                      <a:picLocks noChangeArrowheads="1" noChangeAspect="1"/>
+                    </pic:cNvPicPr>
+                  </pic:nvPicPr>
+                  <pic:blipFill>
+                    <a:blip r:embed="rId40"/>
+                    <a:stretch>
+                      <a:fillRect/>
+                    </a:stretch>
+                  </pic:blipFill>
+                  <pic:spPr bwMode="auto">
+                    <a:xfrm>
+                      <a:off x="0" y="0"/>
+                      <a:ext cx="5334000" cy="2633627"/>
+                    </a:xfrm>
+                    <a:prstGeom prst="rect">
+                      <a:avLst/>
+                    </a:prstGeom>
+                    <a:noFill/>
+                    <a:ln w="9525">
+                      <a:noFill/>
+                      <a:headEnd/>
+                      <a:tailEnd/>
+                    </a:ln>
+                  </pic:spPr>
+                </pic:pic>
+              </a:graphicData>
+            </a:graphic>
+          </wp:inline>
+        </w:drawing>
+      </w:r>
+    </w:p>
+    <w:p>
+      <w:pPr>
+        <w:pStyle w:val="ImageCaption"/>
+      </w:pPr>
+      <w:r>
+        <w:t xml:space="preserve">Item Master — 5G0 Front Cover Assy, Container Config tab</w:t>
+      </w:r>
+    </w:p>
+    <w:p>
+      <w:pPr>
+        <w:pStyle w:val="BodyText"/>
+      </w:pPr>
+      <w:r>
+        <w:rPr>
+          <w:i/>
+          <w:iCs/>
+        </w:rPr>
+        <w:t xml:space="preserve">Item Master screen: header fields (Part Number, Item Type, UOM, Description, Macola Part #, Unit Weight, Weight UOM, Default Sub-LOT Qty, Parts Per Basket) with five tabs below. Container Config tab shown: TraysPerContainer=4, PartsPerTray=12, Serialized=Yes, ClosureMethod=ByCount, DunnageCode=RD-5G0F, CustomerCode=HONDA-5G0.</w:t>
+      </w:r>
+    </w:p>
+    <w:p>
+      <w:pPr>
+        <w:pStyle w:val="CaptionedFigure"/>
+      </w:pPr>
+      <w:r>
+        <w:drawing>
+          <wp:inline>
+            <wp:extent cx="5334000" cy="5370596"/>
+            <wp:effectExtent b="0" l="0" r="0" t="0"/>
+            <wp:docPr descr="Add Item modal" title="" id="44" name="Picture"/>
+            <a:graphic>
+              <a:graphicData uri="http://schemas.openxmlformats.org/drawingml/2006/picture">
+                <pic:pic>
+                  <pic:nvPicPr>
+                    <pic:cNvPr descr="mockup_screenshots/Screenshot%202026-04-30%20122811.png" id="45" name="Picture"/>
+                    <pic:cNvPicPr>
+                      <a:picLocks noChangeArrowheads="1" noChangeAspect="1"/>
+                    </pic:cNvPicPr>
+                  </pic:nvPicPr>
+                  <pic:blipFill>
+                    <a:blip r:embed="rId43"/>
+                    <a:stretch>
+                      <a:fillRect/>
+                    </a:stretch>
+                  </pic:blipFill>
+                  <pic:spPr bwMode="auto">
+                    <a:xfrm>
+                      <a:off x="0" y="0"/>
+                      <a:ext cx="5334000" cy="5370596"/>
+                    </a:xfrm>
+                    <a:prstGeom prst="rect">
+                      <a:avLst/>
+                    </a:prstGeom>
+                    <a:noFill/>
+                    <a:ln w="9525">
+                      <a:noFill/>
+                      <a:headEnd/>
+                      <a:tailEnd/>
+                    </a:ln>
+                  </pic:spPr>
+                </pic:pic>
+              </a:graphicData>
+            </a:graphic>
+          </wp:inline>
+        </w:drawing>
+      </w:r>
+    </w:p>
+    <w:p>
+      <w:pPr>
+        <w:pStyle w:val="ImageCaption"/>
+      </w:pPr>
+      <w:r>
+        <w:t xml:space="preserve">Add Item modal</w:t>
+      </w:r>
+    </w:p>
+    <w:p>
+      <w:pPr>
+        <w:pStyle w:val="BodyText"/>
+      </w:pPr>
+      <w:r>
+        <w:rPr>
+          <w:i/>
+          <w:iCs/>
+        </w:rPr>
+        <w:t xml:space="preserve">Add Item modal: Part Number, Item Type, UOM, Description, Unit Weight, Weight UOM, Default Sub-LOT Qty, Max Lot Size (PartsPerBasket), and Macola Part # fields. Creates the item record; tabs (Routes, BOMs, Quality Specs, Eligibility) are populated on the detail screen.</w:t>
+      </w:r>
+    </w:p>
+    <w:bookmarkEnd w:id="46"/>
+    <w:bookmarkStart w:id="59" w:name="defining-how-we-make-it"/>
     <w:p>
       <w:pPr>
         <w:pStyle w:val="Heading3"/>
@@ -2550,14 +3398,282 @@
     </w:p>
     <w:p>
       <w:pPr>
+        <w:pStyle w:val="CaptionedFigure"/>
+      </w:pPr>
+      <w:r>
+        <w:drawing>
+          <wp:inline>
+            <wp:extent cx="5334000" cy="2630771"/>
+            <wp:effectExtent b="0" l="0" r="0" t="0"/>
+            <wp:docPr descr="Item Master — Routes tab, 5G0 Front Cover v2 Published" title="" id="48" name="Picture"/>
+            <a:graphic>
+              <a:graphicData uri="http://schemas.openxmlformats.org/drawingml/2006/picture">
+                <pic:pic>
+                  <pic:nvPicPr>
+                    <pic:cNvPr descr="mockup_screenshots/Screenshot%202026-05-01%20141214.png" id="49" name="Picture"/>
+                    <pic:cNvPicPr>
+                      <a:picLocks noChangeArrowheads="1" noChangeAspect="1"/>
+                    </pic:cNvPicPr>
+                  </pic:nvPicPr>
+                  <pic:blipFill>
+                    <a:blip r:embed="rId47"/>
+                    <a:stretch>
+                      <a:fillRect/>
+                    </a:stretch>
+                  </pic:blipFill>
+                  <pic:spPr bwMode="auto">
+                    <a:xfrm>
+                      <a:off x="0" y="0"/>
+                      <a:ext cx="5334000" cy="2630771"/>
+                    </a:xfrm>
+                    <a:prstGeom prst="rect">
+                      <a:avLst/>
+                    </a:prstGeom>
+                    <a:noFill/>
+                    <a:ln w="9525">
+                      <a:noFill/>
+                      <a:headEnd/>
+                      <a:tailEnd/>
+                    </a:ln>
+                  </pic:spPr>
+                </pic:pic>
+              </a:graphicData>
+            </a:graphic>
+          </wp:inline>
+        </w:drawing>
+      </w:r>
+    </w:p>
+    <w:p>
+      <w:pPr>
+        <w:pStyle w:val="ImageCaption"/>
+      </w:pPr>
+      <w:r>
+        <w:t xml:space="preserve">Item Master — Routes tab, 5G0 Front Cover v2 Published</w:t>
+      </w:r>
+    </w:p>
+    <w:p>
+      <w:pPr>
         <w:pStyle w:val="BodyText"/>
       </w:pPr>
       <w:r>
+        <w:rPr>
+          <w:i/>
+          <w:iCs/>
+        </w:rPr>
+        <w:t xml:space="preserve">Routes tab: version selector with Published/Draft badge and New Version button. Four-step published route — Die Cast (DC-5G0 v1), Trim Shop (TRIM-5G0 v1), Machine Shop (CNC-5G0 v1), Prod Control (ASSY-FRONT v1). Published routes are read-only — click New Version to begin editing a draft copy.</w:t>
+      </w:r>
+    </w:p>
+    <w:p>
+      <w:pPr>
+        <w:pStyle w:val="CaptionedFigure"/>
+      </w:pPr>
+      <w:r>
+        <w:drawing>
+          <wp:inline>
+            <wp:extent cx="5334000" cy="2249458"/>
+            <wp:effectExtent b="0" l="0" r="0" t="0"/>
+            <wp:docPr descr="Item Master — BOMs tab, 5G0 Front Cover v1 Published" title="" id="51" name="Picture"/>
+            <a:graphic>
+              <a:graphicData uri="http://schemas.openxmlformats.org/drawingml/2006/picture">
+                <pic:pic>
+                  <pic:nvPicPr>
+                    <pic:cNvPr descr="mockup_screenshots/Screenshot%202026-04-30%20122732.png" id="52" name="Picture"/>
+                    <pic:cNvPicPr>
+                      <a:picLocks noChangeArrowheads="1" noChangeAspect="1"/>
+                    </pic:cNvPicPr>
+                  </pic:nvPicPr>
+                  <pic:blipFill>
+                    <a:blip r:embed="rId50"/>
+                    <a:stretch>
+                      <a:fillRect/>
+                    </a:stretch>
+                  </pic:blipFill>
+                  <pic:spPr bwMode="auto">
+                    <a:xfrm>
+                      <a:off x="0" y="0"/>
+                      <a:ext cx="5334000" cy="2249458"/>
+                    </a:xfrm>
+                    <a:prstGeom prst="rect">
+                      <a:avLst/>
+                    </a:prstGeom>
+                    <a:noFill/>
+                    <a:ln w="9525">
+                      <a:noFill/>
+                      <a:headEnd/>
+                      <a:tailEnd/>
+                    </a:ln>
+                  </pic:spPr>
+                </pic:pic>
+              </a:graphicData>
+            </a:graphic>
+          </wp:inline>
+        </w:drawing>
+      </w:r>
+    </w:p>
+    <w:p>
+      <w:pPr>
+        <w:pStyle w:val="ImageCaption"/>
+      </w:pPr>
+      <w:r>
+        <w:t xml:space="preserve">Item Master — BOMs tab, 5G0 Front Cover v1 Published</w:t>
+      </w:r>
+    </w:p>
+    <w:p>
+      <w:pPr>
+        <w:pStyle w:val="BodyText"/>
+      </w:pPr>
+      <w:r>
+        <w:rPr>
+          <w:i/>
+          <w:iCs/>
+        </w:rPr>
+        <w:t xml:space="preserve">BOMs tab: same version/publish pattern as Routes. Each BOM line shows Component, Part Number, Qty, and UOM. Version 1 shows Front Cover Casting (5G0-C, qty 1) and Mounting Pin (PNA, qty 2).</w:t>
+      </w:r>
+    </w:p>
+    <w:p>
+      <w:pPr>
+        <w:pStyle w:val="CaptionedFigure"/>
+      </w:pPr>
+      <w:r>
+        <w:drawing>
+          <wp:inline>
+            <wp:extent cx="5334000" cy="2235021"/>
+            <wp:effectExtent b="0" l="0" r="0" t="0"/>
+            <wp:docPr descr="Item Master — Eligibility tab, Die Cast area filter" title="" id="54" name="Picture"/>
+            <a:graphic>
+              <a:graphicData uri="http://schemas.openxmlformats.org/drawingml/2006/picture">
+                <pic:pic>
+                  <pic:nvPicPr>
+                    <pic:cNvPr descr="mockup_screenshots/Screenshot%202026-04-30%20122756.png" id="55" name="Picture"/>
+                    <pic:cNvPicPr>
+                      <a:picLocks noChangeArrowheads="1" noChangeAspect="1"/>
+                    </pic:cNvPicPr>
+                  </pic:nvPicPr>
+                  <pic:blipFill>
+                    <a:blip r:embed="rId53"/>
+                    <a:stretch>
+                      <a:fillRect/>
+                    </a:stretch>
+                  </pic:blipFill>
+                  <pic:spPr bwMode="auto">
+                    <a:xfrm>
+                      <a:off x="0" y="0"/>
+                      <a:ext cx="5334000" cy="2235021"/>
+                    </a:xfrm>
+                    <a:prstGeom prst="rect">
+                      <a:avLst/>
+                    </a:prstGeom>
+                    <a:noFill/>
+                    <a:ln w="9525">
+                      <a:noFill/>
+                      <a:headEnd/>
+                      <a:tailEnd/>
+                    </a:ln>
+                  </pic:spPr>
+                </pic:pic>
+              </a:graphicData>
+            </a:graphic>
+          </wp:inline>
+        </w:drawing>
+      </w:r>
+    </w:p>
+    <w:p>
+      <w:pPr>
+        <w:pStyle w:val="ImageCaption"/>
+      </w:pPr>
+      <w:r>
+        <w:t xml:space="preserve">Item Master — Eligibility tab, Die Cast area filter</w:t>
+      </w:r>
+    </w:p>
+    <w:p>
+      <w:pPr>
+        <w:pStyle w:val="BodyText"/>
+      </w:pPr>
+      <w:r>
+        <w:rPr>
+          <w:i/>
+          <w:iCs/>
+        </w:rPr>
+        <w:t xml:space="preserve">Eligibility tab: area dropdown filter. Machine Eligibility table lists every Cell in the selected area with its Code, Tonnage, and an Eligible checkbox. DC-015 (250 tons) is unchecked — the 5G0 requires a 400-ton press.</w:t>
+      </w:r>
+    </w:p>
+    <w:p>
+      <w:pPr>
+        <w:pStyle w:val="CaptionedFigure"/>
+      </w:pPr>
+      <w:r>
+        <w:drawing>
+          <wp:inline>
+            <wp:extent cx="5334000" cy="2639160"/>
+            <wp:effectExtent b="0" l="0" r="0" t="0"/>
+            <wp:docPr descr="Operation Templates — Die Cast 5G0 Front Cover DC-5G0 v1" title="" id="57" name="Picture"/>
+            <a:graphic>
+              <a:graphicData uri="http://schemas.openxmlformats.org/drawingml/2006/picture">
+                <pic:pic>
+                  <pic:nvPicPr>
+                    <pic:cNvPr descr="mockup_screenshots/Screenshot%202026-05-01%20141243.png" id="58" name="Picture"/>
+                    <pic:cNvPicPr>
+                      <a:picLocks noChangeArrowheads="1" noChangeAspect="1"/>
+                    </pic:cNvPicPr>
+                  </pic:nvPicPr>
+                  <pic:blipFill>
+                    <a:blip r:embed="rId56"/>
+                    <a:stretch>
+                      <a:fillRect/>
+                    </a:stretch>
+                  </pic:blipFill>
+                  <pic:spPr bwMode="auto">
+                    <a:xfrm>
+                      <a:off x="0" y="0"/>
+                      <a:ext cx="5334000" cy="2639160"/>
+                    </a:xfrm>
+                    <a:prstGeom prst="rect">
+                      <a:avLst/>
+                    </a:prstGeom>
+                    <a:noFill/>
+                    <a:ln w="9525">
+                      <a:noFill/>
+                      <a:headEnd/>
+                      <a:tailEnd/>
+                    </a:ln>
+                  </pic:spPr>
+                </pic:pic>
+              </a:graphicData>
+            </a:graphic>
+          </wp:inline>
+        </w:drawing>
+      </w:r>
+    </w:p>
+    <w:p>
+      <w:pPr>
+        <w:pStyle w:val="ImageCaption"/>
+      </w:pPr>
+      <w:r>
+        <w:t xml:space="preserve">Operation Templates — Die Cast 5G0 Front Cover DC-5G0 v1</w:t>
+      </w:r>
+    </w:p>
+    <w:p>
+      <w:pPr>
+        <w:pStyle w:val="BodyText"/>
+      </w:pPr>
+      <w:r>
+        <w:rPr>
+          <w:i/>
+          <w:iCs/>
+        </w:rPr>
+        <w:t xml:space="preserve">Operation Templates screen: left panel groups templates by area with version badges. Detail panel shows Code, Name, Area, Description, Requires Sub-LOT Split checkbox, and a Data Collection Fields table. DC-5G0 v1 shown with 5 required fields: DieInfo, CavityInfo, Weight, GoodCount, BadCount. Arrow buttons reorder fields; × removes a field.</w:t>
+      </w:r>
+    </w:p>
+    <w:p>
+      <w:pPr>
+        <w:pStyle w:val="BodyText"/>
+      </w:pPr>
+      <w:r>
         <w:t xml:space="preserve">For assembled products with BOMs, the engineer creates versioned bills of material. The 5G0 Front Cover Assembly consumes one 5G0 casting and two PNA mounting pins. Version 1 of the BOM is effective from January 2026. If engineering changes the design in March, they create version 2 — but every production record from January still points to version 1.</w:t>
       </w:r>
     </w:p>
-    <w:bookmarkEnd w:id="14"/>
-    <w:bookmarkStart w:id="15" w:name="defining-quality-standards"/>
+    <w:bookmarkEnd w:id="59"/>
+    <w:bookmarkStart w:id="69" w:name="defining-quality-standards"/>
     <w:p>
       <w:pPr>
         <w:pStyle w:val="Heading3"/>
@@ -2606,8 +3722,237 @@
         <w:t xml:space="preserve">flag for future OEE quality calculations.</w:t>
       </w:r>
     </w:p>
-    <w:bookmarkEnd w:id="15"/>
-    <w:bookmarkStart w:id="16" w:name="defining-downtime-vocabulary"/>
+    <w:p>
+      <w:pPr>
+        <w:pStyle w:val="CaptionedFigure"/>
+      </w:pPr>
+      <w:r>
+        <w:drawing>
+          <wp:inline>
+            <wp:extent cx="5334000" cy="2240355"/>
+            <wp:effectExtent b="0" l="0" r="0" t="0"/>
+            <wp:docPr descr="Item Master — Quality Specs tab, linked specs for 5G0 Front Cover" title="" id="61" name="Picture"/>
+            <a:graphic>
+              <a:graphicData uri="http://schemas.openxmlformats.org/drawingml/2006/picture">
+                <pic:pic>
+                  <pic:nvPicPr>
+                    <pic:cNvPr descr="mockup_screenshots/Screenshot%202026-04-30%20122744.png" id="62" name="Picture"/>
+                    <pic:cNvPicPr>
+                      <a:picLocks noChangeArrowheads="1" noChangeAspect="1"/>
+                    </pic:cNvPicPr>
+                  </pic:nvPicPr>
+                  <pic:blipFill>
+                    <a:blip r:embed="rId60"/>
+                    <a:stretch>
+                      <a:fillRect/>
+                    </a:stretch>
+                  </pic:blipFill>
+                  <pic:spPr bwMode="auto">
+                    <a:xfrm>
+                      <a:off x="0" y="0"/>
+                      <a:ext cx="5334000" cy="2240355"/>
+                    </a:xfrm>
+                    <a:prstGeom prst="rect">
+                      <a:avLst/>
+                    </a:prstGeom>
+                    <a:noFill/>
+                    <a:ln w="9525">
+                      <a:noFill/>
+                      <a:headEnd/>
+                      <a:tailEnd/>
+                    </a:ln>
+                  </pic:spPr>
+                </pic:pic>
+              </a:graphicData>
+            </a:graphic>
+          </wp:inline>
+        </w:drawing>
+      </w:r>
+    </w:p>
+    <w:p>
+      <w:pPr>
+        <w:pStyle w:val="ImageCaption"/>
+      </w:pPr>
+      <w:r>
+        <w:t xml:space="preserve">Item Master — Quality Specs tab, linked specs for 5G0 Front Cover</w:t>
+      </w:r>
+    </w:p>
+    <w:p>
+      <w:pPr>
+        <w:pStyle w:val="BodyText"/>
+      </w:pPr>
+      <w:r>
+        <w:rPr>
+          <w:i/>
+          <w:iCs/>
+        </w:rPr>
+        <w:t xml:space="preserve">Quality Specs tab on the Item Master: lists all quality specs linked to this item, their active version, and Published/Draft status.</w:t>
+      </w:r>
+      <w:r>
+        <w:rPr>
+          <w:i/>
+          <w:iCs/>
+        </w:rPr>
+        <w:t xml:space="preserve"> </w:t>
+      </w:r>
+      <w:r>
+        <w:rPr>
+          <w:i/>
+          <w:iCs/>
+        </w:rPr>
+        <w:t xml:space="preserve">“Go to spec →”</w:t>
+      </w:r>
+      <w:r>
+        <w:rPr>
+          <w:i/>
+          <w:iCs/>
+        </w:rPr>
+        <w:t xml:space="preserve"> </w:t>
+      </w:r>
+      <w:r>
+        <w:rPr>
+          <w:i/>
+          <w:iCs/>
+        </w:rPr>
+        <w:t xml:space="preserve">navigates to the spec detail. Two specs shown: 5G0 Dimensional Spec v2 and 5G0 Visual Inspection v1.</w:t>
+      </w:r>
+    </w:p>
+    <w:p>
+      <w:pPr>
+        <w:pStyle w:val="CaptionedFigure"/>
+      </w:pPr>
+      <w:r>
+        <w:drawing>
+          <wp:inline>
+            <wp:extent cx="5334000" cy="2639189"/>
+            <wp:effectExtent b="0" l="0" r="0" t="0"/>
+            <wp:docPr descr="Quality Specs — 5G0 Dimensional Spec v2, Attributes tab" title="" id="64" name="Picture"/>
+            <a:graphic>
+              <a:graphicData uri="http://schemas.openxmlformats.org/drawingml/2006/picture">
+                <pic:pic>
+                  <pic:nvPicPr>
+                    <pic:cNvPr descr="mockup_screenshots/Screenshot%202026-04-30%20123016.png" id="65" name="Picture"/>
+                    <pic:cNvPicPr>
+                      <a:picLocks noChangeArrowheads="1" noChangeAspect="1"/>
+                    </pic:cNvPicPr>
+                  </pic:nvPicPr>
+                  <pic:blipFill>
+                    <a:blip r:embed="rId63"/>
+                    <a:stretch>
+                      <a:fillRect/>
+                    </a:stretch>
+                  </pic:blipFill>
+                  <pic:spPr bwMode="auto">
+                    <a:xfrm>
+                      <a:off x="0" y="0"/>
+                      <a:ext cx="5334000" cy="2639189"/>
+                    </a:xfrm>
+                    <a:prstGeom prst="rect">
+                      <a:avLst/>
+                    </a:prstGeom>
+                    <a:noFill/>
+                    <a:ln w="9525">
+                      <a:noFill/>
+                      <a:headEnd/>
+                      <a:tailEnd/>
+                    </a:ln>
+                  </pic:spPr>
+                </pic:pic>
+              </a:graphicData>
+            </a:graphic>
+          </wp:inline>
+        </w:drawing>
+      </w:r>
+    </w:p>
+    <w:p>
+      <w:pPr>
+        <w:pStyle w:val="ImageCaption"/>
+      </w:pPr>
+      <w:r>
+        <w:t xml:space="preserve">Quality Specs — 5G0 Dimensional Spec v2, Attributes tab</w:t>
+      </w:r>
+    </w:p>
+    <w:p>
+      <w:pPr>
+        <w:pStyle w:val="BodyText"/>
+      </w:pPr>
+      <w:r>
+        <w:rPr>
+          <w:i/>
+          <w:iCs/>
+        </w:rPr>
+        <w:t xml:space="preserve">Quality Specs screen: item filter dropdown, spec list with version badges. Detail panel shows Name, Linked Item, Linked Operation, version selector, and an Attributes table — each row has Attribute, Type, Target, Lower, Upper, UOM, and Trigger.</w:t>
+      </w:r>
+    </w:p>
+    <w:p>
+      <w:pPr>
+        <w:pStyle w:val="CaptionedFigure"/>
+      </w:pPr>
+      <w:r>
+        <w:drawing>
+          <wp:inline>
+            <wp:extent cx="5334000" cy="2628065"/>
+            <wp:effectExtent b="0" l="0" r="0" t="0"/>
+            <wp:docPr descr="Defect Codes — all areas" title="" id="67" name="Picture"/>
+            <a:graphic>
+              <a:graphicData uri="http://schemas.openxmlformats.org/drawingml/2006/picture">
+                <pic:pic>
+                  <pic:nvPicPr>
+                    <pic:cNvPr descr="mockup_screenshots/Screenshot%202026-04-30%20123030.png" id="68" name="Picture"/>
+                    <pic:cNvPicPr>
+                      <a:picLocks noChangeArrowheads="1" noChangeAspect="1"/>
+                    </pic:cNvPicPr>
+                  </pic:nvPicPr>
+                  <pic:blipFill>
+                    <a:blip r:embed="rId66"/>
+                    <a:stretch>
+                      <a:fillRect/>
+                    </a:stretch>
+                  </pic:blipFill>
+                  <pic:spPr bwMode="auto">
+                    <a:xfrm>
+                      <a:off x="0" y="0"/>
+                      <a:ext cx="5334000" cy="2628065"/>
+                    </a:xfrm>
+                    <a:prstGeom prst="rect">
+                      <a:avLst/>
+                    </a:prstGeom>
+                    <a:noFill/>
+                    <a:ln w="9525">
+                      <a:noFill/>
+                      <a:headEnd/>
+                      <a:tailEnd/>
+                    </a:ln>
+                  </pic:spPr>
+                </pic:pic>
+              </a:graphicData>
+            </a:graphic>
+          </wp:inline>
+        </w:drawing>
+      </w:r>
+    </w:p>
+    <w:p>
+      <w:pPr>
+        <w:pStyle w:val="ImageCaption"/>
+      </w:pPr>
+      <w:r>
+        <w:t xml:space="preserve">Defect Codes — all areas</w:t>
+      </w:r>
+    </w:p>
+    <w:p>
+      <w:pPr>
+        <w:pStyle w:val="BodyText"/>
+      </w:pPr>
+      <w:r>
+        <w:rPr>
+          <w:i/>
+          <w:iCs/>
+        </w:rPr>
+        <w:t xml:space="preserve">Defect Codes screen: area filter and search on the left, flat list on the right with Code, Description, Area, and Excused checkbox. Edit button opens an inline editor. Codes span Die Cast (DC-), Machine Shop (MS-), Trim Shop (TS-), and HSP (HSP-).</w:t>
+      </w:r>
+    </w:p>
+    <w:bookmarkEnd w:id="69"/>
+    <w:bookmarkStart w:id="82" w:name="defining-downtime-vocabulary"/>
     <w:p>
       <w:pPr>
         <w:pStyle w:val="Heading3"/>
@@ -2660,6 +4005,274 @@
       </w:r>
       <w:r>
         <w:t xml:space="preserve">— who changed what, when, what the old value was.</w:t>
+      </w:r>
+    </w:p>
+    <w:p>
+      <w:pPr>
+        <w:pStyle w:val="CaptionedFigure"/>
+      </w:pPr>
+      <w:r>
+        <w:drawing>
+          <wp:inline>
+            <wp:extent cx="5334000" cy="2639189"/>
+            <wp:effectExtent b="0" l="0" r="0" t="0"/>
+            <wp:docPr descr="Downtime Codes — all areas and types" title="" id="71" name="Picture"/>
+            <a:graphic>
+              <a:graphicData uri="http://schemas.openxmlformats.org/drawingml/2006/picture">
+                <pic:pic>
+                  <pic:nvPicPr>
+                    <pic:cNvPr descr="mockup_screenshots/Screenshot%202026-04-30%20123057.png" id="72" name="Picture"/>
+                    <pic:cNvPicPr>
+                      <a:picLocks noChangeArrowheads="1" noChangeAspect="1"/>
+                    </pic:cNvPicPr>
+                  </pic:nvPicPr>
+                  <pic:blipFill>
+                    <a:blip r:embed="rId70"/>
+                    <a:stretch>
+                      <a:fillRect/>
+                    </a:stretch>
+                  </pic:blipFill>
+                  <pic:spPr bwMode="auto">
+                    <a:xfrm>
+                      <a:off x="0" y="0"/>
+                      <a:ext cx="5334000" cy="2639189"/>
+                    </a:xfrm>
+                    <a:prstGeom prst="rect">
+                      <a:avLst/>
+                    </a:prstGeom>
+                    <a:noFill/>
+                    <a:ln w="9525">
+                      <a:noFill/>
+                      <a:headEnd/>
+                      <a:tailEnd/>
+                    </a:ln>
+                  </pic:spPr>
+                </pic:pic>
+              </a:graphicData>
+            </a:graphic>
+          </wp:inline>
+        </w:drawing>
+      </w:r>
+    </w:p>
+    <w:p>
+      <w:pPr>
+        <w:pStyle w:val="ImageCaption"/>
+      </w:pPr>
+      <w:r>
+        <w:t xml:space="preserve">Downtime Codes — all areas and types</w:t>
+      </w:r>
+    </w:p>
+    <w:p>
+      <w:pPr>
+        <w:pStyle w:val="BodyText"/>
+      </w:pPr>
+      <w:r>
+        <w:rPr>
+          <w:i/>
+          <w:iCs/>
+        </w:rPr>
+        <w:t xml:space="preserve">Downtime Codes screen: area + reason-type filters with search and Include Deprecated toggle. Each code shows Code, Description, Area, Type (Equipment / Setup / Quality / Mold), and Excused checkbox.</w:t>
+      </w:r>
+    </w:p>
+    <w:p>
+      <w:pPr>
+        <w:pStyle w:val="CaptionedFigure"/>
+      </w:pPr>
+      <w:r>
+        <w:drawing>
+          <wp:inline>
+            <wp:extent cx="5334000" cy="2630846"/>
+            <wp:effectExtent b="0" l="0" r="0" t="0"/>
+            <wp:docPr descr="Shift Schedules" title="" id="74" name="Picture"/>
+            <a:graphic>
+              <a:graphicData uri="http://schemas.openxmlformats.org/drawingml/2006/picture">
+                <pic:pic>
+                  <pic:nvPicPr>
+                    <pic:cNvPr descr="mockup_screenshots/Screenshot%202026-04-30%20123110.png" id="75" name="Picture"/>
+                    <pic:cNvPicPr>
+                      <a:picLocks noChangeArrowheads="1" noChangeAspect="1"/>
+                    </pic:cNvPicPr>
+                  </pic:nvPicPr>
+                  <pic:blipFill>
+                    <a:blip r:embed="rId73"/>
+                    <a:stretch>
+                      <a:fillRect/>
+                    </a:stretch>
+                  </pic:blipFill>
+                  <pic:spPr bwMode="auto">
+                    <a:xfrm>
+                      <a:off x="0" y="0"/>
+                      <a:ext cx="5334000" cy="2630846"/>
+                    </a:xfrm>
+                    <a:prstGeom prst="rect">
+                      <a:avLst/>
+                    </a:prstGeom>
+                    <a:noFill/>
+                    <a:ln w="9525">
+                      <a:noFill/>
+                      <a:headEnd/>
+                      <a:tailEnd/>
+                    </a:ln>
+                  </pic:spPr>
+                </pic:pic>
+              </a:graphicData>
+            </a:graphic>
+          </wp:inline>
+        </w:drawing>
+      </w:r>
+    </w:p>
+    <w:p>
+      <w:pPr>
+        <w:pStyle w:val="ImageCaption"/>
+      </w:pPr>
+      <w:r>
+        <w:t xml:space="preserve">Shift Schedules</w:t>
+      </w:r>
+    </w:p>
+    <w:p>
+      <w:pPr>
+        <w:pStyle w:val="BodyText"/>
+      </w:pPr>
+      <w:r>
+        <w:rPr>
+          <w:i/>
+          <w:iCs/>
+        </w:rPr>
+        <w:t xml:space="preserve">Shift Schedules screen: each row shows Name, Start, End, active day-of-week buttons (M/T/W/T/F/S/S), and Effective date. First Shift 06:00–14:00 weekdays, Second Shift 14:00–22:00 weekdays, Weekend OT 06:00–16:00 Sat/Sun. End-of-shift break buttons derive their times and durations from these records.</w:t>
+      </w:r>
+    </w:p>
+    <w:p>
+      <w:pPr>
+        <w:pStyle w:val="CaptionedFigure"/>
+      </w:pPr>
+      <w:r>
+        <w:drawing>
+          <wp:inline>
+            <wp:extent cx="5334000" cy="2641944"/>
+            <wp:effectExtent b="0" l="0" r="0" t="0"/>
+            <wp:docPr descr="System — Audit Log" title="" id="77" name="Picture"/>
+            <a:graphic>
+              <a:graphicData uri="http://schemas.openxmlformats.org/drawingml/2006/picture">
+                <pic:pic>
+                  <pic:nvPicPr>
+                    <pic:cNvPr descr="mockup_screenshots/Screenshot%202026-04-30%20123132.png" id="78" name="Picture"/>
+                    <pic:cNvPicPr>
+                      <a:picLocks noChangeArrowheads="1" noChangeAspect="1"/>
+                    </pic:cNvPicPr>
+                  </pic:nvPicPr>
+                  <pic:blipFill>
+                    <a:blip r:embed="rId76"/>
+                    <a:stretch>
+                      <a:fillRect/>
+                    </a:stretch>
+                  </pic:blipFill>
+                  <pic:spPr bwMode="auto">
+                    <a:xfrm>
+                      <a:off x="0" y="0"/>
+                      <a:ext cx="5334000" cy="2641944"/>
+                    </a:xfrm>
+                    <a:prstGeom prst="rect">
+                      <a:avLst/>
+                    </a:prstGeom>
+                    <a:noFill/>
+                    <a:ln w="9525">
+                      <a:noFill/>
+                      <a:headEnd/>
+                      <a:tailEnd/>
+                    </a:ln>
+                  </pic:spPr>
+                </pic:pic>
+              </a:graphicData>
+            </a:graphic>
+          </wp:inline>
+        </w:drawing>
+      </w:r>
+    </w:p>
+    <w:p>
+      <w:pPr>
+        <w:pStyle w:val="ImageCaption"/>
+      </w:pPr>
+      <w:r>
+        <w:t xml:space="preserve">System — Audit Log</w:t>
+      </w:r>
+    </w:p>
+    <w:p>
+      <w:pPr>
+        <w:pStyle w:val="BodyText"/>
+      </w:pPr>
+      <w:r>
+        <w:rPr>
+          <w:i/>
+          <w:iCs/>
+        </w:rPr>
+        <w:t xml:space="preserve">Audit Log screen: date range, entity type, and user filters. Result table shows Timestamp, User, Entity Type, Entity, Event, and Description of each change. Entries are written by every Configuration Tool mutation stored proc.</w:t>
+      </w:r>
+    </w:p>
+    <w:p>
+      <w:pPr>
+        <w:pStyle w:val="CaptionedFigure"/>
+      </w:pPr>
+      <w:r>
+        <w:drawing>
+          <wp:inline>
+            <wp:extent cx="5334000" cy="2628065"/>
+            <wp:effectExtent b="0" l="0" r="0" t="0"/>
+            <wp:docPr descr="System — Failure Log" title="" id="80" name="Picture"/>
+            <a:graphic>
+              <a:graphicData uri="http://schemas.openxmlformats.org/drawingml/2006/picture">
+                <pic:pic>
+                  <pic:nvPicPr>
+                    <pic:cNvPr descr="mockup_screenshots/Screenshot%202026-04-30%20123143.png" id="81" name="Picture"/>
+                    <pic:cNvPicPr>
+                      <a:picLocks noChangeArrowheads="1" noChangeAspect="1"/>
+                    </pic:cNvPicPr>
+                  </pic:nvPicPr>
+                  <pic:blipFill>
+                    <a:blip r:embed="rId79"/>
+                    <a:stretch>
+                      <a:fillRect/>
+                    </a:stretch>
+                  </pic:blipFill>
+                  <pic:spPr bwMode="auto">
+                    <a:xfrm>
+                      <a:off x="0" y="0"/>
+                      <a:ext cx="5334000" cy="2628065"/>
+                    </a:xfrm>
+                    <a:prstGeom prst="rect">
+                      <a:avLst/>
+                    </a:prstGeom>
+                    <a:noFill/>
+                    <a:ln w="9525">
+                      <a:noFill/>
+                      <a:headEnd/>
+                      <a:tailEnd/>
+                    </a:ln>
+                  </pic:spPr>
+                </pic:pic>
+              </a:graphicData>
+            </a:graphic>
+          </wp:inline>
+        </w:drawing>
+      </w:r>
+    </w:p>
+    <w:p>
+      <w:pPr>
+        <w:pStyle w:val="ImageCaption"/>
+      </w:pPr>
+      <w:r>
+        <w:t xml:space="preserve">System — Failure Log</w:t>
+      </w:r>
+    </w:p>
+    <w:p>
+      <w:pPr>
+        <w:pStyle w:val="BodyText"/>
+      </w:pPr>
+      <w:r>
+        <w:rPr>
+          <w:i/>
+          <w:iCs/>
+        </w:rPr>
+        <w:t xml:space="preserve">Failure Log screen: date range, entity type, and procedure filters. Top panels summarize top rejection reasons and top failing procedures over the selected window as bar charts. Detail table below shows the individual failed calls with Timestamp, User, Entity, Procedure, and Failure Reason.</w:t>
       </w:r>
     </w:p>
     <w:p>
@@ -2669,9 +4282,9 @@
         </w:pict>
       </w:r>
     </w:p>
-    <w:bookmarkEnd w:id="16"/>
-    <w:bookmarkEnd w:id="17"/>
-    <w:bookmarkStart w:id="27" w:name="X9d3dbf4d142c75b298042d81841f871b0d06ec6"/>
+    <w:bookmarkEnd w:id="82"/>
+    <w:bookmarkEnd w:id="83"/>
+    <w:bookmarkStart w:id="168" w:name="X9d3dbf4d142c75b298042d81841f871b0d06ec6"/>
     <w:p>
       <w:pPr>
         <w:pStyle w:val="Heading2"/>
@@ -2694,7 +4307,74 @@
         <w:t xml:space="preserve">It’s 6:15am on a Tuesday. First shift has started. The aluminum is already molten.</w:t>
       </w:r>
     </w:p>
-    <w:bookmarkStart w:id="18" w:name="am-die-cast-a-lot-is-born"/>
+    <w:p>
+      <w:pPr>
+        <w:pStyle w:val="CaptionedFigure"/>
+      </w:pPr>
+      <w:r>
+        <w:drawing>
+          <wp:inline>
+            <wp:extent cx="5334000" cy="2995991"/>
+            <wp:effectExtent b="0" l="0" r="0" t="0"/>
+            <wp:docPr descr="Plant Floor Home — Supervisor Dashboard tile" title="" id="85" name="Picture"/>
+            <a:graphic>
+              <a:graphicData uri="http://schemas.openxmlformats.org/drawingml/2006/picture">
+                <pic:pic>
+                  <pic:nvPicPr>
+                    <pic:cNvPr descr="mockup_screenshots/Screenshot%202026-04-30%20125428.png" id="86" name="Picture"/>
+                    <pic:cNvPicPr>
+                      <a:picLocks noChangeArrowheads="1" noChangeAspect="1"/>
+                    </pic:cNvPicPr>
+                  </pic:nvPicPr>
+                  <pic:blipFill>
+                    <a:blip r:embed="rId84"/>
+                    <a:stretch>
+                      <a:fillRect/>
+                    </a:stretch>
+                  </pic:blipFill>
+                  <pic:spPr bwMode="auto">
+                    <a:xfrm>
+                      <a:off x="0" y="0"/>
+                      <a:ext cx="5334000" cy="2995991"/>
+                    </a:xfrm>
+                    <a:prstGeom prst="rect">
+                      <a:avLst/>
+                    </a:prstGeom>
+                    <a:noFill/>
+                    <a:ln w="9525">
+                      <a:noFill/>
+                      <a:headEnd/>
+                      <a:tailEnd/>
+                    </a:ln>
+                  </pic:spPr>
+                </pic:pic>
+              </a:graphicData>
+            </a:graphic>
+          </wp:inline>
+        </w:drawing>
+      </w:r>
+    </w:p>
+    <w:p>
+      <w:pPr>
+        <w:pStyle w:val="ImageCaption"/>
+      </w:pPr>
+      <w:r>
+        <w:t xml:space="preserve">Plant Floor Home — Supervisor Dashboard tile</w:t>
+      </w:r>
+    </w:p>
+    <w:p>
+      <w:pPr>
+        <w:pStyle w:val="BodyText"/>
+      </w:pPr>
+      <w:r>
+        <w:rPr>
+          <w:i/>
+          <w:iCs/>
+        </w:rPr>
+        <w:t xml:space="preserve">Supervisor Dashboard (elevated): seven live tiles auto-refreshing every 30 seconds via Gateway broadcast — Open Downtime Events, Paused LOTs, Shift Availability %, AIM Shipper Pool depth by part number, Stranded Prints count, Top Defect shift-to-date, Active Operators, and Containers Shipped Today. All tiles are drillable.</w:t>
+      </w:r>
+    </w:p>
+    <w:bookmarkStart w:id="99" w:name="am-die-cast-a-lot-is-born"/>
     <w:p>
       <w:pPr>
         <w:pStyle w:val="Heading3"/>
@@ -2726,6 +4406,73 @@
     </w:p>
     <w:p>
       <w:pPr>
+        <w:pStyle w:val="CaptionedFigure"/>
+      </w:pPr>
+      <w:r>
+        <w:drawing>
+          <wp:inline>
+            <wp:extent cx="5334000" cy="2653080"/>
+            <wp:effectExtent b="0" l="0" r="0" t="0"/>
+            <wp:docPr descr="Plant Floor Home — Location Details tab, Press 7 selected" title="" id="88" name="Picture"/>
+            <a:graphic>
+              <a:graphicData uri="http://schemas.openxmlformats.org/drawingml/2006/picture">
+                <pic:pic>
+                  <pic:nvPicPr>
+                    <pic:cNvPr descr="mockup_screenshots/Screenshot%202026-04-30%20123512.png" id="89" name="Picture"/>
+                    <pic:cNvPicPr>
+                      <a:picLocks noChangeArrowheads="1" noChangeAspect="1"/>
+                    </pic:cNvPicPr>
+                  </pic:nvPicPr>
+                  <pic:blipFill>
+                    <a:blip r:embed="rId87"/>
+                    <a:stretch>
+                      <a:fillRect/>
+                    </a:stretch>
+                  </pic:blipFill>
+                  <pic:spPr bwMode="auto">
+                    <a:xfrm>
+                      <a:off x="0" y="0"/>
+                      <a:ext cx="5334000" cy="2653080"/>
+                    </a:xfrm>
+                    <a:prstGeom prst="rect">
+                      <a:avLst/>
+                    </a:prstGeom>
+                    <a:noFill/>
+                    <a:ln w="9525">
+                      <a:noFill/>
+                      <a:headEnd/>
+                      <a:tailEnd/>
+                    </a:ln>
+                  </pic:spPr>
+                </pic:pic>
+              </a:graphicData>
+            </a:graphic>
+          </wp:inline>
+        </w:drawing>
+      </w:r>
+    </w:p>
+    <w:p>
+      <w:pPr>
+        <w:pStyle w:val="ImageCaption"/>
+      </w:pPr>
+      <w:r>
+        <w:t xml:space="preserve">Plant Floor Home — Location Details tab, Press 7 selected</w:t>
+      </w:r>
+    </w:p>
+    <w:p>
+      <w:pPr>
+        <w:pStyle w:val="BodyText"/>
+      </w:pPr>
+      <w:r>
+        <w:rPr>
+          <w:i/>
+          <w:iCs/>
+        </w:rPr>
+        <w:t xml:space="preserve">Home page Location Details view for Press 7: six live status cards (Current LOT, Last Operator, Active Tool, Open Downtime, Cycle Rate, Shift Production) plus four action buttons — View Terminal, Open Current LOT, Edit Tool Assignment, Place Hold. An orange downtime card (EQ-DIE-STICK, awaiting reason confirm) is visible.</w:t>
+      </w:r>
+    </w:p>
+    <w:p>
+      <w:pPr>
         <w:pStyle w:val="BodyText"/>
       </w:pPr>
       <w:r>
@@ -2745,7 +4492,80 @@
         <w:t xml:space="preserve"> </w:t>
       </w:r>
       <w:r>
-        <w:t xml:space="preserve">already set as the active operator presence. He scans the LTT barcode.</w:t>
+        <w:t xml:space="preserve">already set as the active operator presence.</w:t>
+      </w:r>
+    </w:p>
+    <w:p>
+      <w:pPr>
+        <w:pStyle w:val="CaptionedFigure"/>
+      </w:pPr>
+      <w:r>
+        <w:drawing>
+          <wp:inline>
+            <wp:extent cx="4812631" cy="2993456"/>
+            <wp:effectExtent b="0" l="0" r="0" t="0"/>
+            <wp:docPr descr="Operator Presence — Dedicated Terminal initials entry" title="" id="91" name="Picture"/>
+            <a:graphic>
+              <a:graphicData uri="http://schemas.openxmlformats.org/drawingml/2006/picture">
+                <pic:pic>
+                  <pic:nvPicPr>
+                    <pic:cNvPr descr="mockup_screenshots/Screenshot%202026-04-30%20123815.png" id="92" name="Picture"/>
+                    <pic:cNvPicPr>
+                      <a:picLocks noChangeArrowheads="1" noChangeAspect="1"/>
+                    </pic:cNvPicPr>
+                  </pic:nvPicPr>
+                  <pic:blipFill>
+                    <a:blip r:embed="rId90"/>
+                    <a:stretch>
+                      <a:fillRect/>
+                    </a:stretch>
+                  </pic:blipFill>
+                  <pic:spPr bwMode="auto">
+                    <a:xfrm>
+                      <a:off x="0" y="0"/>
+                      <a:ext cx="4812631" cy="2993456"/>
+                    </a:xfrm>
+                    <a:prstGeom prst="rect">
+                      <a:avLst/>
+                    </a:prstGeom>
+                    <a:noFill/>
+                    <a:ln w="9525">
+                      <a:noFill/>
+                      <a:headEnd/>
+                      <a:tailEnd/>
+                    </a:ln>
+                  </pic:spPr>
+                </pic:pic>
+              </a:graphicData>
+            </a:graphic>
+          </wp:inline>
+        </w:drawing>
+      </w:r>
+    </w:p>
+    <w:p>
+      <w:pPr>
+        <w:pStyle w:val="ImageCaption"/>
+      </w:pPr>
+      <w:r>
+        <w:t xml:space="preserve">Operator Presence — Dedicated Terminal initials entry</w:t>
+      </w:r>
+    </w:p>
+    <w:p>
+      <w:pPr>
+        <w:pStyle w:val="BodyText"/>
+      </w:pPr>
+      <w:r>
+        <w:rPr>
+          <w:i/>
+          <w:iCs/>
+        </w:rPr>
+        <w:t xml:space="preserve">Operator Presence screen on a dedicated terminal: single Initials field with a Set Presence button. No password, no PIN — initials map to AppUser_GetByInitials. Presence persists through the shift subject to a 30-minute idle re-confirm.</w:t>
+      </w:r>
+      <w:r>
+        <w:t xml:space="preserve"> </w:t>
+      </w:r>
+      <w:r>
+        <w:t xml:space="preserve">He scans the LTT barcode.</w:t>
       </w:r>
     </w:p>
     <w:p>
@@ -2915,6 +4735,140 @@
     </w:p>
     <w:p>
       <w:pPr>
+        <w:pStyle w:val="CaptionedFigure"/>
+      </w:pPr>
+      <w:r>
+        <w:drawing>
+          <wp:inline>
+            <wp:extent cx="5334000" cy="2632219"/>
+            <wp:effectExtent b="0" l="0" r="0" t="0"/>
+            <wp:docPr descr="Die Cast LOT Entry — shared terminal, Press 7, LTT scanned" title="" id="94" name="Picture"/>
+            <a:graphic>
+              <a:graphicData uri="http://schemas.openxmlformats.org/drawingml/2006/picture">
+                <pic:pic>
+                  <pic:nvPicPr>
+                    <pic:cNvPr descr="mockup_screenshots/Screenshot%202026-04-30%20123530.png" id="95" name="Picture"/>
+                    <pic:cNvPicPr>
+                      <a:picLocks noChangeArrowheads="1" noChangeAspect="1"/>
+                    </pic:cNvPicPr>
+                  </pic:nvPicPr>
+                  <pic:blipFill>
+                    <a:blip r:embed="rId93"/>
+                    <a:stretch>
+                      <a:fillRect/>
+                    </a:stretch>
+                  </pic:blipFill>
+                  <pic:spPr bwMode="auto">
+                    <a:xfrm>
+                      <a:off x="0" y="0"/>
+                      <a:ext cx="5334000" cy="2632219"/>
+                    </a:xfrm>
+                    <a:prstGeom prst="rect">
+                      <a:avLst/>
+                    </a:prstGeom>
+                    <a:noFill/>
+                    <a:ln w="9525">
+                      <a:noFill/>
+                      <a:headEnd/>
+                      <a:tailEnd/>
+                    </a:ln>
+                  </pic:spPr>
+                </pic:pic>
+              </a:graphicData>
+            </a:graphic>
+          </wp:inline>
+        </w:drawing>
+      </w:r>
+    </w:p>
+    <w:p>
+      <w:pPr>
+        <w:pStyle w:val="ImageCaption"/>
+      </w:pPr>
+      <w:r>
+        <w:t xml:space="preserve">Die Cast LOT Entry — shared terminal, Press 7, LTT scanned</w:t>
+      </w:r>
+    </w:p>
+    <w:p>
+      <w:pPr>
+        <w:pStyle w:val="BodyText"/>
+      </w:pPr>
+      <w:r>
+        <w:rPr>
+          <w:i/>
+          <w:iCs/>
+        </w:rPr>
+        <w:t xml:space="preserve">Die Cast LOT Entry screen: Active Cell shown at top with a Change button. LTT Barcode field (scanned — mints a new LOT on first scan), Operator Initials (inline on a shared terminal), Item (auto-resolved from the mounted Tool), Tool (auto-populated from ToolAssignment_ListActiveByCell with an Edit button for elevated reassignment), Cavity dropdown (filtered to active cavities on the mounted die), Piece Count (≤ PartsPerBasket), and optional Weight. Right panel shows Cavity A cumulative ShotCount and ScrapCount plus a Reject Entry panel.</w:t>
+      </w:r>
+    </w:p>
+    <w:p>
+      <w:pPr>
+        <w:pStyle w:val="CaptionedFigure"/>
+      </w:pPr>
+      <w:r>
+        <w:drawing>
+          <wp:inline>
+            <wp:extent cx="5334000" cy="3657365"/>
+            <wp:effectExtent b="0" l="0" r="0" t="0"/>
+            <wp:docPr descr="Change Active Cell modal — shared terminal context selector" title="" id="97" name="Picture"/>
+            <a:graphic>
+              <a:graphicData uri="http://schemas.openxmlformats.org/drawingml/2006/picture">
+                <pic:pic>
+                  <pic:nvPicPr>
+                    <pic:cNvPr descr="mockup_screenshots/Screenshot%202026-04-30%20123743.png" id="98" name="Picture"/>
+                    <pic:cNvPicPr>
+                      <a:picLocks noChangeArrowheads="1" noChangeAspect="1"/>
+                    </pic:cNvPicPr>
+                  </pic:nvPicPr>
+                  <pic:blipFill>
+                    <a:blip r:embed="rId96"/>
+                    <a:stretch>
+                      <a:fillRect/>
+                    </a:stretch>
+                  </pic:blipFill>
+                  <pic:spPr bwMode="auto">
+                    <a:xfrm>
+                      <a:off x="0" y="0"/>
+                      <a:ext cx="5334000" cy="3657365"/>
+                    </a:xfrm>
+                    <a:prstGeom prst="rect">
+                      <a:avLst/>
+                    </a:prstGeom>
+                    <a:noFill/>
+                    <a:ln w="9525">
+                      <a:noFill/>
+                      <a:headEnd/>
+                      <a:tailEnd/>
+                    </a:ln>
+                  </pic:spPr>
+                </pic:pic>
+              </a:graphicData>
+            </a:graphic>
+          </wp:inline>
+        </w:drawing>
+      </w:r>
+    </w:p>
+    <w:p>
+      <w:pPr>
+        <w:pStyle w:val="ImageCaption"/>
+      </w:pPr>
+      <w:r>
+        <w:t xml:space="preserve">Change Active Cell modal — shared terminal context selector</w:t>
+      </w:r>
+    </w:p>
+    <w:p>
+      <w:pPr>
+        <w:pStyle w:val="BodyText"/>
+      </w:pPr>
+      <w:r>
+        <w:rPr>
+          <w:i/>
+          <w:iCs/>
+        </w:rPr>
+        <w:t xml:space="preserve">Change Active Cell modal: operator scans a Cell barcode or picks from a dropdown showing descendant Cells of the terminal’s parent Location. All dependent fields (Tool, Cavity, FIFO queue, etc.) refresh on confirmation.</w:t>
+      </w:r>
+    </w:p>
+    <w:p>
+      <w:pPr>
         <w:pStyle w:val="BodyText"/>
       </w:pPr>
       <w:r>
@@ -3174,8 +5128,8 @@
         <w:t xml:space="preserve">would have been created automatically with source=PLC, and Carlos would just need to assign the reason code. Note: the legacy paper forms track downtime as cumulative minutes subtracted from a 425-minute base runtime (with adjustments for lunch, breaks, and overtime). The new MES captures discrete start/end events, which is a more granular model — the cumulative shift total is derived from the events rather than entered directly.</w:t>
       </w:r>
     </w:p>
-    <w:bookmarkEnd w:id="18"/>
-    <w:bookmarkStart w:id="19" w:name="am-trim-shop-lot-moves-through-the-plant"/>
+    <w:bookmarkEnd w:id="99"/>
+    <w:bookmarkStart w:id="115" w:name="am-trim-shop-lot-moves-through-the-plant"/>
     <w:p>
       <w:pPr>
         <w:pStyle w:val="Heading3"/>
@@ -3220,6 +5174,73 @@
       </w:r>
       <w:r>
         <w:t xml:space="preserve">— from Die Cast Machine #7 to Trim Area.</w:t>
+      </w:r>
+    </w:p>
+    <w:p>
+      <w:pPr>
+        <w:pStyle w:val="CaptionedFigure"/>
+      </w:pPr>
+      <w:r>
+        <w:drawing>
+          <wp:inline>
+            <wp:extent cx="5334000" cy="2658656"/>
+            <wp:effectExtent b="0" l="0" r="0" t="0"/>
+            <wp:docPr descr="Trim Station — Idle, Lineside Inventory queue visible" title="" id="101" name="Picture"/>
+            <a:graphic>
+              <a:graphicData uri="http://schemas.openxmlformats.org/drawingml/2006/picture">
+                <pic:pic>
+                  <pic:nvPicPr>
+                    <pic:cNvPr descr="mockup_screenshots/Screenshot%202026-05-01%20142156.png" id="102" name="Picture"/>
+                    <pic:cNvPicPr>
+                      <a:picLocks noChangeArrowheads="1" noChangeAspect="1"/>
+                    </pic:cNvPicPr>
+                  </pic:nvPicPr>
+                  <pic:blipFill>
+                    <a:blip r:embed="rId100"/>
+                    <a:stretch>
+                      <a:fillRect/>
+                    </a:stretch>
+                  </pic:blipFill>
+                  <pic:spPr bwMode="auto">
+                    <a:xfrm>
+                      <a:off x="0" y="0"/>
+                      <a:ext cx="5334000" cy="2658656"/>
+                    </a:xfrm>
+                    <a:prstGeom prst="rect">
+                      <a:avLst/>
+                    </a:prstGeom>
+                    <a:noFill/>
+                    <a:ln w="9525">
+                      <a:noFill/>
+                      <a:headEnd/>
+                      <a:tailEnd/>
+                    </a:ln>
+                  </pic:spPr>
+                </pic:pic>
+              </a:graphicData>
+            </a:graphic>
+          </wp:inline>
+        </w:drawing>
+      </w:r>
+    </w:p>
+    <w:p>
+      <w:pPr>
+        <w:pStyle w:val="ImageCaption"/>
+      </w:pPr>
+      <w:r>
+        <w:t xml:space="preserve">Trim Station — Idle, Lineside Inventory queue visible</w:t>
+      </w:r>
+    </w:p>
+    <w:p>
+      <w:pPr>
+        <w:pStyle w:val="BodyText"/>
+      </w:pPr>
+      <w:r>
+        <w:rPr>
+          <w:i/>
+          <w:iCs/>
+        </w:rPr>
+        <w:t xml:space="preserve">Trim Station idle state: Active Cell header (Trim Cell 3) with Change button. Active LOTs at Trim Cell 3 panel shows the currently checked-in LOT (MESL1710931, 5G0-TRIM-4102, 48 pcs) with a Resume → OUT button. Lineside Inventory panel below lists LOTs awaiting pick in FIFO order — Position, LotName, source (Press 7, DC-042/Cavity A), status badge, time in storage, and a Pick → IN button. Scan field auto-disambiguates: a lineside LOT goes to IN, an active LOT resumes to OUT.</w:t>
       </w:r>
     </w:p>
     <w:p>
@@ -3412,6 +5433,73 @@
     </w:p>
     <w:p>
       <w:pPr>
+        <w:pStyle w:val="CaptionedFigure"/>
+      </w:pPr>
+      <w:r>
+        <w:drawing>
+          <wp:inline>
+            <wp:extent cx="5334000" cy="2646044"/>
+            <wp:effectExtent b="0" l="0" r="0" t="0"/>
+            <wp:docPr descr="Trim Station — Check IN, eligibility validation pass" title="" id="104" name="Picture"/>
+            <a:graphic>
+              <a:graphicData uri="http://schemas.openxmlformats.org/drawingml/2006/picture">
+                <pic:pic>
+                  <pic:nvPicPr>
+                    <pic:cNvPr descr="mockup_screenshots/Screenshot%202026-04-30%20124705.png" id="105" name="Picture"/>
+                    <pic:cNvPicPr>
+                      <a:picLocks noChangeArrowheads="1" noChangeAspect="1"/>
+                    </pic:cNvPicPr>
+                  </pic:nvPicPr>
+                  <pic:blipFill>
+                    <a:blip r:embed="rId103"/>
+                    <a:stretch>
+                      <a:fillRect/>
+                    </a:stretch>
+                  </pic:blipFill>
+                  <pic:spPr bwMode="auto">
+                    <a:xfrm>
+                      <a:off x="0" y="0"/>
+                      <a:ext cx="5334000" cy="2646044"/>
+                    </a:xfrm>
+                    <a:prstGeom prst="rect">
+                      <a:avLst/>
+                    </a:prstGeom>
+                    <a:noFill/>
+                    <a:ln w="9525">
+                      <a:noFill/>
+                      <a:headEnd/>
+                      <a:tailEnd/>
+                    </a:ln>
+                  </pic:spPr>
+                </pic:pic>
+              </a:graphicData>
+            </a:graphic>
+          </wp:inline>
+        </w:drawing>
+      </w:r>
+    </w:p>
+    <w:p>
+      <w:pPr>
+        <w:pStyle w:val="ImageCaption"/>
+      </w:pPr>
+      <w:r>
+        <w:t xml:space="preserve">Trim Station — Check IN, eligibility validation pass</w:t>
+      </w:r>
+    </w:p>
+    <w:p>
+      <w:pPr>
+        <w:pStyle w:val="BodyText"/>
+      </w:pPr>
+      <w:r>
+        <w:rPr>
+          <w:i/>
+          <w:iCs/>
+        </w:rPr>
+        <w:t xml:space="preserve">Check IN state: LTT barcode field with the scanned LOT resolved (LotName, Item, From Location, Pieces). A green eligibility banner confirms the direct ItemLocation match and MaxParts cap check. Operator Initials field (shared terminal), then Submit · Receive at Trim Cell 3.</w:t>
+      </w:r>
+    </w:p>
+    <w:p>
+      <w:pPr>
         <w:pStyle w:val="BodyText"/>
       </w:pPr>
       <w:r>
@@ -3493,6 +5581,73 @@
     </w:p>
     <w:p>
       <w:pPr>
+        <w:pStyle w:val="CaptionedFigure"/>
+      </w:pPr>
+      <w:r>
+        <w:drawing>
+          <wp:inline>
+            <wp:extent cx="5334000" cy="2640594"/>
+            <wp:effectExtent b="0" l="0" r="0" t="0"/>
+            <wp:docPr descr="Trim Station — Check OUT, RequiresSubLotSplit ON" title="" id="107" name="Picture"/>
+            <a:graphic>
+              <a:graphicData uri="http://schemas.openxmlformats.org/drawingml/2006/picture">
+                <pic:pic>
+                  <pic:nvPicPr>
+                    <pic:cNvPr descr="mockup_screenshots/Screenshot%202026-04-30%20124731.png" id="108" name="Picture"/>
+                    <pic:cNvPicPr>
+                      <a:picLocks noChangeArrowheads="1" noChangeAspect="1"/>
+                    </pic:cNvPicPr>
+                  </pic:nvPicPr>
+                  <pic:blipFill>
+                    <a:blip r:embed="rId106"/>
+                    <a:stretch>
+                      <a:fillRect/>
+                    </a:stretch>
+                  </pic:blipFill>
+                  <pic:spPr bwMode="auto">
+                    <a:xfrm>
+                      <a:off x="0" y="0"/>
+                      <a:ext cx="5334000" cy="2640594"/>
+                    </a:xfrm>
+                    <a:prstGeom prst="rect">
+                      <a:avLst/>
+                    </a:prstGeom>
+                    <a:noFill/>
+                    <a:ln w="9525">
+                      <a:noFill/>
+                      <a:headEnd/>
+                      <a:tailEnd/>
+                    </a:ln>
+                  </pic:spPr>
+                </pic:pic>
+              </a:graphicData>
+            </a:graphic>
+          </wp:inline>
+        </w:drawing>
+      </w:r>
+    </w:p>
+    <w:p>
+      <w:pPr>
+        <w:pStyle w:val="ImageCaption"/>
+      </w:pPr>
+      <w:r>
+        <w:t xml:space="preserve">Trim Station — Check OUT, RequiresSubLotSplit ON</w:t>
+      </w:r>
+    </w:p>
+    <w:p>
+      <w:pPr>
+        <w:pStyle w:val="BodyText"/>
+      </w:pPr>
+      <w:r>
+        <w:rPr>
+          <w:i/>
+          <w:iCs/>
+        </w:rPr>
+        <w:t xml:space="preserve">Check OUT state: OperationTemplate banner (TrimOut · 5G0-TRIM-4102 v3) with RequiresSubLotSplit = ON · split + route shown at right. Closing ProductionEvent (TrimOut) section captures Operator Initials. Reject Entry · Trim Yield Loss section below records RejectEvents against the LOT with Trim-area Defect Code and Quantity.</w:t>
+      </w:r>
+    </w:p>
+    <w:p>
+      <w:pPr>
         <w:pStyle w:val="BodyText"/>
       </w:pPr>
       <w:r>
@@ -3601,8 +5756,142 @@
         <w:t xml:space="preserve">(FDS-05-024).</w:t>
       </w:r>
     </w:p>
-    <w:bookmarkEnd w:id="19"/>
-    <w:bookmarkStart w:id="20" w:name="X33b4f3c9a0224f726c67dbc69ec4a6e4d562a08"/>
+    <w:p>
+      <w:pPr>
+        <w:pStyle w:val="CaptionedFigure"/>
+      </w:pPr>
+      <w:r>
+        <w:drawing>
+          <wp:inline>
+            <wp:extent cx="5334000" cy="1126940"/>
+            <wp:effectExtent b="0" l="0" r="0" t="0"/>
+            <wp:docPr descr="Sub-LOT Distribution — 2 destinations, 48 pcs split 24/24" title="" id="110" name="Picture"/>
+            <a:graphic>
+              <a:graphicData uri="http://schemas.openxmlformats.org/drawingml/2006/picture">
+                <pic:pic>
+                  <pic:nvPicPr>
+                    <pic:cNvPr descr="mockup_screenshots/Screenshot%202026-04-30%20124742.png" id="111" name="Picture"/>
+                    <pic:cNvPicPr>
+                      <a:picLocks noChangeArrowheads="1" noChangeAspect="1"/>
+                    </pic:cNvPicPr>
+                  </pic:nvPicPr>
+                  <pic:blipFill>
+                    <a:blip r:embed="rId109"/>
+                    <a:stretch>
+                      <a:fillRect/>
+                    </a:stretch>
+                  </pic:blipFill>
+                  <pic:spPr bwMode="auto">
+                    <a:xfrm>
+                      <a:off x="0" y="0"/>
+                      <a:ext cx="5334000" cy="1126940"/>
+                    </a:xfrm>
+                    <a:prstGeom prst="rect">
+                      <a:avLst/>
+                    </a:prstGeom>
+                    <a:noFill/>
+                    <a:ln w="9525">
+                      <a:noFill/>
+                      <a:headEnd/>
+                      <a:tailEnd/>
+                    </a:ln>
+                  </pic:spPr>
+                </pic:pic>
+              </a:graphicData>
+            </a:graphic>
+          </wp:inline>
+        </w:drawing>
+      </w:r>
+    </w:p>
+    <w:p>
+      <w:pPr>
+        <w:pStyle w:val="ImageCaption"/>
+      </w:pPr>
+      <w:r>
+        <w:t xml:space="preserve">Sub-LOT Distribution — 2 destinations, 48 pcs split 24/24</w:t>
+      </w:r>
+    </w:p>
+    <w:p>
+      <w:pPr>
+        <w:pStyle w:val="BodyText"/>
+      </w:pPr>
+      <w:r>
+        <w:rPr>
+          <w:i/>
+          <w:iCs/>
+        </w:rPr>
+        <w:t xml:space="preserve">Sub-LOT Distribution panel: Total pieces shown at top right. Each row is a destination sub-LOT — operator enters Pieces and selects a Destination Machining Cell from a dropdown showing queue depth. + Add sub-LOT adds another row. Same Flex Repeater renders 1 row when RequiresSubLotSplit=0 (whole move) or N rows when =1. Submit · TrimOut + Split + Route commits in one transaction.</w:t>
+      </w:r>
+    </w:p>
+    <w:p>
+      <w:pPr>
+        <w:pStyle w:val="CaptionedFigure"/>
+      </w:pPr>
+      <w:r>
+        <w:drawing>
+          <wp:inline>
+            <wp:extent cx="5334000" cy="2629397"/>
+            <wp:effectExtent b="0" l="0" r="0" t="0"/>
+            <wp:docPr descr="Trim Station — Error state, LOT not at this Cell" title="" id="113" name="Picture"/>
+            <a:graphic>
+              <a:graphicData uri="http://schemas.openxmlformats.org/drawingml/2006/picture">
+                <pic:pic>
+                  <pic:nvPicPr>
+                    <pic:cNvPr descr="mockup_screenshots/Screenshot%202026-04-30%20124755.png" id="114" name="Picture"/>
+                    <pic:cNvPicPr>
+                      <a:picLocks noChangeArrowheads="1" noChangeAspect="1"/>
+                    </pic:cNvPicPr>
+                  </pic:nvPicPr>
+                  <pic:blipFill>
+                    <a:blip r:embed="rId112"/>
+                    <a:stretch>
+                      <a:fillRect/>
+                    </a:stretch>
+                  </pic:blipFill>
+                  <pic:spPr bwMode="auto">
+                    <a:xfrm>
+                      <a:off x="0" y="0"/>
+                      <a:ext cx="5334000" cy="2629397"/>
+                    </a:xfrm>
+                    <a:prstGeom prst="rect">
+                      <a:avLst/>
+                    </a:prstGeom>
+                    <a:noFill/>
+                    <a:ln w="9525">
+                      <a:noFill/>
+                      <a:headEnd/>
+                      <a:tailEnd/>
+                    </a:ln>
+                  </pic:spPr>
+                </pic:pic>
+              </a:graphicData>
+            </a:graphic>
+          </wp:inline>
+        </w:drawing>
+      </w:r>
+    </w:p>
+    <w:p>
+      <w:pPr>
+        <w:pStyle w:val="ImageCaption"/>
+      </w:pPr>
+      <w:r>
+        <w:t xml:space="preserve">Trim Station — Error state, LOT not at this Cell</w:t>
+      </w:r>
+    </w:p>
+    <w:p>
+      <w:pPr>
+        <w:pStyle w:val="BodyText"/>
+      </w:pPr>
+      <w:r>
+        <w:rPr>
+          <w:i/>
+          <w:iCs/>
+        </w:rPr>
+        <w:t xml:space="preserve">Error state: scanned LOT is not in storage and is not currently active here. The CAN’T PROCESS THIS LOT HERE panel shows the scanned LotName, its current location (already past Trim), and who checked it in. Back to storage queue or Open LOT Detail.</w:t>
+      </w:r>
+    </w:p>
+    <w:bookmarkEnd w:id="115"/>
+    <w:bookmarkStart w:id="122" w:name="X33b4f3c9a0224f726c67dbc69ec4a6e4d562a08"/>
     <w:p>
       <w:pPr>
         <w:pStyle w:val="Heading3"/>
@@ -3649,6 +5938,73 @@
     </w:p>
     <w:p>
       <w:pPr>
+        <w:pStyle w:val="CaptionedFigure"/>
+      </w:pPr>
+      <w:r>
+        <w:drawing>
+          <wp:inline>
+            <wp:extent cx="5334000" cy="2640538"/>
+            <wp:effectExtent b="0" l="0" r="0" t="0"/>
+            <wp:docPr descr="Machining IN — FIFO queue, 3 sub-LOTs awaiting" title="" id="117" name="Picture"/>
+            <a:graphic>
+              <a:graphicData uri="http://schemas.openxmlformats.org/drawingml/2006/picture">
+                <pic:pic>
+                  <pic:nvPicPr>
+                    <pic:cNvPr descr="mockup_screenshots/Screenshot%202026-04-30%20124828.png" id="118" name="Picture"/>
+                    <pic:cNvPicPr>
+                      <a:picLocks noChangeArrowheads="1" noChangeAspect="1"/>
+                    </pic:cNvPicPr>
+                  </pic:nvPicPr>
+                  <pic:blipFill>
+                    <a:blip r:embed="rId116"/>
+                    <a:stretch>
+                      <a:fillRect/>
+                    </a:stretch>
+                  </pic:blipFill>
+                  <pic:spPr bwMode="auto">
+                    <a:xfrm>
+                      <a:off x="0" y="0"/>
+                      <a:ext cx="5334000" cy="2640538"/>
+                    </a:xfrm>
+                    <a:prstGeom prst="rect">
+                      <a:avLst/>
+                    </a:prstGeom>
+                    <a:noFill/>
+                    <a:ln w="9525">
+                      <a:noFill/>
+                      <a:headEnd/>
+                      <a:tailEnd/>
+                    </a:ln>
+                  </pic:spPr>
+                </pic:pic>
+              </a:graphicData>
+            </a:graphic>
+          </wp:inline>
+        </w:drawing>
+      </w:r>
+    </w:p>
+    <w:p>
+      <w:pPr>
+        <w:pStyle w:val="ImageCaption"/>
+      </w:pPr>
+      <w:r>
+        <w:t xml:space="preserve">Machining IN — FIFO queue, 3 sub-LOTs awaiting</w:t>
+      </w:r>
+    </w:p>
+    <w:p>
+      <w:pPr>
+        <w:pStyle w:val="BodyText"/>
+      </w:pPr>
+      <w:r>
+        <w:rPr>
+          <w:i/>
+          <w:iCs/>
+        </w:rPr>
+        <w:t xml:space="preserve">Machining IN screen: no scan-to-receive. FIFO Queue panel lists sub-LOTs in arrival order with Position, LotName, parent LOT, Item, piece count, and arrival time. GOOD badge allows pick; HOLD badge blocks it. Pick (skip queue) is available on non-oldest positions. Active Machined LOT section below fills after a pick confirms.</w:t>
+      </w:r>
+    </w:p>
+    <w:p>
+      <w:pPr>
         <w:pStyle w:val="BodyText"/>
       </w:pPr>
       <w:r>
@@ -3827,6 +6183,73 @@
     </w:p>
     <w:p>
       <w:pPr>
+        <w:pStyle w:val="CaptionedFigure"/>
+      </w:pPr>
+      <w:r>
+        <w:drawing>
+          <wp:inline>
+            <wp:extent cx="4716378" cy="3724976"/>
+            <wp:effectExtent b="0" l="0" r="0" t="0"/>
+            <wp:docPr descr="BOM-Driven Rename modal — Machining IN" title="" id="120" name="Picture"/>
+            <a:graphic>
+              <a:graphicData uri="http://schemas.openxmlformats.org/drawingml/2006/picture">
+                <pic:pic>
+                  <pic:nvPicPr>
+                    <pic:cNvPr descr="mockup_screenshots/Screenshot%202026-04-30%20124844.png" id="121" name="Picture"/>
+                    <pic:cNvPicPr>
+                      <a:picLocks noChangeArrowheads="1" noChangeAspect="1"/>
+                    </pic:cNvPicPr>
+                  </pic:nvPicPr>
+                  <pic:blipFill>
+                    <a:blip r:embed="rId119"/>
+                    <a:stretch>
+                      <a:fillRect/>
+                    </a:stretch>
+                  </pic:blipFill>
+                  <pic:spPr bwMode="auto">
+                    <a:xfrm>
+                      <a:off x="0" y="0"/>
+                      <a:ext cx="4716378" cy="3724976"/>
+                    </a:xfrm>
+                    <a:prstGeom prst="rect">
+                      <a:avLst/>
+                    </a:prstGeom>
+                    <a:noFill/>
+                    <a:ln w="9525">
+                      <a:noFill/>
+                      <a:headEnd/>
+                      <a:tailEnd/>
+                    </a:ln>
+                  </pic:spPr>
+                </pic:pic>
+              </a:graphicData>
+            </a:graphic>
+          </wp:inline>
+        </w:drawing>
+      </w:r>
+    </w:p>
+    <w:p>
+      <w:pPr>
+        <w:pStyle w:val="ImageCaption"/>
+      </w:pPr>
+      <w:r>
+        <w:t xml:space="preserve">BOM-Driven Rename modal — Machining IN</w:t>
+      </w:r>
+    </w:p>
+    <w:p>
+      <w:pPr>
+        <w:pStyle w:val="BodyText"/>
+      </w:pPr>
+      <w:r>
+        <w:rPr>
+          <w:i/>
+          <w:iCs/>
+        </w:rPr>
+        <w:t xml:space="preserve">Receive sub-LOT — Rename to Machined Item modal: confirms the source sub-LOT (LotName · Item · piece count) and the target Item (BOM-resolved) with the new LotName that will be minted. Confirm Receive fires ConsumptionEvent + LotGenealogy + new LOT creation in one transaction.</w:t>
+      </w:r>
+    </w:p>
+    <w:p>
+      <w:pPr>
         <w:pStyle w:val="BodyText"/>
       </w:pPr>
       <w:r>
@@ -4008,8 +6431,8 @@
         <w:t xml:space="preserve">, and the LOT stays at the Machining Cell awaiting an operator-driven movement.)</w:t>
       </w:r>
     </w:p>
-    <w:bookmarkEnd w:id="20"/>
-    <w:bookmarkStart w:id="21" w:name="Xe45f8832e7997e311c5f47e21b87e7afa8aeaa5"/>
+    <w:bookmarkEnd w:id="122"/>
+    <w:bookmarkStart w:id="135" w:name="Xe45f8832e7997e311c5f47e21b87e7afa8aeaa5"/>
     <w:p>
       <w:pPr>
         <w:pStyle w:val="Heading3"/>
@@ -4024,6 +6447,73 @@
       </w:pPr>
       <w:r>
         <w:t xml:space="preserve">Sub-LOT A (23 x 5G0 castings, machined) arrives at the 5G0 Assembly Front line. This is a serialized line — every finished assembly gets a laser-etched serial number. The line also needs PNA mounting pins — there’s a LOT of those staged at the lineside location.</w:t>
+      </w:r>
+    </w:p>
+    <w:p>
+      <w:pPr>
+        <w:pStyle w:val="CaptionedFigure"/>
+      </w:pPr>
+      <w:r>
+        <w:drawing>
+          <wp:inline>
+            <wp:extent cx="5334000" cy="2640566"/>
+            <wp:effectExtent b="0" l="0" r="0" t="0"/>
+            <wp:docPr descr="Lineside Inventory — ASSY-FRONT Cell #3, 2 items needing attention" title="" id="124" name="Picture"/>
+            <a:graphic>
+              <a:graphicData uri="http://schemas.openxmlformats.org/drawingml/2006/picture">
+                <pic:pic>
+                  <pic:nvPicPr>
+                    <pic:cNvPr descr="mockup_screenshots/Screenshot%202026-05-01%20142114.png" id="125" name="Picture"/>
+                    <pic:cNvPicPr>
+                      <a:picLocks noChangeArrowheads="1" noChangeAspect="1"/>
+                    </pic:cNvPicPr>
+                  </pic:nvPicPr>
+                  <pic:blipFill>
+                    <a:blip r:embed="rId123"/>
+                    <a:stretch>
+                      <a:fillRect/>
+                    </a:stretch>
+                  </pic:blipFill>
+                  <pic:spPr bwMode="auto">
+                    <a:xfrm>
+                      <a:off x="0" y="0"/>
+                      <a:ext cx="5334000" cy="2640566"/>
+                    </a:xfrm>
+                    <a:prstGeom prst="rect">
+                      <a:avLst/>
+                    </a:prstGeom>
+                    <a:noFill/>
+                    <a:ln w="9525">
+                      <a:noFill/>
+                      <a:headEnd/>
+                      <a:tailEnd/>
+                    </a:ln>
+                  </pic:spPr>
+                </pic:pic>
+              </a:graphicData>
+            </a:graphic>
+          </wp:inline>
+        </w:drawing>
+      </w:r>
+    </w:p>
+    <w:p>
+      <w:pPr>
+        <w:pStyle w:val="ImageCaption"/>
+      </w:pPr>
+      <w:r>
+        <w:t xml:space="preserve">Lineside Inventory — ASSY-FRONT Cell #3, 2 items needing attention</w:t>
+      </w:r>
+    </w:p>
+    <w:p>
+      <w:pPr>
+        <w:pStyle w:val="BodyText"/>
+      </w:pPr>
+      <w:r>
+        <w:rPr>
+          <w:i/>
+          <w:iCs/>
+        </w:rPr>
+        <w:t xml:space="preserve">Lineside Inventory supervisory view for ASSY-FRONT Cell #3: four header cards (Lineside Capacity 486/800 pcs from the LinesideLimit LocationAttribute, Components Configured = 4 active BOM items, Oldest Staged LOT = 4 h 22 m, Low / Empty Items = 2). Per-item rows sorted attention-first — BRG-INSERT-M8 EMPTY (0 pcs staged, Min 80 / Default 160 / Max 240, blocks assembly with a red error banner) and SLV-GASKET-5G0 LOW (8 pcs, below MinQuantity 50, amber warning). Each item shows a Scan In LOT button for replenishment. Items at OK level appear below the attention items.</w:t>
       </w:r>
     </w:p>
     <w:p>
@@ -4365,6 +6855,140 @@
     </w:p>
     <w:p>
       <w:pPr>
+        <w:pStyle w:val="CaptionedFigure"/>
+      </w:pPr>
+      <w:r>
+        <w:drawing>
+          <wp:inline>
+            <wp:extent cx="5334000" cy="2641944"/>
+            <wp:effectExtent b="0" l="0" r="0" t="0"/>
+            <wp:docPr descr="Assembly 5G0F Serialized Line — ByVision tray fill, container 3 of 4 in progress" title="" id="127" name="Picture"/>
+            <a:graphic>
+              <a:graphicData uri="http://schemas.openxmlformats.org/drawingml/2006/picture">
+                <pic:pic>
+                  <pic:nvPicPr>
+                    <pic:cNvPr descr="mockup_screenshots/Screenshot%202026-04-30%20124910.png" id="128" name="Picture"/>
+                    <pic:cNvPicPr>
+                      <a:picLocks noChangeArrowheads="1" noChangeAspect="1"/>
+                    </pic:cNvPicPr>
+                  </pic:nvPicPr>
+                  <pic:blipFill>
+                    <a:blip r:embed="rId126"/>
+                    <a:stretch>
+                      <a:fillRect/>
+                    </a:stretch>
+                  </pic:blipFill>
+                  <pic:spPr bwMode="auto">
+                    <a:xfrm>
+                      <a:off x="0" y="0"/>
+                      <a:ext cx="5334000" cy="2641944"/>
+                    </a:xfrm>
+                    <a:prstGeom prst="rect">
+                      <a:avLst/>
+                    </a:prstGeom>
+                    <a:noFill/>
+                    <a:ln w="9525">
+                      <a:noFill/>
+                      <a:headEnd/>
+                      <a:tailEnd/>
+                    </a:ln>
+                  </pic:spPr>
+                </pic:pic>
+              </a:graphicData>
+            </a:graphic>
+          </wp:inline>
+        </w:drawing>
+      </w:r>
+    </w:p>
+    <w:p>
+      <w:pPr>
+        <w:pStyle w:val="ImageCaption"/>
+      </w:pPr>
+      <w:r>
+        <w:t xml:space="preserve">Assembly 5G0F Serialized Line — ByVision tray fill, container 3 of 4 in progress</w:t>
+      </w:r>
+    </w:p>
+    <w:p>
+      <w:pPr>
+        <w:pStyle w:val="BodyText"/>
+      </w:pPr>
+      <w:r>
+        <w:rPr>
+          <w:i/>
+          <w:iCs/>
+        </w:rPr>
+        <w:t xml:space="preserve">Assembly 5G0F Serialized Line: header cards show Active Source LOT, Lineside PNA Pins LOT, Container · Tray (3 of 4 · 8 of 12), and AIM Pool Depth. Tray Fill panel visualizes each tray position as a serial badge — green for validated, dashed for empty, orange for hardware-interlock-bypassed. Workorder Completion Gate panel appears when the container reaches full capacity — Confirm Completion claims an AIM ID, inserts a ShippingLabel row, and dispatches Zebra print.</w:t>
+      </w:r>
+    </w:p>
+    <w:p>
+      <w:pPr>
+        <w:pStyle w:val="CaptionedFigure"/>
+      </w:pPr>
+      <w:r>
+        <w:drawing>
+          <wp:inline>
+            <wp:extent cx="5334000" cy="5134517"/>
+            <wp:effectExtent b="0" l="0" r="0" t="0"/>
+            <wp:docPr descr="Material Substitute · Supervisor Override Required modal" title="" id="130" name="Picture"/>
+            <a:graphic>
+              <a:graphicData uri="http://schemas.openxmlformats.org/drawingml/2006/picture">
+                <pic:pic>
+                  <pic:nvPicPr>
+                    <pic:cNvPr descr="mockup_screenshots/Screenshot%202026-04-30%20124930.png" id="131" name="Picture"/>
+                    <pic:cNvPicPr>
+                      <a:picLocks noChangeArrowheads="1" noChangeAspect="1"/>
+                    </pic:cNvPicPr>
+                  </pic:nvPicPr>
+                  <pic:blipFill>
+                    <a:blip r:embed="rId129"/>
+                    <a:stretch>
+                      <a:fillRect/>
+                    </a:stretch>
+                  </pic:blipFill>
+                  <pic:spPr bwMode="auto">
+                    <a:xfrm>
+                      <a:off x="0" y="0"/>
+                      <a:ext cx="5334000" cy="5134517"/>
+                    </a:xfrm>
+                    <a:prstGeom prst="rect">
+                      <a:avLst/>
+                    </a:prstGeom>
+                    <a:noFill/>
+                    <a:ln w="9525">
+                      <a:noFill/>
+                      <a:headEnd/>
+                      <a:tailEnd/>
+                    </a:ln>
+                  </pic:spPr>
+                </pic:pic>
+              </a:graphicData>
+            </a:graphic>
+          </wp:inline>
+        </w:drawing>
+      </w:r>
+    </w:p>
+    <w:p>
+      <w:pPr>
+        <w:pStyle w:val="ImageCaption"/>
+      </w:pPr>
+      <w:r>
+        <w:t xml:space="preserve">Material Substitute · Supervisor Override Required modal</w:t>
+      </w:r>
+    </w:p>
+    <w:p>
+      <w:pPr>
+        <w:pStyle w:val="BodyText"/>
+      </w:pPr>
+      <w:r>
+        <w:rPr>
+          <w:i/>
+          <w:iCs/>
+        </w:rPr>
+        <w:t xml:space="preserve">Material Substitute override modal (UJ-09): fires when the operator scans a lineside LOT whose Item is not on the active BOM. Shows the scanned LOT vs. what the BOM expects. Requires Supervisor AD Username, Password, and a mandatory Reason for Substitute. Both operator and supervisor AppUserId are logged to Audit.OperationLog.</w:t>
+      </w:r>
+    </w:p>
+    <w:p>
+      <w:pPr>
         <w:pStyle w:val="BlockText"/>
       </w:pPr>
       <w:r>
@@ -4562,8 +7186,75 @@
         <w:t xml:space="preserve">carry the configured capacities per Item.</w:t>
       </w:r>
     </w:p>
-    <w:bookmarkEnd w:id="21"/>
-    <w:bookmarkStart w:id="22" w:name="pm-a-quality-hold"/>
+    <w:p>
+      <w:pPr>
+        <w:pStyle w:val="CaptionedFigure"/>
+      </w:pPr>
+      <w:r>
+        <w:drawing>
+          <wp:inline>
+            <wp:extent cx="5334000" cy="2651680"/>
+            <wp:effectExtent b="0" l="0" r="0" t="0"/>
+            <wp:docPr descr="Assembly 6B2 Non-Serialized Line — ByWeight, live scale reading" title="" id="133" name="Picture"/>
+            <a:graphic>
+              <a:graphicData uri="http://schemas.openxmlformats.org/drawingml/2006/picture">
+                <pic:pic>
+                  <pic:nvPicPr>
+                    <pic:cNvPr descr="mockup_screenshots/Screenshot%202026-04-30%20124949.png" id="134" name="Picture"/>
+                    <pic:cNvPicPr>
+                      <a:picLocks noChangeArrowheads="1" noChangeAspect="1"/>
+                    </pic:cNvPicPr>
+                  </pic:nvPicPr>
+                  <pic:blipFill>
+                    <a:blip r:embed="rId132"/>
+                    <a:stretch>
+                      <a:fillRect/>
+                    </a:stretch>
+                  </pic:blipFill>
+                  <pic:spPr bwMode="auto">
+                    <a:xfrm>
+                      <a:off x="0" y="0"/>
+                      <a:ext cx="5334000" cy="2651680"/>
+                    </a:xfrm>
+                    <a:prstGeom prst="rect">
+                      <a:avLst/>
+                    </a:prstGeom>
+                    <a:noFill/>
+                    <a:ln w="9525">
+                      <a:noFill/>
+                      <a:headEnd/>
+                      <a:tailEnd/>
+                    </a:ln>
+                  </pic:spPr>
+                </pic:pic>
+              </a:graphicData>
+            </a:graphic>
+          </wp:inline>
+        </w:drawing>
+      </w:r>
+    </w:p>
+    <w:p>
+      <w:pPr>
+        <w:pStyle w:val="ImageCaption"/>
+      </w:pPr>
+      <w:r>
+        <w:t xml:space="preserve">Assembly 6B2 Non-Serialized Line — ByWeight, live scale reading</w:t>
+      </w:r>
+    </w:p>
+    <w:p>
+      <w:pPr>
+        <w:pStyle w:val="BodyText"/>
+      </w:pPr>
+      <w:r>
+        <w:rPr>
+          <w:i/>
+          <w:iCs/>
+        </w:rPr>
+        <w:t xml:space="preserve">Assembly 6B2 Non-Serialized Line (ByWeight): Per-Tray Close panel shows a live scale reading (17.83 lb, approaching the 18.4 lb target) and TrayFullFlag status. Auto-close fires when the PLC asserts the flag. Container Completion Gate at bottom has the same atomic AIM-claim-and-print flow as the serialized line.</w:t>
+      </w:r>
+    </w:p>
+    <w:bookmarkEnd w:id="135"/>
+    <w:bookmarkStart w:id="142" w:name="pm-a-quality-hold"/>
     <w:p>
       <w:pPr>
         <w:pStyle w:val="Heading3"/>
@@ -4585,7 +7276,80 @@
         <w:pStyle w:val="BodyText"/>
       </w:pPr>
       <w:r>
-        <w:t xml:space="preserve">She goes to her terminal, opens the Hold Management screen, and searches for all open 5G0 LOTs and containers. She selects them and places a hold — type: CUSTOMER_COMPLAINT, reason:</w:t>
+        <w:t xml:space="preserve">She goes to her terminal, opens the Hold Management screen, and searches for all open 5G0 LOTs and containers.</w:t>
+      </w:r>
+    </w:p>
+    <w:p>
+      <w:pPr>
+        <w:pStyle w:val="CaptionedFigure"/>
+      </w:pPr>
+      <w:r>
+        <w:drawing>
+          <wp:inline>
+            <wp:extent cx="5334000" cy="2991590"/>
+            <wp:effectExtent b="0" l="0" r="0" t="0"/>
+            <wp:docPr descr="LOT Search — cross-area lookup, 5 results" title="" id="137" name="Picture"/>
+            <a:graphic>
+              <a:graphicData uri="http://schemas.openxmlformats.org/drawingml/2006/picture">
+                <pic:pic>
+                  <pic:nvPicPr>
+                    <pic:cNvPr descr="mockup_screenshots/Screenshot%202026-04-30%20125337.png" id="138" name="Picture"/>
+                    <pic:cNvPicPr>
+                      <a:picLocks noChangeArrowheads="1" noChangeAspect="1"/>
+                    </pic:cNvPicPr>
+                  </pic:nvPicPr>
+                  <pic:blipFill>
+                    <a:blip r:embed="rId136"/>
+                    <a:stretch>
+                      <a:fillRect/>
+                    </a:stretch>
+                  </pic:blipFill>
+                  <pic:spPr bwMode="auto">
+                    <a:xfrm>
+                      <a:off x="0" y="0"/>
+                      <a:ext cx="5334000" cy="2991590"/>
+                    </a:xfrm>
+                    <a:prstGeom prst="rect">
+                      <a:avLst/>
+                    </a:prstGeom>
+                    <a:noFill/>
+                    <a:ln w="9525">
+                      <a:noFill/>
+                      <a:headEnd/>
+                      <a:tailEnd/>
+                    </a:ln>
+                  </pic:spPr>
+                </pic:pic>
+              </a:graphicData>
+            </a:graphic>
+          </wp:inline>
+        </w:drawing>
+      </w:r>
+    </w:p>
+    <w:p>
+      <w:pPr>
+        <w:pStyle w:val="ImageCaption"/>
+      </w:pPr>
+      <w:r>
+        <w:t xml:space="preserve">LOT Search — cross-area lookup, 5 results</w:t>
+      </w:r>
+    </w:p>
+    <w:p>
+      <w:pPr>
+        <w:pStyle w:val="BodyText"/>
+      </w:pPr>
+      <w:r>
+        <w:rPr>
+          <w:i/>
+          <w:iCs/>
+        </w:rPr>
+        <w:t xml:space="preserve">LOT Search tab (elevated): search by LotName prefix, serial number, AIM Shipper ID, vendor lot, or part number. Status and Origin filters. Results sorted by recency — each row shows LotName, Item, piece count, location, status badge, and an Open button. CLOSED LOTs (split parents) appear with a note explaining why they closed.</w:t>
+      </w:r>
+      <w:r>
+        <w:t xml:space="preserve"> </w:t>
+      </w:r>
+      <w:r>
+        <w:t xml:space="preserve">She selects them and places a hold — type: CUSTOMER_COMPLAINT, reason:</w:t>
       </w:r>
       <w:r>
         <w:t xml:space="preserve"> </w:t>
@@ -4647,9 +7411,76 @@
     </w:p>
     <w:p>
       <w:pPr>
+        <w:pStyle w:val="CaptionedFigure"/>
+      </w:pPr>
+      <w:r>
+        <w:drawing>
+          <wp:inline>
+            <wp:extent cx="5334000" cy="2997868"/>
+            <wp:effectExtent b="0" l="0" r="0" t="0"/>
+            <wp:docPr descr="Hold Management — open LOTs and containers, batch place/release" title="" id="140" name="Picture"/>
+            <a:graphic>
+              <a:graphicData uri="http://schemas.openxmlformats.org/drawingml/2006/picture">
+                <pic:pic>
+                  <pic:nvPicPr>
+                    <pic:cNvPr descr="mockup_screenshots/Screenshot%202026-04-30%20125404.png" id="141" name="Picture"/>
+                    <pic:cNvPicPr>
+                      <a:picLocks noChangeArrowheads="1" noChangeAspect="1"/>
+                    </pic:cNvPicPr>
+                  </pic:nvPicPr>
+                  <pic:blipFill>
+                    <a:blip r:embed="rId139"/>
+                    <a:stretch>
+                      <a:fillRect/>
+                    </a:stretch>
+                  </pic:blipFill>
+                  <pic:spPr bwMode="auto">
+                    <a:xfrm>
+                      <a:off x="0" y="0"/>
+                      <a:ext cx="5334000" cy="2997868"/>
+                    </a:xfrm>
+                    <a:prstGeom prst="rect">
+                      <a:avLst/>
+                    </a:prstGeom>
+                    <a:noFill/>
+                    <a:ln w="9525">
+                      <a:noFill/>
+                      <a:headEnd/>
+                      <a:tailEnd/>
+                    </a:ln>
+                  </pic:spPr>
+                </pic:pic>
+              </a:graphicData>
+            </a:graphic>
+          </wp:inline>
+        </w:drawing>
+      </w:r>
+    </w:p>
+    <w:p>
+      <w:pPr>
+        <w:pStyle w:val="ImageCaption"/>
+      </w:pPr>
+      <w:r>
+        <w:t xml:space="preserve">Hold Management — open LOTs and containers, batch place/release</w:t>
+      </w:r>
+    </w:p>
+    <w:p>
+      <w:pPr>
         <w:pStyle w:val="BodyText"/>
       </w:pPr>
       <w:r>
+        <w:rPr>
+          <w:i/>
+          <w:iCs/>
+        </w:rPr>
+        <w:t xml:space="preserve">Hold Management screen (elevated): filter by LotName, AIM Shipper ID, Item, or Location; Hold Type and Reason fields. Left panel shows Open LOTs (4) with status badges and area context. Right panel shows Open Containers (3) with AIM Shipper ID and status. Select any combination across both panels and Place Hold on Selected or Release Selected Holds in one batch operation. Pre-shipped containers also fire AIM PlaceOnHold async.</w:t>
+      </w:r>
+    </w:p>
+    <w:p>
+      <w:pPr>
+        <w:pStyle w:val="BodyText"/>
+      </w:pPr>
+      <w:r>
         <w:t xml:space="preserve">There’s a container already packed and staged at the Shipping Dock — container</w:t>
       </w:r>
       <w:r>
@@ -4692,8 +7523,8 @@
         <w:t xml:space="preserve">with the shipper ID. AIM acknowledges. The container status goes to HOLD. It’s not going on the truck.</w:t>
       </w:r>
     </w:p>
-    <w:bookmarkEnd w:id="22"/>
-    <w:bookmarkStart w:id="23" w:name="pm-the-sort-cage"/>
+    <w:bookmarkEnd w:id="142"/>
+    <w:bookmarkStart w:id="155" w:name="pm-the-sort-cage"/>
     <w:p>
       <w:pPr>
         <w:pStyle w:val="Heading3"/>
@@ -4723,7 +7554,108 @@
         <w:t xml:space="preserve"> </w:t>
       </w:r>
       <w:r>
-        <w:t xml:space="preserve">tile on the MES home page (FDS-12-012), types in one of the Honda-reported serial numbers, and immediately sees the full genealogy tree — cavity, die, Carlos, timestamp, and forward through to the containers and shipper IDs where that serial landed. From that tree she pivots into a search on</w:t>
+        <w:t xml:space="preserve">tile on the MES home page (FDS-12-012), types in one of the Honda-reported serial numbers, and immediately sees the full genealogy tree — cavity, die, Carlos, timestamp, and forward through to the containers and shipper IDs where that serial landed.</w:t>
+      </w:r>
+    </w:p>
+    <w:p>
+      <w:pPr>
+        <w:pStyle w:val="CaptionedFigure"/>
+      </w:pPr>
+      <w:r>
+        <w:drawing>
+          <wp:inline>
+            <wp:extent cx="5334000" cy="2999331"/>
+            <wp:effectExtent b="0" l="0" r="0" t="0"/>
+            <wp:docPr descr="Genealogy Lookup — tree for serial 5G0F-240429-00147, depth 4" title="" id="144" name="Picture"/>
+            <a:graphic>
+              <a:graphicData uri="http://schemas.openxmlformats.org/drawingml/2006/picture">
+                <pic:pic>
+                  <pic:nvPicPr>
+                    <pic:cNvPr descr="mockup_screenshots/Screenshot%202026-04-30%20125350.png" id="145" name="Picture"/>
+                    <pic:cNvPicPr>
+                      <a:picLocks noChangeArrowheads="1" noChangeAspect="1"/>
+                    </pic:cNvPicPr>
+                  </pic:nvPicPr>
+                  <pic:blipFill>
+                    <a:blip r:embed="rId143"/>
+                    <a:stretch>
+                      <a:fillRect/>
+                    </a:stretch>
+                  </pic:blipFill>
+                  <pic:spPr bwMode="auto">
+                    <a:xfrm>
+                      <a:off x="0" y="0"/>
+                      <a:ext cx="5334000" cy="2999331"/>
+                    </a:xfrm>
+                    <a:prstGeom prst="rect">
+                      <a:avLst/>
+                    </a:prstGeom>
+                    <a:noFill/>
+                    <a:ln w="9525">
+                      <a:noFill/>
+                      <a:headEnd/>
+                      <a:tailEnd/>
+                    </a:ln>
+                  </pic:spPr>
+                </pic:pic>
+              </a:graphicData>
+            </a:graphic>
+          </wp:inline>
+        </w:drawing>
+      </w:r>
+    </w:p>
+    <w:p>
+      <w:pPr>
+        <w:pStyle w:val="ImageCaption"/>
+      </w:pPr>
+      <w:r>
+        <w:t xml:space="preserve">Genealogy Lookup — tree for serial 5G0F-240429-00147, depth 4</w:t>
+      </w:r>
+    </w:p>
+    <w:p>
+      <w:pPr>
+        <w:pStyle w:val="BodyText"/>
+      </w:pPr>
+      <w:r>
+        <w:rPr>
+          <w:i/>
+          <w:iCs/>
+        </w:rPr>
+        <w:t xml:space="preserve">Genealogy Lookup tab (elevated): enter a LotName or SerialNumber, choose direction (ancestors, descendants, or both). Tree walks the closure table in one read (or recursive CTE if not materialized). Nodes are: SerializedPart at leaf → machined LOT → trim sub-LOT → cast/trim parent LOT → die-cast origin LOT at root. Each node shows its LotName, Item, origin, and status badge. Honda’s</w:t>
+      </w:r>
+      <w:r>
+        <w:rPr>
+          <w:i/>
+          <w:iCs/>
+        </w:rPr>
+        <w:t xml:space="preserve"> </w:t>
+      </w:r>
+      <w:r>
+        <w:rPr>
+          <w:i/>
+          <w:iCs/>
+        </w:rPr>
+        <w:t xml:space="preserve">“give me everything for serial X”</w:t>
+      </w:r>
+      <w:r>
+        <w:rPr>
+          <w:i/>
+          <w:iCs/>
+        </w:rPr>
+        <w:t xml:space="preserve"> </w:t>
+      </w:r>
+      <w:r>
+        <w:rPr>
+          <w:i/>
+          <w:iCs/>
+        </w:rPr>
+        <w:t xml:space="preserve">lands at the ORIGIN node in one read.</w:t>
+      </w:r>
+      <w:r>
+        <w:t xml:space="preserve"> </w:t>
+      </w:r>
+      <w:r>
+        <w:t xml:space="preserve">From that tree she pivots into a search on</w:t>
       </w:r>
       <w:r>
         <w:t xml:space="preserve"> </w:t>
@@ -4827,121 +7759,466 @@
     </w:p>
     <w:p>
       <w:pPr>
+        <w:pStyle w:val="CaptionedFigure"/>
+      </w:pPr>
+      <w:r>
+        <w:drawing>
+          <wp:inline>
+            <wp:extent cx="5334000" cy="2648932"/>
+            <wp:effectExtent b="0" l="0" r="0" t="0"/>
+            <wp:docPr descr="LOT Detail — MESL1710935, History tab" title="" id="147" name="Picture"/>
+            <a:graphic>
+              <a:graphicData uri="http://schemas.openxmlformats.org/drawingml/2006/picture">
+                <pic:pic>
+                  <pic:nvPicPr>
+                    <pic:cNvPr descr="mockup_screenshots/Screenshot%202026-04-30%20125310.png" id="148" name="Picture"/>
+                    <pic:cNvPicPr>
+                      <a:picLocks noChangeArrowheads="1" noChangeAspect="1"/>
+                    </pic:cNvPicPr>
+                  </pic:nvPicPr>
+                  <pic:blipFill>
+                    <a:blip r:embed="rId146"/>
+                    <a:stretch>
+                      <a:fillRect/>
+                    </a:stretch>
+                  </pic:blipFill>
+                  <pic:spPr bwMode="auto">
+                    <a:xfrm>
+                      <a:off x="0" y="0"/>
+                      <a:ext cx="5334000" cy="2648932"/>
+                    </a:xfrm>
+                    <a:prstGeom prst="rect">
+                      <a:avLst/>
+                    </a:prstGeom>
+                    <a:noFill/>
+                    <a:ln w="9525">
+                      <a:noFill/>
+                      <a:headEnd/>
+                      <a:tailEnd/>
+                    </a:ln>
+                  </pic:spPr>
+                </pic:pic>
+              </a:graphicData>
+            </a:graphic>
+          </wp:inline>
+        </w:drawing>
+      </w:r>
+    </w:p>
+    <w:p>
+      <w:pPr>
+        <w:pStyle w:val="ImageCaption"/>
+      </w:pPr>
+      <w:r>
+        <w:t xml:space="preserve">LOT Detail — MESL1710935, History tab</w:t>
+      </w:r>
+    </w:p>
+    <w:p>
+      <w:pPr>
+        <w:pStyle w:val="BodyText"/>
+      </w:pPr>
+      <w:r>
+        <w:rPr>
+          <w:i/>
+          <w:iCs/>
+        </w:rPr>
+        <w:t xml:space="preserve">LOT Detail screen: header cards show LotName, Item, Piece Count, Current Location, Tool, and Cavity. Four tabs — History (chronological event timeline), Genealogy, Paused-at, and Linked Container. History tab shows LotCreated, Die Cast ProductionEvent, RejectEvent, LotMovement, and Trim IN ProductionEvent — each with timestamp, event type, and key values. Place Hold, Scrap, and Back to Home actions at bottom.</w:t>
+      </w:r>
+    </w:p>
+    <w:p>
+      <w:pPr>
+        <w:pStyle w:val="BodyText"/>
+      </w:pPr>
+      <w:r>
+        <w:t xml:space="preserve">The two containers go to the Sort Cage — a physical location in the plant where containers are unpacked, parts re-inspected, and re-packed. The containers move (location: Sort Cage). Operators unpack them, inspect each part. Good parts get re-packed into new containers — the MES must support</w:t>
+      </w:r>
+      <w:r>
+        <w:t xml:space="preserve"> </w:t>
+      </w:r>
+      <w:r>
+        <w:t xml:space="preserve">“part replacement”</w:t>
+      </w:r>
+      <w:r>
+        <w:t xml:space="preserve"> </w:t>
+      </w:r>
+      <w:r>
+        <w:t xml:space="preserve">within containers (per FRS 2.1.10 and 2.2.7). For serialized parts, the MES handles serial number migration — the</w:t>
+      </w:r>
+      <w:r>
+        <w:t xml:space="preserve"> </w:t>
+      </w:r>
+      <w:r>
+        <w:rPr>
+          <w:rStyle w:val="VerbatimChar"/>
+        </w:rPr>
+        <w:t xml:space="preserve">ContainerSerial</w:t>
+      </w:r>
+      <w:r>
+        <w:t xml:space="preserve"> </w:t>
+      </w:r>
+      <w:r>
+        <w:t xml:space="preserve">records are updated to point to the new containers and tray positions.</w:t>
+      </w:r>
+    </w:p>
+    <w:p>
+      <w:pPr>
+        <w:pStyle w:val="CaptionedFigure"/>
+      </w:pPr>
+      <w:r>
+        <w:drawing>
+          <wp:inline>
+            <wp:extent cx="5334000" cy="2636376"/>
+            <wp:effectExtent b="0" l="0" r="0" t="0"/>
+            <wp:docPr descr="Sort Cage Workflow — Serialized, per-serial migration" title="" id="150" name="Picture"/>
+            <a:graphic>
+              <a:graphicData uri="http://schemas.openxmlformats.org/drawingml/2006/picture">
+                <pic:pic>
+                  <pic:nvPicPr>
+                    <pic:cNvPr descr="mockup_screenshots/Screenshot%202026-04-30%20125013.png" id="151" name="Picture"/>
+                    <pic:cNvPicPr>
+                      <a:picLocks noChangeArrowheads="1" noChangeAspect="1"/>
+                    </pic:cNvPicPr>
+                  </pic:nvPicPr>
+                  <pic:blipFill>
+                    <a:blip r:embed="rId149"/>
+                    <a:stretch>
+                      <a:fillRect/>
+                    </a:stretch>
+                  </pic:blipFill>
+                  <pic:spPr bwMode="auto">
+                    <a:xfrm>
+                      <a:off x="0" y="0"/>
+                      <a:ext cx="5334000" cy="2636376"/>
+                    </a:xfrm>
+                    <a:prstGeom prst="rect">
+                      <a:avLst/>
+                    </a:prstGeom>
+                    <a:noFill/>
+                    <a:ln w="9525">
+                      <a:noFill/>
+                      <a:headEnd/>
+                      <a:tailEnd/>
+                    </a:ln>
+                  </pic:spPr>
+                </pic:pic>
+              </a:graphicData>
+            </a:graphic>
+          </wp:inline>
+        </w:drawing>
+      </w:r>
+    </w:p>
+    <w:p>
+      <w:pPr>
+        <w:pStyle w:val="ImageCaption"/>
+      </w:pPr>
+      <w:r>
+        <w:t xml:space="preserve">Sort Cage Workflow — Serialized, per-serial migration</w:t>
+      </w:r>
+    </w:p>
+    <w:p>
+      <w:pPr>
+        <w:pStyle w:val="BodyText"/>
+      </w:pPr>
+      <w:r>
+        <w:rPr>
+          <w:i/>
+          <w:iCs/>
+        </w:rPr>
+        <w:t xml:space="preserve">Sort Cage Workflow (serialized, UJ-05 update-in-place default): Source Container header (Container, AIM Shipper ID, Item, Total Serials). Per-Serial Migration table — each row shows a serial number and a Destination Container · Tray · Position dropdown; PASS/FAIL badge. Suspect-only filter and Select All button for bulk operations. Submit Bulk Migration commits all rows in one call; ShippingLabel_Void fires on the source, Container_Complete fires on the destination claiming a fresh AIM ID.</w:t>
+      </w:r>
+    </w:p>
+    <w:p>
+      <w:pPr>
+        <w:pStyle w:val="CaptionedFigure"/>
+      </w:pPr>
+      <w:r>
+        <w:drawing>
+          <wp:inline>
+            <wp:extent cx="5334000" cy="2653080"/>
+            <wp:effectExtent b="0" l="0" r="0" t="0"/>
+            <wp:docPr descr="Sort Cage Workflow — Non-Serialized, ByVision camera re-pack" title="" id="153" name="Picture"/>
+            <a:graphic>
+              <a:graphicData uri="http://schemas.openxmlformats.org/drawingml/2006/picture">
+                <pic:pic>
+                  <pic:nvPicPr>
+                    <pic:cNvPr descr="mockup_screenshots/Screenshot%202026-04-30%20125038.png" id="154" name="Picture"/>
+                    <pic:cNvPicPr>
+                      <a:picLocks noChangeArrowheads="1" noChangeAspect="1"/>
+                    </pic:cNvPicPr>
+                  </pic:nvPicPr>
+                  <pic:blipFill>
+                    <a:blip r:embed="rId152"/>
+                    <a:stretch>
+                      <a:fillRect/>
+                    </a:stretch>
+                  </pic:blipFill>
+                  <pic:spPr bwMode="auto">
+                    <a:xfrm>
+                      <a:off x="0" y="0"/>
+                      <a:ext cx="5334000" cy="2653080"/>
+                    </a:xfrm>
+                    <a:prstGeom prst="rect">
+                      <a:avLst/>
+                    </a:prstGeom>
+                    <a:noFill/>
+                    <a:ln w="9525">
+                      <a:noFill/>
+                      <a:headEnd/>
+                      <a:tailEnd/>
+                    </a:ln>
+                  </pic:spPr>
+                </pic:pic>
+              </a:graphicData>
+            </a:graphic>
+          </wp:inline>
+        </w:drawing>
+      </w:r>
+    </w:p>
+    <w:p>
+      <w:pPr>
+        <w:pStyle w:val="ImageCaption"/>
+      </w:pPr>
+      <w:r>
+        <w:t xml:space="preserve">Sort Cage Workflow — Non-Serialized, ByVision camera re-pack</w:t>
+      </w:r>
+    </w:p>
+    <w:p>
+      <w:pPr>
+        <w:pStyle w:val="BodyText"/>
+      </w:pPr>
+      <w:r>
+        <w:rPr>
+          <w:i/>
+          <w:iCs/>
+        </w:rPr>
+        <w:t xml:space="preserve">Sort Cage Workflow (non-serialized): same Cognex camera as the Assembly non-serialized line. Per-Tray Close · ByVision panel shows a live camera feed, PASS/FAIL result, Trays Validated counter, Operator Scrap count (visually rejected before tray placement), and Source Remaining count. Active Destination Container selector and Force-Close Tray override. End Session button completes the flow.</w:t>
+      </w:r>
+      <w:r>
+        <w:t xml:space="preserve"> </w:t>
+      </w:r>
+      <w:r>
+        <w:t xml:space="preserve">When containers are re-packed, AIM must also be updated via</w:t>
+      </w:r>
+      <w:r>
+        <w:t xml:space="preserve"> </w:t>
+      </w:r>
+      <w:r>
+        <w:rPr>
+          <w:rStyle w:val="VerbatimChar"/>
+        </w:rPr>
+        <w:t xml:space="preserve">UpdateAim</w:t>
+      </w:r>
+      <w:r>
+        <w:t xml:space="preserve"> </w:t>
+      </w:r>
+      <w:r>
+        <w:t xml:space="preserve">(which accepts</w:t>
+      </w:r>
+      <w:r>
+        <w:t xml:space="preserve"> </w:t>
+      </w:r>
+      <w:r>
+        <w:rPr>
+          <w:rStyle w:val="VerbatimChar"/>
+        </w:rPr>
+        <w:t xml:space="preserve">serial</w:t>
+      </w:r>
+      <w:r>
+        <w:t xml:space="preserve"> </w:t>
+      </w:r>
+      <w:r>
+        <w:t xml:space="preserve">and</w:t>
+      </w:r>
+      <w:r>
+        <w:t xml:space="preserve"> </w:t>
+      </w:r>
+      <w:r>
+        <w:rPr>
+          <w:rStyle w:val="VerbatimChar"/>
+        </w:rPr>
+        <w:t xml:space="preserve">previousSerial</w:t>
+      </w:r>
+      <w:r>
+        <w:t xml:space="preserve"> </w:t>
+      </w:r>
+      <w:r>
+        <w:t xml:space="preserve">parameters, per Appendix L). New LTT labels print for any new LOTs created during re-sort. New shipping labels print for the re-packed containers. Old shipping labels are voided (</w:t>
+      </w:r>
+      <w:r>
+        <w:rPr>
+          <w:rStyle w:val="VerbatimChar"/>
+        </w:rPr>
+        <w:t xml:space="preserve">is_void=1</w:t>
+      </w:r>
+      <w:r>
+        <w:t xml:space="preserve">,</w:t>
+      </w:r>
+      <w:r>
+        <w:t xml:space="preserve"> </w:t>
+      </w:r>
+      <w:r>
+        <w:rPr>
+          <w:rStyle w:val="VerbatimChar"/>
+        </w:rPr>
+        <w:t xml:space="preserve">VoidedAt</w:t>
+      </w:r>
+      <w:r>
+        <w:t xml:space="preserve"> </w:t>
+      </w:r>
+      <w:r>
+        <w:t xml:space="preserve">recorded). AIM gets updated:</w:t>
+      </w:r>
+      <w:r>
+        <w:t xml:space="preserve"> </w:t>
+      </w:r>
+      <w:r>
+        <w:rPr>
+          <w:rStyle w:val="VerbatimChar"/>
+        </w:rPr>
+        <w:t xml:space="preserve">ReleaseFromHold</w:t>
+      </w:r>
+      <w:r>
+        <w:t xml:space="preserve"> </w:t>
+      </w:r>
+      <w:r>
+        <w:t xml:space="preserve">for the new good containers, the old shipper IDs are cancelled.</w:t>
+      </w:r>
+    </w:p>
+    <w:p>
+      <w:pPr>
+        <w:pStyle w:val="BodyText"/>
+      </w:pPr>
+      <w:r>
+        <w:t xml:space="preserve">Diane releases the hold on the good LOTs. The</w:t>
+      </w:r>
+      <w:r>
+        <w:t xml:space="preserve"> </w:t>
+      </w:r>
+      <w:r>
+        <w:rPr>
+          <w:rStyle w:val="VerbatimChar"/>
+        </w:rPr>
+        <w:t xml:space="preserve">HoldEvent</w:t>
+      </w:r>
+      <w:r>
+        <w:t xml:space="preserve"> </w:t>
+      </w:r>
+      <w:r>
+        <w:t xml:space="preserve">gets</w:t>
+      </w:r>
+      <w:r>
+        <w:t xml:space="preserve"> </w:t>
+      </w:r>
+      <w:r>
+        <w:rPr>
+          <w:rStyle w:val="VerbatimChar"/>
+        </w:rPr>
+        <w:t xml:space="preserve">ReleasedByUserId</w:t>
+      </w:r>
+      <w:r>
+        <w:t xml:space="preserve"> </w:t>
+      </w:r>
+      <w:r>
+        <w:t xml:space="preserve">and</w:t>
+      </w:r>
+      <w:r>
+        <w:t xml:space="preserve"> </w:t>
+      </w:r>
+      <w:r>
+        <w:rPr>
+          <w:rStyle w:val="VerbatimChar"/>
+        </w:rPr>
+        <w:t xml:space="preserve">ReleasedAt</w:t>
+      </w:r>
+      <w:r>
+        <w:t xml:space="preserve"> </w:t>
+      </w:r>
+      <w:r>
+        <w:t xml:space="preserve">populated. LOT status goes back to GOOD. Production can resume.</w:t>
+      </w:r>
+    </w:p>
+    <w:bookmarkEnd w:id="155"/>
+    <w:bookmarkStart w:id="159" w:name="Xef0509370e552f9e4610b8262e70be2381c36f2"/>
+    <w:p>
+      <w:pPr>
+        <w:pStyle w:val="Heading3"/>
+      </w:pPr>
+      <w:r>
+        <w:t xml:space="preserve">3:30pm — Receiving Dock: A Pass-Through Part Arrives</w:t>
+      </w:r>
+    </w:p>
+    <w:p>
+      <w:pPr>
         <w:pStyle w:val="FirstParagraph"/>
       </w:pPr>
       <w:r>
-        <w:t xml:space="preserve">The two containers go to the Sort Cage — a physical location in the plant where containers are unpacked, parts re-inspected, and re-packed. The containers move (location: Sort Cage). Operators unpack them, inspect each part. Good parts get re-packed into new containers — the MES must support</w:t>
-      </w:r>
-      <w:r>
-        <w:t xml:space="preserve"> </w:t>
-      </w:r>
-      <w:r>
-        <w:t xml:space="preserve">“part replacement”</w:t>
-      </w:r>
-      <w:r>
-        <w:t xml:space="preserve"> </w:t>
-      </w:r>
-      <w:r>
-        <w:t xml:space="preserve">within containers (per FRS 2.1.10 and 2.2.7). For serialized parts, the MES handles serial number migration — the</w:t>
-      </w:r>
-      <w:r>
-        <w:t xml:space="preserve"> </w:t>
-      </w:r>
-      <w:r>
-        <w:rPr>
-          <w:rStyle w:val="VerbatimChar"/>
-        </w:rPr>
-        <w:t xml:space="preserve">ContainerSerial</w:t>
-      </w:r>
-      <w:r>
-        <w:t xml:space="preserve"> </w:t>
-      </w:r>
-      <w:r>
-        <w:t xml:space="preserve">records are updated to point to the new containers and tray positions. When containers are re-packed, AIM must also be updated via</w:t>
-      </w:r>
-      <w:r>
-        <w:t xml:space="preserve"> </w:t>
-      </w:r>
-      <w:r>
-        <w:rPr>
-          <w:rStyle w:val="VerbatimChar"/>
-        </w:rPr>
-        <w:t xml:space="preserve">UpdateAim</w:t>
-      </w:r>
-      <w:r>
-        <w:t xml:space="preserve"> </w:t>
-      </w:r>
-      <w:r>
-        <w:t xml:space="preserve">(which accepts</w:t>
-      </w:r>
-      <w:r>
-        <w:t xml:space="preserve"> </w:t>
-      </w:r>
-      <w:r>
-        <w:rPr>
-          <w:rStyle w:val="VerbatimChar"/>
-        </w:rPr>
-        <w:t xml:space="preserve">serial</w:t>
-      </w:r>
-      <w:r>
-        <w:t xml:space="preserve"> </w:t>
-      </w:r>
-      <w:r>
-        <w:t xml:space="preserve">and</w:t>
-      </w:r>
-      <w:r>
-        <w:t xml:space="preserve"> </w:t>
-      </w:r>
-      <w:r>
-        <w:rPr>
-          <w:rStyle w:val="VerbatimChar"/>
-        </w:rPr>
-        <w:t xml:space="preserve">previousSerial</w:t>
-      </w:r>
-      <w:r>
-        <w:t xml:space="preserve"> </w:t>
-      </w:r>
-      <w:r>
-        <w:t xml:space="preserve">parameters, per Appendix L). New LTT labels print for any new LOTs created during re-sort. New shipping labels print for the re-packed containers. Old shipping labels are voided (</w:t>
-      </w:r>
-      <w:r>
-        <w:rPr>
-          <w:rStyle w:val="VerbatimChar"/>
-        </w:rPr>
-        <w:t xml:space="preserve">is_void=1</w:t>
-      </w:r>
-      <w:r>
-        <w:t xml:space="preserve">,</w:t>
-      </w:r>
-      <w:r>
-        <w:t xml:space="preserve"> </w:t>
-      </w:r>
-      <w:r>
-        <w:rPr>
-          <w:rStyle w:val="VerbatimChar"/>
-        </w:rPr>
-        <w:t xml:space="preserve">VoidedAt</w:t>
-      </w:r>
-      <w:r>
-        <w:t xml:space="preserve"> </w:t>
-      </w:r>
-      <w:r>
-        <w:t xml:space="preserve">recorded). AIM gets updated:</w:t>
-      </w:r>
-      <w:r>
-        <w:t xml:space="preserve"> </w:t>
-      </w:r>
-      <w:r>
-        <w:rPr>
-          <w:rStyle w:val="VerbatimChar"/>
-        </w:rPr>
-        <w:t xml:space="preserve">ReleaseFromHold</w:t>
-      </w:r>
-      <w:r>
-        <w:t xml:space="preserve"> </w:t>
-      </w:r>
-      <w:r>
-        <w:t xml:space="preserve">for the new good containers, the old shipper IDs are cancelled.</w:t>
+        <w:t xml:space="preserve">A truck pulls up with a delivery of 6MA Cam Holder housings from an outside supplier. These are pass-through parts — MPP doesn’t manufacture them, just assembles them. The receiving operator scans the packing slip, creates a LOT in the MES: origin type Received, vendor lot number</w:t>
+      </w:r>
+      <w:r>
+        <w:t xml:space="preserve"> </w:t>
+      </w:r>
+      <w:r>
+        <w:rPr>
+          <w:rStyle w:val="VerbatimChar"/>
+        </w:rPr>
+        <w:t xml:space="preserve">VND-88721</w:t>
+      </w:r>
+      <w:r>
+        <w:t xml:space="preserve">, piece count 500, part number 6MA-HSG. The LOT enters the system at the Receiving Dock location.</w:t>
+      </w:r>
+    </w:p>
+    <w:p>
+      <w:pPr>
+        <w:pStyle w:val="CaptionedFigure"/>
+      </w:pPr>
+      <w:r>
+        <w:drawing>
+          <wp:inline>
+            <wp:extent cx="5334000" cy="2626654"/>
+            <wp:effectExtent b="0" l="0" r="0" t="0"/>
+            <wp:docPr descr="Receiving Dock terminal" title="" id="157" name="Picture"/>
+            <a:graphic>
+              <a:graphicData uri="http://schemas.openxmlformats.org/drawingml/2006/picture">
+                <pic:pic>
+                  <pic:nvPicPr>
+                    <pic:cNvPr descr="mockup_screenshots/Screenshot%202026-04-30%20123957.png" id="158" name="Picture"/>
+                    <pic:cNvPicPr>
+                      <a:picLocks noChangeArrowheads="1" noChangeAspect="1"/>
+                    </pic:cNvPicPr>
+                  </pic:nvPicPr>
+                  <pic:blipFill>
+                    <a:blip r:embed="rId156"/>
+                    <a:stretch>
+                      <a:fillRect/>
+                    </a:stretch>
+                  </pic:blipFill>
+                  <pic:spPr bwMode="auto">
+                    <a:xfrm>
+                      <a:off x="0" y="0"/>
+                      <a:ext cx="5334000" cy="2626654"/>
+                    </a:xfrm>
+                    <a:prstGeom prst="rect">
+                      <a:avLst/>
+                    </a:prstGeom>
+                    <a:noFill/>
+                    <a:ln w="9525">
+                      <a:noFill/>
+                      <a:headEnd/>
+                      <a:tailEnd/>
+                    </a:ln>
+                  </pic:spPr>
+                </pic:pic>
+              </a:graphicData>
+            </a:graphic>
+          </wp:inline>
+        </w:drawing>
+      </w:r>
+    </w:p>
+    <w:p>
+      <w:pPr>
+        <w:pStyle w:val="ImageCaption"/>
+      </w:pPr>
+      <w:r>
+        <w:t xml:space="preserve">Receiving Dock terminal</w:t>
       </w:r>
     </w:p>
     <w:p>
@@ -4949,82 +8226,11 @@
         <w:pStyle w:val="BodyText"/>
       </w:pPr>
       <w:r>
-        <w:t xml:space="preserve">Diane releases the hold on the good LOTs. The</w:t>
-      </w:r>
-      <w:r>
-        <w:t xml:space="preserve"> </w:t>
-      </w:r>
-      <w:r>
-        <w:rPr>
-          <w:rStyle w:val="VerbatimChar"/>
-        </w:rPr>
-        <w:t xml:space="preserve">HoldEvent</w:t>
-      </w:r>
-      <w:r>
-        <w:t xml:space="preserve"> </w:t>
-      </w:r>
-      <w:r>
-        <w:t xml:space="preserve">gets</w:t>
-      </w:r>
-      <w:r>
-        <w:t xml:space="preserve"> </w:t>
-      </w:r>
-      <w:r>
-        <w:rPr>
-          <w:rStyle w:val="VerbatimChar"/>
-        </w:rPr>
-        <w:t xml:space="preserve">ReleasedByUserId</w:t>
-      </w:r>
-      <w:r>
-        <w:t xml:space="preserve"> </w:t>
-      </w:r>
-      <w:r>
-        <w:t xml:space="preserve">and</w:t>
-      </w:r>
-      <w:r>
-        <w:t xml:space="preserve"> </w:t>
-      </w:r>
-      <w:r>
-        <w:rPr>
-          <w:rStyle w:val="VerbatimChar"/>
-        </w:rPr>
-        <w:t xml:space="preserve">ReleasedAt</w:t>
-      </w:r>
-      <w:r>
-        <w:t xml:space="preserve"> </w:t>
-      </w:r>
-      <w:r>
-        <w:t xml:space="preserve">populated. LOT status goes back to GOOD. Production can resume.</w:t>
-      </w:r>
-    </w:p>
-    <w:bookmarkEnd w:id="23"/>
-    <w:bookmarkStart w:id="24" w:name="Xef0509370e552f9e4610b8262e70be2381c36f2"/>
-    <w:p>
-      <w:pPr>
-        <w:pStyle w:val="Heading3"/>
-      </w:pPr>
-      <w:r>
-        <w:t xml:space="preserve">3:30pm — Receiving Dock: A Pass-Through Part Arrives</w:t>
-      </w:r>
-    </w:p>
-    <w:p>
-      <w:pPr>
-        <w:pStyle w:val="FirstParagraph"/>
-      </w:pPr>
-      <w:r>
-        <w:t xml:space="preserve">A truck pulls up with a delivery of 6MA Cam Holder housings from an outside supplier. These are pass-through parts — MPP doesn’t manufacture them, just assembles them. The receiving operator scans the packing slip, creates a LOT in the MES: origin type Received, vendor lot number</w:t>
-      </w:r>
-      <w:r>
-        <w:t xml:space="preserve"> </w:t>
-      </w:r>
-      <w:r>
-        <w:rPr>
-          <w:rStyle w:val="VerbatimChar"/>
-        </w:rPr>
-        <w:t xml:space="preserve">VND-88721</w:t>
-      </w:r>
-      <w:r>
-        <w:t xml:space="preserve">, piece count 500, part number 6MA-HSG. The LOT enters the system at the Receiving Dock location.</w:t>
+        <w:rPr>
+          <w:i/>
+          <w:iCs/>
+        </w:rPr>
+        <w:t xml:space="preserve">Receiving Dock screen: Active Location header (Receiving Dock A) with Change button. New Received LOT form: packing slip barcode scan auto-fills Part Number, Vendor LOT, and Piece Count when present. Part Number resolves to Parts.Item.Id. Optional serial range (Min/Max) for vendor-issued serials validated at Assembly. Operator Initials field. Today’s Receiving Log sidebar shows the day’s inbound LOTs with timestamps, item codes, and piece counts.</w:t>
       </w:r>
     </w:p>
     <w:p>
@@ -5069,8 +8275,8 @@
         <w:t xml:space="preserve">note on Scope Matrix row 20 refers to the dedicated operational workflows — Perspective screens for receiving inspection, vendor lot verification, and staging procedures specific to pass-through parts — not to the underlying tracking capability.</w:t>
       </w:r>
     </w:p>
-    <w:bookmarkEnd w:id="24"/>
-    <w:bookmarkStart w:id="25" w:name="pm-shipping-the-truck-leaves"/>
+    <w:bookmarkEnd w:id="159"/>
+    <w:bookmarkStart w:id="163" w:name="pm-shipping-the-truck-leaves"/>
     <w:p>
       <w:pPr>
         <w:pStyle w:val="Heading3"/>
@@ -5087,8 +8293,75 @@
         <w:t xml:space="preserve">The released containers — the good ones from this morning’s production, plus the re-sorted containers from the Sort Cage — are loaded onto the Honda truck. The shipping operator scans each container’s shipping label. The MES confirms: status Complete (not HOLD, not VOID), AIM shipper ID valid. Each container’s location moves to Shipping Dock → Shipped. The truck rolls out. Honda can trace every part on it back to the melt.</w:t>
       </w:r>
     </w:p>
-    <w:bookmarkEnd w:id="25"/>
-    <w:bookmarkStart w:id="26" w:name="end-of-shift"/>
+    <w:p>
+      <w:pPr>
+        <w:pStyle w:val="CaptionedFigure"/>
+      </w:pPr>
+      <w:r>
+        <w:drawing>
+          <wp:inline>
+            <wp:extent cx="5334000" cy="2646153"/>
+            <wp:effectExtent b="0" l="0" r="0" t="0"/>
+            <wp:docPr descr="Shipping Dock — active manifest TRUCK-MFG-240430-002" title="" id="161" name="Picture"/>
+            <a:graphic>
+              <a:graphicData uri="http://schemas.openxmlformats.org/drawingml/2006/picture">
+                <pic:pic>
+                  <pic:nvPicPr>
+                    <pic:cNvPr descr="mockup_screenshots/Screenshot%202026-04-30%20125103.png" id="162" name="Picture"/>
+                    <pic:cNvPicPr>
+                      <a:picLocks noChangeArrowheads="1" noChangeAspect="1"/>
+                    </pic:cNvPicPr>
+                  </pic:nvPicPr>
+                  <pic:blipFill>
+                    <a:blip r:embed="rId160"/>
+                    <a:stretch>
+                      <a:fillRect/>
+                    </a:stretch>
+                  </pic:blipFill>
+                  <pic:spPr bwMode="auto">
+                    <a:xfrm>
+                      <a:off x="0" y="0"/>
+                      <a:ext cx="5334000" cy="2646153"/>
+                    </a:xfrm>
+                    <a:prstGeom prst="rect">
+                      <a:avLst/>
+                    </a:prstGeom>
+                    <a:noFill/>
+                    <a:ln w="9525">
+                      <a:noFill/>
+                      <a:headEnd/>
+                      <a:tailEnd/>
+                    </a:ln>
+                  </pic:spPr>
+                </pic:pic>
+              </a:graphicData>
+            </a:graphic>
+          </wp:inline>
+        </w:drawing>
+      </w:r>
+    </w:p>
+    <w:p>
+      <w:pPr>
+        <w:pStyle w:val="ImageCaption"/>
+      </w:pPr>
+      <w:r>
+        <w:t xml:space="preserve">Shipping Dock — active manifest TRUCK-MFG-240430-002</w:t>
+      </w:r>
+    </w:p>
+    <w:p>
+      <w:pPr>
+        <w:pStyle w:val="BodyText"/>
+      </w:pPr>
+      <w:r>
+        <w:rPr>
+          <w:i/>
+          <w:iCs/>
+        </w:rPr>
+        <w:t xml:space="preserve">Shipping Dock screen: Active Manifest header (truck ID, carrier, scheduled departure) with per-part-number progress tiles (5G0F 8/16, 5G0R 3/6, 6B2 1/2). Scan Container Shipping Label field — per-scan validation fires Lots.Container_Ship. Scanned list below shows loaded (green), on-hold (red), and void-label (orange) entries with their Shipper IDs, Container codes, and timestamps. Pending Containers sidebar shows READY containers at the dock. Today’s Stats panel at bottom right.</w:t>
+      </w:r>
+    </w:p>
+    <w:bookmarkEnd w:id="163"/>
+    <w:bookmarkStart w:id="167" w:name="end-of-shift"/>
     <w:p>
       <w:pPr>
         <w:pStyle w:val="Heading3"/>
@@ -5118,7 +8391,80 @@
         <w:t xml:space="preserve"> </w:t>
       </w:r>
       <w:r>
-        <w:t xml:space="preserve">control (FDS-09-013). His terminal is dedicated (Cell-parented), so the entry is a single button press: tap once, the MES writes</w:t>
+        <w:t xml:space="preserve">control (FDS-09-013).</w:t>
+      </w:r>
+    </w:p>
+    <w:p>
+      <w:pPr>
+        <w:pStyle w:val="CaptionedFigure"/>
+      </w:pPr>
+      <w:r>
+        <w:drawing>
+          <wp:inline>
+            <wp:extent cx="5334000" cy="2643348"/>
+            <wp:effectExtent b="0" l="0" r="0" t="0"/>
+            <wp:docPr descr="End-of-Shift Time Entry — Dedicated terminal, button-toggle mode" title="" id="165" name="Picture"/>
+            <a:graphic>
+              <a:graphicData uri="http://schemas.openxmlformats.org/drawingml/2006/picture">
+                <pic:pic>
+                  <pic:nvPicPr>
+                    <pic:cNvPr descr="mockup_screenshots/Screenshot%202026-04-30%20125159.png" id="166" name="Picture"/>
+                    <pic:cNvPicPr>
+                      <a:picLocks noChangeArrowheads="1" noChangeAspect="1"/>
+                    </pic:cNvPicPr>
+                  </pic:nvPicPr>
+                  <pic:blipFill>
+                    <a:blip r:embed="rId164"/>
+                    <a:stretch>
+                      <a:fillRect/>
+                    </a:stretch>
+                  </pic:blipFill>
+                  <pic:spPr bwMode="auto">
+                    <a:xfrm>
+                      <a:off x="0" y="0"/>
+                      <a:ext cx="5334000" cy="2643348"/>
+                    </a:xfrm>
+                    <a:prstGeom prst="rect">
+                      <a:avLst/>
+                    </a:prstGeom>
+                    <a:noFill/>
+                    <a:ln w="9525">
+                      <a:noFill/>
+                      <a:headEnd/>
+                      <a:tailEnd/>
+                    </a:ln>
+                  </pic:spPr>
+                </pic:pic>
+              </a:graphicData>
+            </a:graphic>
+          </wp:inline>
+        </w:drawing>
+      </w:r>
+    </w:p>
+    <w:p>
+      <w:pPr>
+        <w:pStyle w:val="ImageCaption"/>
+      </w:pPr>
+      <w:r>
+        <w:t xml:space="preserve">End-of-Shift Time Entry — Dedicated terminal, button-toggle mode</w:t>
+      </w:r>
+    </w:p>
+    <w:p>
+      <w:pPr>
+        <w:pStyle w:val="BodyText"/>
+      </w:pPr>
+      <w:r>
+        <w:rPr>
+          <w:i/>
+          <w:iCs/>
+        </w:rPr>
+        <w:t xml:space="preserve">End-of-Shift Time Entry screen: terminal mode badge (Dedicated · button-based, derived from parent Location tier per FDS-02-010). Three large toggle buttons — Lunch (30 min · 11:30 start), Break 1 (15 min · 09:00 start), Break 2 (15 min · 13:30 start) — tap to select, tap again to deselect. Submit Shift End writes one Oee.DowntimeEvent per selected break using shift-schedule start times and durations — no numeric entry. Zero-button submission valid. Shift Handover Summary below shows Open Downtime Events, Open Paused LOTs, and In-Process LOTs spanning the boundary.</w:t>
+      </w:r>
+      <w:r>
+        <w:t xml:space="preserve"> </w:t>
+      </w:r>
+      <w:r>
+        <w:t xml:space="preserve">His terminal is dedicated (Cell-parented), so the entry is a single button press: tap once, the MES writes</w:t>
       </w:r>
       <w:r>
         <w:t xml:space="preserve"> </w:t>
@@ -5317,9 +8663,9 @@
         </w:pict>
       </w:r>
     </w:p>
-    <w:bookmarkEnd w:id="26"/>
-    <w:bookmarkEnd w:id="27"/>
-    <w:bookmarkStart w:id="47" w:name="assumptions-open-decisions"/>
+    <w:bookmarkEnd w:id="167"/>
+    <w:bookmarkEnd w:id="168"/>
+    <w:bookmarkStart w:id="188" w:name="assumptions-open-decisions"/>
     <w:p>
       <w:pPr>
         <w:pStyle w:val="Heading2"/>
@@ -5354,7 +8700,7 @@
         <w:t xml:space="preserve">✅ Resolved | 🔶 Pending Customer Validation / Pending Internal Review | ⬜ Open</w:t>
       </w:r>
     </w:p>
-    <w:bookmarkStart w:id="28" w:name="X5b90eb551c604f4716bb765ca587f0c2360571b"/>
+    <w:bookmarkStart w:id="169" w:name="X5b90eb551c604f4716bb765ca587f0c2360571b"/>
     <w:p>
       <w:pPr>
         <w:pStyle w:val="Heading3"/>
@@ -5446,8 +8792,8 @@
         <w:t xml:space="preserve">See FDS §4.</w:t>
       </w:r>
     </w:p>
-    <w:bookmarkEnd w:id="28"/>
-    <w:bookmarkStart w:id="29" w:name="X8a97f2b45aacffcfde53291572bcd0cf661d011"/>
+    <w:bookmarkEnd w:id="169"/>
+    <w:bookmarkStart w:id="170" w:name="X8a97f2b45aacffcfde53291572bcd0cf661d011"/>
     <w:p>
       <w:pPr>
         <w:pStyle w:val="Heading3"/>
@@ -5538,8 +8884,8 @@
         <w:t xml:space="preserve">time (operator selects/confirms which cavity). See FDS-05-036.</w:t>
       </w:r>
     </w:p>
-    <w:bookmarkEnd w:id="29"/>
-    <w:bookmarkStart w:id="30" w:name="X02d9ed5b59999fee2ed9f775d0d739f5d3a01b0"/>
+    <w:bookmarkEnd w:id="170"/>
+    <w:bookmarkStart w:id="171" w:name="X02d9ed5b59999fee2ed9f775d0d739f5d3a01b0"/>
     <w:p>
       <w:pPr>
         <w:pStyle w:val="Heading3"/>
@@ -5692,8 +9038,8 @@
         <w:t xml:space="preserve">set at creation. The 2026-04-20 meeting notes conflated the two concepts; OI-09 closes this by locking the cavity-parallel-as-peer model in Data Model v1.9. See FDS-05-022 (sublots, Machining) and FDS-05-034 (cavity-parallel LOTs, Die Cast).</w:t>
       </w:r>
     </w:p>
-    <w:bookmarkEnd w:id="30"/>
-    <w:bookmarkStart w:id="31" w:name="Xc36c0c0c40ec76e485664de89aee6242e09b3d6"/>
+    <w:bookmarkEnd w:id="171"/>
+    <w:bookmarkStart w:id="172" w:name="Xc36c0c0c40ec76e485664de89aee6242e09b3d6"/>
     <w:p>
       <w:pPr>
         <w:pStyle w:val="Heading3"/>
@@ -5899,8 +9245,8 @@
         <w:t xml:space="preserve">OI-02 closed.</w:t>
       </w:r>
     </w:p>
-    <w:bookmarkEnd w:id="31"/>
-    <w:bookmarkStart w:id="32" w:name="sort-cage-serial-number-migration-open"/>
+    <w:bookmarkEnd w:id="172"/>
+    <w:bookmarkStart w:id="173" w:name="sort-cage-serial-number-migration-open"/>
     <w:p>
       <w:pPr>
         <w:pStyle w:val="Heading3"/>
@@ -5975,8 +9321,8 @@
         <w:t xml:space="preserve">table is needed.</w:t>
       </w:r>
     </w:p>
-    <w:bookmarkEnd w:id="32"/>
-    <w:bookmarkStart w:id="33" w:name="off-site-receiving-resolved"/>
+    <w:bookmarkEnd w:id="173"/>
+    <w:bookmarkStart w:id="174" w:name="off-site-receiving-resolved"/>
     <w:p>
       <w:pPr>
         <w:pStyle w:val="Heading3"/>
@@ -6021,8 +9367,8 @@
         <w:t xml:space="preserve">Online capability confirmed. No concerns about network reliability or offline requirements. Standard Ignition Perspective via VPN/published gateway.</w:t>
       </w:r>
     </w:p>
-    <w:bookmarkEnd w:id="33"/>
-    <w:bookmarkStart w:id="34" w:name="work-order-visibility-and-lifecycle-open"/>
+    <w:bookmarkEnd w:id="174"/>
+    <w:bookmarkStart w:id="175" w:name="work-order-visibility-and-lifecycle-open"/>
     <w:p>
       <w:pPr>
         <w:pStyle w:val="Heading3"/>
@@ -6089,8 +9435,8 @@
         <w:t xml:space="preserve">Maps to OI-07.</w:t>
       </w:r>
     </w:p>
-    <w:bookmarkEnd w:id="34"/>
-    <w:bookmarkStart w:id="35" w:name="lot-merge-business-rules-open"/>
+    <w:bookmarkEnd w:id="175"/>
+    <w:bookmarkStart w:id="176" w:name="lot-merge-business-rules-open"/>
     <w:p>
       <w:pPr>
         <w:pStyle w:val="Heading3"/>
@@ -6256,8 +9602,8 @@
         <w:t xml:space="preserve">walk of the pre-merge source LOTs (each retains its own Tool/Cavity FKs immutably). See FDS-05-030.</w:t>
       </w:r>
     </w:p>
-    <w:bookmarkEnd w:id="35"/>
-    <w:bookmarkStart w:id="36" w:name="Xaf546f60fbb4131369bf8f225358aae274b9155"/>
+    <w:bookmarkEnd w:id="176"/>
+    <w:bookmarkStart w:id="177" w:name="Xaf546f60fbb4131369bf8f225358aae274b9155"/>
     <w:p>
       <w:pPr>
         <w:pStyle w:val="Heading3"/>
@@ -6329,8 +9675,8 @@
         <w:t xml:space="preserve">BOM-based check. The scanned source LOT’s part number must match a component in the active BOM version. Substitute parts are rejected. Needs MPP confirmation.</w:t>
       </w:r>
     </w:p>
-    <w:bookmarkEnd w:id="36"/>
-    <w:bookmarkStart w:id="37" w:name="shift-boundary-handling-open"/>
+    <w:bookmarkEnd w:id="177"/>
+    <w:bookmarkStart w:id="178" w:name="shift-boundary-handling-open"/>
     <w:p>
       <w:pPr>
         <w:pStyle w:val="Heading3"/>
@@ -6385,8 +9731,8 @@
         <w:t xml:space="preserve">Maps to OI-03.</w:t>
       </w:r>
     </w:p>
-    <w:bookmarkEnd w:id="37"/>
-    <w:bookmarkStart w:id="38" w:name="paper-to-screen-transition-open"/>
+    <w:bookmarkEnd w:id="178"/>
+    <w:bookmarkStart w:id="179" w:name="paper-to-screen-transition-open"/>
     <w:p>
       <w:pPr>
         <w:pStyle w:val="Heading3"/>
@@ -6431,8 +9777,8 @@
         <w:t xml:space="preserve">Flagged for discussion with Ben. Whether Perspective screens replace paper at point-of-action or some stations retain paper-first workflow is a process change that requires MPP commitment.</w:t>
       </w:r>
     </w:p>
-    <w:bookmarkEnd w:id="38"/>
-    <w:bookmarkStart w:id="39" w:name="terminal-to-machine-mapping-resolved"/>
+    <w:bookmarkEnd w:id="179"/>
+    <w:bookmarkStart w:id="180" w:name="terminal-to-machine-mapping-resolved"/>
     <w:p>
       <w:pPr>
         <w:pStyle w:val="Heading3"/>
@@ -6567,8 +9913,8 @@
         <w:t xml:space="preserve">entries on the Terminal Location row.</w:t>
       </w:r>
     </w:p>
-    <w:bookmarkEnd w:id="39"/>
-    <w:bookmarkStart w:id="40" w:name="Xc0a5eb28306015653f1346584140a8b0bcc5f4a"/>
+    <w:bookmarkEnd w:id="180"/>
+    <w:bookmarkStart w:id="181" w:name="Xc0a5eb28306015653f1346584140a8b0bcc5f4a"/>
     <w:p>
       <w:pPr>
         <w:pStyle w:val="Heading3"/>
@@ -6746,8 +10092,8 @@
         <w:t xml:space="preserve">OI-02 closed.</w:t>
       </w:r>
     </w:p>
-    <w:bookmarkEnd w:id="40"/>
-    <w:bookmarkStart w:id="41" w:name="Xfe8f85755c74df97db4328170e4f07503f02ed7"/>
+    <w:bookmarkEnd w:id="181"/>
+    <w:bookmarkStart w:id="182" w:name="Xfe8f85755c74df97db4328170e4f07503f02ed7"/>
     <w:p>
       <w:pPr>
         <w:pStyle w:val="Heading3"/>
@@ -6888,8 +10234,8 @@
         <w:t xml:space="preserve">) so warm-up time and shot count stay in a single record.</w:t>
       </w:r>
     </w:p>
-    <w:bookmarkEnd w:id="41"/>
-    <w:bookmarkStart w:id="42" w:name="multi-part-number-lines-resolved"/>
+    <w:bookmarkEnd w:id="182"/>
+    <w:bookmarkStart w:id="183" w:name="multi-part-number-lines-resolved"/>
     <w:p>
       <w:pPr>
         <w:pStyle w:val="Heading3"/>
@@ -6944,8 +10290,8 @@
         <w:t xml:space="preserve">Maps to OI-09.</w:t>
       </w:r>
     </w:p>
-    <w:bookmarkEnd w:id="42"/>
-    <w:bookmarkStart w:id="43" w:name="hardware-interlock-bypass-mode-resolved"/>
+    <w:bookmarkEnd w:id="183"/>
+    <w:bookmarkStart w:id="184" w:name="hardware-interlock-bypass-mode-resolved"/>
     <w:p>
       <w:pPr>
         <w:pStyle w:val="Heading3"/>
@@ -7104,8 +10450,8 @@
         <w:t xml:space="preserve">would lose the per-piece granularity. Schema add deferred to Arc 2 Phase 7 alongside the rest of the Container schema CREATE.</w:t>
       </w:r>
     </w:p>
-    <w:bookmarkEnd w:id="43"/>
-    <w:bookmarkStart w:id="44" w:name="X7711411ed0c744b11ef8373c23e3eb986c2f7d7"/>
+    <w:bookmarkEnd w:id="184"/>
+    <w:bookmarkStart w:id="185" w:name="X7711411ed0c744b11ef8373c23e3eb986c2f7d7"/>
     <w:p>
       <w:pPr>
         <w:pStyle w:val="Heading3"/>
@@ -7175,8 +10521,8 @@
         <w:t xml:space="preserve">Maps to OI-04.</w:t>
       </w:r>
     </w:p>
-    <w:bookmarkEnd w:id="44"/>
-    <w:bookmarkStart w:id="45" w:name="X280b68ff8bcbd45e5069f035e24c9fb94030f71"/>
+    <w:bookmarkEnd w:id="185"/>
+    <w:bookmarkStart w:id="186" w:name="X280b68ff8bcbd45e5069f035e24c9fb94030f71"/>
     <w:p>
       <w:pPr>
         <w:pStyle w:val="Heading3"/>
@@ -7310,8 +10656,8 @@
         <w:t xml:space="preserve">(when the caller needs error surfacing — print path, AIM Hold/Update). The label-printing latency concern at container close is addressed by extracting print dispatch from the atomic close transaction (FDS-07-005/006a/b) — the close commits with the AIM ID claimed from the local pool (UJ-04), then a Gateway message handler fires the print with 3 retries (2s gap) and surfaces failures via a per-terminal banner with Acknowledge action (FDS-07-006b).</w:t>
       </w:r>
     </w:p>
-    <w:bookmarkEnd w:id="45"/>
-    <w:bookmarkStart w:id="46" w:name="Xc0ae84e509ec30bacfcc0a2e20bcc2db236d541"/>
+    <w:bookmarkEnd w:id="186"/>
+    <w:bookmarkStart w:id="187" w:name="Xc0ae84e509ec30bacfcc0a2e20bcc2db236d541"/>
     <w:p>
       <w:pPr>
         <w:pStyle w:val="Heading3"/>
@@ -7363,9 +10709,9 @@
         </w:pict>
       </w:r>
     </w:p>
-    <w:bookmarkEnd w:id="46"/>
-    <w:bookmarkEnd w:id="47"/>
-    <w:bookmarkStart w:id="48" w:name="impact-matrix"/>
+    <w:bookmarkEnd w:id="187"/>
+    <w:bookmarkEnd w:id="188"/>
+    <w:bookmarkStart w:id="189" w:name="impact-matrix"/>
     <w:p>
       <w:pPr>
         <w:pStyle w:val="Heading2"/>
@@ -7910,8 +11256,8 @@
         </w:pict>
       </w:r>
     </w:p>
-    <w:bookmarkEnd w:id="48"/>
-    <w:bookmarkStart w:id="49" w:name="related-documents"/>
+    <w:bookmarkEnd w:id="189"/>
+    <w:bookmarkStart w:id="190" w:name="related-documents"/>
     <w:p>
       <w:pPr>
         <w:pStyle w:val="Heading2"/>
@@ -8168,8 +11514,8 @@
         </w:pict>
       </w:r>
     </w:p>
-    <w:bookmarkEnd w:id="49"/>
-    <w:bookmarkStart w:id="50" w:name="validation-log-2026-04-06"/>
+    <w:bookmarkEnd w:id="190"/>
+    <w:bookmarkStart w:id="191" w:name="validation-log-2026-04-06"/>
     <w:p>
       <w:pPr>
         <w:pStyle w:val="Heading2"/>
@@ -9372,8 +12718,8 @@
         </w:tc>
       </w:tr>
     </w:tbl>
-    <w:bookmarkEnd w:id="50"/>
-    <w:bookmarkEnd w:id="51"/>
+    <w:bookmarkEnd w:id="191"/>
+    <w:bookmarkEnd w:id="192"/>
     <w:sectPr>
       <w:footnotePr>
         <w:numRestart w:val="eachSect"/>

</xml_diff>